<commit_message>
Run-of-show: a "Before the show" section at the front of the teleprompter
Four pages in the order you do them: once per project (clone, build_demo.sh, run the notebook), the rehearsal
recording (skip once rehearsal.json is committed), morning of (start_demo.sh, read the model check), and the five
tabs to open. Replaces the one-page checklist.

Co-Authored-By: Claude Opus 5.5 <noreply@anthropic.com>
Claude-Session: https://claude.ai/code/session_01XP7fEGExmmDaM7W6ayMgxX
</commit_message>
<xml_diff>
--- a/run-of-show/docs/PLANNING GUIDE - A4I kickoff demo.docx
+++ b/run-of-show/docs/PLANNING GUIDE - A4I kickoff demo.docx
@@ -1116,26 +1116,6 @@
           <w:szCs w:val="32"/>
         </w:rPr>
         <w:t xml:space="preserve">2. Demo map</w:t>
-      </w:r>
-    </w:p>
-    <w:p>
-      <w:pPr>
-        <w:pStyle w:val="Heading2"/>
-        <w:keepNext/>
-        <w:spacing w:after="80" w:before="260"/>
-      </w:pPr>
-      <w:r>
-        <w:rPr>
-          <w:rFonts w:ascii="Calibri" w:cs="Calibri" w:eastAsia="Calibri" w:hAnsi="Calibri"/>
-          <w:b/>
-          <w:bCs/>
-          <w:i w:val="false"/>
-          <w:iCs w:val="false"/>
-          <w:color w:val="F28C28"/>
-          <w:sz w:val="26"/>
-          <w:szCs w:val="26"/>
-        </w:rPr>
-        <w:t xml:space="preserve">KICKOFF</w:t>
       </w:r>
     </w:p>
     <w:tbl>
@@ -2578,7 +2558,7 @@
           <w:sz w:val="20"/>
           <w:szCs w:val="20"/>
         </w:rPr>
-        <w:t xml:space="preserve">KICKOFF: about 9.5 minutes of core demo, 9.5 with the optional blocks.</w:t>
+        <w:t xml:space="preserve">Total: about 9.5 minutes of core demo, 9.5 with the optional blocks.</w:t>
       </w:r>
     </w:p>
     <w:p>
@@ -3530,6 +3510,1444 @@
           <w:szCs w:val="20"/>
         </w:rPr>
         <w:t xml:space="preserve">Each block is the teleprompter block plus the reasoning behind it. The WHY line is the answer to "why should I care on Monday".</w:t>
+      </w:r>
+    </w:p>
+    <w:p>
+      <w:pPr>
+        <w:pStyle w:val="Heading3"/>
+        <w:keepNext/>
+        <w:spacing w:after="40" w:before="160"/>
+      </w:pPr>
+      <w:r>
+        <w:rPr>
+          <w:rFonts w:ascii="Calibri" w:cs="Calibri" w:eastAsia="Calibri" w:hAnsi="Calibri"/>
+          <w:b/>
+          <w:bCs/>
+          <w:i w:val="false"/>
+          <w:iCs w:val="false"/>
+          <w:color w:val="2BB3B1"/>
+          <w:sz w:val="22"/>
+          <w:szCs w:val="22"/>
+        </w:rPr>
+        <w:t xml:space="preserve">BEFORE THE SHOW · 1 · ONCE PER PROJECT</w:t>
+      </w:r>
+    </w:p>
+    <w:tbl>
+      <w:tblPr>
+        <w:tblW w:type="dxa" w:w="10080"/>
+        <w:tblBorders>
+          <w:top w:val="single" w:color="auto" w:sz="4"/>
+          <w:left w:val="single" w:color="auto" w:sz="4"/>
+          <w:bottom w:val="single" w:color="auto" w:sz="4"/>
+          <w:right w:val="single" w:color="auto" w:sz="4"/>
+          <w:insideH w:val="single" w:color="auto" w:sz="4"/>
+          <w:insideV w:val="single" w:color="auto" w:sz="4"/>
+        </w:tblBorders>
+      </w:tblPr>
+      <w:tblGrid>
+        <w:gridCol w:w="10080"/>
+      </w:tblGrid>
+      <w:tr>
+        <w:trPr>
+          <w:cantSplit/>
+        </w:trPr>
+        <w:tc>
+          <w:tcPr>
+            <w:tcW w:type="dxa" w:w="10080"/>
+            <w:tcBorders>
+              <w:top w:val="single" w:color="2BB3B1" w:sz="12"/>
+              <w:left w:val="single" w:color="2BB3B1" w:sz="36"/>
+              <w:bottom w:val="single" w:color="2BB3B1" w:sz="12"/>
+              <w:right w:val="single" w:color="2BB3B1" w:sz="12"/>
+            </w:tcBorders>
+            <w:tcMar>
+              <w:top w:type="dxa" w:w="80"/>
+              <w:left w:type="dxa" w:w="160"/>
+              <w:bottom w:type="dxa" w:w="80"/>
+              <w:right w:type="dxa" w:w="160"/>
+            </w:tcMar>
+          </w:tcPr>
+          <w:p>
+            <w:pPr>
+              <w:spacing w:after="40" w:before="0" w:line="264"/>
+            </w:pPr>
+            <w:r>
+              <w:rPr>
+                <w:rFonts w:ascii="Calibri" w:cs="Calibri" w:eastAsia="Calibri" w:hAnsi="Calibri"/>
+                <w:b/>
+                <w:bCs/>
+                <w:i w:val="false"/>
+                <w:iCs w:val="false"/>
+                <w:color w:val="2BB3B1"/>
+                <w:sz w:val="18"/>
+                <w:szCs w:val="18"/>
+              </w:rPr>
+              <w:t xml:space="preserve">CLOUD SHELL · a fresh project · about 10 minutes</w:t>
+            </w:r>
+          </w:p>
+          <w:p>
+            <w:pPr>
+              <w:spacing w:after="0" w:before="0" w:line="264"/>
+            </w:pPr>
+            <w:r>
+              <w:rPr>
+                <w:rFonts w:ascii="Consolas" w:cs="Consolas" w:eastAsia="Consolas" w:hAnsi="Consolas"/>
+                <w:b w:val="false"/>
+                <w:bCs w:val="false"/>
+                <w:i w:val="false"/>
+                <w:iCs w:val="false"/>
+                <w:sz w:val="19"/>
+                <w:szCs w:val="19"/>
+              </w:rPr>
+              <w:t xml:space="preserve">git clone https://github.com/haggman/A4I2026-demo-orbital-conjunction.git</w:t>
+            </w:r>
+          </w:p>
+          <w:p>
+            <w:pPr>
+              <w:spacing w:after="0" w:before="0" w:line="264"/>
+            </w:pPr>
+            <w:r>
+              <w:rPr>
+                <w:rFonts w:ascii="Consolas" w:cs="Consolas" w:eastAsia="Consolas" w:hAnsi="Consolas"/>
+                <w:b w:val="false"/>
+                <w:bCs w:val="false"/>
+                <w:i w:val="false"/>
+                <w:iCs w:val="false"/>
+                <w:sz w:val="19"/>
+                <w:szCs w:val="19"/>
+              </w:rPr>
+              <w:t xml:space="preserve">cd A4I2026-demo-orbital-conjunction</w:t>
+            </w:r>
+          </w:p>
+          <w:p>
+            <w:pPr>
+              <w:spacing w:after="0" w:before="0" w:line="264"/>
+            </w:pPr>
+            <w:r>
+              <w:rPr>
+                <w:rFonts w:ascii="Consolas" w:cs="Consolas" w:eastAsia="Consolas" w:hAnsi="Consolas"/>
+                <w:b w:val="false"/>
+                <w:bCs w:val="false"/>
+                <w:i w:val="false"/>
+                <w:iCs w:val="false"/>
+                <w:sz w:val="19"/>
+                <w:szCs w:val="19"/>
+              </w:rPr>
+              <w:t xml:space="preserve">bash scripts/build_demo.sh</w:t>
+            </w:r>
+          </w:p>
+          <w:p>
+            <w:pPr>
+              <w:spacing w:after="0" w:before="60" w:line="264"/>
+            </w:pPr>
+            <w:r>
+              <w:rPr>
+                <w:rFonts w:ascii="Calibri" w:cs="Calibri" w:eastAsia="Calibri" w:hAnsi="Calibri"/>
+                <w:b/>
+                <w:bCs/>
+                <w:i w:val="false"/>
+                <w:iCs w:val="false"/>
+                <w:color w:val="2ECC71"/>
+                <w:sz w:val="19"/>
+                <w:szCs w:val="19"/>
+              </w:rPr>
+              <w:t xml:space="preserve">→ </w:t>
+            </w:r>
+            <w:r>
+              <w:rPr>
+                <w:rFonts w:ascii="Calibri" w:cs="Calibri" w:eastAsia="Calibri" w:hAnsi="Calibri"/>
+                <w:b w:val="false"/>
+                <w:bCs w:val="false"/>
+                <w:i w:val="false"/>
+                <w:iCs w:val="false"/>
+                <w:color w:val="9AA4B2"/>
+                <w:sz w:val="19"/>
+                <w:szCs w:val="19"/>
+              </w:rPr>
+              <w:t xml:space="preserve">Data loads (850 conjunctions) · sandbox created · smoke test: 7 checks PASS · Cloud Run deploys cymbal-ops · Ready.</w:t>
+            </w:r>
+          </w:p>
+        </w:tc>
+      </w:tr>
+    </w:tbl>
+    <w:p>
+      <w:pPr>
+        <w:spacing w:after="20" w:before="0" w:line="264"/>
+      </w:pPr>
+      <w:r>
+        <w:rPr>
+          <w:rFonts w:ascii="Calibri" w:cs="Calibri" w:eastAsia="Calibri" w:hAnsi="Calibri"/>
+          <w:b w:val="false"/>
+          <w:bCs w:val="false"/>
+          <w:i w:val="false"/>
+          <w:iCs w:val="false"/>
+          <w:sz w:val="22"/>
+          <w:szCs w:val="22"/>
+        </w:rPr>
+        <w:t xml:space="preserve"/>
+      </w:r>
+    </w:p>
+    <w:tbl>
+      <w:tblPr>
+        <w:tblW w:type="dxa" w:w="10080"/>
+        <w:tblBorders>
+          <w:top w:val="single" w:color="auto" w:sz="4"/>
+          <w:left w:val="single" w:color="auto" w:sz="4"/>
+          <w:bottom w:val="single" w:color="auto" w:sz="4"/>
+          <w:right w:val="single" w:color="auto" w:sz="4"/>
+          <w:insideH w:val="single" w:color="auto" w:sz="4"/>
+          <w:insideV w:val="single" w:color="auto" w:sz="4"/>
+        </w:tblBorders>
+      </w:tblPr>
+      <w:tblGrid>
+        <w:gridCol w:w="10080"/>
+      </w:tblGrid>
+      <w:tr>
+        <w:trPr>
+          <w:cantSplit/>
+        </w:trPr>
+        <w:tc>
+          <w:tcPr>
+            <w:tcW w:type="dxa" w:w="10080"/>
+            <w:tcBorders>
+              <w:top w:val="single" w:color="B07CFF" w:sz="12"/>
+              <w:left w:val="single" w:color="B07CFF" w:sz="12"/>
+              <w:bottom w:val="single" w:color="B07CFF" w:sz="12"/>
+              <w:right w:val="single" w:color="B07CFF" w:sz="12"/>
+            </w:tcBorders>
+            <w:tcMar>
+              <w:top w:type="dxa" w:w="80"/>
+              <w:left w:type="dxa" w:w="160"/>
+              <w:bottom w:type="dxa" w:w="80"/>
+              <w:right w:type="dxa" w:w="160"/>
+            </w:tcMar>
+          </w:tcPr>
+          <w:p>
+            <w:pPr>
+              <w:spacing w:after="40" w:before="0" w:line="264"/>
+            </w:pPr>
+            <w:r>
+              <w:rPr>
+                <w:rFonts w:ascii="Calibri" w:cs="Calibri" w:eastAsia="Calibri" w:hAnsi="Calibri"/>
+                <w:b/>
+                <w:bCs/>
+                <w:i w:val="false"/>
+                <w:iCs w:val="false"/>
+                <w:color w:val="B07CFF"/>
+                <w:sz w:val="18"/>
+                <w:szCs w:val="18"/>
+              </w:rPr>
+              <w:t xml:space="preserve">COLAB ENTERPRISE · about 3 minutes</w:t>
+            </w:r>
+          </w:p>
+          <w:p>
+            <w:pPr>
+              <w:spacing w:after="0" w:before="0" w:line="264"/>
+            </w:pPr>
+            <w:r>
+              <w:rPr>
+                <w:rFonts w:ascii="Calibri" w:cs="Calibri" w:eastAsia="Calibri" w:hAnsi="Calibri"/>
+                <w:b w:val="false"/>
+                <w:bCs w:val="false"/>
+                <w:i w:val="false"/>
+                <w:iCs w:val="false"/>
+                <w:sz w:val="20"/>
+                <w:szCs w:val="20"/>
+              </w:rPr>
+              <w:t xml:space="preserve">Import notebooks/demo_01_load_explore.ipynb from the repo ▸ Runtime ▸ Run all</w:t>
+            </w:r>
+          </w:p>
+          <w:p>
+            <w:pPr>
+              <w:spacing w:after="0" w:before="60" w:line="264"/>
+            </w:pPr>
+            <w:r>
+              <w:rPr>
+                <w:rFonts w:ascii="Calibri" w:cs="Calibri" w:eastAsia="Calibri" w:hAnsi="Calibri"/>
+                <w:b/>
+                <w:bCs/>
+                <w:i w:val="false"/>
+                <w:iCs w:val="false"/>
+                <w:color w:val="2ECC71"/>
+                <w:sz w:val="19"/>
+                <w:szCs w:val="19"/>
+              </w:rPr>
+              <w:t xml:space="preserve">→ </w:t>
+            </w:r>
+            <w:r>
+              <w:rPr>
+                <w:rFonts w:ascii="Calibri" w:cs="Calibri" w:eastAsia="Calibri" w:hAnsi="Calibri"/>
+                <w:b w:val="false"/>
+                <w:bCs w:val="false"/>
+                <w:i w:val="false"/>
+                <w:iCs w:val="false"/>
+                <w:color w:val="9AA4B2"/>
+                <w:sz w:val="19"/>
+                <w:szCs w:val="19"/>
+              </w:rPr>
+              <w:t xml:space="preserve">Section 10: 850 approaches. Section 11: every check PASS. Keep this tab: it's step 2.</w:t>
+            </w:r>
+          </w:p>
+        </w:tc>
+      </w:tr>
+    </w:tbl>
+    <w:p>
+      <w:pPr>
+        <w:spacing w:after="20" w:before="0" w:line="264"/>
+      </w:pPr>
+      <w:r>
+        <w:rPr>
+          <w:rFonts w:ascii="Calibri" w:cs="Calibri" w:eastAsia="Calibri" w:hAnsi="Calibri"/>
+          <w:b w:val="false"/>
+          <w:bCs w:val="false"/>
+          <w:i w:val="false"/>
+          <w:iCs w:val="false"/>
+          <w:sz w:val="22"/>
+          <w:szCs w:val="22"/>
+        </w:rPr>
+        <w:t xml:space="preserve"/>
+      </w:r>
+    </w:p>
+    <w:p>
+      <w:pPr>
+        <w:spacing w:after="80" w:before="40" w:line="264"/>
+      </w:pPr>
+      <w:r>
+        <w:rPr>
+          <w:rFonts w:ascii="Calibri" w:cs="Calibri" w:eastAsia="Calibri" w:hAnsi="Calibri"/>
+          <w:b w:val="false"/>
+          <w:bCs w:val="false"/>
+          <w:i w:val="false"/>
+          <w:iCs w:val="false"/>
+          <w:color w:val="9AA4B2"/>
+          <w:sz w:val="20"/>
+          <w:szCs w:val="20"/>
+        </w:rPr>
+        <w:t xml:space="preserve">Once per Google Cloud project. A new Google Skills lab is a new project: start here again.</w:t>
+      </w:r>
+    </w:p>
+    <w:p>
+      <w:pPr>
+        <w:pStyle w:val="Heading3"/>
+        <w:keepNext/>
+        <w:spacing w:after="40" w:before="160"/>
+      </w:pPr>
+      <w:r>
+        <w:rPr>
+          <w:rFonts w:ascii="Calibri" w:cs="Calibri" w:eastAsia="Calibri" w:hAnsi="Calibri"/>
+          <w:b/>
+          <w:bCs/>
+          <w:i w:val="false"/>
+          <w:iCs w:val="false"/>
+          <w:color w:val="2BB3B1"/>
+          <w:sz w:val="22"/>
+          <w:szCs w:val="22"/>
+        </w:rPr>
+        <w:t xml:space="preserve">BEFORE THE SHOW · 2 · THE REHEARSAL RECORDING</w:t>
+      </w:r>
+    </w:p>
+    <w:tbl>
+      <w:tblPr>
+        <w:tblW w:type="dxa" w:w="10080"/>
+        <w:tblBorders>
+          <w:top w:val="single" w:color="auto" w:sz="4"/>
+          <w:left w:val="single" w:color="auto" w:sz="4"/>
+          <w:bottom w:val="single" w:color="auto" w:sz="4"/>
+          <w:right w:val="single" w:color="auto" w:sz="4"/>
+          <w:insideH w:val="single" w:color="auto" w:sz="4"/>
+          <w:insideV w:val="single" w:color="auto" w:sz="4"/>
+        </w:tblBorders>
+      </w:tblPr>
+      <w:tblGrid>
+        <w:gridCol w:w="10080"/>
+      </w:tblGrid>
+      <w:tr>
+        <w:trPr>
+          <w:cantSplit/>
+        </w:trPr>
+        <w:tc>
+          <w:tcPr>
+            <w:tcW w:type="dxa" w:w="10080"/>
+            <w:tcBorders>
+              <w:top w:val="single" w:color="2BB3B1" w:sz="12"/>
+              <w:left w:val="single" w:color="2BB3B1" w:sz="36"/>
+              <w:bottom w:val="single" w:color="2BB3B1" w:sz="12"/>
+              <w:right w:val="single" w:color="2BB3B1" w:sz="12"/>
+            </w:tcBorders>
+            <w:tcMar>
+              <w:top w:type="dxa" w:w="80"/>
+              <w:left w:type="dxa" w:w="160"/>
+              <w:bottom w:type="dxa" w:w="80"/>
+              <w:right w:type="dxa" w:w="160"/>
+            </w:tcMar>
+          </w:tcPr>
+          <w:p>
+            <w:pPr>
+              <w:spacing w:after="40" w:before="0" w:line="264"/>
+            </w:pPr>
+            <w:r>
+              <w:rPr>
+                <w:rFonts w:ascii="Calibri" w:cs="Calibri" w:eastAsia="Calibri" w:hAnsi="Calibri"/>
+                <w:b/>
+                <w:bCs/>
+                <w:i w:val="false"/>
+                <w:iCs w:val="false"/>
+                <w:color w:val="2BB3B1"/>
+                <w:sz w:val="18"/>
+                <w:szCs w:val="18"/>
+              </w:rPr>
+              <w:t xml:space="preserve">CLOUD SHELL · skip this page if console/recordings/rehearsal.json is already in the repo</w:t>
+            </w:r>
+          </w:p>
+          <w:p>
+            <w:pPr>
+              <w:spacing w:after="0" w:before="0" w:line="264"/>
+            </w:pPr>
+            <w:r>
+              <w:rPr>
+                <w:rFonts w:ascii="Consolas" w:cs="Consolas" w:eastAsia="Consolas" w:hAnsi="Consolas"/>
+                <w:b w:val="false"/>
+                <w:bCs w:val="false"/>
+                <w:i w:val="false"/>
+                <w:iCs w:val="false"/>
+                <w:sz w:val="19"/>
+                <w:szCs w:val="19"/>
+              </w:rPr>
+              <w:t xml:space="preserve">source scripts/activate.sh</w:t>
+            </w:r>
+          </w:p>
+          <w:p>
+            <w:pPr>
+              <w:spacing w:after="0" w:before="0" w:line="264"/>
+            </w:pPr>
+            <w:r>
+              <w:rPr>
+                <w:rFonts w:ascii="Consolas" w:cs="Consolas" w:eastAsia="Consolas" w:hAnsi="Consolas"/>
+                <w:b w:val="false"/>
+                <w:bCs w:val="false"/>
+                <w:i w:val="false"/>
+                <w:iCs w:val="false"/>
+                <w:sz w:val="19"/>
+                <w:szCs w:val="19"/>
+              </w:rPr>
+              <w:t xml:space="preserve">python console/data.py</w:t>
+            </w:r>
+          </w:p>
+          <w:p>
+            <w:pPr>
+              <w:spacing w:after="0" w:before="0" w:line="264"/>
+            </w:pPr>
+            <w:r>
+              <w:rPr>
+                <w:rFonts w:ascii="Consolas" w:cs="Consolas" w:eastAsia="Consolas" w:hAnsi="Consolas"/>
+                <w:b w:val="false"/>
+                <w:bCs w:val="false"/>
+                <w:i w:val="false"/>
+                <w:iCs w:val="false"/>
+                <w:sz w:val="19"/>
+                <w:szCs w:val="19"/>
+              </w:rPr>
+              <w:t xml:space="preserve">uvicorn console.app:app --port 8080</w:t>
+            </w:r>
+          </w:p>
+          <w:p>
+            <w:pPr>
+              <w:spacing w:after="0" w:before="60" w:line="264"/>
+            </w:pPr>
+            <w:r>
+              <w:rPr>
+                <w:rFonts w:ascii="Calibri" w:cs="Calibri" w:eastAsia="Calibri" w:hAnsi="Calibri"/>
+                <w:b/>
+                <w:bCs/>
+                <w:i w:val="false"/>
+                <w:iCs w:val="false"/>
+                <w:color w:val="2ECC71"/>
+                <w:sz w:val="19"/>
+                <w:szCs w:val="19"/>
+              </w:rPr>
+              <w:t xml:space="preserve">→ </w:t>
+            </w:r>
+            <w:r>
+              <w:rPr>
+                <w:rFonts w:ascii="Calibri" w:cs="Calibri" w:eastAsia="Calibri" w:hAnsi="Calibri"/>
+                <w:b w:val="false"/>
+                <w:bCs w:val="false"/>
+                <w:i w:val="false"/>
+                <w:iCs w:val="false"/>
+                <w:color w:val="9AA4B2"/>
+                <w:sz w:val="19"/>
+                <w:szCs w:val="19"/>
+              </w:rPr>
+              <w:t xml:space="preserve">Web Preview ▸ Change port ▸ 8080. Header says LIVE AGENT.</w:t>
+            </w:r>
+          </w:p>
+        </w:tc>
+      </w:tr>
+    </w:tbl>
+    <w:p>
+      <w:pPr>
+        <w:spacing w:after="20" w:before="0" w:line="264"/>
+      </w:pPr>
+      <w:r>
+        <w:rPr>
+          <w:rFonts w:ascii="Calibri" w:cs="Calibri" w:eastAsia="Calibri" w:hAnsi="Calibri"/>
+          <w:b w:val="false"/>
+          <w:bCs w:val="false"/>
+          <w:i w:val="false"/>
+          <w:iCs w:val="false"/>
+          <w:sz w:val="22"/>
+          <w:szCs w:val="22"/>
+        </w:rPr>
+        <w:t xml:space="preserve"/>
+      </w:r>
+    </w:p>
+    <w:tbl>
+      <w:tblPr>
+        <w:tblW w:type="dxa" w:w="10080"/>
+        <w:tblBorders>
+          <w:top w:val="single" w:color="auto" w:sz="4"/>
+          <w:left w:val="single" w:color="auto" w:sz="4"/>
+          <w:bottom w:val="single" w:color="auto" w:sz="4"/>
+          <w:right w:val="single" w:color="auto" w:sz="4"/>
+          <w:insideH w:val="single" w:color="auto" w:sz="4"/>
+          <w:insideV w:val="single" w:color="auto" w:sz="4"/>
+        </w:tblBorders>
+      </w:tblPr>
+      <w:tblGrid>
+        <w:gridCol w:w="10080"/>
+      </w:tblGrid>
+      <w:tr>
+        <w:trPr>
+          <w:cantSplit/>
+        </w:trPr>
+        <w:tc>
+          <w:tcPr>
+            <w:tcW w:type="dxa" w:w="10080"/>
+            <w:tcBorders>
+              <w:top w:val="single" w:color="B07CFF" w:sz="12"/>
+              <w:left w:val="single" w:color="B07CFF" w:sz="12"/>
+              <w:bottom w:val="single" w:color="B07CFF" w:sz="12"/>
+              <w:right w:val="single" w:color="B07CFF" w:sz="12"/>
+            </w:tcBorders>
+            <w:tcMar>
+              <w:top w:type="dxa" w:w="80"/>
+              <w:left w:type="dxa" w:w="160"/>
+              <w:bottom w:type="dxa" w:w="80"/>
+              <w:right w:type="dxa" w:w="160"/>
+            </w:tcMar>
+          </w:tcPr>
+          <w:p>
+            <w:pPr>
+              <w:spacing w:after="40" w:before="0" w:line="264"/>
+            </w:pPr>
+            <w:r>
+              <w:rPr>
+                <w:rFonts w:ascii="Calibri" w:cs="Calibri" w:eastAsia="Calibri" w:hAnsi="Calibri"/>
+                <w:b/>
+                <w:bCs/>
+                <w:i w:val="false"/>
+                <w:iCs w:val="false"/>
+                <w:color w:val="B07CFF"/>
+                <w:sz w:val="18"/>
+                <w:szCs w:val="18"/>
+              </w:rPr>
+              <w:t xml:space="preserve">IN THE CONSOLE · live Gemini</w:t>
+            </w:r>
+          </w:p>
+          <w:p>
+            <w:pPr>
+              <w:spacing w:after="0" w:before="0" w:line="264"/>
+            </w:pPr>
+            <w:r>
+              <w:rPr>
+                <w:rFonts w:ascii="Calibri" w:cs="Calibri" w:eastAsia="Calibri" w:hAnsi="Calibri"/>
+                <w:b w:val="false"/>
+                <w:bCs w:val="false"/>
+                <w:i w:val="false"/>
+                <w:iCs w:val="false"/>
+                <w:sz w:val="20"/>
+                <w:szCs w:val="20"/>
+              </w:rPr>
+              <w:t xml:space="preserve">Skip to next until the CYMBAL-04 card ▸ wait for YOUR CALL ▸ Approve</w:t>
+            </w:r>
+          </w:p>
+          <w:p>
+            <w:pPr>
+              <w:spacing w:after="0" w:before="0" w:line="264"/>
+            </w:pPr>
+            <w:r>
+              <w:rPr>
+                <w:rFonts w:ascii="Calibri" w:cs="Calibri" w:eastAsia="Calibri" w:hAnsi="Calibri"/>
+                <w:b w:val="false"/>
+                <w:bCs w:val="false"/>
+                <w:i w:val="false"/>
+                <w:iCs w:val="false"/>
+                <w:sz w:val="20"/>
+                <w:szCs w:val="20"/>
+              </w:rPr>
+              <w:t xml:space="preserve">Skip to next until Tuesday's card ▸ wait for YOUR CALL ▸ Approve</w:t>
+            </w:r>
+          </w:p>
+          <w:p>
+            <w:pPr>
+              <w:spacing w:after="0" w:before="60" w:line="264"/>
+            </w:pPr>
+            <w:r>
+              <w:rPr>
+                <w:rFonts w:ascii="Calibri" w:cs="Calibri" w:eastAsia="Calibri" w:hAnsi="Calibri"/>
+                <w:b/>
+                <w:bCs/>
+                <w:i w:val="false"/>
+                <w:iCs w:val="false"/>
+                <w:color w:val="2ECC71"/>
+                <w:sz w:val="19"/>
+                <w:szCs w:val="19"/>
+              </w:rPr>
+              <w:t xml:space="preserve">→ </w:t>
+            </w:r>
+            <w:r>
+              <w:rPr>
+                <w:rFonts w:ascii="Calibri" w:cs="Calibri" w:eastAsia="Calibri" w:hAnsi="Calibri"/>
+                <w:b w:val="false"/>
+                <w:bCs w:val="false"/>
+                <w:i w:val="false"/>
+                <w:iCs w:val="false"/>
+                <w:color w:val="9AA4B2"/>
+                <w:sz w:val="19"/>
+                <w:szCs w:val="19"/>
+              </w:rPr>
+              <w:t xml:space="preserve">CYMBAL-04: MANEUVER at 04:00. Tuesday: no burn.</w:t>
+            </w:r>
+          </w:p>
+        </w:tc>
+      </w:tr>
+    </w:tbl>
+    <w:p>
+      <w:pPr>
+        <w:spacing w:after="20" w:before="0" w:line="264"/>
+      </w:pPr>
+      <w:r>
+        <w:rPr>
+          <w:rFonts w:ascii="Calibri" w:cs="Calibri" w:eastAsia="Calibri" w:hAnsi="Calibri"/>
+          <w:b w:val="false"/>
+          <w:bCs w:val="false"/>
+          <w:i w:val="false"/>
+          <w:iCs w:val="false"/>
+          <w:sz w:val="22"/>
+          <w:szCs w:val="22"/>
+        </w:rPr>
+        <w:t xml:space="preserve"/>
+      </w:r>
+    </w:p>
+    <w:tbl>
+      <w:tblPr>
+        <w:tblW w:type="dxa" w:w="10080"/>
+        <w:tblBorders>
+          <w:top w:val="single" w:color="auto" w:sz="4"/>
+          <w:left w:val="single" w:color="auto" w:sz="4"/>
+          <w:bottom w:val="single" w:color="auto" w:sz="4"/>
+          <w:right w:val="single" w:color="auto" w:sz="4"/>
+          <w:insideH w:val="single" w:color="auto" w:sz="4"/>
+          <w:insideV w:val="single" w:color="auto" w:sz="4"/>
+        </w:tblBorders>
+      </w:tblPr>
+      <w:tblGrid>
+        <w:gridCol w:w="10080"/>
+      </w:tblGrid>
+      <w:tr>
+        <w:trPr>
+          <w:cantSplit/>
+        </w:trPr>
+        <w:tc>
+          <w:tcPr>
+            <w:tcW w:type="dxa" w:w="10080"/>
+            <w:tcBorders>
+              <w:top w:val="single" w:color="2BB3B1" w:sz="12"/>
+              <w:left w:val="single" w:color="2BB3B1" w:sz="36"/>
+              <w:bottom w:val="single" w:color="2BB3B1" w:sz="12"/>
+              <w:right w:val="single" w:color="2BB3B1" w:sz="12"/>
+            </w:tcBorders>
+            <w:tcMar>
+              <w:top w:type="dxa" w:w="80"/>
+              <w:left w:type="dxa" w:w="160"/>
+              <w:bottom w:type="dxa" w:w="80"/>
+              <w:right w:type="dxa" w:w="160"/>
+            </w:tcMar>
+          </w:tcPr>
+          <w:p>
+            <w:pPr>
+              <w:spacing w:after="40" w:before="0" w:line="264"/>
+            </w:pPr>
+            <w:r>
+              <w:rPr>
+                <w:rFonts w:ascii="Calibri" w:cs="Calibri" w:eastAsia="Calibri" w:hAnsi="Calibri"/>
+                <w:b/>
+                <w:bCs/>
+                <w:i w:val="false"/>
+                <w:iCs w:val="false"/>
+                <w:color w:val="2BB3B1"/>
+                <w:sz w:val="18"/>
+                <w:szCs w:val="18"/>
+              </w:rPr>
+              <w:t xml:space="preserve">CLOUD SHELL · stop uvicorn first (Ctrl+C in its terminal)</w:t>
+            </w:r>
+          </w:p>
+          <w:p>
+            <w:pPr>
+              <w:spacing w:after="0" w:before="0" w:line="264"/>
+            </w:pPr>
+            <w:r>
+              <w:rPr>
+                <w:rFonts w:ascii="Consolas" w:cs="Consolas" w:eastAsia="Consolas" w:hAnsi="Consolas"/>
+                <w:b w:val="false"/>
+                <w:bCs w:val="false"/>
+                <w:i w:val="false"/>
+                <w:iCs w:val="false"/>
+                <w:sz w:val="19"/>
+                <w:szCs w:val="19"/>
+              </w:rPr>
+              <w:t xml:space="preserve">python console/keep_recording.py</w:t>
+            </w:r>
+          </w:p>
+          <w:p>
+            <w:pPr>
+              <w:spacing w:after="0" w:before="60" w:line="264"/>
+            </w:pPr>
+            <w:r>
+              <w:rPr>
+                <w:rFonts w:ascii="Calibri" w:cs="Calibri" w:eastAsia="Calibri" w:hAnsi="Calibri"/>
+                <w:b/>
+                <w:bCs/>
+                <w:i w:val="false"/>
+                <w:iCs w:val="false"/>
+                <w:color w:val="2ECC71"/>
+                <w:sz w:val="19"/>
+                <w:szCs w:val="19"/>
+              </w:rPr>
+              <w:t xml:space="preserve">→ </w:t>
+            </w:r>
+            <w:r>
+              <w:rPr>
+                <w:rFonts w:ascii="Calibri" w:cs="Calibri" w:eastAsia="Calibri" w:hAnsi="Calibri"/>
+                <w:b w:val="false"/>
+                <w:bCs w:val="false"/>
+                <w:i w:val="false"/>
+                <w:iCs w:val="false"/>
+                <w:color w:val="9AA4B2"/>
+                <w:sz w:val="19"/>
+                <w:szCs w:val="19"/>
+              </w:rPr>
+              <w:t xml:space="preserve">Kept run-… → console/recordings/rehearsal.json · replayed the week twice: identical. If it says NOT KEPT, it says why: rehearse again.</w:t>
+            </w:r>
+          </w:p>
+        </w:tc>
+      </w:tr>
+    </w:tbl>
+    <w:p>
+      <w:pPr>
+        <w:spacing w:after="20" w:before="0" w:line="264"/>
+      </w:pPr>
+      <w:r>
+        <w:rPr>
+          <w:rFonts w:ascii="Calibri" w:cs="Calibri" w:eastAsia="Calibri" w:hAnsi="Calibri"/>
+          <w:b w:val="false"/>
+          <w:bCs w:val="false"/>
+          <w:i w:val="false"/>
+          <w:iCs w:val="false"/>
+          <w:sz w:val="22"/>
+          <w:szCs w:val="22"/>
+        </w:rPr>
+        <w:t xml:space="preserve"/>
+      </w:r>
+    </w:p>
+    <w:tbl>
+      <w:tblPr>
+        <w:tblW w:type="dxa" w:w="10080"/>
+        <w:tblBorders>
+          <w:top w:val="single" w:color="auto" w:sz="4"/>
+          <w:left w:val="single" w:color="auto" w:sz="4"/>
+          <w:bottom w:val="single" w:color="auto" w:sz="4"/>
+          <w:right w:val="single" w:color="auto" w:sz="4"/>
+          <w:insideH w:val="single" w:color="auto" w:sz="4"/>
+          <w:insideV w:val="single" w:color="auto" w:sz="4"/>
+        </w:tblBorders>
+      </w:tblPr>
+      <w:tblGrid>
+        <w:gridCol w:w="10080"/>
+      </w:tblGrid>
+      <w:tr>
+        <w:trPr>
+          <w:cantSplit/>
+        </w:trPr>
+        <w:tc>
+          <w:tcPr>
+            <w:tcW w:type="dxa" w:w="10080"/>
+            <w:tcBorders>
+              <w:top w:val="single" w:color="B07CFF" w:sz="12"/>
+              <w:left w:val="single" w:color="B07CFF" w:sz="12"/>
+              <w:bottom w:val="single" w:color="B07CFF" w:sz="12"/>
+              <w:right w:val="single" w:color="B07CFF" w:sz="12"/>
+            </w:tcBorders>
+            <w:tcMar>
+              <w:top w:type="dxa" w:w="80"/>
+              <w:left w:type="dxa" w:w="160"/>
+              <w:bottom w:type="dxa" w:w="80"/>
+              <w:right w:type="dxa" w:w="160"/>
+            </w:tcMar>
+          </w:tcPr>
+          <w:p>
+            <w:pPr>
+              <w:spacing w:after="40" w:before="0" w:line="264"/>
+            </w:pPr>
+            <w:r>
+              <w:rPr>
+                <w:rFonts w:ascii="Calibri" w:cs="Calibri" w:eastAsia="Calibri" w:hAnsi="Calibri"/>
+                <w:b/>
+                <w:bCs/>
+                <w:i w:val="false"/>
+                <w:iCs w:val="false"/>
+                <w:color w:val="B07CFF"/>
+                <w:sz w:val="18"/>
+                <w:szCs w:val="18"/>
+              </w:rPr>
+              <w:t xml:space="preserve">KEEP IT</w:t>
+            </w:r>
+          </w:p>
+          <w:p>
+            <w:pPr>
+              <w:spacing w:after="0" w:before="0" w:line="264"/>
+            </w:pPr>
+            <w:r>
+              <w:rPr>
+                <w:rFonts w:ascii="Calibri" w:cs="Calibri" w:eastAsia="Calibri" w:hAnsi="Calibri"/>
+                <w:b w:val="false"/>
+                <w:bCs w:val="false"/>
+                <w:i w:val="false"/>
+                <w:iCs w:val="false"/>
+                <w:sz w:val="20"/>
+                <w:szCs w:val="20"/>
+              </w:rPr>
+              <w:t xml:space="preserve">Commit and push console/recordings/rehearsal.json</w:t>
+            </w:r>
+          </w:p>
+          <w:p>
+            <w:pPr>
+              <w:spacing w:after="0" w:before="0" w:line="264"/>
+            </w:pPr>
+            <w:r>
+              <w:rPr>
+                <w:rFonts w:ascii="Calibri" w:cs="Calibri" w:eastAsia="Calibri" w:hAnsi="Calibri"/>
+                <w:b w:val="false"/>
+                <w:bCs w:val="false"/>
+                <w:i w:val="false"/>
+                <w:iCs w:val="false"/>
+                <w:sz w:val="20"/>
+                <w:szCs w:val="20"/>
+              </w:rPr>
+              <w:t xml:space="preserve">(or ⋯ More ▸ Download it and commit it from your Mac)</w:t>
+            </w:r>
+          </w:p>
+        </w:tc>
+      </w:tr>
+    </w:tbl>
+    <w:p>
+      <w:pPr>
+        <w:spacing w:after="20" w:before="0" w:line="264"/>
+      </w:pPr>
+      <w:r>
+        <w:rPr>
+          <w:rFonts w:ascii="Calibri" w:cs="Calibri" w:eastAsia="Calibri" w:hAnsi="Calibri"/>
+          <w:b w:val="false"/>
+          <w:bCs w:val="false"/>
+          <w:i w:val="false"/>
+          <w:iCs w:val="false"/>
+          <w:sz w:val="22"/>
+          <w:szCs w:val="22"/>
+        </w:rPr>
+        <w:t xml:space="preserve"/>
+      </w:r>
+    </w:p>
+    <w:p>
+      <w:pPr>
+        <w:spacing w:after="80" w:before="40" w:line="264"/>
+      </w:pPr>
+      <w:r>
+        <w:rPr>
+          <w:rFonts w:ascii="Calibri" w:cs="Calibri" w:eastAsia="Calibri" w:hAnsi="Calibri"/>
+          <w:b w:val="false"/>
+          <w:bCs w:val="false"/>
+          <w:i w:val="false"/>
+          <w:iCs w:val="false"/>
+          <w:color w:val="9AA4B2"/>
+          <w:sz w:val="20"/>
+          <w:szCs w:val="20"/>
+        </w:rPr>
+        <w:t xml:space="preserve">The console replays this run in the show, so it behaves the same every time. Once it's committed, every later project reuses it.</w:t>
+      </w:r>
+    </w:p>
+    <w:p>
+      <w:pPr>
+        <w:pStyle w:val="Heading3"/>
+        <w:keepNext/>
+        <w:spacing w:after="40" w:before="160"/>
+      </w:pPr>
+      <w:r>
+        <w:rPr>
+          <w:rFonts w:ascii="Calibri" w:cs="Calibri" w:eastAsia="Calibri" w:hAnsi="Calibri"/>
+          <w:b/>
+          <w:bCs/>
+          <w:i w:val="false"/>
+          <w:iCs w:val="false"/>
+          <w:color w:val="2BB3B1"/>
+          <w:sz w:val="22"/>
+          <w:szCs w:val="22"/>
+        </w:rPr>
+        <w:t xml:space="preserve">BEFORE THE SHOW · 3 · MORNING OF</w:t>
+      </w:r>
+    </w:p>
+    <w:tbl>
+      <w:tblPr>
+        <w:tblW w:type="dxa" w:w="10080"/>
+        <w:tblBorders>
+          <w:top w:val="single" w:color="auto" w:sz="4"/>
+          <w:left w:val="single" w:color="auto" w:sz="4"/>
+          <w:bottom w:val="single" w:color="auto" w:sz="4"/>
+          <w:right w:val="single" w:color="auto" w:sz="4"/>
+          <w:insideH w:val="single" w:color="auto" w:sz="4"/>
+          <w:insideV w:val="single" w:color="auto" w:sz="4"/>
+        </w:tblBorders>
+      </w:tblPr>
+      <w:tblGrid>
+        <w:gridCol w:w="10080"/>
+      </w:tblGrid>
+      <w:tr>
+        <w:trPr>
+          <w:cantSplit/>
+        </w:trPr>
+        <w:tc>
+          <w:tcPr>
+            <w:tcW w:type="dxa" w:w="10080"/>
+            <w:tcBorders>
+              <w:top w:val="single" w:color="2BB3B1" w:sz="12"/>
+              <w:left w:val="single" w:color="2BB3B1" w:sz="36"/>
+              <w:bottom w:val="single" w:color="2BB3B1" w:sz="12"/>
+              <w:right w:val="single" w:color="2BB3B1" w:sz="12"/>
+            </w:tcBorders>
+            <w:tcMar>
+              <w:top w:type="dxa" w:w="80"/>
+              <w:left w:type="dxa" w:w="160"/>
+              <w:bottom w:type="dxa" w:w="80"/>
+              <w:right w:type="dxa" w:w="160"/>
+            </w:tcMar>
+          </w:tcPr>
+          <w:p>
+            <w:pPr>
+              <w:spacing w:after="40" w:before="0" w:line="264"/>
+            </w:pPr>
+            <w:r>
+              <w:rPr>
+                <w:rFonts w:ascii="Calibri" w:cs="Calibri" w:eastAsia="Calibri" w:hAnsi="Calibri"/>
+                <w:b/>
+                <w:bCs/>
+                <w:i w:val="false"/>
+                <w:iCs w:val="false"/>
+                <w:color w:val="2BB3B1"/>
+                <w:sz w:val="18"/>
+                <w:szCs w:val="18"/>
+              </w:rPr>
+              <w:t xml:space="preserve">CLOUD SHELL · repo root · the start block</w:t>
+            </w:r>
+          </w:p>
+          <w:p>
+            <w:pPr>
+              <w:spacing w:after="0" w:before="0" w:line="264"/>
+            </w:pPr>
+            <w:r>
+              <w:rPr>
+                <w:rFonts w:ascii="Consolas" w:cs="Consolas" w:eastAsia="Consolas" w:hAnsi="Consolas"/>
+                <w:b w:val="false"/>
+                <w:bCs w:val="false"/>
+                <w:i w:val="false"/>
+                <w:iCs w:val="false"/>
+                <w:sz w:val="19"/>
+                <w:szCs w:val="19"/>
+              </w:rPr>
+              <w:t xml:space="preserve">bash scripts/start_demo.sh</w:t>
+            </w:r>
+          </w:p>
+          <w:p>
+            <w:pPr>
+              <w:spacing w:after="0" w:before="60" w:line="264"/>
+            </w:pPr>
+            <w:r>
+              <w:rPr>
+                <w:rFonts w:ascii="Calibri" w:cs="Calibri" w:eastAsia="Calibri" w:hAnsi="Calibri"/>
+                <w:b/>
+                <w:bCs/>
+                <w:i w:val="false"/>
+                <w:iCs w:val="false"/>
+                <w:color w:val="2ECC71"/>
+                <w:sz w:val="19"/>
+                <w:szCs w:val="19"/>
+              </w:rPr>
+              <w:t xml:space="preserve">→ </w:t>
+            </w:r>
+            <w:r>
+              <w:rPr>
+                <w:rFonts w:ascii="Calibri" w:cs="Calibri" w:eastAsia="Calibri" w:hAnsi="Calibri"/>
+                <w:b w:val="false"/>
+                <w:bCs w:val="false"/>
+                <w:i w:val="false"/>
+                <w:iCs w:val="false"/>
+                <w:color w:val="9AA4B2"/>
+                <w:sz w:val="19"/>
+                <w:szCs w:val="19"/>
+              </w:rPr>
+              <w:t xml:space="preserve">Sandbox ✓ · model check · port 8000 ✓ · port 8080 ✓ · console: replay rehearsal · Ready.</w:t>
+            </w:r>
+          </w:p>
+        </w:tc>
+      </w:tr>
+    </w:tbl>
+    <w:p>
+      <w:pPr>
+        <w:spacing w:after="20" w:before="0" w:line="264"/>
+      </w:pPr>
+      <w:r>
+        <w:rPr>
+          <w:rFonts w:ascii="Calibri" w:cs="Calibri" w:eastAsia="Calibri" w:hAnsi="Calibri"/>
+          <w:b w:val="false"/>
+          <w:bCs w:val="false"/>
+          <w:i w:val="false"/>
+          <w:iCs w:val="false"/>
+          <w:sz w:val="22"/>
+          <w:szCs w:val="22"/>
+        </w:rPr>
+        <w:t xml:space="preserve"/>
+      </w:r>
+    </w:p>
+    <w:tbl>
+      <w:tblPr>
+        <w:tblW w:type="dxa" w:w="10080"/>
+        <w:tblBorders>
+          <w:top w:val="single" w:color="auto" w:sz="4"/>
+          <w:left w:val="single" w:color="auto" w:sz="4"/>
+          <w:bottom w:val="single" w:color="auto" w:sz="4"/>
+          <w:right w:val="single" w:color="auto" w:sz="4"/>
+          <w:insideH w:val="single" w:color="auto" w:sz="4"/>
+          <w:insideV w:val="single" w:color="auto" w:sz="4"/>
+        </w:tblBorders>
+      </w:tblPr>
+      <w:tblGrid>
+        <w:gridCol w:w="10080"/>
+      </w:tblGrid>
+      <w:tr>
+        <w:trPr>
+          <w:cantSplit/>
+        </w:trPr>
+        <w:tc>
+          <w:tcPr>
+            <w:tcW w:type="dxa" w:w="10080"/>
+            <w:tcBorders>
+              <w:top w:val="single" w:color="B07CFF" w:sz="12"/>
+              <w:left w:val="single" w:color="B07CFF" w:sz="12"/>
+              <w:bottom w:val="single" w:color="B07CFF" w:sz="12"/>
+              <w:right w:val="single" w:color="B07CFF" w:sz="12"/>
+            </w:tcBorders>
+            <w:tcMar>
+              <w:top w:type="dxa" w:w="80"/>
+              <w:left w:type="dxa" w:w="160"/>
+              <w:bottom w:type="dxa" w:w="80"/>
+              <w:right w:type="dxa" w:w="160"/>
+            </w:tcMar>
+          </w:tcPr>
+          <w:p>
+            <w:pPr>
+              <w:spacing w:after="40" w:before="0" w:line="264"/>
+            </w:pPr>
+            <w:r>
+              <w:rPr>
+                <w:rFonts w:ascii="Calibri" w:cs="Calibri" w:eastAsia="Calibri" w:hAnsi="Calibri"/>
+                <w:b/>
+                <w:bCs/>
+                <w:i w:val="false"/>
+                <w:iCs w:val="false"/>
+                <w:color w:val="B07CFF"/>
+                <w:sz w:val="18"/>
+                <w:szCs w:val="18"/>
+              </w:rPr>
+              <w:t xml:space="preserve">READ THE MODEL CHECK</w:t>
+            </w:r>
+          </w:p>
+          <w:p>
+            <w:pPr>
+              <w:spacing w:after="0" w:before="0" w:line="264"/>
+            </w:pPr>
+            <w:r>
+              <w:rPr>
+                <w:rFonts w:ascii="Calibri" w:cs="Calibri" w:eastAsia="Calibri" w:hAnsi="Calibri"/>
+                <w:b w:val="false"/>
+                <w:bCs w:val="false"/>
+                <w:i w:val="false"/>
+                <w:iCs w:val="false"/>
+                <w:sz w:val="20"/>
+                <w:szCs w:val="20"/>
+              </w:rPr>
+              <w:t xml:space="preserve">Default model quick (a few seconds) → steps 3–4 run live as written.</w:t>
+            </w:r>
+          </w:p>
+          <w:p>
+            <w:pPr>
+              <w:spacing w:after="0" w:before="0" w:line="264"/>
+            </w:pPr>
+            <w:r>
+              <w:rPr>
+                <w:rFonts w:ascii="Calibri" w:cs="Calibri" w:eastAsia="Calibri" w:hAnsi="Calibri"/>
+                <w:b w:val="false"/>
+                <w:bCs w:val="false"/>
+                <w:i w:val="false"/>
+                <w:iCs w:val="false"/>
+                <w:sz w:val="20"/>
+                <w:szCs w:val="20"/>
+              </w:rPr>
+              <w:t xml:space="preserve">Slow → still run them; use each step's IF IT GOES WRONG line. The console is a replay either way.</w:t>
+            </w:r>
+          </w:p>
+        </w:tc>
+      </w:tr>
+    </w:tbl>
+    <w:p>
+      <w:pPr>
+        <w:spacing w:after="20" w:before="0" w:line="264"/>
+      </w:pPr>
+      <w:r>
+        <w:rPr>
+          <w:rFonts w:ascii="Calibri" w:cs="Calibri" w:eastAsia="Calibri" w:hAnsi="Calibri"/>
+          <w:b w:val="false"/>
+          <w:bCs w:val="false"/>
+          <w:i w:val="false"/>
+          <w:iCs w:val="false"/>
+          <w:sz w:val="22"/>
+          <w:szCs w:val="22"/>
+        </w:rPr>
+        <w:t xml:space="preserve"/>
+      </w:r>
+    </w:p>
+    <w:tbl>
+      <w:tblPr>
+        <w:tblW w:type="dxa" w:w="10080"/>
+        <w:tblBorders>
+          <w:top w:val="single" w:color="auto" w:sz="4"/>
+          <w:left w:val="single" w:color="auto" w:sz="4"/>
+          <w:bottom w:val="single" w:color="auto" w:sz="4"/>
+          <w:right w:val="single" w:color="auto" w:sz="4"/>
+          <w:insideH w:val="single" w:color="auto" w:sz="4"/>
+          <w:insideV w:val="single" w:color="auto" w:sz="4"/>
+        </w:tblBorders>
+      </w:tblPr>
+      <w:tblGrid>
+        <w:gridCol w:w="10080"/>
+      </w:tblGrid>
+      <w:tr>
+        <w:trPr>
+          <w:cantSplit/>
+        </w:trPr>
+        <w:tc>
+          <w:tcPr>
+            <w:tcW w:type="dxa" w:w="10080"/>
+            <w:tcBorders>
+              <w:top w:val="single" w:color="B07CFF" w:sz="12"/>
+              <w:left w:val="single" w:color="B07CFF" w:sz="12"/>
+              <w:bottom w:val="single" w:color="B07CFF" w:sz="12"/>
+              <w:right w:val="single" w:color="B07CFF" w:sz="12"/>
+            </w:tcBorders>
+            <w:tcMar>
+              <w:top w:type="dxa" w:w="80"/>
+              <w:left w:type="dxa" w:w="160"/>
+              <w:bottom w:type="dxa" w:w="80"/>
+              <w:right w:type="dxa" w:w="160"/>
+            </w:tcMar>
+          </w:tcPr>
+          <w:p>
+            <w:pPr>
+              <w:spacing w:after="40" w:before="0" w:line="264"/>
+            </w:pPr>
+            <w:r>
+              <w:rPr>
+                <w:rFonts w:ascii="Calibri" w:cs="Calibri" w:eastAsia="Calibri" w:hAnsi="Calibri"/>
+                <w:b/>
+                <w:bCs/>
+                <w:i w:val="false"/>
+                <w:iCs w:val="false"/>
+                <w:color w:val="B07CFF"/>
+                <w:sz w:val="18"/>
+                <w:szCs w:val="18"/>
+              </w:rPr>
+              <w:t xml:space="preserve">COLAB ENTERPRISE</w:t>
+            </w:r>
+          </w:p>
+          <w:p>
+            <w:pPr>
+              <w:spacing w:after="0" w:before="0" w:line="264"/>
+            </w:pPr>
+            <w:r>
+              <w:rPr>
+                <w:rFonts w:ascii="Calibri" w:cs="Calibri" w:eastAsia="Calibri" w:hAnsi="Calibri"/>
+                <w:b w:val="false"/>
+                <w:bCs w:val="false"/>
+                <w:i w:val="false"/>
+                <w:iCs w:val="false"/>
+                <w:sz w:val="20"/>
+                <w:szCs w:val="20"/>
+              </w:rPr>
+              <w:t xml:space="preserve">Notebook outputs still there? If the runtime was recycled: Runtime ▸ Run all (3 minutes).</w:t>
+            </w:r>
+          </w:p>
+        </w:tc>
+      </w:tr>
+    </w:tbl>
+    <w:p>
+      <w:pPr>
+        <w:spacing w:after="20" w:before="0" w:line="264"/>
+      </w:pPr>
+      <w:r>
+        <w:rPr>
+          <w:rFonts w:ascii="Calibri" w:cs="Calibri" w:eastAsia="Calibri" w:hAnsi="Calibri"/>
+          <w:b w:val="false"/>
+          <w:bCs w:val="false"/>
+          <w:i w:val="false"/>
+          <w:iCs w:val="false"/>
+          <w:sz w:val="22"/>
+          <w:szCs w:val="22"/>
+        </w:rPr>
+        <w:t xml:space="preserve"/>
+      </w:r>
+    </w:p>
+    <w:p>
+      <w:pPr>
+        <w:pStyle w:val="Heading3"/>
+        <w:keepNext/>
+        <w:spacing w:after="40" w:before="160"/>
+      </w:pPr>
+      <w:r>
+        <w:rPr>
+          <w:rFonts w:ascii="Calibri" w:cs="Calibri" w:eastAsia="Calibri" w:hAnsi="Calibri"/>
+          <w:b/>
+          <w:bCs/>
+          <w:i w:val="false"/>
+          <w:iCs w:val="false"/>
+          <w:color w:val="2BB3B1"/>
+          <w:sz w:val="22"/>
+          <w:szCs w:val="22"/>
+        </w:rPr>
+        <w:t xml:space="preserve">BEFORE THE SHOW · 4 · OPEN THE FIVE TABS</w:t>
+      </w:r>
+    </w:p>
+    <w:tbl>
+      <w:tblPr>
+        <w:tblW w:type="dxa" w:w="10080"/>
+        <w:tblBorders>
+          <w:top w:val="single" w:color="auto" w:sz="4"/>
+          <w:left w:val="single" w:color="auto" w:sz="4"/>
+          <w:bottom w:val="single" w:color="auto" w:sz="4"/>
+          <w:right w:val="single" w:color="auto" w:sz="4"/>
+          <w:insideH w:val="single" w:color="auto" w:sz="4"/>
+          <w:insideV w:val="single" w:color="auto" w:sz="4"/>
+        </w:tblBorders>
+      </w:tblPr>
+      <w:tblGrid>
+        <w:gridCol w:w="10080"/>
+      </w:tblGrid>
+      <w:tr>
+        <w:trPr>
+          <w:cantSplit/>
+        </w:trPr>
+        <w:tc>
+          <w:tcPr>
+            <w:tcW w:type="dxa" w:w="10080"/>
+            <w:tcBorders>
+              <w:top w:val="single" w:color="B07CFF" w:sz="12"/>
+              <w:left w:val="single" w:color="B07CFF" w:sz="12"/>
+              <w:bottom w:val="single" w:color="B07CFF" w:sz="12"/>
+              <w:right w:val="single" w:color="B07CFF" w:sz="12"/>
+            </w:tcBorders>
+            <w:tcMar>
+              <w:top w:type="dxa" w:w="80"/>
+              <w:left w:type="dxa" w:w="160"/>
+              <w:bottom w:type="dxa" w:w="80"/>
+              <w:right w:type="dxa" w:w="160"/>
+            </w:tcMar>
+          </w:tcPr>
+          <w:p>
+            <w:pPr>
+              <w:spacing w:after="40" w:before="0" w:line="264"/>
+            </w:pPr>
+            <w:r>
+              <w:rPr>
+                <w:rFonts w:ascii="Calibri" w:cs="Calibri" w:eastAsia="Calibri" w:hAnsi="Calibri"/>
+                <w:b/>
+                <w:bCs/>
+                <w:i w:val="false"/>
+                <w:iCs w:val="false"/>
+                <w:color w:val="B07CFF"/>
+                <w:sz w:val="18"/>
+                <w:szCs w:val="18"/>
+              </w:rPr>
+              <w:t xml:space="preserve">IN THIS ORDER, LEFT TO RIGHT</w:t>
+            </w:r>
+          </w:p>
+          <w:p>
+            <w:pPr>
+              <w:spacing w:after="0" w:before="0" w:line="264"/>
+            </w:pPr>
+            <w:r>
+              <w:rPr>
+                <w:rFonts w:ascii="Calibri" w:cs="Calibri" w:eastAsia="Calibri" w:hAnsi="Calibri"/>
+                <w:b w:val="false"/>
+                <w:bCs w:val="false"/>
+                <w:i w:val="false"/>
+                <w:iCs w:val="false"/>
+                <w:sz w:val="20"/>
+                <w:szCs w:val="20"/>
+              </w:rPr>
+              <w:t xml:space="preserve">1  GitHub ▸ haggman/A4I2026-demo-orbital-conjunction (the README)</w:t>
+            </w:r>
+          </w:p>
+          <w:p>
+            <w:pPr>
+              <w:spacing w:after="0" w:before="0" w:line="264"/>
+            </w:pPr>
+            <w:r>
+              <w:rPr>
+                <w:rFonts w:ascii="Calibri" w:cs="Calibri" w:eastAsia="Calibri" w:hAnsi="Calibri"/>
+                <w:b w:val="false"/>
+                <w:bCs w:val="false"/>
+                <w:i w:val="false"/>
+                <w:iCs w:val="false"/>
+                <w:sz w:val="20"/>
+                <w:szCs w:val="20"/>
+              </w:rPr>
+              <w:t xml:space="preserve">2  Colab Enterprise ▸ demo_01_load_explore.ipynb</w:t>
+            </w:r>
+          </w:p>
+          <w:p>
+            <w:pPr>
+              <w:spacing w:after="0" w:before="0" w:line="264"/>
+            </w:pPr>
+            <w:r>
+              <w:rPr>
+                <w:rFonts w:ascii="Calibri" w:cs="Calibri" w:eastAsia="Calibri" w:hAnsi="Calibri"/>
+                <w:b w:val="false"/>
+                <w:bCs w:val="false"/>
+                <w:i w:val="false"/>
+                <w:iCs w:val="false"/>
+                <w:sz w:val="20"/>
+                <w:szCs w:val="20"/>
+              </w:rPr>
+              <w:t xml:space="preserve">3  Web Preview ▸ Change port ▸ 8000 ▸ cymbal_ops ▸ new session</w:t>
+            </w:r>
+          </w:p>
+          <w:p>
+            <w:pPr>
+              <w:spacing w:after="0" w:before="0" w:line="264"/>
+            </w:pPr>
+            <w:r>
+              <w:rPr>
+                <w:rFonts w:ascii="Calibri" w:cs="Calibri" w:eastAsia="Calibri" w:hAnsi="Calibri"/>
+                <w:b w:val="false"/>
+                <w:bCs w:val="false"/>
+                <w:i w:val="false"/>
+                <w:iCs w:val="false"/>
+                <w:sz w:val="20"/>
+                <w:szCs w:val="20"/>
+              </w:rPr>
+              <w:t xml:space="preserve">4  Google Cloud console ▸ Cloud Run ▸ cymbal-ops</w:t>
+            </w:r>
+          </w:p>
+          <w:p>
+            <w:pPr>
+              <w:spacing w:after="0" w:before="0" w:line="264"/>
+            </w:pPr>
+            <w:r>
+              <w:rPr>
+                <w:rFonts w:ascii="Calibri" w:cs="Calibri" w:eastAsia="Calibri" w:hAnsi="Calibri"/>
+                <w:b w:val="false"/>
+                <w:bCs w:val="false"/>
+                <w:i w:val="false"/>
+                <w:iCs w:val="false"/>
+                <w:sz w:val="20"/>
+                <w:szCs w:val="20"/>
+              </w:rPr>
+              <w:t xml:space="preserve">5  Web Preview ▸ Change port ▸ 8080</w:t>
+            </w:r>
+          </w:p>
+          <w:p>
+            <w:pPr>
+              <w:spacing w:after="0" w:before="60" w:line="264"/>
+            </w:pPr>
+            <w:r>
+              <w:rPr>
+                <w:rFonts w:ascii="Calibri" w:cs="Calibri" w:eastAsia="Calibri" w:hAnsi="Calibri"/>
+                <w:b/>
+                <w:bCs/>
+                <w:i w:val="false"/>
+                <w:iCs w:val="false"/>
+                <w:color w:val="2ECC71"/>
+                <w:sz w:val="19"/>
+                <w:szCs w:val="19"/>
+              </w:rPr>
+              <w:t xml:space="preserve">→ </w:t>
+            </w:r>
+            <w:r>
+              <w:rPr>
+                <w:rFonts w:ascii="Calibri" w:cs="Calibri" w:eastAsia="Calibri" w:hAnsi="Calibri"/>
+                <w:b w:val="false"/>
+                <w:bCs w:val="false"/>
+                <w:i w:val="false"/>
+                <w:iCs w:val="false"/>
+                <w:color w:val="9AA4B2"/>
+                <w:sz w:val="19"/>
+                <w:szCs w:val="19"/>
+              </w:rPr>
+              <w:t xml:space="preserve">Tab 5: header says REPLAY, clock Fri 25 Sep 01:00:00 UTC, three watcher cards on the desk.</w:t>
+            </w:r>
+          </w:p>
+        </w:tc>
+      </w:tr>
+    </w:tbl>
+    <w:p>
+      <w:pPr>
+        <w:spacing w:after="20" w:before="0" w:line="264"/>
+      </w:pPr>
+      <w:r>
+        <w:rPr>
+          <w:rFonts w:ascii="Calibri" w:cs="Calibri" w:eastAsia="Calibri" w:hAnsi="Calibri"/>
+          <w:b w:val="false"/>
+          <w:bCs w:val="false"/>
+          <w:i w:val="false"/>
+          <w:iCs w:val="false"/>
+          <w:sz w:val="22"/>
+          <w:szCs w:val="22"/>
+        </w:rPr>
+        <w:t xml:space="preserve"/>
+      </w:r>
+    </w:p>
+    <w:p>
+      <w:pPr>
+        <w:spacing w:after="80" w:before="40" w:line="264"/>
+      </w:pPr>
+      <w:r>
+        <w:rPr>
+          <w:rFonts w:ascii="Calibri" w:cs="Calibri" w:eastAsia="Calibri" w:hAnsi="Calibri"/>
+          <w:b w:val="false"/>
+          <w:bCs w:val="false"/>
+          <w:i w:val="false"/>
+          <w:iCs w:val="false"/>
+          <w:color w:val="9AA4B2"/>
+          <w:sz w:val="20"/>
+          <w:szCs w:val="20"/>
+        </w:rPr>
+        <w:t xml:space="preserve">Stop both web apps afterwards with: bash scripts/start_demo.sh --stop</w:t>
       </w:r>
     </w:p>
     <w:p>

</xml_diff>

<commit_message>
Console: the kept rehearsal recording; teleprompter drops its recording page
console/recordings/rehearsal.json is the real Gemini run the show replays (CYMBAL-04 decide,
Tuesday update). It's committed now, so the teleprompter's "Before the show" no longer walks
through making it; the planning guide still covers re-recording.

Co-Authored-By: Claude Opus 5.5 <noreply@anthropic.com>
Claude-Session: https://claude.ai/code/session_01XP7fEGExmmDaM7W6ayMgxX
</commit_message>
<xml_diff>
--- a/run-of-show/docs/PLANNING GUIDE - A4I kickoff demo.docx
+++ b/run-of-show/docs/PLANNING GUIDE - A4I kickoff demo.docx
@@ -3843,7 +3843,7 @@
           <w:sz w:val="22"/>
           <w:szCs w:val="22"/>
         </w:rPr>
-        <w:t xml:space="preserve">BEFORE THE SHOW · 2 · THE REHEARSAL RECORDING</w:t>
+        <w:t xml:space="preserve">BEFORE THE SHOW · 2 · MORNING OF</w:t>
       </w:r>
     </w:p>
     <w:tbl>
@@ -3896,7 +3896,7 @@
                 <w:sz w:val="18"/>
                 <w:szCs w:val="18"/>
               </w:rPr>
-              <w:t xml:space="preserve">CLOUD SHELL · skip this page if console/recordings/rehearsal.json is already in the repo</w:t>
+              <w:t xml:space="preserve">CLOUD SHELL · repo root · the start block</w:t>
             </w:r>
           </w:p>
           <w:p>
@@ -3913,41 +3913,7 @@
                 <w:sz w:val="19"/>
                 <w:szCs w:val="19"/>
               </w:rPr>
-              <w:t xml:space="preserve">source scripts/activate.sh</w:t>
-            </w:r>
-          </w:p>
-          <w:p>
-            <w:pPr>
-              <w:spacing w:after="0" w:before="0" w:line="264"/>
-            </w:pPr>
-            <w:r>
-              <w:rPr>
-                <w:rFonts w:ascii="Consolas" w:cs="Consolas" w:eastAsia="Consolas" w:hAnsi="Consolas"/>
-                <w:b w:val="false"/>
-                <w:bCs w:val="false"/>
-                <w:i w:val="false"/>
-                <w:iCs w:val="false"/>
-                <w:sz w:val="19"/>
-                <w:szCs w:val="19"/>
-              </w:rPr>
-              <w:t xml:space="preserve">python console/data.py</w:t>
-            </w:r>
-          </w:p>
-          <w:p>
-            <w:pPr>
-              <w:spacing w:after="0" w:before="0" w:line="264"/>
-            </w:pPr>
-            <w:r>
-              <w:rPr>
-                <w:rFonts w:ascii="Consolas" w:cs="Consolas" w:eastAsia="Consolas" w:hAnsi="Consolas"/>
-                <w:b w:val="false"/>
-                <w:bCs w:val="false"/>
-                <w:i w:val="false"/>
-                <w:iCs w:val="false"/>
-                <w:sz w:val="19"/>
-                <w:szCs w:val="19"/>
-              </w:rPr>
-              <w:t xml:space="preserve">uvicorn console.app:app --port 8080</w:t>
+              <w:t xml:space="preserve">bash scripts/start_demo.sh</w:t>
             </w:r>
           </w:p>
           <w:p>
@@ -3978,7 +3944,7 @@
                 <w:sz w:val="19"/>
                 <w:szCs w:val="19"/>
               </w:rPr>
-              <w:t xml:space="preserve">Web Preview ▸ Change port ▸ 8080. Header says LIVE AGENT.</w:t>
+              <w:t xml:space="preserve">Sandbox ✓ · model check · port 8000 ✓ · port 8080 ✓ · console: replay rehearsal · Ready.</w:t>
             </w:r>
           </w:p>
         </w:tc>
@@ -4051,7 +4017,7 @@
                 <w:sz w:val="18"/>
                 <w:szCs w:val="18"/>
               </w:rPr>
-              <w:t xml:space="preserve">IN THE CONSOLE · live Gemini</w:t>
+              <w:t xml:space="preserve">READ THE MODEL CHECK</w:t>
             </w:r>
           </w:p>
           <w:p>
@@ -4068,7 +4034,7 @@
                 <w:sz w:val="20"/>
                 <w:szCs w:val="20"/>
               </w:rPr>
-              <w:t xml:space="preserve">Skip to next until the CYMBAL-04 card ▸ wait for YOUR CALL ▸ Approve</w:t>
+              <w:t xml:space="preserve">Default model quick (a few seconds) → steps 3–4 run live as written.</w:t>
             </w:r>
           </w:p>
           <w:p>
@@ -4085,38 +4051,7 @@
                 <w:sz w:val="20"/>
                 <w:szCs w:val="20"/>
               </w:rPr>
-              <w:t xml:space="preserve">Skip to next until Tuesday's card ▸ wait for YOUR CALL ▸ Approve</w:t>
-            </w:r>
-          </w:p>
-          <w:p>
-            <w:pPr>
-              <w:spacing w:after="0" w:before="60" w:line="264"/>
-            </w:pPr>
-            <w:r>
-              <w:rPr>
-                <w:rFonts w:ascii="Calibri" w:cs="Calibri" w:eastAsia="Calibri" w:hAnsi="Calibri"/>
-                <w:b/>
-                <w:bCs/>
-                <w:i w:val="false"/>
-                <w:iCs w:val="false"/>
-                <w:color w:val="2ECC71"/>
-                <w:sz w:val="19"/>
-                <w:szCs w:val="19"/>
-              </w:rPr>
-              <w:t xml:space="preserve">→ </w:t>
-            </w:r>
-            <w:r>
-              <w:rPr>
-                <w:rFonts w:ascii="Calibri" w:cs="Calibri" w:eastAsia="Calibri" w:hAnsi="Calibri"/>
-                <w:b w:val="false"/>
-                <w:bCs w:val="false"/>
-                <w:i w:val="false"/>
-                <w:iCs w:val="false"/>
-                <w:color w:val="9AA4B2"/>
-                <w:sz w:val="19"/>
-                <w:szCs w:val="19"/>
-              </w:rPr>
-              <w:t xml:space="preserve">CYMBAL-04: MANEUVER at 04:00. Tuesday: no burn.</w:t>
+              <w:t xml:space="preserve">Slow → still run them; use each step's IF IT GOES WRONG line. The console is a replay either way.</w:t>
             </w:r>
           </w:p>
         </w:tc>
@@ -4162,10 +4097,10 @@
           <w:tcPr>
             <w:tcW w:type="dxa" w:w="10080"/>
             <w:tcBorders>
-              <w:top w:val="single" w:color="2BB3B1" w:sz="12"/>
-              <w:left w:val="single" w:color="2BB3B1" w:sz="36"/>
-              <w:bottom w:val="single" w:color="2BB3B1" w:sz="12"/>
-              <w:right w:val="single" w:color="2BB3B1" w:sz="12"/>
+              <w:top w:val="single" w:color="B07CFF" w:sz="12"/>
+              <w:left w:val="single" w:color="B07CFF" w:sz="12"/>
+              <w:bottom w:val="single" w:color="B07CFF" w:sz="12"/>
+              <w:right w:val="single" w:color="B07CFF" w:sz="12"/>
             </w:tcBorders>
             <w:tcMar>
               <w:top w:type="dxa" w:w="80"/>
@@ -4185,132 +4120,11 @@
                 <w:bCs/>
                 <w:i w:val="false"/>
                 <w:iCs w:val="false"/>
-                <w:color w:val="2BB3B1"/>
-                <w:sz w:val="18"/>
-                <w:szCs w:val="18"/>
-              </w:rPr>
-              <w:t xml:space="preserve">CLOUD SHELL · stop uvicorn first (Ctrl+C in its terminal)</w:t>
-            </w:r>
-          </w:p>
-          <w:p>
-            <w:pPr>
-              <w:spacing w:after="0" w:before="0" w:line="264"/>
-            </w:pPr>
-            <w:r>
-              <w:rPr>
-                <w:rFonts w:ascii="Consolas" w:cs="Consolas" w:eastAsia="Consolas" w:hAnsi="Consolas"/>
-                <w:b w:val="false"/>
-                <w:bCs w:val="false"/>
-                <w:i w:val="false"/>
-                <w:iCs w:val="false"/>
-                <w:sz w:val="19"/>
-                <w:szCs w:val="19"/>
-              </w:rPr>
-              <w:t xml:space="preserve">python console/keep_recording.py</w:t>
-            </w:r>
-          </w:p>
-          <w:p>
-            <w:pPr>
-              <w:spacing w:after="0" w:before="60" w:line="264"/>
-            </w:pPr>
-            <w:r>
-              <w:rPr>
-                <w:rFonts w:ascii="Calibri" w:cs="Calibri" w:eastAsia="Calibri" w:hAnsi="Calibri"/>
-                <w:b/>
-                <w:bCs/>
-                <w:i w:val="false"/>
-                <w:iCs w:val="false"/>
-                <w:color w:val="2ECC71"/>
-                <w:sz w:val="19"/>
-                <w:szCs w:val="19"/>
-              </w:rPr>
-              <w:t xml:space="preserve">→ </w:t>
-            </w:r>
-            <w:r>
-              <w:rPr>
-                <w:rFonts w:ascii="Calibri" w:cs="Calibri" w:eastAsia="Calibri" w:hAnsi="Calibri"/>
-                <w:b w:val="false"/>
-                <w:bCs w:val="false"/>
-                <w:i w:val="false"/>
-                <w:iCs w:val="false"/>
-                <w:color w:val="9AA4B2"/>
-                <w:sz w:val="19"/>
-                <w:szCs w:val="19"/>
-              </w:rPr>
-              <w:t xml:space="preserve">Kept run-… → console/recordings/rehearsal.json · replayed the week twice: identical. If it says NOT KEPT, it says why: rehearse again.</w:t>
-            </w:r>
-          </w:p>
-        </w:tc>
-      </w:tr>
-    </w:tbl>
-    <w:p>
-      <w:pPr>
-        <w:spacing w:after="20" w:before="0" w:line="264"/>
-      </w:pPr>
-      <w:r>
-        <w:rPr>
-          <w:rFonts w:ascii="Calibri" w:cs="Calibri" w:eastAsia="Calibri" w:hAnsi="Calibri"/>
-          <w:b w:val="false"/>
-          <w:bCs w:val="false"/>
-          <w:i w:val="false"/>
-          <w:iCs w:val="false"/>
-          <w:sz w:val="22"/>
-          <w:szCs w:val="22"/>
-        </w:rPr>
-        <w:t xml:space="preserve"/>
-      </w:r>
-    </w:p>
-    <w:tbl>
-      <w:tblPr>
-        <w:tblW w:type="dxa" w:w="10080"/>
-        <w:tblBorders>
-          <w:top w:val="single" w:color="auto" w:sz="4"/>
-          <w:left w:val="single" w:color="auto" w:sz="4"/>
-          <w:bottom w:val="single" w:color="auto" w:sz="4"/>
-          <w:right w:val="single" w:color="auto" w:sz="4"/>
-          <w:insideH w:val="single" w:color="auto" w:sz="4"/>
-          <w:insideV w:val="single" w:color="auto" w:sz="4"/>
-        </w:tblBorders>
-      </w:tblPr>
-      <w:tblGrid>
-        <w:gridCol w:w="10080"/>
-      </w:tblGrid>
-      <w:tr>
-        <w:trPr>
-          <w:cantSplit/>
-        </w:trPr>
-        <w:tc>
-          <w:tcPr>
-            <w:tcW w:type="dxa" w:w="10080"/>
-            <w:tcBorders>
-              <w:top w:val="single" w:color="B07CFF" w:sz="12"/>
-              <w:left w:val="single" w:color="B07CFF" w:sz="12"/>
-              <w:bottom w:val="single" w:color="B07CFF" w:sz="12"/>
-              <w:right w:val="single" w:color="B07CFF" w:sz="12"/>
-            </w:tcBorders>
-            <w:tcMar>
-              <w:top w:type="dxa" w:w="80"/>
-              <w:left w:type="dxa" w:w="160"/>
-              <w:bottom w:type="dxa" w:w="80"/>
-              <w:right w:type="dxa" w:w="160"/>
-            </w:tcMar>
-          </w:tcPr>
-          <w:p>
-            <w:pPr>
-              <w:spacing w:after="40" w:before="0" w:line="264"/>
-            </w:pPr>
-            <w:r>
-              <w:rPr>
-                <w:rFonts w:ascii="Calibri" w:cs="Calibri" w:eastAsia="Calibri" w:hAnsi="Calibri"/>
-                <w:b/>
-                <w:bCs/>
-                <w:i w:val="false"/>
-                <w:iCs w:val="false"/>
                 <w:color w:val="B07CFF"/>
                 <w:sz w:val="18"/>
                 <w:szCs w:val="18"/>
               </w:rPr>
-              <w:t xml:space="preserve">KEEP IT</w:t>
+              <w:t xml:space="preserve">COLAB ENTERPRISE</w:t>
             </w:r>
           </w:p>
           <w:p>
@@ -4327,24 +4141,7 @@
                 <w:sz w:val="20"/>
                 <w:szCs w:val="20"/>
               </w:rPr>
-              <w:t xml:space="preserve">Commit and push console/recordings/rehearsal.json</w:t>
-            </w:r>
-          </w:p>
-          <w:p>
-            <w:pPr>
-              <w:spacing w:after="0" w:before="0" w:line="264"/>
-            </w:pPr>
-            <w:r>
-              <w:rPr>
-                <w:rFonts w:ascii="Calibri" w:cs="Calibri" w:eastAsia="Calibri" w:hAnsi="Calibri"/>
-                <w:b w:val="false"/>
-                <w:bCs w:val="false"/>
-                <w:i w:val="false"/>
-                <w:iCs w:val="false"/>
-                <w:sz w:val="20"/>
-                <w:szCs w:val="20"/>
-              </w:rPr>
-              <w:t xml:space="preserve">(or ⋯ More ▸ Download it and commit it from your Mac)</w:t>
+              <w:t xml:space="preserve">Notebook outputs still there? If the runtime was recycled: Runtime ▸ Run all (3 minutes).</w:t>
             </w:r>
           </w:p>
         </w:tc>
@@ -4365,24 +4162,6 @@
           <w:szCs w:val="22"/>
         </w:rPr>
         <w:t xml:space="preserve"/>
-      </w:r>
-    </w:p>
-    <w:p>
-      <w:pPr>
-        <w:spacing w:after="80" w:before="40" w:line="264"/>
-      </w:pPr>
-      <w:r>
-        <w:rPr>
-          <w:rFonts w:ascii="Calibri" w:cs="Calibri" w:eastAsia="Calibri" w:hAnsi="Calibri"/>
-          <w:b w:val="false"/>
-          <w:bCs w:val="false"/>
-          <w:i w:val="false"/>
-          <w:iCs w:val="false"/>
-          <w:color w:val="9AA4B2"/>
-          <w:sz w:val="20"/>
-          <w:szCs w:val="20"/>
-        </w:rPr>
-        <w:t xml:space="preserve">The console replays this run in the show, so it behaves the same every time. Once it's committed, every later project reuses it.</w:t>
       </w:r>
     </w:p>
     <w:p>
@@ -4402,345 +4181,7 @@
           <w:sz w:val="22"/>
           <w:szCs w:val="22"/>
         </w:rPr>
-        <w:t xml:space="preserve">BEFORE THE SHOW · 3 · MORNING OF</w:t>
-      </w:r>
-    </w:p>
-    <w:tbl>
-      <w:tblPr>
-        <w:tblW w:type="dxa" w:w="10080"/>
-        <w:tblBorders>
-          <w:top w:val="single" w:color="auto" w:sz="4"/>
-          <w:left w:val="single" w:color="auto" w:sz="4"/>
-          <w:bottom w:val="single" w:color="auto" w:sz="4"/>
-          <w:right w:val="single" w:color="auto" w:sz="4"/>
-          <w:insideH w:val="single" w:color="auto" w:sz="4"/>
-          <w:insideV w:val="single" w:color="auto" w:sz="4"/>
-        </w:tblBorders>
-      </w:tblPr>
-      <w:tblGrid>
-        <w:gridCol w:w="10080"/>
-      </w:tblGrid>
-      <w:tr>
-        <w:trPr>
-          <w:cantSplit/>
-        </w:trPr>
-        <w:tc>
-          <w:tcPr>
-            <w:tcW w:type="dxa" w:w="10080"/>
-            <w:tcBorders>
-              <w:top w:val="single" w:color="2BB3B1" w:sz="12"/>
-              <w:left w:val="single" w:color="2BB3B1" w:sz="36"/>
-              <w:bottom w:val="single" w:color="2BB3B1" w:sz="12"/>
-              <w:right w:val="single" w:color="2BB3B1" w:sz="12"/>
-            </w:tcBorders>
-            <w:tcMar>
-              <w:top w:type="dxa" w:w="80"/>
-              <w:left w:type="dxa" w:w="160"/>
-              <w:bottom w:type="dxa" w:w="80"/>
-              <w:right w:type="dxa" w:w="160"/>
-            </w:tcMar>
-          </w:tcPr>
-          <w:p>
-            <w:pPr>
-              <w:spacing w:after="40" w:before="0" w:line="264"/>
-            </w:pPr>
-            <w:r>
-              <w:rPr>
-                <w:rFonts w:ascii="Calibri" w:cs="Calibri" w:eastAsia="Calibri" w:hAnsi="Calibri"/>
-                <w:b/>
-                <w:bCs/>
-                <w:i w:val="false"/>
-                <w:iCs w:val="false"/>
-                <w:color w:val="2BB3B1"/>
-                <w:sz w:val="18"/>
-                <w:szCs w:val="18"/>
-              </w:rPr>
-              <w:t xml:space="preserve">CLOUD SHELL · repo root · the start block</w:t>
-            </w:r>
-          </w:p>
-          <w:p>
-            <w:pPr>
-              <w:spacing w:after="0" w:before="0" w:line="264"/>
-            </w:pPr>
-            <w:r>
-              <w:rPr>
-                <w:rFonts w:ascii="Consolas" w:cs="Consolas" w:eastAsia="Consolas" w:hAnsi="Consolas"/>
-                <w:b w:val="false"/>
-                <w:bCs w:val="false"/>
-                <w:i w:val="false"/>
-                <w:iCs w:val="false"/>
-                <w:sz w:val="19"/>
-                <w:szCs w:val="19"/>
-              </w:rPr>
-              <w:t xml:space="preserve">bash scripts/start_demo.sh</w:t>
-            </w:r>
-          </w:p>
-          <w:p>
-            <w:pPr>
-              <w:spacing w:after="0" w:before="60" w:line="264"/>
-            </w:pPr>
-            <w:r>
-              <w:rPr>
-                <w:rFonts w:ascii="Calibri" w:cs="Calibri" w:eastAsia="Calibri" w:hAnsi="Calibri"/>
-                <w:b/>
-                <w:bCs/>
-                <w:i w:val="false"/>
-                <w:iCs w:val="false"/>
-                <w:color w:val="2ECC71"/>
-                <w:sz w:val="19"/>
-                <w:szCs w:val="19"/>
-              </w:rPr>
-              <w:t xml:space="preserve">→ </w:t>
-            </w:r>
-            <w:r>
-              <w:rPr>
-                <w:rFonts w:ascii="Calibri" w:cs="Calibri" w:eastAsia="Calibri" w:hAnsi="Calibri"/>
-                <w:b w:val="false"/>
-                <w:bCs w:val="false"/>
-                <w:i w:val="false"/>
-                <w:iCs w:val="false"/>
-                <w:color w:val="9AA4B2"/>
-                <w:sz w:val="19"/>
-                <w:szCs w:val="19"/>
-              </w:rPr>
-              <w:t xml:space="preserve">Sandbox ✓ · model check · port 8000 ✓ · port 8080 ✓ · console: replay rehearsal · Ready.</w:t>
-            </w:r>
-          </w:p>
-        </w:tc>
-      </w:tr>
-    </w:tbl>
-    <w:p>
-      <w:pPr>
-        <w:spacing w:after="20" w:before="0" w:line="264"/>
-      </w:pPr>
-      <w:r>
-        <w:rPr>
-          <w:rFonts w:ascii="Calibri" w:cs="Calibri" w:eastAsia="Calibri" w:hAnsi="Calibri"/>
-          <w:b w:val="false"/>
-          <w:bCs w:val="false"/>
-          <w:i w:val="false"/>
-          <w:iCs w:val="false"/>
-          <w:sz w:val="22"/>
-          <w:szCs w:val="22"/>
-        </w:rPr>
-        <w:t xml:space="preserve"/>
-      </w:r>
-    </w:p>
-    <w:tbl>
-      <w:tblPr>
-        <w:tblW w:type="dxa" w:w="10080"/>
-        <w:tblBorders>
-          <w:top w:val="single" w:color="auto" w:sz="4"/>
-          <w:left w:val="single" w:color="auto" w:sz="4"/>
-          <w:bottom w:val="single" w:color="auto" w:sz="4"/>
-          <w:right w:val="single" w:color="auto" w:sz="4"/>
-          <w:insideH w:val="single" w:color="auto" w:sz="4"/>
-          <w:insideV w:val="single" w:color="auto" w:sz="4"/>
-        </w:tblBorders>
-      </w:tblPr>
-      <w:tblGrid>
-        <w:gridCol w:w="10080"/>
-      </w:tblGrid>
-      <w:tr>
-        <w:trPr>
-          <w:cantSplit/>
-        </w:trPr>
-        <w:tc>
-          <w:tcPr>
-            <w:tcW w:type="dxa" w:w="10080"/>
-            <w:tcBorders>
-              <w:top w:val="single" w:color="B07CFF" w:sz="12"/>
-              <w:left w:val="single" w:color="B07CFF" w:sz="12"/>
-              <w:bottom w:val="single" w:color="B07CFF" w:sz="12"/>
-              <w:right w:val="single" w:color="B07CFF" w:sz="12"/>
-            </w:tcBorders>
-            <w:tcMar>
-              <w:top w:type="dxa" w:w="80"/>
-              <w:left w:type="dxa" w:w="160"/>
-              <w:bottom w:type="dxa" w:w="80"/>
-              <w:right w:type="dxa" w:w="160"/>
-            </w:tcMar>
-          </w:tcPr>
-          <w:p>
-            <w:pPr>
-              <w:spacing w:after="40" w:before="0" w:line="264"/>
-            </w:pPr>
-            <w:r>
-              <w:rPr>
-                <w:rFonts w:ascii="Calibri" w:cs="Calibri" w:eastAsia="Calibri" w:hAnsi="Calibri"/>
-                <w:b/>
-                <w:bCs/>
-                <w:i w:val="false"/>
-                <w:iCs w:val="false"/>
-                <w:color w:val="B07CFF"/>
-                <w:sz w:val="18"/>
-                <w:szCs w:val="18"/>
-              </w:rPr>
-              <w:t xml:space="preserve">READ THE MODEL CHECK</w:t>
-            </w:r>
-          </w:p>
-          <w:p>
-            <w:pPr>
-              <w:spacing w:after="0" w:before="0" w:line="264"/>
-            </w:pPr>
-            <w:r>
-              <w:rPr>
-                <w:rFonts w:ascii="Calibri" w:cs="Calibri" w:eastAsia="Calibri" w:hAnsi="Calibri"/>
-                <w:b w:val="false"/>
-                <w:bCs w:val="false"/>
-                <w:i w:val="false"/>
-                <w:iCs w:val="false"/>
-                <w:sz w:val="20"/>
-                <w:szCs w:val="20"/>
-              </w:rPr>
-              <w:t xml:space="preserve">Default model quick (a few seconds) → steps 3–4 run live as written.</w:t>
-            </w:r>
-          </w:p>
-          <w:p>
-            <w:pPr>
-              <w:spacing w:after="0" w:before="0" w:line="264"/>
-            </w:pPr>
-            <w:r>
-              <w:rPr>
-                <w:rFonts w:ascii="Calibri" w:cs="Calibri" w:eastAsia="Calibri" w:hAnsi="Calibri"/>
-                <w:b w:val="false"/>
-                <w:bCs w:val="false"/>
-                <w:i w:val="false"/>
-                <w:iCs w:val="false"/>
-                <w:sz w:val="20"/>
-                <w:szCs w:val="20"/>
-              </w:rPr>
-              <w:t xml:space="preserve">Slow → still run them; use each step's IF IT GOES WRONG line. The console is a replay either way.</w:t>
-            </w:r>
-          </w:p>
-        </w:tc>
-      </w:tr>
-    </w:tbl>
-    <w:p>
-      <w:pPr>
-        <w:spacing w:after="20" w:before="0" w:line="264"/>
-      </w:pPr>
-      <w:r>
-        <w:rPr>
-          <w:rFonts w:ascii="Calibri" w:cs="Calibri" w:eastAsia="Calibri" w:hAnsi="Calibri"/>
-          <w:b w:val="false"/>
-          <w:bCs w:val="false"/>
-          <w:i w:val="false"/>
-          <w:iCs w:val="false"/>
-          <w:sz w:val="22"/>
-          <w:szCs w:val="22"/>
-        </w:rPr>
-        <w:t xml:space="preserve"/>
-      </w:r>
-    </w:p>
-    <w:tbl>
-      <w:tblPr>
-        <w:tblW w:type="dxa" w:w="10080"/>
-        <w:tblBorders>
-          <w:top w:val="single" w:color="auto" w:sz="4"/>
-          <w:left w:val="single" w:color="auto" w:sz="4"/>
-          <w:bottom w:val="single" w:color="auto" w:sz="4"/>
-          <w:right w:val="single" w:color="auto" w:sz="4"/>
-          <w:insideH w:val="single" w:color="auto" w:sz="4"/>
-          <w:insideV w:val="single" w:color="auto" w:sz="4"/>
-        </w:tblBorders>
-      </w:tblPr>
-      <w:tblGrid>
-        <w:gridCol w:w="10080"/>
-      </w:tblGrid>
-      <w:tr>
-        <w:trPr>
-          <w:cantSplit/>
-        </w:trPr>
-        <w:tc>
-          <w:tcPr>
-            <w:tcW w:type="dxa" w:w="10080"/>
-            <w:tcBorders>
-              <w:top w:val="single" w:color="B07CFF" w:sz="12"/>
-              <w:left w:val="single" w:color="B07CFF" w:sz="12"/>
-              <w:bottom w:val="single" w:color="B07CFF" w:sz="12"/>
-              <w:right w:val="single" w:color="B07CFF" w:sz="12"/>
-            </w:tcBorders>
-            <w:tcMar>
-              <w:top w:type="dxa" w:w="80"/>
-              <w:left w:type="dxa" w:w="160"/>
-              <w:bottom w:type="dxa" w:w="80"/>
-              <w:right w:type="dxa" w:w="160"/>
-            </w:tcMar>
-          </w:tcPr>
-          <w:p>
-            <w:pPr>
-              <w:spacing w:after="40" w:before="0" w:line="264"/>
-            </w:pPr>
-            <w:r>
-              <w:rPr>
-                <w:rFonts w:ascii="Calibri" w:cs="Calibri" w:eastAsia="Calibri" w:hAnsi="Calibri"/>
-                <w:b/>
-                <w:bCs/>
-                <w:i w:val="false"/>
-                <w:iCs w:val="false"/>
-                <w:color w:val="B07CFF"/>
-                <w:sz w:val="18"/>
-                <w:szCs w:val="18"/>
-              </w:rPr>
-              <w:t xml:space="preserve">COLAB ENTERPRISE</w:t>
-            </w:r>
-          </w:p>
-          <w:p>
-            <w:pPr>
-              <w:spacing w:after="0" w:before="0" w:line="264"/>
-            </w:pPr>
-            <w:r>
-              <w:rPr>
-                <w:rFonts w:ascii="Calibri" w:cs="Calibri" w:eastAsia="Calibri" w:hAnsi="Calibri"/>
-                <w:b w:val="false"/>
-                <w:bCs w:val="false"/>
-                <w:i w:val="false"/>
-                <w:iCs w:val="false"/>
-                <w:sz w:val="20"/>
-                <w:szCs w:val="20"/>
-              </w:rPr>
-              <w:t xml:space="preserve">Notebook outputs still there? If the runtime was recycled: Runtime ▸ Run all (3 minutes).</w:t>
-            </w:r>
-          </w:p>
-        </w:tc>
-      </w:tr>
-    </w:tbl>
-    <w:p>
-      <w:pPr>
-        <w:spacing w:after="20" w:before="0" w:line="264"/>
-      </w:pPr>
-      <w:r>
-        <w:rPr>
-          <w:rFonts w:ascii="Calibri" w:cs="Calibri" w:eastAsia="Calibri" w:hAnsi="Calibri"/>
-          <w:b w:val="false"/>
-          <w:bCs w:val="false"/>
-          <w:i w:val="false"/>
-          <w:iCs w:val="false"/>
-          <w:sz w:val="22"/>
-          <w:szCs w:val="22"/>
-        </w:rPr>
-        <w:t xml:space="preserve"/>
-      </w:r>
-    </w:p>
-    <w:p>
-      <w:pPr>
-        <w:pStyle w:val="Heading3"/>
-        <w:keepNext/>
-        <w:spacing w:after="40" w:before="160"/>
-      </w:pPr>
-      <w:r>
-        <w:rPr>
-          <w:rFonts w:ascii="Calibri" w:cs="Calibri" w:eastAsia="Calibri" w:hAnsi="Calibri"/>
-          <w:b/>
-          <w:bCs/>
-          <w:i w:val="false"/>
-          <w:iCs w:val="false"/>
-          <w:color w:val="2BB3B1"/>
-          <w:sz w:val="22"/>
-          <w:szCs w:val="22"/>
-        </w:rPr>
-        <w:t xml:space="preserve">BEFORE THE SHOW · 4 · OPEN THE FIVE TABS</w:t>
+        <w:t xml:space="preserve">BEFORE THE SHOW · 3 · OPEN THE FIVE TABS</w:t>
       </w:r>
     </w:p>
     <w:tbl>

</xml_diff>

<commit_message>
Console loses the head-on view; run-of-show gains an instructor guide
- Console: the small head-on "bullseye" is gone (it only moved when the prediction did, and said what the
  fly-by already says); the fly-by gets the width. Near the top of the picture, the object's label and
  "will miss by" no longer overlap.
- run-of-show/docs/INSTRUCTOR-GUIDE.md: for any presenter, not just the author. How the console would run
  for real and why the agent is woken 18 hours out, what Skip to next does, reading the picture, what the
  agent did on its card (steps, reasoning, the write-up, the console re-check), the walkthrough beat by
  beat with screenshots from the rehearsal replay, and the questions you'll get.
- Planning guide and run-of-show README point new presenters at it; the show's talk track says why 18 hours.

Co-Authored-By: Claude Opus 5.5 <noreply@anthropic.com>
Claude-Session: https://claude.ai/code/session_01XP7fEGExmmDaM7W6ayMgxX
</commit_message>
<xml_diff>
--- a/run-of-show/docs/PLANNING GUIDE - A4I kickoff demo.docx
+++ b/run-of-show/docs/PLANNING GUIDE - A4I kickoff demo.docx
@@ -249,6 +249,28 @@
                 <w:szCs w:val="22"/>
               </w:rPr>
               <w:t xml:space="preserve">How this demo works</w:t>
+            </w:r>
+          </w:p>
+          <w:p>
+            <w:pPr>
+              <w:pStyle w:val="ListParagraph"/>
+              <w:numPr>
+                <w:ilvl w:val="0"/>
+                <w:numId w:val="2"/>
+              </w:numPr>
+              <w:spacing w:after="40" w:before="20" w:line="264"/>
+            </w:pPr>
+            <w:r>
+              <w:rPr>
+                <w:rFonts w:ascii="Calibri" w:cs="Calibri" w:eastAsia="Calibri" w:hAnsi="Calibri"/>
+                <w:b w:val="false"/>
+                <w:bCs w:val="false"/>
+                <w:i w:val="false"/>
+                <w:iCs w:val="false"/>
+                <w:sz w:val="22"/>
+                <w:szCs w:val="22"/>
+              </w:rPr>
+              <w:t xml:space="preserve">New to this demo? Read docs/INSTRUCTOR-GUIDE.md first: how the console would run for real, why the agent is woken 18 hours out, what Skip does, how to read the picture, and what the agent did, beat by beat with screenshots.</w:t>
             </w:r>
           </w:p>
           <w:p>
@@ -6813,7 +6835,7 @@
           <w:sz w:val="22"/>
           <w:szCs w:val="22"/>
         </w:rPr>
-        <w:t xml:space="preserve">Eighteen hours out, the agent runs the playbook you just watched: assess, size the burn at two times, price it, write it up. Then it waits for a human. I approve.</w:t>
+        <w:t xml:space="preserve">Eighteen hours out, when the tracking is as good as it will get and there's still time to burn cheaply, the agent runs the playbook you just watched: assess, size the burn at two times, price it, write it up. Then it waits for a human. I approve.</w:t>
       </w:r>
     </w:p>
     <w:p>

</xml_diff>

<commit_message>
Teleprompter step 1 opens on the README's "solved for you" box
Co-Authored-By: Claude Opus 5.5 <noreply@anthropic.com>
Claude-Session: https://claude.ai/code/session_01XP7fEGExmmDaM7W6ayMgxX
</commit_message>
<xml_diff>
--- a/run-of-show/docs/PLANNING GUIDE - A4I kickoff demo.docx
+++ b/run-of-show/docs/PLANNING GUIDE - A4I kickoff demo.docx
@@ -4534,6 +4534,36 @@
           <w:bCs/>
           <w:i w:val="false"/>
           <w:iCs w:val="false"/>
+          <w:color w:val="2BB3B1"/>
+          <w:sz w:val="20"/>
+          <w:szCs w:val="20"/>
+        </w:rPr>
+        <w:t xml:space="preserve">SAY  </w:t>
+      </w:r>
+      <w:r>
+        <w:rPr>
+          <w:rFonts w:ascii="Calibri" w:cs="Calibri" w:eastAsia="Calibri" w:hAnsi="Calibri"/>
+          <w:b w:val="false"/>
+          <w:bCs w:val="false"/>
+          <w:i/>
+          <w:iCs/>
+          <w:sz w:val="22"/>
+          <w:szCs w:val="22"/>
+        </w:rPr>
+        <w:t xml:space="preserve">It's all in this repo, and the box at the top tells you where each piece lives. Read your own challenge first; come back here when you want to see what the end looks like.</w:t>
+      </w:r>
+    </w:p>
+    <w:p>
+      <w:pPr>
+        <w:spacing w:after="80" w:before="40" w:line="264"/>
+      </w:pPr>
+      <w:r>
+        <w:rPr>
+          <w:rFonts w:ascii="Calibri" w:cs="Calibri" w:eastAsia="Calibri" w:hAnsi="Calibri"/>
+          <w:b/>
+          <w:bCs/>
+          <w:i w:val="false"/>
+          <w:iCs w:val="false"/>
           <w:color w:val="B07CFF"/>
           <w:sz w:val="20"/>
           <w:szCs w:val="20"/>
@@ -4550,7 +4580,7 @@
           <w:sz w:val="20"/>
           <w:szCs w:val="20"/>
         </w:rPr>
-        <w:t xml:space="preserve">README at the top: the title and "Our satellites are made up. Everything they could hit is real."</w:t>
+        <w:t xml:space="preserve">README at the top: the title and the "This one has been solved for you" box.</w:t>
       </w:r>
     </w:p>
     <w:tbl>
@@ -4710,7 +4740,97 @@
                 <w:sz w:val="20"/>
                 <w:szCs w:val="20"/>
               </w:rPr>
-              <w:t xml:space="preserve">Point at the one-line problem: a small constellation, 32,000 tracked objects, warnings that never stop.</w:t>
+              <w:t xml:space="preserve">Point at the box's table: the five build-path steps, each with the folder that solves it.</w:t>
+            </w:r>
+          </w:p>
+        </w:tc>
+      </w:tr>
+    </w:tbl>
+    <w:p>
+      <w:pPr>
+        <w:spacing w:after="20" w:before="0" w:line="264"/>
+      </w:pPr>
+      <w:r>
+        <w:rPr>
+          <w:rFonts w:ascii="Calibri" w:cs="Calibri" w:eastAsia="Calibri" w:hAnsi="Calibri"/>
+          <w:b w:val="false"/>
+          <w:bCs w:val="false"/>
+          <w:i w:val="false"/>
+          <w:iCs w:val="false"/>
+          <w:sz w:val="22"/>
+          <w:szCs w:val="22"/>
+        </w:rPr>
+        <w:t xml:space="preserve"/>
+      </w:r>
+    </w:p>
+    <w:tbl>
+      <w:tblPr>
+        <w:tblW w:type="dxa" w:w="10080"/>
+        <w:tblBorders>
+          <w:top w:val="single" w:color="auto" w:sz="4"/>
+          <w:left w:val="single" w:color="auto" w:sz="4"/>
+          <w:bottom w:val="single" w:color="auto" w:sz="4"/>
+          <w:right w:val="single" w:color="auto" w:sz="4"/>
+          <w:insideH w:val="single" w:color="auto" w:sz="4"/>
+          <w:insideV w:val="single" w:color="auto" w:sz="4"/>
+        </w:tblBorders>
+      </w:tblPr>
+      <w:tblGrid>
+        <w:gridCol w:w="10080"/>
+      </w:tblGrid>
+      <w:tr>
+        <w:trPr>
+          <w:cantSplit/>
+        </w:trPr>
+        <w:tc>
+          <w:tcPr>
+            <w:tcW w:type="dxa" w:w="10080"/>
+            <w:tcBorders>
+              <w:top w:val="single" w:color="B07CFF" w:sz="12"/>
+              <w:left w:val="single" w:color="B07CFF" w:sz="12"/>
+              <w:bottom w:val="single" w:color="B07CFF" w:sz="12"/>
+              <w:right w:val="single" w:color="B07CFF" w:sz="12"/>
+            </w:tcBorders>
+            <w:tcMar>
+              <w:top w:type="dxa" w:w="80"/>
+              <w:left w:type="dxa" w:w="160"/>
+              <w:bottom w:type="dxa" w:w="80"/>
+              <w:right w:type="dxa" w:w="160"/>
+            </w:tcMar>
+          </w:tcPr>
+          <w:p>
+            <w:pPr>
+              <w:spacing w:after="40" w:before="0" w:line="264"/>
+            </w:pPr>
+            <w:r>
+              <w:rPr>
+                <w:rFonts w:ascii="Calibri" w:cs="Calibri" w:eastAsia="Calibri" w:hAnsi="Calibri"/>
+                <w:b/>
+                <w:bCs/>
+                <w:i w:val="false"/>
+                <w:iCs w:val="false"/>
+                <w:color w:val="B07CFF"/>
+                <w:sz w:val="18"/>
+                <w:szCs w:val="18"/>
+              </w:rPr>
+              <w:t xml:space="preserve">DO</w:t>
+            </w:r>
+          </w:p>
+          <w:p>
+            <w:pPr>
+              <w:spacing w:after="0" w:before="0" w:line="264"/>
+            </w:pPr>
+            <w:r>
+              <w:rPr>
+                <w:rFonts w:ascii="Calibri" w:cs="Calibri" w:eastAsia="Calibri" w:hAnsi="Calibri"/>
+                <w:b w:val="false"/>
+                <w:bCs w:val="false"/>
+                <w:i w:val="false"/>
+                <w:iCs w:val="false"/>
+                <w:sz w:val="20"/>
+                <w:szCs w:val="20"/>
+              </w:rPr>
+              <w:t xml:space="preserve">Scroll to Why this one matters: a small constellation, 32,000 tracked objects, warnings that never stop.</w:t>
             </w:r>
           </w:p>
         </w:tc>

</xml_diff>

<commit_message>
ADK web UI works through Cloud Shell's Web Preview; the start block prints clickable links
- The blank page on port 8000: ADK 2.7's web server, bound to 127.0.0.1, refuses any request whose Host isn't
  localhost (a DNS-rebinding guard), and Web Preview arrives as *.cloudshell.dev, so every request got
  "403 Forbidden: host not allowed". scripts/adk_web.sh runs adk web on 0.0.0.0 with Cloud Shell's preview
  origins allowed; other origins are still refused. start_demo.sh, build_demo.sh, activate.sh and
  agent/README.md use it.
- start_demo.sh ends with two links to click in the terminal: http://0.0.0.0:8000/dev-ui/?app=cymbal_ops
  (cymbal_ops already picked) and http://0.0.0.0:8080.
- Teleprompter: the notebook's full raw URL to paste into Colab Enterprise's Import, the GitHub link in full,
  and tabs 3 and 5 opened from the start block's links.

Co-Authored-By: Claude Opus 5.5 <noreply@anthropic.com>
Claude-Session: https://claude.ai/code/session_01XP7fEGExmmDaM7W6ayMgxX
</commit_message>
<xml_diff>
--- a/run-of-show/docs/PLANNING GUIDE - A4I kickoff demo.docx
+++ b/run-of-show/docs/PLANNING GUIDE - A4I kickoff demo.docx
@@ -3068,7 +3068,7 @@
                 <w:sz w:val="19"/>
                 <w:szCs w:val="19"/>
               </w:rPr>
-              <w:t xml:space="preserve">Web Preview ▸ Change port ▸ 8080. Header says LIVE AGENT.</w:t>
+              <w:t xml:space="preserve">Click http://0.0.0.0:8080 in Cloud Shell. Header says LIVE AGENT.</w:t>
             </w:r>
           </w:p>
         </w:tc>
@@ -3776,38 +3776,7 @@
                 <w:sz w:val="20"/>
                 <w:szCs w:val="20"/>
               </w:rPr>
-              <w:t xml:space="preserve">Import notebooks/demo_01_load_explore.ipynb from the repo ▸ Runtime ▸ Run all</w:t>
-            </w:r>
-          </w:p>
-          <w:p>
-            <w:pPr>
-              <w:spacing w:after="0" w:before="60" w:line="264"/>
-            </w:pPr>
-            <w:r>
-              <w:rPr>
-                <w:rFonts w:ascii="Calibri" w:cs="Calibri" w:eastAsia="Calibri" w:hAnsi="Calibri"/>
-                <w:b/>
-                <w:bCs/>
-                <w:i w:val="false"/>
-                <w:iCs w:val="false"/>
-                <w:color w:val="2ECC71"/>
-                <w:sz w:val="19"/>
-                <w:szCs w:val="19"/>
-              </w:rPr>
-              <w:t xml:space="preserve">→ </w:t>
-            </w:r>
-            <w:r>
-              <w:rPr>
-                <w:rFonts w:ascii="Calibri" w:cs="Calibri" w:eastAsia="Calibri" w:hAnsi="Calibri"/>
-                <w:b w:val="false"/>
-                <w:bCs w:val="false"/>
-                <w:i w:val="false"/>
-                <w:iCs w:val="false"/>
-                <w:color w:val="9AA4B2"/>
-                <w:sz w:val="19"/>
-                <w:szCs w:val="19"/>
-              </w:rPr>
-              <w:t xml:space="preserve">Section 10: 850 approaches. Section 11: every check PASS. Keep this tab: it's step 2.</w:t>
+              <w:t xml:space="preserve">Google Cloud console ▸ search Colab Enterprise ▸ enable the APIs it asks for (twice is normal) ▸ My Notebooks ▸ Import ▸ source URL, and paste:</w:t>
             </w:r>
           </w:p>
         </w:tc>
@@ -3828,44 +3797,6 @@
           <w:szCs w:val="22"/>
         </w:rPr>
         <w:t xml:space="preserve"/>
-      </w:r>
-    </w:p>
-    <w:p>
-      <w:pPr>
-        <w:spacing w:after="80" w:before="40" w:line="264"/>
-      </w:pPr>
-      <w:r>
-        <w:rPr>
-          <w:rFonts w:ascii="Calibri" w:cs="Calibri" w:eastAsia="Calibri" w:hAnsi="Calibri"/>
-          <w:b w:val="false"/>
-          <w:bCs w:val="false"/>
-          <w:i w:val="false"/>
-          <w:iCs w:val="false"/>
-          <w:color w:val="9AA4B2"/>
-          <w:sz w:val="20"/>
-          <w:szCs w:val="20"/>
-        </w:rPr>
-        <w:t xml:space="preserve">Once per Google Cloud project. A new Google Skills lab is a new project: start here again.</w:t>
-      </w:r>
-    </w:p>
-    <w:p>
-      <w:pPr>
-        <w:pStyle w:val="Heading3"/>
-        <w:keepNext/>
-        <w:spacing w:after="40" w:before="160"/>
-      </w:pPr>
-      <w:r>
-        <w:rPr>
-          <w:rFonts w:ascii="Calibri" w:cs="Calibri" w:eastAsia="Calibri" w:hAnsi="Calibri"/>
-          <w:b/>
-          <w:bCs/>
-          <w:i w:val="false"/>
-          <w:iCs w:val="false"/>
-          <w:color w:val="2BB3B1"/>
-          <w:sz w:val="22"/>
-          <w:szCs w:val="22"/>
-        </w:rPr>
-        <w:t xml:space="preserve">BEFORE THE SHOW · 2 · MORNING OF</w:t>
       </w:r>
     </w:p>
     <w:tbl>
@@ -3891,10 +3822,10 @@
           <w:tcPr>
             <w:tcW w:type="dxa" w:w="10080"/>
             <w:tcBorders>
-              <w:top w:val="single" w:color="2BB3B1" w:sz="12"/>
-              <w:left w:val="single" w:color="2BB3B1" w:sz="36"/>
-              <w:bottom w:val="single" w:color="2BB3B1" w:sz="12"/>
-              <w:right w:val="single" w:color="2BB3B1" w:sz="12"/>
+              <w:top w:val="single" w:color="F28C28" w:sz="12"/>
+              <w:left w:val="single" w:color="F28C28" w:sz="36"/>
+              <w:bottom w:val="single" w:color="F28C28" w:sz="12"/>
+              <w:right w:val="single" w:color="F28C28" w:sz="12"/>
             </w:tcBorders>
             <w:tcMar>
               <w:top w:type="dxa" w:w="80"/>
@@ -3914,11 +3845,11 @@
                 <w:bCs/>
                 <w:i w:val="false"/>
                 <w:iCs w:val="false"/>
-                <w:color w:val="2BB3B1"/>
+                <w:color w:val="F28C28"/>
                 <w:sz w:val="18"/>
                 <w:szCs w:val="18"/>
               </w:rPr>
-              <w:t xml:space="preserve">CLOUD SHELL · repo root · the start block</w:t>
+              <w:t xml:space="preserve">PASTE · the notebook's URL</w:t>
             </w:r>
           </w:p>
           <w:p>
@@ -3935,38 +3866,7 @@
                 <w:sz w:val="19"/>
                 <w:szCs w:val="19"/>
               </w:rPr>
-              <w:t xml:space="preserve">bash scripts/start_demo.sh</w:t>
-            </w:r>
-          </w:p>
-          <w:p>
-            <w:pPr>
-              <w:spacing w:after="0" w:before="60" w:line="264"/>
-            </w:pPr>
-            <w:r>
-              <w:rPr>
-                <w:rFonts w:ascii="Calibri" w:cs="Calibri" w:eastAsia="Calibri" w:hAnsi="Calibri"/>
-                <w:b/>
-                <w:bCs/>
-                <w:i w:val="false"/>
-                <w:iCs w:val="false"/>
-                <w:color w:val="2ECC71"/>
-                <w:sz w:val="19"/>
-                <w:szCs w:val="19"/>
-              </w:rPr>
-              <w:t xml:space="preserve">→ </w:t>
-            </w:r>
-            <w:r>
-              <w:rPr>
-                <w:rFonts w:ascii="Calibri" w:cs="Calibri" w:eastAsia="Calibri" w:hAnsi="Calibri"/>
-                <w:b w:val="false"/>
-                <w:bCs w:val="false"/>
-                <w:i w:val="false"/>
-                <w:iCs w:val="false"/>
-                <w:color w:val="9AA4B2"/>
-                <w:sz w:val="19"/>
-                <w:szCs w:val="19"/>
-              </w:rPr>
-              <w:t xml:space="preserve">Sandbox ✓ · model check · port 8000 ✓ · port 8080 ✓ · console: replay rehearsal · Ready.</w:t>
+              <w:t xml:space="preserve">https://raw.githubusercontent.com/haggman/A4I2026-demo-orbital-conjunction/main/notebooks/demo_01_load_explore.ipynb</w:t>
             </w:r>
           </w:p>
         </w:tc>
@@ -4039,7 +3939,7 @@
                 <w:sz w:val="18"/>
                 <w:szCs w:val="18"/>
               </w:rPr>
-              <w:t xml:space="preserve">READ THE MODEL CHECK</w:t>
+              <w:t xml:space="preserve">COLAB ENTERPRISE</w:t>
             </w:r>
           </w:p>
           <w:p>
@@ -4056,24 +3956,38 @@
                 <w:sz w:val="20"/>
                 <w:szCs w:val="20"/>
               </w:rPr>
-              <w:t xml:space="preserve">Default model quick (a few seconds) → steps 3–4 run live as written.</w:t>
-            </w:r>
-          </w:p>
-          <w:p>
-            <w:pPr>
-              <w:spacing w:after="0" w:before="0" w:line="264"/>
-            </w:pPr>
-            <w:r>
-              <w:rPr>
-                <w:rFonts w:ascii="Calibri" w:cs="Calibri" w:eastAsia="Calibri" w:hAnsi="Calibri"/>
-                <w:b w:val="false"/>
-                <w:bCs w:val="false"/>
-                <w:i w:val="false"/>
-                <w:iCs w:val="false"/>
-                <w:sz w:val="20"/>
-                <w:szCs w:val="20"/>
-              </w:rPr>
-              <w:t xml:space="preserve">Slow → still run them; use each step's IF IT GOES WRONG line. The console is a replay either way.</w:t>
+              <w:t xml:space="preserve">Import ▸ open it ▸ Runtime ▸ Run all</w:t>
+            </w:r>
+          </w:p>
+          <w:p>
+            <w:pPr>
+              <w:spacing w:after="0" w:before="60" w:line="264"/>
+            </w:pPr>
+            <w:r>
+              <w:rPr>
+                <w:rFonts w:ascii="Calibri" w:cs="Calibri" w:eastAsia="Calibri" w:hAnsi="Calibri"/>
+                <w:b/>
+                <w:bCs/>
+                <w:i w:val="false"/>
+                <w:iCs w:val="false"/>
+                <w:color w:val="2ECC71"/>
+                <w:sz w:val="19"/>
+                <w:szCs w:val="19"/>
+              </w:rPr>
+              <w:t xml:space="preserve">→ </w:t>
+            </w:r>
+            <w:r>
+              <w:rPr>
+                <w:rFonts w:ascii="Calibri" w:cs="Calibri" w:eastAsia="Calibri" w:hAnsi="Calibri"/>
+                <w:b w:val="false"/>
+                <w:bCs w:val="false"/>
+                <w:i w:val="false"/>
+                <w:iCs w:val="false"/>
+                <w:color w:val="9AA4B2"/>
+                <w:sz w:val="19"/>
+                <w:szCs w:val="19"/>
+              </w:rPr>
+              <w:t xml:space="preserve">Section 10: 850 approaches. Section 11: every check PASS. Keep this tab: it's step 2.</w:t>
             </w:r>
           </w:p>
         </w:tc>
@@ -4094,6 +4008,44 @@
           <w:szCs w:val="22"/>
         </w:rPr>
         <w:t xml:space="preserve"/>
+      </w:r>
+    </w:p>
+    <w:p>
+      <w:pPr>
+        <w:spacing w:after="80" w:before="40" w:line="264"/>
+      </w:pPr>
+      <w:r>
+        <w:rPr>
+          <w:rFonts w:ascii="Calibri" w:cs="Calibri" w:eastAsia="Calibri" w:hAnsi="Calibri"/>
+          <w:b w:val="false"/>
+          <w:bCs w:val="false"/>
+          <w:i w:val="false"/>
+          <w:iCs w:val="false"/>
+          <w:color w:val="9AA4B2"/>
+          <w:sz w:val="20"/>
+          <w:szCs w:val="20"/>
+        </w:rPr>
+        <w:t xml:space="preserve">Once per Google Cloud project. A new Google Skills lab is a new project: start here again.</w:t>
+      </w:r>
+    </w:p>
+    <w:p>
+      <w:pPr>
+        <w:pStyle w:val="Heading3"/>
+        <w:keepNext/>
+        <w:spacing w:after="40" w:before="160"/>
+      </w:pPr>
+      <w:r>
+        <w:rPr>
+          <w:rFonts w:ascii="Calibri" w:cs="Calibri" w:eastAsia="Calibri" w:hAnsi="Calibri"/>
+          <w:b/>
+          <w:bCs/>
+          <w:i w:val="false"/>
+          <w:iCs w:val="false"/>
+          <w:color w:val="2BB3B1"/>
+          <w:sz w:val="22"/>
+          <w:szCs w:val="22"/>
+        </w:rPr>
+        <w:t xml:space="preserve">BEFORE THE SHOW · 2 · MORNING OF</w:t>
       </w:r>
     </w:p>
     <w:tbl>
@@ -4119,10 +4071,10 @@
           <w:tcPr>
             <w:tcW w:type="dxa" w:w="10080"/>
             <w:tcBorders>
-              <w:top w:val="single" w:color="B07CFF" w:sz="12"/>
-              <w:left w:val="single" w:color="B07CFF" w:sz="12"/>
-              <w:bottom w:val="single" w:color="B07CFF" w:sz="12"/>
-              <w:right w:val="single" w:color="B07CFF" w:sz="12"/>
+              <w:top w:val="single" w:color="2BB3B1" w:sz="12"/>
+              <w:left w:val="single" w:color="2BB3B1" w:sz="36"/>
+              <w:bottom w:val="single" w:color="2BB3B1" w:sz="12"/>
+              <w:right w:val="single" w:color="2BB3B1" w:sz="12"/>
             </w:tcBorders>
             <w:tcMar>
               <w:top w:type="dxa" w:w="80"/>
@@ -4142,11 +4094,11 @@
                 <w:bCs/>
                 <w:i w:val="false"/>
                 <w:iCs w:val="false"/>
-                <w:color w:val="B07CFF"/>
+                <w:color w:val="2BB3B1"/>
                 <w:sz w:val="18"/>
                 <w:szCs w:val="18"/>
               </w:rPr>
-              <w:t xml:space="preserve">COLAB ENTERPRISE</w:t>
+              <w:t xml:space="preserve">CLOUD SHELL · repo root · the start block</w:t>
             </w:r>
           </w:p>
           <w:p>
@@ -4155,15 +4107,46 @@
             </w:pPr>
             <w:r>
               <w:rPr>
-                <w:rFonts w:ascii="Calibri" w:cs="Calibri" w:eastAsia="Calibri" w:hAnsi="Calibri"/>
-                <w:b w:val="false"/>
-                <w:bCs w:val="false"/>
-                <w:i w:val="false"/>
-                <w:iCs w:val="false"/>
-                <w:sz w:val="20"/>
-                <w:szCs w:val="20"/>
-              </w:rPr>
-              <w:t xml:space="preserve">Notebook outputs still there? If the runtime was recycled: Runtime ▸ Run all (3 minutes).</w:t>
+                <w:rFonts w:ascii="Consolas" w:cs="Consolas" w:eastAsia="Consolas" w:hAnsi="Consolas"/>
+                <w:b w:val="false"/>
+                <w:bCs w:val="false"/>
+                <w:i w:val="false"/>
+                <w:iCs w:val="false"/>
+                <w:sz w:val="19"/>
+                <w:szCs w:val="19"/>
+              </w:rPr>
+              <w:t xml:space="preserve">bash scripts/start_demo.sh</w:t>
+            </w:r>
+          </w:p>
+          <w:p>
+            <w:pPr>
+              <w:spacing w:after="0" w:before="60" w:line="264"/>
+            </w:pPr>
+            <w:r>
+              <w:rPr>
+                <w:rFonts w:ascii="Calibri" w:cs="Calibri" w:eastAsia="Calibri" w:hAnsi="Calibri"/>
+                <w:b/>
+                <w:bCs/>
+                <w:i w:val="false"/>
+                <w:iCs w:val="false"/>
+                <w:color w:val="2ECC71"/>
+                <w:sz w:val="19"/>
+                <w:szCs w:val="19"/>
+              </w:rPr>
+              <w:t xml:space="preserve">→ </w:t>
+            </w:r>
+            <w:r>
+              <w:rPr>
+                <w:rFonts w:ascii="Calibri" w:cs="Calibri" w:eastAsia="Calibri" w:hAnsi="Calibri"/>
+                <w:b w:val="false"/>
+                <w:bCs w:val="false"/>
+                <w:i w:val="false"/>
+                <w:iCs w:val="false"/>
+                <w:color w:val="9AA4B2"/>
+                <w:sz w:val="19"/>
+                <w:szCs w:val="19"/>
+              </w:rPr>
+              <w:t xml:space="preserve">Sandbox ✓ · model check · port 8000 ✓ · port 8080 ✓ · console: replay rehearsal · Ready, and two links: http://0.0.0.0:8000/dev-ui/?app=cymbal_ops and http://0.0.0.0:8080.</w:t>
             </w:r>
           </w:p>
         </w:tc>
@@ -4184,26 +4167,6 @@
           <w:szCs w:val="22"/>
         </w:rPr>
         <w:t xml:space="preserve"/>
-      </w:r>
-    </w:p>
-    <w:p>
-      <w:pPr>
-        <w:pStyle w:val="Heading3"/>
-        <w:keepNext/>
-        <w:spacing w:after="40" w:before="160"/>
-      </w:pPr>
-      <w:r>
-        <w:rPr>
-          <w:rFonts w:ascii="Calibri" w:cs="Calibri" w:eastAsia="Calibri" w:hAnsi="Calibri"/>
-          <w:b/>
-          <w:bCs/>
-          <w:i w:val="false"/>
-          <w:iCs w:val="false"/>
-          <w:color w:val="2BB3B1"/>
-          <w:sz w:val="22"/>
-          <w:szCs w:val="22"/>
-        </w:rPr>
-        <w:t xml:space="preserve">BEFORE THE SHOW · 3 · OPEN THE FIVE TABS</w:t>
       </w:r>
     </w:p>
     <w:tbl>
@@ -4256,7 +4219,7 @@
                 <w:sz w:val="18"/>
                 <w:szCs w:val="18"/>
               </w:rPr>
-              <w:t xml:space="preserve">IN THIS ORDER, LEFT TO RIGHT</w:t>
+              <w:t xml:space="preserve">READ THE MODEL CHECK</w:t>
             </w:r>
           </w:p>
           <w:p>
@@ -4273,7 +4236,7 @@
                 <w:sz w:val="20"/>
                 <w:szCs w:val="20"/>
               </w:rPr>
-              <w:t xml:space="preserve">1  GitHub ▸ haggman/A4I2026-demo-orbital-conjunction (the README)</w:t>
+              <w:t xml:space="preserve">Default model quick (a few seconds) → steps 3–4 run live as written.</w:t>
             </w:r>
           </w:p>
           <w:p>
@@ -4290,89 +4253,7 @@
                 <w:sz w:val="20"/>
                 <w:szCs w:val="20"/>
               </w:rPr>
-              <w:t xml:space="preserve">2  Colab Enterprise ▸ demo_01_load_explore.ipynb</w:t>
-            </w:r>
-          </w:p>
-          <w:p>
-            <w:pPr>
-              <w:spacing w:after="0" w:before="0" w:line="264"/>
-            </w:pPr>
-            <w:r>
-              <w:rPr>
-                <w:rFonts w:ascii="Calibri" w:cs="Calibri" w:eastAsia="Calibri" w:hAnsi="Calibri"/>
-                <w:b w:val="false"/>
-                <w:bCs w:val="false"/>
-                <w:i w:val="false"/>
-                <w:iCs w:val="false"/>
-                <w:sz w:val="20"/>
-                <w:szCs w:val="20"/>
-              </w:rPr>
-              <w:t xml:space="preserve">3  Web Preview ▸ Change port ▸ 8000 ▸ cymbal_ops ▸ new session</w:t>
-            </w:r>
-          </w:p>
-          <w:p>
-            <w:pPr>
-              <w:spacing w:after="0" w:before="0" w:line="264"/>
-            </w:pPr>
-            <w:r>
-              <w:rPr>
-                <w:rFonts w:ascii="Calibri" w:cs="Calibri" w:eastAsia="Calibri" w:hAnsi="Calibri"/>
-                <w:b w:val="false"/>
-                <w:bCs w:val="false"/>
-                <w:i w:val="false"/>
-                <w:iCs w:val="false"/>
-                <w:sz w:val="20"/>
-                <w:szCs w:val="20"/>
-              </w:rPr>
-              <w:t xml:space="preserve">4  Google Cloud console ▸ Cloud Run ▸ cymbal-ops</w:t>
-            </w:r>
-          </w:p>
-          <w:p>
-            <w:pPr>
-              <w:spacing w:after="0" w:before="0" w:line="264"/>
-            </w:pPr>
-            <w:r>
-              <w:rPr>
-                <w:rFonts w:ascii="Calibri" w:cs="Calibri" w:eastAsia="Calibri" w:hAnsi="Calibri"/>
-                <w:b w:val="false"/>
-                <w:bCs w:val="false"/>
-                <w:i w:val="false"/>
-                <w:iCs w:val="false"/>
-                <w:sz w:val="20"/>
-                <w:szCs w:val="20"/>
-              </w:rPr>
-              <w:t xml:space="preserve">5  Web Preview ▸ Change port ▸ 8080</w:t>
-            </w:r>
-          </w:p>
-          <w:p>
-            <w:pPr>
-              <w:spacing w:after="0" w:before="60" w:line="264"/>
-            </w:pPr>
-            <w:r>
-              <w:rPr>
-                <w:rFonts w:ascii="Calibri" w:cs="Calibri" w:eastAsia="Calibri" w:hAnsi="Calibri"/>
-                <w:b/>
-                <w:bCs/>
-                <w:i w:val="false"/>
-                <w:iCs w:val="false"/>
-                <w:color w:val="2ECC71"/>
-                <w:sz w:val="19"/>
-                <w:szCs w:val="19"/>
-              </w:rPr>
-              <w:t xml:space="preserve">→ </w:t>
-            </w:r>
-            <w:r>
-              <w:rPr>
-                <w:rFonts w:ascii="Calibri" w:cs="Calibri" w:eastAsia="Calibri" w:hAnsi="Calibri"/>
-                <w:b w:val="false"/>
-                <w:bCs w:val="false"/>
-                <w:i w:val="false"/>
-                <w:iCs w:val="false"/>
-                <w:color w:val="9AA4B2"/>
-                <w:sz w:val="19"/>
-                <w:szCs w:val="19"/>
-              </w:rPr>
-              <w:t xml:space="preserve">Tab 5: header says REPLAY, clock Fri 25 Sep 01:00:00 UTC, three watcher cards on the desk.</w:t>
+              <w:t xml:space="preserve">Slow → still run them; use each step's IF IT GOES WRONG line. The console is a replay either way.</w:t>
             </w:r>
           </w:p>
         </w:tc>
@@ -4393,194 +4274,6 @@
           <w:szCs w:val="22"/>
         </w:rPr>
         <w:t xml:space="preserve"/>
-      </w:r>
-    </w:p>
-    <w:p>
-      <w:pPr>
-        <w:spacing w:after="80" w:before="40" w:line="264"/>
-      </w:pPr>
-      <w:r>
-        <w:rPr>
-          <w:rFonts w:ascii="Calibri" w:cs="Calibri" w:eastAsia="Calibri" w:hAnsi="Calibri"/>
-          <w:b w:val="false"/>
-          <w:bCs w:val="false"/>
-          <w:i w:val="false"/>
-          <w:iCs w:val="false"/>
-          <w:color w:val="9AA4B2"/>
-          <w:sz w:val="20"/>
-          <w:szCs w:val="20"/>
-        </w:rPr>
-        <w:t xml:space="preserve">Stop both web apps afterwards with: bash scripts/start_demo.sh --stop</w:t>
-      </w:r>
-    </w:p>
-    <w:p>
-      <w:pPr>
-        <w:pStyle w:val="Heading3"/>
-        <w:keepNext/>
-        <w:spacing w:after="40" w:before="160"/>
-      </w:pPr>
-      <w:r>
-        <w:rPr>
-          <w:rFonts w:ascii="Calibri" w:cs="Calibri" w:eastAsia="Calibri" w:hAnsi="Calibri"/>
-          <w:b/>
-          <w:bCs/>
-          <w:i w:val="false"/>
-          <w:iCs w:val="false"/>
-          <w:color w:val="3D8BFF"/>
-          <w:sz w:val="22"/>
-          <w:szCs w:val="22"/>
-        </w:rPr>
-        <w:t xml:space="preserve">1. The challenge: which of these warnings is real?   ·   TAB · GITHUB · THE DEMO REPO   ·   ~0.5 min</w:t>
-      </w:r>
-    </w:p>
-    <w:p>
-      <w:pPr>
-        <w:spacing w:after="80" w:before="40" w:line="264"/>
-      </w:pPr>
-      <w:r>
-        <w:rPr>
-          <w:rFonts w:ascii="Calibri" w:cs="Calibri" w:eastAsia="Calibri" w:hAnsi="Calibri"/>
-          <w:b/>
-          <w:bCs/>
-          <w:i w:val="false"/>
-          <w:iCs w:val="false"/>
-          <w:color w:val="2ECC71"/>
-          <w:sz w:val="20"/>
-          <w:szCs w:val="20"/>
-        </w:rPr>
-        <w:t xml:space="preserve">WHY  </w:t>
-      </w:r>
-      <w:r>
-        <w:rPr>
-          <w:rFonts w:ascii="Calibri" w:cs="Calibri" w:eastAsia="Calibri" w:hAnsi="Calibri"/>
-          <w:b w:val="false"/>
-          <w:bCs w:val="false"/>
-          <w:i w:val="false"/>
-          <w:iCs w:val="false"/>
-          <w:sz w:val="22"/>
-          <w:szCs w:val="22"/>
-        </w:rPr>
-        <w:t xml:space="preserve">Every team starts at the same place: a person, a decision, a deadline. This one is finished, so they can see where the day ends.</w:t>
-      </w:r>
-    </w:p>
-    <w:p>
-      <w:pPr>
-        <w:spacing w:after="80" w:before="40" w:line="264"/>
-      </w:pPr>
-      <w:r>
-        <w:rPr>
-          <w:rFonts w:ascii="Calibri" w:cs="Calibri" w:eastAsia="Calibri" w:hAnsi="Calibri"/>
-          <w:b/>
-          <w:bCs/>
-          <w:i w:val="false"/>
-          <w:iCs w:val="false"/>
-          <w:color w:val="2BB3B1"/>
-          <w:sz w:val="20"/>
-          <w:szCs w:val="20"/>
-        </w:rPr>
-        <w:t xml:space="preserve">SAY  </w:t>
-      </w:r>
-      <w:r>
-        <w:rPr>
-          <w:rFonts w:ascii="Calibri" w:cs="Calibri" w:eastAsia="Calibri" w:hAnsi="Calibri"/>
-          <w:b w:val="false"/>
-          <w:bCs w:val="false"/>
-          <w:i/>
-          <w:iCs/>
-          <w:sz w:val="22"/>
-          <w:szCs w:val="22"/>
-        </w:rPr>
-        <w:t xml:space="preserve">You operate twelve small Earth-observation satellites. About 32,000 tracked objects share their sky, the warnings never stop, and nearly all of them are noise. Which ones are real, and what do you do about them?</w:t>
-      </w:r>
-    </w:p>
-    <w:p>
-      <w:pPr>
-        <w:spacing w:after="80" w:before="40" w:line="264"/>
-      </w:pPr>
-      <w:r>
-        <w:rPr>
-          <w:rFonts w:ascii="Calibri" w:cs="Calibri" w:eastAsia="Calibri" w:hAnsi="Calibri"/>
-          <w:b/>
-          <w:bCs/>
-          <w:i w:val="false"/>
-          <w:iCs w:val="false"/>
-          <w:color w:val="2BB3B1"/>
-          <w:sz w:val="20"/>
-          <w:szCs w:val="20"/>
-        </w:rPr>
-        <w:t xml:space="preserve">SAY  </w:t>
-      </w:r>
-      <w:r>
-        <w:rPr>
-          <w:rFonts w:ascii="Calibri" w:cs="Calibri" w:eastAsia="Calibri" w:hAnsi="Calibri"/>
-          <w:b w:val="false"/>
-          <w:bCs w:val="false"/>
-          <w:i/>
-          <w:iCs/>
-          <w:sz w:val="22"/>
-          <w:szCs w:val="22"/>
-        </w:rPr>
-        <w:t xml:space="preserve">It's built the way your challenge is built: load the data, build an agent, give it one thing only your challenge has, deploy it, show it. I'll walk you through each step in a minute or two.</w:t>
-      </w:r>
-    </w:p>
-    <w:p>
-      <w:pPr>
-        <w:spacing w:after="80" w:before="40" w:line="264"/>
-      </w:pPr>
-      <w:r>
-        <w:rPr>
-          <w:rFonts w:ascii="Calibri" w:cs="Calibri" w:eastAsia="Calibri" w:hAnsi="Calibri"/>
-          <w:b/>
-          <w:bCs/>
-          <w:i w:val="false"/>
-          <w:iCs w:val="false"/>
-          <w:color w:val="2BB3B1"/>
-          <w:sz w:val="20"/>
-          <w:szCs w:val="20"/>
-        </w:rPr>
-        <w:t xml:space="preserve">SAY  </w:t>
-      </w:r>
-      <w:r>
-        <w:rPr>
-          <w:rFonts w:ascii="Calibri" w:cs="Calibri" w:eastAsia="Calibri" w:hAnsi="Calibri"/>
-          <w:b w:val="false"/>
-          <w:bCs w:val="false"/>
-          <w:i/>
-          <w:iCs/>
-          <w:sz w:val="22"/>
-          <w:szCs w:val="22"/>
-        </w:rPr>
-        <w:t xml:space="preserve">It's all in this repo, and the box at the top tells you where each piece lives. Read your own challenge first; come back here when you want to see what the end looks like.</w:t>
-      </w:r>
-    </w:p>
-    <w:p>
-      <w:pPr>
-        <w:spacing w:after="80" w:before="40" w:line="264"/>
-      </w:pPr>
-      <w:r>
-        <w:rPr>
-          <w:rFonts w:ascii="Calibri" w:cs="Calibri" w:eastAsia="Calibri" w:hAnsi="Calibri"/>
-          <w:b/>
-          <w:bCs/>
-          <w:i w:val="false"/>
-          <w:iCs w:val="false"/>
-          <w:color w:val="B07CFF"/>
-          <w:sz w:val="20"/>
-          <w:szCs w:val="20"/>
-        </w:rPr>
-        <w:t xml:space="preserve">NEEDS  </w:t>
-      </w:r>
-      <w:r>
-        <w:rPr>
-          <w:rFonts w:ascii="Calibri" w:cs="Calibri" w:eastAsia="Calibri" w:hAnsi="Calibri"/>
-          <w:b w:val="false"/>
-          <w:bCs w:val="false"/>
-          <w:i w:val="false"/>
-          <w:iCs w:val="false"/>
-          <w:sz w:val="20"/>
-          <w:szCs w:val="20"/>
-        </w:rPr>
-        <w:t xml:space="preserve">README at the top: the title and the "This one has been solved for you" box.</w:t>
       </w:r>
     </w:p>
     <w:tbl>
@@ -4606,10 +4299,10 @@
           <w:tcPr>
             <w:tcW w:type="dxa" w:w="10080"/>
             <w:tcBorders>
-              <w:top w:val="single" w:color="2BB3B1" w:sz="12"/>
-              <w:left w:val="single" w:color="2BB3B1" w:sz="12"/>
-              <w:bottom w:val="single" w:color="2BB3B1" w:sz="12"/>
-              <w:right w:val="single" w:color="2BB3B1" w:sz="12"/>
+              <w:top w:val="single" w:color="B07CFF" w:sz="12"/>
+              <w:left w:val="single" w:color="B07CFF" w:sz="12"/>
+              <w:bottom w:val="single" w:color="B07CFF" w:sz="12"/>
+              <w:right w:val="single" w:color="B07CFF" w:sz="12"/>
             </w:tcBorders>
             <w:tcMar>
               <w:top w:type="dxa" w:w="80"/>
@@ -4629,11 +4322,11 @@
                 <w:bCs/>
                 <w:i w:val="false"/>
                 <w:iCs w:val="false"/>
-                <w:color w:val="2BB3B1"/>
+                <w:color w:val="B07CFF"/>
                 <w:sz w:val="18"/>
                 <w:szCs w:val="18"/>
               </w:rPr>
-              <w:t xml:space="preserve">SAY</w:t>
+              <w:t xml:space="preserve">COLAB ENTERPRISE</w:t>
             </w:r>
           </w:p>
           <w:p>
@@ -4645,12 +4338,12 @@
                 <w:rFonts w:ascii="Calibri" w:cs="Calibri" w:eastAsia="Calibri" w:hAnsi="Calibri"/>
                 <w:b w:val="false"/>
                 <w:bCs w:val="false"/>
-                <w:i/>
-                <w:iCs/>
+                <w:i w:val="false"/>
+                <w:iCs w:val="false"/>
                 <w:sz w:val="20"/>
                 <w:szCs w:val="20"/>
               </w:rPr>
-              <w:t xml:space="preserve">A sixth challenge, built exactly the way you'll build yours today, and taken all the way to the end.</w:t>
+              <w:t xml:space="preserve">Notebook outputs still there? If the runtime was recycled: Runtime ▸ Run all (3 minutes).</w:t>
             </w:r>
           </w:p>
         </w:tc>
@@ -4671,6 +4364,26 @@
           <w:szCs w:val="22"/>
         </w:rPr>
         <w:t xml:space="preserve"/>
+      </w:r>
+    </w:p>
+    <w:p>
+      <w:pPr>
+        <w:pStyle w:val="Heading3"/>
+        <w:keepNext/>
+        <w:spacing w:after="40" w:before="160"/>
+      </w:pPr>
+      <w:r>
+        <w:rPr>
+          <w:rFonts w:ascii="Calibri" w:cs="Calibri" w:eastAsia="Calibri" w:hAnsi="Calibri"/>
+          <w:b/>
+          <w:bCs/>
+          <w:i w:val="false"/>
+          <w:iCs w:val="false"/>
+          <w:color w:val="2BB3B1"/>
+          <w:sz w:val="22"/>
+          <w:szCs w:val="22"/>
+        </w:rPr>
+        <w:t xml:space="preserve">BEFORE THE SHOW · 3 · OPEN THE FIVE TABS</w:t>
       </w:r>
     </w:p>
     <w:tbl>
@@ -4723,7 +4436,7 @@
                 <w:sz w:val="18"/>
                 <w:szCs w:val="18"/>
               </w:rPr>
-              <w:t xml:space="preserve">DO</w:t>
+              <w:t xml:space="preserve">IN THIS ORDER, LEFT TO RIGHT</w:t>
             </w:r>
           </w:p>
           <w:p>
@@ -4740,7 +4453,106 @@
                 <w:sz w:val="20"/>
                 <w:szCs w:val="20"/>
               </w:rPr>
-              <w:t xml:space="preserve">Point at the box's table: the five build-path steps, each with the folder that solves it.</w:t>
+              <w:t xml:space="preserve">1  GitHub: https://github.com/haggman/A4I2026-demo-orbital-conjunction (the README)</w:t>
+            </w:r>
+          </w:p>
+          <w:p>
+            <w:pPr>
+              <w:spacing w:after="0" w:before="0" w:line="264"/>
+            </w:pPr>
+            <w:r>
+              <w:rPr>
+                <w:rFonts w:ascii="Calibri" w:cs="Calibri" w:eastAsia="Calibri" w:hAnsi="Calibri"/>
+                <w:b w:val="false"/>
+                <w:bCs w:val="false"/>
+                <w:i w:val="false"/>
+                <w:iCs w:val="false"/>
+                <w:sz w:val="20"/>
+                <w:szCs w:val="20"/>
+              </w:rPr>
+              <w:t xml:space="preserve">2  Colab Enterprise ▸ demo_01_load_explore.ipynb (from page 1)</w:t>
+            </w:r>
+          </w:p>
+          <w:p>
+            <w:pPr>
+              <w:spacing w:after="0" w:before="0" w:line="264"/>
+            </w:pPr>
+            <w:r>
+              <w:rPr>
+                <w:rFonts w:ascii="Calibri" w:cs="Calibri" w:eastAsia="Calibri" w:hAnsi="Calibri"/>
+                <w:b w:val="false"/>
+                <w:bCs w:val="false"/>
+                <w:i w:val="false"/>
+                <w:iCs w:val="false"/>
+                <w:sz w:val="20"/>
+                <w:szCs w:val="20"/>
+              </w:rPr>
+              <w:t xml:space="preserve">3  The start block's 8000 link (click it in Cloud Shell): the ADK web UI, cymbal_ops picked ▸ new session</w:t>
+            </w:r>
+          </w:p>
+          <w:p>
+            <w:pPr>
+              <w:spacing w:after="0" w:before="0" w:line="264"/>
+            </w:pPr>
+            <w:r>
+              <w:rPr>
+                <w:rFonts w:ascii="Calibri" w:cs="Calibri" w:eastAsia="Calibri" w:hAnsi="Calibri"/>
+                <w:b w:val="false"/>
+                <w:bCs w:val="false"/>
+                <w:i w:val="false"/>
+                <w:iCs w:val="false"/>
+                <w:sz w:val="20"/>
+                <w:szCs w:val="20"/>
+              </w:rPr>
+              <w:t xml:space="preserve">4  Google Cloud console ▸ Cloud Run ▸ cymbal-ops</w:t>
+            </w:r>
+          </w:p>
+          <w:p>
+            <w:pPr>
+              <w:spacing w:after="0" w:before="0" w:line="264"/>
+            </w:pPr>
+            <w:r>
+              <w:rPr>
+                <w:rFonts w:ascii="Calibri" w:cs="Calibri" w:eastAsia="Calibri" w:hAnsi="Calibri"/>
+                <w:b w:val="false"/>
+                <w:bCs w:val="false"/>
+                <w:i w:val="false"/>
+                <w:iCs w:val="false"/>
+                <w:sz w:val="20"/>
+                <w:szCs w:val="20"/>
+              </w:rPr>
+              <w:t xml:space="preserve">5  The start block's 8080 link: the console</w:t>
+            </w:r>
+          </w:p>
+          <w:p>
+            <w:pPr>
+              <w:spacing w:after="0" w:before="60" w:line="264"/>
+            </w:pPr>
+            <w:r>
+              <w:rPr>
+                <w:rFonts w:ascii="Calibri" w:cs="Calibri" w:eastAsia="Calibri" w:hAnsi="Calibri"/>
+                <w:b/>
+                <w:bCs/>
+                <w:i w:val="false"/>
+                <w:iCs w:val="false"/>
+                <w:color w:val="2ECC71"/>
+                <w:sz w:val="19"/>
+                <w:szCs w:val="19"/>
+              </w:rPr>
+              <w:t xml:space="preserve">→ </w:t>
+            </w:r>
+            <w:r>
+              <w:rPr>
+                <w:rFonts w:ascii="Calibri" w:cs="Calibri" w:eastAsia="Calibri" w:hAnsi="Calibri"/>
+                <w:b w:val="false"/>
+                <w:bCs w:val="false"/>
+                <w:i w:val="false"/>
+                <w:iCs w:val="false"/>
+                <w:color w:val="9AA4B2"/>
+                <w:sz w:val="19"/>
+                <w:szCs w:val="19"/>
+              </w:rPr>
+              <w:t xml:space="preserve">Tab 5: header says REPLAY, clock Fri 25 Sep 01:00:00 UTC, three watcher cards on the desk.</w:t>
             </w:r>
           </w:p>
         </w:tc>
@@ -4761,6 +4573,194 @@
           <w:szCs w:val="22"/>
         </w:rPr>
         <w:t xml:space="preserve"/>
+      </w:r>
+    </w:p>
+    <w:p>
+      <w:pPr>
+        <w:spacing w:after="80" w:before="40" w:line="264"/>
+      </w:pPr>
+      <w:r>
+        <w:rPr>
+          <w:rFonts w:ascii="Calibri" w:cs="Calibri" w:eastAsia="Calibri" w:hAnsi="Calibri"/>
+          <w:b w:val="false"/>
+          <w:bCs w:val="false"/>
+          <w:i w:val="false"/>
+          <w:iCs w:val="false"/>
+          <w:color w:val="9AA4B2"/>
+          <w:sz w:val="20"/>
+          <w:szCs w:val="20"/>
+        </w:rPr>
+        <w:t xml:space="preserve">Stop both web apps afterwards with: bash scripts/start_demo.sh --stop</w:t>
+      </w:r>
+    </w:p>
+    <w:p>
+      <w:pPr>
+        <w:pStyle w:val="Heading3"/>
+        <w:keepNext/>
+        <w:spacing w:after="40" w:before="160"/>
+      </w:pPr>
+      <w:r>
+        <w:rPr>
+          <w:rFonts w:ascii="Calibri" w:cs="Calibri" w:eastAsia="Calibri" w:hAnsi="Calibri"/>
+          <w:b/>
+          <w:bCs/>
+          <w:i w:val="false"/>
+          <w:iCs w:val="false"/>
+          <w:color w:val="3D8BFF"/>
+          <w:sz w:val="22"/>
+          <w:szCs w:val="22"/>
+        </w:rPr>
+        <w:t xml:space="preserve">1. The challenge: which of these warnings is real?   ·   TAB · GITHUB · THE DEMO REPO   ·   ~0.5 min</w:t>
+      </w:r>
+    </w:p>
+    <w:p>
+      <w:pPr>
+        <w:spacing w:after="80" w:before="40" w:line="264"/>
+      </w:pPr>
+      <w:r>
+        <w:rPr>
+          <w:rFonts w:ascii="Calibri" w:cs="Calibri" w:eastAsia="Calibri" w:hAnsi="Calibri"/>
+          <w:b/>
+          <w:bCs/>
+          <w:i w:val="false"/>
+          <w:iCs w:val="false"/>
+          <w:color w:val="2ECC71"/>
+          <w:sz w:val="20"/>
+          <w:szCs w:val="20"/>
+        </w:rPr>
+        <w:t xml:space="preserve">WHY  </w:t>
+      </w:r>
+      <w:r>
+        <w:rPr>
+          <w:rFonts w:ascii="Calibri" w:cs="Calibri" w:eastAsia="Calibri" w:hAnsi="Calibri"/>
+          <w:b w:val="false"/>
+          <w:bCs w:val="false"/>
+          <w:i w:val="false"/>
+          <w:iCs w:val="false"/>
+          <w:sz w:val="22"/>
+          <w:szCs w:val="22"/>
+        </w:rPr>
+        <w:t xml:space="preserve">Every team starts at the same place: a person, a decision, a deadline. This one is finished, so they can see where the day ends.</w:t>
+      </w:r>
+    </w:p>
+    <w:p>
+      <w:pPr>
+        <w:spacing w:after="80" w:before="40" w:line="264"/>
+      </w:pPr>
+      <w:r>
+        <w:rPr>
+          <w:rFonts w:ascii="Calibri" w:cs="Calibri" w:eastAsia="Calibri" w:hAnsi="Calibri"/>
+          <w:b/>
+          <w:bCs/>
+          <w:i w:val="false"/>
+          <w:iCs w:val="false"/>
+          <w:color w:val="2BB3B1"/>
+          <w:sz w:val="20"/>
+          <w:szCs w:val="20"/>
+        </w:rPr>
+        <w:t xml:space="preserve">SAY  </w:t>
+      </w:r>
+      <w:r>
+        <w:rPr>
+          <w:rFonts w:ascii="Calibri" w:cs="Calibri" w:eastAsia="Calibri" w:hAnsi="Calibri"/>
+          <w:b w:val="false"/>
+          <w:bCs w:val="false"/>
+          <w:i/>
+          <w:iCs/>
+          <w:sz w:val="22"/>
+          <w:szCs w:val="22"/>
+        </w:rPr>
+        <w:t xml:space="preserve">You operate twelve small Earth-observation satellites. About 32,000 tracked objects share their sky, the warnings never stop, and nearly all of them are noise. Which ones are real, and what do you do about them?</w:t>
+      </w:r>
+    </w:p>
+    <w:p>
+      <w:pPr>
+        <w:spacing w:after="80" w:before="40" w:line="264"/>
+      </w:pPr>
+      <w:r>
+        <w:rPr>
+          <w:rFonts w:ascii="Calibri" w:cs="Calibri" w:eastAsia="Calibri" w:hAnsi="Calibri"/>
+          <w:b/>
+          <w:bCs/>
+          <w:i w:val="false"/>
+          <w:iCs w:val="false"/>
+          <w:color w:val="2BB3B1"/>
+          <w:sz w:val="20"/>
+          <w:szCs w:val="20"/>
+        </w:rPr>
+        <w:t xml:space="preserve">SAY  </w:t>
+      </w:r>
+      <w:r>
+        <w:rPr>
+          <w:rFonts w:ascii="Calibri" w:cs="Calibri" w:eastAsia="Calibri" w:hAnsi="Calibri"/>
+          <w:b w:val="false"/>
+          <w:bCs w:val="false"/>
+          <w:i/>
+          <w:iCs/>
+          <w:sz w:val="22"/>
+          <w:szCs w:val="22"/>
+        </w:rPr>
+        <w:t xml:space="preserve">It's built the way your challenge is built: load the data, build an agent, give it one thing only your challenge has, deploy it, show it. I'll walk you through each step in a minute or two.</w:t>
+      </w:r>
+    </w:p>
+    <w:p>
+      <w:pPr>
+        <w:spacing w:after="80" w:before="40" w:line="264"/>
+      </w:pPr>
+      <w:r>
+        <w:rPr>
+          <w:rFonts w:ascii="Calibri" w:cs="Calibri" w:eastAsia="Calibri" w:hAnsi="Calibri"/>
+          <w:b/>
+          <w:bCs/>
+          <w:i w:val="false"/>
+          <w:iCs w:val="false"/>
+          <w:color w:val="2BB3B1"/>
+          <w:sz w:val="20"/>
+          <w:szCs w:val="20"/>
+        </w:rPr>
+        <w:t xml:space="preserve">SAY  </w:t>
+      </w:r>
+      <w:r>
+        <w:rPr>
+          <w:rFonts w:ascii="Calibri" w:cs="Calibri" w:eastAsia="Calibri" w:hAnsi="Calibri"/>
+          <w:b w:val="false"/>
+          <w:bCs w:val="false"/>
+          <w:i/>
+          <w:iCs/>
+          <w:sz w:val="22"/>
+          <w:szCs w:val="22"/>
+        </w:rPr>
+        <w:t xml:space="preserve">It's all in this repo, and the box at the top tells you where each piece lives. Read your own challenge first; come back here when you want to see what the end looks like.</w:t>
+      </w:r>
+    </w:p>
+    <w:p>
+      <w:pPr>
+        <w:spacing w:after="80" w:before="40" w:line="264"/>
+      </w:pPr>
+      <w:r>
+        <w:rPr>
+          <w:rFonts w:ascii="Calibri" w:cs="Calibri" w:eastAsia="Calibri" w:hAnsi="Calibri"/>
+          <w:b/>
+          <w:bCs/>
+          <w:i w:val="false"/>
+          <w:iCs w:val="false"/>
+          <w:color w:val="B07CFF"/>
+          <w:sz w:val="20"/>
+          <w:szCs w:val="20"/>
+        </w:rPr>
+        <w:t xml:space="preserve">NEEDS  </w:t>
+      </w:r>
+      <w:r>
+        <w:rPr>
+          <w:rFonts w:ascii="Calibri" w:cs="Calibri" w:eastAsia="Calibri" w:hAnsi="Calibri"/>
+          <w:b w:val="false"/>
+          <w:bCs w:val="false"/>
+          <w:i w:val="false"/>
+          <w:iCs w:val="false"/>
+          <w:sz w:val="20"/>
+          <w:szCs w:val="20"/>
+        </w:rPr>
+        <w:t xml:space="preserve">README at the top: the title and the "This one has been solved for you" box.</w:t>
       </w:r>
     </w:p>
     <w:tbl>
@@ -4786,10 +4786,10 @@
           <w:tcPr>
             <w:tcW w:type="dxa" w:w="10080"/>
             <w:tcBorders>
-              <w:top w:val="single" w:color="B07CFF" w:sz="12"/>
-              <w:left w:val="single" w:color="B07CFF" w:sz="12"/>
-              <w:bottom w:val="single" w:color="B07CFF" w:sz="12"/>
-              <w:right w:val="single" w:color="B07CFF" w:sz="12"/>
+              <w:top w:val="single" w:color="2BB3B1" w:sz="12"/>
+              <w:left w:val="single" w:color="2BB3B1" w:sz="12"/>
+              <w:bottom w:val="single" w:color="2BB3B1" w:sz="12"/>
+              <w:right w:val="single" w:color="2BB3B1" w:sz="12"/>
             </w:tcBorders>
             <w:tcMar>
               <w:top w:type="dxa" w:w="80"/>
@@ -4809,11 +4809,11 @@
                 <w:bCs/>
                 <w:i w:val="false"/>
                 <w:iCs w:val="false"/>
-                <w:color w:val="B07CFF"/>
+                <w:color w:val="2BB3B1"/>
                 <w:sz w:val="18"/>
                 <w:szCs w:val="18"/>
               </w:rPr>
-              <w:t xml:space="preserve">DO</w:t>
+              <w:t xml:space="preserve">SAY</w:t>
             </w:r>
           </w:p>
           <w:p>
@@ -4825,12 +4825,12 @@
                 <w:rFonts w:ascii="Calibri" w:cs="Calibri" w:eastAsia="Calibri" w:hAnsi="Calibri"/>
                 <w:b w:val="false"/>
                 <w:bCs w:val="false"/>
-                <w:i w:val="false"/>
-                <w:iCs w:val="false"/>
+                <w:i/>
+                <w:iCs/>
                 <w:sz w:val="20"/>
                 <w:szCs w:val="20"/>
               </w:rPr>
-              <w:t xml:space="preserve">Scroll to Why this one matters: a small constellation, 32,000 tracked objects, warnings that never stop.</w:t>
+              <w:t xml:space="preserve">A sixth challenge, built exactly the way you'll build yours today, and taken all the way to the end.</w:t>
             </w:r>
           </w:p>
         </w:tc>
@@ -4851,176 +4851,6 @@
           <w:szCs w:val="22"/>
         </w:rPr>
         <w:t xml:space="preserve"/>
-      </w:r>
-    </w:p>
-    <w:p>
-      <w:pPr>
-        <w:pStyle w:val="Heading3"/>
-        <w:keepNext/>
-        <w:spacing w:after="40" w:before="160"/>
-      </w:pPr>
-      <w:r>
-        <w:rPr>
-          <w:rFonts w:ascii="Calibri" w:cs="Calibri" w:eastAsia="Calibri" w:hAnsi="Calibri"/>
-          <w:b/>
-          <w:bCs/>
-          <w:i w:val="false"/>
-          <w:iCs w:val="false"/>
-          <w:color w:val="3D8BFF"/>
-          <w:sz w:val="22"/>
-          <w:szCs w:val="22"/>
-        </w:rPr>
-        <w:t xml:space="preserve">2. Load &amp; Explore: load it, distrust it, validate it   ·   TAB · COLAB ENTERPRISE · THE DATA NOTEBOOK   ·   ~1.5 min</w:t>
-      </w:r>
-    </w:p>
-    <w:p>
-      <w:pPr>
-        <w:spacing w:after="80" w:before="40" w:line="264"/>
-      </w:pPr>
-      <w:r>
-        <w:rPr>
-          <w:rFonts w:ascii="Calibri" w:cs="Calibri" w:eastAsia="Calibri" w:hAnsi="Calibri"/>
-          <w:b/>
-          <w:bCs/>
-          <w:i w:val="false"/>
-          <w:iCs w:val="false"/>
-          <w:color w:val="2ECC71"/>
-          <w:sz w:val="20"/>
-          <w:szCs w:val="20"/>
-        </w:rPr>
-        <w:t xml:space="preserve">WHY  </w:t>
-      </w:r>
-      <w:r>
-        <w:rPr>
-          <w:rFonts w:ascii="Calibri" w:cs="Calibri" w:eastAsia="Calibri" w:hAnsi="Calibri"/>
-          <w:b w:val="false"/>
-          <w:bCs w:val="false"/>
-          <w:i w:val="false"/>
-          <w:iCs w:val="false"/>
-          <w:sz w:val="22"/>
-          <w:szCs w:val="22"/>
-        </w:rPr>
-        <w:t xml:space="preserve">The data lane's job: load real data, find what's wrong with it, and hand the agent clean, validated tables in BigQuery.</w:t>
-      </w:r>
-    </w:p>
-    <w:p>
-      <w:pPr>
-        <w:spacing w:after="80" w:before="40" w:line="264"/>
-      </w:pPr>
-      <w:r>
-        <w:rPr>
-          <w:rFonts w:ascii="Calibri" w:cs="Calibri" w:eastAsia="Calibri" w:hAnsi="Calibri"/>
-          <w:b/>
-          <w:bCs/>
-          <w:i w:val="false"/>
-          <w:iCs w:val="false"/>
-          <w:color w:val="2BB3B1"/>
-          <w:sz w:val="20"/>
-          <w:szCs w:val="20"/>
-        </w:rPr>
-        <w:t xml:space="preserve">SAY  </w:t>
-      </w:r>
-      <w:r>
-        <w:rPr>
-          <w:rFonts w:ascii="Calibri" w:cs="Calibri" w:eastAsia="Calibri" w:hAnsi="Calibri"/>
-          <w:b w:val="false"/>
-          <w:bCs w:val="false"/>
-          <w:i/>
-          <w:iCs/>
-          <w:sz w:val="22"/>
-          <w:szCs w:val="22"/>
-        </w:rPr>
-        <w:t xml:space="preserve">First thing every team does: load and explore. Here's the obvious first answer: anything that can reach our altitude is a threat. That's thousands of objects. And it's wrong, because being at the same height isn't being in the same place at the same second.</w:t>
-      </w:r>
-    </w:p>
-    <w:p>
-      <w:pPr>
-        <w:spacing w:after="80" w:before="40" w:line="264"/>
-      </w:pPr>
-      <w:r>
-        <w:rPr>
-          <w:rFonts w:ascii="Calibri" w:cs="Calibri" w:eastAsia="Calibri" w:hAnsi="Calibri"/>
-          <w:b/>
-          <w:bCs/>
-          <w:i w:val="false"/>
-          <w:iCs w:val="false"/>
-          <w:color w:val="2BB3B1"/>
-          <w:sz w:val="20"/>
-          <w:szCs w:val="20"/>
-        </w:rPr>
-        <w:t xml:space="preserve">SAY  </w:t>
-      </w:r>
-      <w:r>
-        <w:rPr>
-          <w:rFonts w:ascii="Calibri" w:cs="Calibri" w:eastAsia="Calibri" w:hAnsi="Calibri"/>
-          <w:b w:val="false"/>
-          <w:bCs w:val="false"/>
-          <w:i/>
-          <w:iCs/>
-          <w:sz w:val="22"/>
-          <w:szCs w:val="22"/>
-        </w:rPr>
-        <w:t xml:space="preserve">This is the query that surprises people: a big share of what's up there came from two moments, 2007 and 2009. Kessler syndrome in one table.</w:t>
-      </w:r>
-    </w:p>
-    <w:p>
-      <w:pPr>
-        <w:spacing w:after="80" w:before="40" w:line="264"/>
-      </w:pPr>
-      <w:r>
-        <w:rPr>
-          <w:rFonts w:ascii="Calibri" w:cs="Calibri" w:eastAsia="Calibri" w:hAnsi="Calibri"/>
-          <w:b/>
-          <w:bCs/>
-          <w:i w:val="false"/>
-          <w:iCs w:val="false"/>
-          <w:color w:val="2BB3B1"/>
-          <w:sz w:val="20"/>
-          <w:szCs w:val="20"/>
-        </w:rPr>
-        <w:t xml:space="preserve">SAY  </w:t>
-      </w:r>
-      <w:r>
-        <w:rPr>
-          <w:rFonts w:ascii="Calibri" w:cs="Calibri" w:eastAsia="Calibri" w:hAnsi="Calibri"/>
-          <w:b w:val="false"/>
-          <w:bCs w:val="false"/>
-          <w:i/>
-          <w:iCs/>
-          <w:sz w:val="22"/>
-          <w:szCs w:val="22"/>
-        </w:rPr>
-        <w:t xml:space="preserve">And here's the honest answer for the week: 850 close approaches, and one worth escalating. Everything after this point is about that one.</w:t>
-      </w:r>
-    </w:p>
-    <w:p>
-      <w:pPr>
-        <w:spacing w:after="80" w:before="40" w:line="264"/>
-      </w:pPr>
-      <w:r>
-        <w:rPr>
-          <w:rFonts w:ascii="Calibri" w:cs="Calibri" w:eastAsia="Calibri" w:hAnsi="Calibri"/>
-          <w:b/>
-          <w:bCs/>
-          <w:i w:val="false"/>
-          <w:iCs w:val="false"/>
-          <w:color w:val="B07CFF"/>
-          <w:sz w:val="20"/>
-          <w:szCs w:val="20"/>
-        </w:rPr>
-        <w:t xml:space="preserve">NEEDS  </w:t>
-      </w:r>
-      <w:r>
-        <w:rPr>
-          <w:rFonts w:ascii="Calibri" w:cs="Calibri" w:eastAsia="Calibri" w:hAnsi="Calibri"/>
-          <w:b w:val="false"/>
-          <w:bCs w:val="false"/>
-          <w:i w:val="false"/>
-          <w:iCs w:val="false"/>
-          <w:sz w:val="20"/>
-          <w:szCs w:val="20"/>
-        </w:rPr>
-        <w:t xml:space="preserve">demo_01_load_explore.ipynb, already run end to end (Runtime ▸ Run all, this morning, same project).</w:t>
       </w:r>
     </w:p>
     <w:tbl>
@@ -5090,38 +4920,7 @@
                 <w:sz w:val="20"/>
                 <w:szCs w:val="20"/>
               </w:rPr>
-              <w:t xml:space="preserve">Table of contents ▸ 3—The wrong answer first</w:t>
-            </w:r>
-          </w:p>
-          <w:p>
-            <w:pPr>
-              <w:spacing w:after="0" w:before="60" w:line="264"/>
-            </w:pPr>
-            <w:r>
-              <w:rPr>
-                <w:rFonts w:ascii="Calibri" w:cs="Calibri" w:eastAsia="Calibri" w:hAnsi="Calibri"/>
-                <w:b/>
-                <w:bCs/>
-                <w:i w:val="false"/>
-                <w:iCs w:val="false"/>
-                <w:color w:val="2ECC71"/>
-                <w:sz w:val="19"/>
-                <w:szCs w:val="19"/>
-              </w:rPr>
-              <w:t xml:space="preserve">→ </w:t>
-            </w:r>
-            <w:r>
-              <w:rPr>
-                <w:rFonts w:ascii="Calibri" w:cs="Calibri" w:eastAsia="Calibri" w:hAnsi="Calibri"/>
-                <w:b w:val="false"/>
-                <w:bCs w:val="false"/>
-                <w:i w:val="false"/>
-                <w:iCs w:val="false"/>
-                <w:color w:val="9AA4B2"/>
-                <w:sz w:val="19"/>
-                <w:szCs w:val="19"/>
-              </w:rPr>
-              <w:t xml:space="preserve">Thousands of objects whose orbit crosses our 880 km altitude. Every one of them really is at our height.</w:t>
+              <w:t xml:space="preserve">Point at the box's table: the five build-path steps, each with the folder that solves it.</w:t>
             </w:r>
           </w:p>
         </w:tc>
@@ -5167,10 +4966,10 @@
           <w:tcPr>
             <w:tcW w:type="dxa" w:w="10080"/>
             <w:tcBorders>
-              <w:top w:val="single" w:color="2BB3B1" w:sz="12"/>
-              <w:left w:val="single" w:color="2BB3B1" w:sz="12"/>
-              <w:bottom w:val="single" w:color="2BB3B1" w:sz="12"/>
-              <w:right w:val="single" w:color="2BB3B1" w:sz="12"/>
+              <w:top w:val="single" w:color="B07CFF" w:sz="12"/>
+              <w:left w:val="single" w:color="B07CFF" w:sz="12"/>
+              <w:bottom w:val="single" w:color="B07CFF" w:sz="12"/>
+              <w:right w:val="single" w:color="B07CFF" w:sz="12"/>
             </w:tcBorders>
             <w:tcMar>
               <w:top w:type="dxa" w:w="80"/>
@@ -5190,11 +4989,11 @@
                 <w:bCs/>
                 <w:i w:val="false"/>
                 <w:iCs w:val="false"/>
-                <w:color w:val="2BB3B1"/>
+                <w:color w:val="B07CFF"/>
                 <w:sz w:val="18"/>
                 <w:szCs w:val="18"/>
               </w:rPr>
-              <w:t xml:space="preserve">SAY</w:t>
+              <w:t xml:space="preserve">DO</w:t>
             </w:r>
           </w:p>
           <w:p>
@@ -5206,12 +5005,12 @@
                 <w:rFonts w:ascii="Calibri" w:cs="Calibri" w:eastAsia="Calibri" w:hAnsi="Calibri"/>
                 <w:b w:val="false"/>
                 <w:bCs w:val="false"/>
-                <w:i/>
-                <w:iCs/>
+                <w:i w:val="false"/>
+                <w:iCs w:val="false"/>
                 <w:sz w:val="20"/>
                 <w:szCs w:val="20"/>
               </w:rPr>
-              <w:t xml:space="preserve">Same height is not same place. Altitude is a filter, not an answer.</w:t>
+              <w:t xml:space="preserve">Scroll to Why this one matters: a small constellation, 32,000 tracked objects, warnings that never stop.</w:t>
             </w:r>
           </w:p>
         </w:tc>
@@ -5232,6 +5031,176 @@
           <w:szCs w:val="22"/>
         </w:rPr>
         <w:t xml:space="preserve"/>
+      </w:r>
+    </w:p>
+    <w:p>
+      <w:pPr>
+        <w:pStyle w:val="Heading3"/>
+        <w:keepNext/>
+        <w:spacing w:after="40" w:before="160"/>
+      </w:pPr>
+      <w:r>
+        <w:rPr>
+          <w:rFonts w:ascii="Calibri" w:cs="Calibri" w:eastAsia="Calibri" w:hAnsi="Calibri"/>
+          <w:b/>
+          <w:bCs/>
+          <w:i w:val="false"/>
+          <w:iCs w:val="false"/>
+          <w:color w:val="3D8BFF"/>
+          <w:sz w:val="22"/>
+          <w:szCs w:val="22"/>
+        </w:rPr>
+        <w:t xml:space="preserve">2. Load &amp; Explore: load it, distrust it, validate it   ·   TAB · COLAB ENTERPRISE · THE DATA NOTEBOOK   ·   ~1.5 min</w:t>
+      </w:r>
+    </w:p>
+    <w:p>
+      <w:pPr>
+        <w:spacing w:after="80" w:before="40" w:line="264"/>
+      </w:pPr>
+      <w:r>
+        <w:rPr>
+          <w:rFonts w:ascii="Calibri" w:cs="Calibri" w:eastAsia="Calibri" w:hAnsi="Calibri"/>
+          <w:b/>
+          <w:bCs/>
+          <w:i w:val="false"/>
+          <w:iCs w:val="false"/>
+          <w:color w:val="2ECC71"/>
+          <w:sz w:val="20"/>
+          <w:szCs w:val="20"/>
+        </w:rPr>
+        <w:t xml:space="preserve">WHY  </w:t>
+      </w:r>
+      <w:r>
+        <w:rPr>
+          <w:rFonts w:ascii="Calibri" w:cs="Calibri" w:eastAsia="Calibri" w:hAnsi="Calibri"/>
+          <w:b w:val="false"/>
+          <w:bCs w:val="false"/>
+          <w:i w:val="false"/>
+          <w:iCs w:val="false"/>
+          <w:sz w:val="22"/>
+          <w:szCs w:val="22"/>
+        </w:rPr>
+        <w:t xml:space="preserve">The data lane's job: load real data, find what's wrong with it, and hand the agent clean, validated tables in BigQuery.</w:t>
+      </w:r>
+    </w:p>
+    <w:p>
+      <w:pPr>
+        <w:spacing w:after="80" w:before="40" w:line="264"/>
+      </w:pPr>
+      <w:r>
+        <w:rPr>
+          <w:rFonts w:ascii="Calibri" w:cs="Calibri" w:eastAsia="Calibri" w:hAnsi="Calibri"/>
+          <w:b/>
+          <w:bCs/>
+          <w:i w:val="false"/>
+          <w:iCs w:val="false"/>
+          <w:color w:val="2BB3B1"/>
+          <w:sz w:val="20"/>
+          <w:szCs w:val="20"/>
+        </w:rPr>
+        <w:t xml:space="preserve">SAY  </w:t>
+      </w:r>
+      <w:r>
+        <w:rPr>
+          <w:rFonts w:ascii="Calibri" w:cs="Calibri" w:eastAsia="Calibri" w:hAnsi="Calibri"/>
+          <w:b w:val="false"/>
+          <w:bCs w:val="false"/>
+          <w:i/>
+          <w:iCs/>
+          <w:sz w:val="22"/>
+          <w:szCs w:val="22"/>
+        </w:rPr>
+        <w:t xml:space="preserve">First thing every team does: load and explore. Here's the obvious first answer: anything that can reach our altitude is a threat. That's thousands of objects. And it's wrong, because being at the same height isn't being in the same place at the same second.</w:t>
+      </w:r>
+    </w:p>
+    <w:p>
+      <w:pPr>
+        <w:spacing w:after="80" w:before="40" w:line="264"/>
+      </w:pPr>
+      <w:r>
+        <w:rPr>
+          <w:rFonts w:ascii="Calibri" w:cs="Calibri" w:eastAsia="Calibri" w:hAnsi="Calibri"/>
+          <w:b/>
+          <w:bCs/>
+          <w:i w:val="false"/>
+          <w:iCs w:val="false"/>
+          <w:color w:val="2BB3B1"/>
+          <w:sz w:val="20"/>
+          <w:szCs w:val="20"/>
+        </w:rPr>
+        <w:t xml:space="preserve">SAY  </w:t>
+      </w:r>
+      <w:r>
+        <w:rPr>
+          <w:rFonts w:ascii="Calibri" w:cs="Calibri" w:eastAsia="Calibri" w:hAnsi="Calibri"/>
+          <w:b w:val="false"/>
+          <w:bCs w:val="false"/>
+          <w:i/>
+          <w:iCs/>
+          <w:sz w:val="22"/>
+          <w:szCs w:val="22"/>
+        </w:rPr>
+        <w:t xml:space="preserve">This is the query that surprises people: a big share of what's up there came from two moments, 2007 and 2009. Kessler syndrome in one table.</w:t>
+      </w:r>
+    </w:p>
+    <w:p>
+      <w:pPr>
+        <w:spacing w:after="80" w:before="40" w:line="264"/>
+      </w:pPr>
+      <w:r>
+        <w:rPr>
+          <w:rFonts w:ascii="Calibri" w:cs="Calibri" w:eastAsia="Calibri" w:hAnsi="Calibri"/>
+          <w:b/>
+          <w:bCs/>
+          <w:i w:val="false"/>
+          <w:iCs w:val="false"/>
+          <w:color w:val="2BB3B1"/>
+          <w:sz w:val="20"/>
+          <w:szCs w:val="20"/>
+        </w:rPr>
+        <w:t xml:space="preserve">SAY  </w:t>
+      </w:r>
+      <w:r>
+        <w:rPr>
+          <w:rFonts w:ascii="Calibri" w:cs="Calibri" w:eastAsia="Calibri" w:hAnsi="Calibri"/>
+          <w:b w:val="false"/>
+          <w:bCs w:val="false"/>
+          <w:i/>
+          <w:iCs/>
+          <w:sz w:val="22"/>
+          <w:szCs w:val="22"/>
+        </w:rPr>
+        <w:t xml:space="preserve">And here's the honest answer for the week: 850 close approaches, and one worth escalating. Everything after this point is about that one.</w:t>
+      </w:r>
+    </w:p>
+    <w:p>
+      <w:pPr>
+        <w:spacing w:after="80" w:before="40" w:line="264"/>
+      </w:pPr>
+      <w:r>
+        <w:rPr>
+          <w:rFonts w:ascii="Calibri" w:cs="Calibri" w:eastAsia="Calibri" w:hAnsi="Calibri"/>
+          <w:b/>
+          <w:bCs/>
+          <w:i w:val="false"/>
+          <w:iCs w:val="false"/>
+          <w:color w:val="B07CFF"/>
+          <w:sz w:val="20"/>
+          <w:szCs w:val="20"/>
+        </w:rPr>
+        <w:t xml:space="preserve">NEEDS  </w:t>
+      </w:r>
+      <w:r>
+        <w:rPr>
+          <w:rFonts w:ascii="Calibri" w:cs="Calibri" w:eastAsia="Calibri" w:hAnsi="Calibri"/>
+          <w:b w:val="false"/>
+          <w:bCs w:val="false"/>
+          <w:i w:val="false"/>
+          <w:iCs w:val="false"/>
+          <w:sz w:val="20"/>
+          <w:szCs w:val="20"/>
+        </w:rPr>
+        <w:t xml:space="preserve">demo_01_load_explore.ipynb, already run end to end (Runtime ▸ Run all, this morning, same project).</w:t>
       </w:r>
     </w:p>
     <w:tbl>
@@ -5301,7 +5270,7 @@
                 <w:sz w:val="20"/>
                 <w:szCs w:val="20"/>
               </w:rPr>
-              <w:t xml:space="preserve">Table of contents ▸ 7—What the data says ▸ the hook query</w:t>
+              <w:t xml:space="preserve">Table of contents ▸ 3—The wrong answer first</w:t>
             </w:r>
           </w:p>
           <w:p>
@@ -5332,7 +5301,7 @@
                 <w:sz w:val="19"/>
                 <w:szCs w:val="19"/>
               </w:rPr>
-              <w:t xml:space="preserve">About a quarter of what crosses our altitude comes from two events: the 2007 anti-satellite test and the 2009 collision.</w:t>
+              <w:t xml:space="preserve">Thousands of objects whose orbit crosses our 880 km altitude. Every one of them really is at our height.</w:t>
             </w:r>
           </w:p>
         </w:tc>
@@ -5378,10 +5347,10 @@
           <w:tcPr>
             <w:tcW w:type="dxa" w:w="10080"/>
             <w:tcBorders>
-              <w:top w:val="single" w:color="B07CFF" w:sz="12"/>
-              <w:left w:val="single" w:color="B07CFF" w:sz="12"/>
-              <w:bottom w:val="single" w:color="B07CFF" w:sz="12"/>
-              <w:right w:val="single" w:color="B07CFF" w:sz="12"/>
+              <w:top w:val="single" w:color="2BB3B1" w:sz="12"/>
+              <w:left w:val="single" w:color="2BB3B1" w:sz="12"/>
+              <w:bottom w:val="single" w:color="2BB3B1" w:sz="12"/>
+              <w:right w:val="single" w:color="2BB3B1" w:sz="12"/>
             </w:tcBorders>
             <w:tcMar>
               <w:top w:type="dxa" w:w="80"/>
@@ -5401,11 +5370,11 @@
                 <w:bCs/>
                 <w:i w:val="false"/>
                 <w:iCs w:val="false"/>
-                <w:color w:val="B07CFF"/>
+                <w:color w:val="2BB3B1"/>
                 <w:sz w:val="18"/>
                 <w:szCs w:val="18"/>
               </w:rPr>
-              <w:t xml:space="preserve">DO</w:t>
+              <w:t xml:space="preserve">SAY</w:t>
             </w:r>
           </w:p>
           <w:p>
@@ -5417,43 +5386,12 @@
                 <w:rFonts w:ascii="Calibri" w:cs="Calibri" w:eastAsia="Calibri" w:hAnsi="Calibri"/>
                 <w:b w:val="false"/>
                 <w:bCs w:val="false"/>
-                <w:i w:val="false"/>
-                <w:iCs w:val="false"/>
+                <w:i/>
+                <w:iCs/>
                 <w:sz w:val="20"/>
                 <w:szCs w:val="20"/>
               </w:rPr>
-              <w:t xml:space="preserve">Table of contents ▸ 10—The honest numbers</w:t>
-            </w:r>
-          </w:p>
-          <w:p>
-            <w:pPr>
-              <w:spacing w:after="0" w:before="60" w:line="264"/>
-            </w:pPr>
-            <w:r>
-              <w:rPr>
-                <w:rFonts w:ascii="Calibri" w:cs="Calibri" w:eastAsia="Calibri" w:hAnsi="Calibri"/>
-                <w:b/>
-                <w:bCs/>
-                <w:i w:val="false"/>
-                <w:iCs w:val="false"/>
-                <w:color w:val="2ECC71"/>
-                <w:sz w:val="19"/>
-                <w:szCs w:val="19"/>
-              </w:rPr>
-              <w:t xml:space="preserve">→ </w:t>
-            </w:r>
-            <w:r>
-              <w:rPr>
-                <w:rFonts w:ascii="Calibri" w:cs="Calibri" w:eastAsia="Calibri" w:hAnsi="Calibri"/>
-                <w:b w:val="false"/>
-                <w:bCs w:val="false"/>
-                <w:i w:val="false"/>
-                <w:iCs w:val="false"/>
-                <w:color w:val="9AA4B2"/>
-                <w:sz w:val="19"/>
-                <w:szCs w:val="19"/>
-              </w:rPr>
-              <w:t xml:space="preserve">850 approaches under 10 km this week: 1 ESCALATE, 7 WATCH, 842 noise.</w:t>
+              <w:t xml:space="preserve">Same height is not same place. Altitude is a filter, not an answer.</w:t>
             </w:r>
           </w:p>
         </w:tc>
@@ -5474,193 +5412,6 @@
           <w:szCs w:val="22"/>
         </w:rPr>
         <w:t xml:space="preserve"/>
-      </w:r>
-    </w:p>
-    <w:p>
-      <w:pPr>
-        <w:spacing w:after="80" w:before="40" w:line="264"/>
-      </w:pPr>
-      <w:r>
-        <w:rPr>
-          <w:rFonts w:ascii="Calibri" w:cs="Calibri" w:eastAsia="Calibri" w:hAnsi="Calibri"/>
-          <w:b w:val="false"/>
-          <w:bCs w:val="false"/>
-          <w:i w:val="false"/>
-          <w:iCs w:val="false"/>
-          <w:sz w:val="22"/>
-          <w:szCs w:val="22"/>
-        </w:rPr>
-        <w:t xml:space="preserve">The notebook also carries the real messes we hit (the end of the old TLE format, stale tracking, a timestamp BigQuery refused) and a validation section that re-reads the loaded tables. Mention them only if someone asks: they're what the data lane will live through.</w:t>
-      </w:r>
-    </w:p>
-    <w:p>
-      <w:pPr>
-        <w:spacing w:after="80" w:before="40" w:line="264"/>
-      </w:pPr>
-      <w:r>
-        <w:rPr>
-          <w:rFonts w:ascii="Calibri" w:cs="Calibri" w:eastAsia="Calibri" w:hAnsi="Calibri"/>
-          <w:b/>
-          <w:bCs/>
-          <w:i w:val="false"/>
-          <w:iCs w:val="false"/>
-          <w:color w:val="FF5C5C"/>
-          <w:sz w:val="20"/>
-          <w:szCs w:val="20"/>
-        </w:rPr>
-        <w:t xml:space="preserve">GOTCHA  </w:t>
-      </w:r>
-      <w:r>
-        <w:rPr>
-          <w:rFonts w:ascii="Calibri" w:cs="Calibri" w:eastAsia="Calibri" w:hAnsi="Calibri"/>
-          <w:b w:val="false"/>
-          <w:bCs w:val="false"/>
-          <w:i w:val="false"/>
-          <w:iCs w:val="false"/>
-          <w:sz w:val="20"/>
-          <w:szCs w:val="20"/>
-        </w:rPr>
-        <w:t xml:space="preserve">If the outputs are gone (kernel restarted), don't re-run live: the screen takes two minutes. Say the numbers from this page and move on.</w:t>
-      </w:r>
-    </w:p>
-    <w:p>
-      <w:pPr>
-        <w:pStyle w:val="Heading3"/>
-        <w:keepNext/>
-        <w:spacing w:after="40" w:before="160"/>
-      </w:pPr>
-      <w:r>
-        <w:rPr>
-          <w:rFonts w:ascii="Calibri" w:cs="Calibri" w:eastAsia="Calibri" w:hAnsi="Calibri"/>
-          <w:b/>
-          <w:bCs/>
-          <w:i w:val="false"/>
-          <w:iCs w:val="false"/>
-          <w:color w:val="3D8BFF"/>
-          <w:sz w:val="22"/>
-          <w:szCs w:val="22"/>
-        </w:rPr>
-        <w:t xml:space="preserve">3. Build: an agent on the required stack   ·   TAB · ADK WEB UI · PORT 8000   ·   ~1.5 min</w:t>
-      </w:r>
-    </w:p>
-    <w:p>
-      <w:pPr>
-        <w:spacing w:after="80" w:before="40" w:line="264"/>
-      </w:pPr>
-      <w:r>
-        <w:rPr>
-          <w:rFonts w:ascii="Calibri" w:cs="Calibri" w:eastAsia="Calibri" w:hAnsi="Calibri"/>
-          <w:b/>
-          <w:bCs/>
-          <w:i w:val="false"/>
-          <w:iCs w:val="false"/>
-          <w:color w:val="2ECC71"/>
-          <w:sz w:val="20"/>
-          <w:szCs w:val="20"/>
-        </w:rPr>
-        <w:t xml:space="preserve">WHY  </w:t>
-      </w:r>
-      <w:r>
-        <w:rPr>
-          <w:rFonts w:ascii="Calibri" w:cs="Calibri" w:eastAsia="Calibri" w:hAnsi="Calibri"/>
-          <w:b w:val="false"/>
-          <w:bCs w:val="false"/>
-          <w:i w:val="false"/>
-          <w:iCs w:val="false"/>
-          <w:sz w:val="22"/>
-          <w:szCs w:val="22"/>
-        </w:rPr>
-        <w:t xml:space="preserve">The agent lane's required stack, visible in one answer: ADK, Gemini, BigQuery, a managed MCP server.</w:t>
-      </w:r>
-    </w:p>
-    <w:p>
-      <w:pPr>
-        <w:spacing w:after="80" w:before="40" w:line="264"/>
-      </w:pPr>
-      <w:r>
-        <w:rPr>
-          <w:rFonts w:ascii="Calibri" w:cs="Calibri" w:eastAsia="Calibri" w:hAnsi="Calibri"/>
-          <w:b/>
-          <w:bCs/>
-          <w:i w:val="false"/>
-          <w:iCs w:val="false"/>
-          <w:color w:val="2BB3B1"/>
-          <w:sz w:val="20"/>
-          <w:szCs w:val="20"/>
-        </w:rPr>
-        <w:t xml:space="preserve">SAY  </w:t>
-      </w:r>
-      <w:r>
-        <w:rPr>
-          <w:rFonts w:ascii="Calibri" w:cs="Calibri" w:eastAsia="Calibri" w:hAnsi="Calibri"/>
-          <w:b w:val="false"/>
-          <w:bCs w:val="false"/>
-          <w:i/>
-          <w:iCs/>
-          <w:sz w:val="22"/>
-          <w:szCs w:val="22"/>
-        </w:rPr>
-        <w:t xml:space="preserve">Second step: build the agent. Same required stack as yours: ADK, Gemini, BigQuery, and a Google-managed MCP server it uses to query the tables.</w:t>
-      </w:r>
-    </w:p>
-    <w:p>
-      <w:pPr>
-        <w:spacing w:after="80" w:before="40" w:line="264"/>
-      </w:pPr>
-      <w:r>
-        <w:rPr>
-          <w:rFonts w:ascii="Calibri" w:cs="Calibri" w:eastAsia="Calibri" w:hAnsi="Calibri"/>
-          <w:b/>
-          <w:bCs/>
-          <w:i w:val="false"/>
-          <w:iCs w:val="false"/>
-          <w:color w:val="2BB3B1"/>
-          <w:sz w:val="20"/>
-          <w:szCs w:val="20"/>
-        </w:rPr>
-        <w:t xml:space="preserve">SAY  </w:t>
-      </w:r>
-      <w:r>
-        <w:rPr>
-          <w:rFonts w:ascii="Calibri" w:cs="Calibri" w:eastAsia="Calibri" w:hAnsi="Calibri"/>
-          <w:b w:val="false"/>
-          <w:bCs w:val="false"/>
-          <w:i/>
-          <w:iCs/>
-          <w:sz w:val="22"/>
-          <w:szCs w:val="22"/>
-        </w:rPr>
-        <w:t xml:space="preserve">Watch what it does: it decided that question needs a query, wrote it, ran it through the MCP server, and summarised. Nobody wrote that SQL for it.</w:t>
-      </w:r>
-    </w:p>
-    <w:p>
-      <w:pPr>
-        <w:spacing w:after="80" w:before="40" w:line="264"/>
-      </w:pPr>
-      <w:r>
-        <w:rPr>
-          <w:rFonts w:ascii="Calibri" w:cs="Calibri" w:eastAsia="Calibri" w:hAnsi="Calibri"/>
-          <w:b/>
-          <w:bCs/>
-          <w:i w:val="false"/>
-          <w:iCs w:val="false"/>
-          <w:color w:val="B07CFF"/>
-          <w:sz w:val="20"/>
-          <w:szCs w:val="20"/>
-        </w:rPr>
-        <w:t xml:space="preserve">NEEDS  </w:t>
-      </w:r>
-      <w:r>
-        <w:rPr>
-          <w:rFonts w:ascii="Calibri" w:cs="Calibri" w:eastAsia="Calibri" w:hAnsi="Calibri"/>
-          <w:b w:val="false"/>
-          <w:bCs w:val="false"/>
-          <w:i w:val="false"/>
-          <w:iCs w:val="false"/>
-          <w:sz w:val="20"/>
-          <w:szCs w:val="20"/>
-        </w:rPr>
-        <w:t xml:space="preserve">cymbal_ops selected, new session.</w:t>
       </w:r>
     </w:p>
     <w:tbl>
@@ -5686,10 +5437,10 @@
           <w:tcPr>
             <w:tcW w:type="dxa" w:w="10080"/>
             <w:tcBorders>
-              <w:top w:val="single" w:color="F28C28" w:sz="12"/>
-              <w:left w:val="single" w:color="F28C28" w:sz="36"/>
-              <w:bottom w:val="single" w:color="F28C28" w:sz="12"/>
-              <w:right w:val="single" w:color="F28C28" w:sz="12"/>
+              <w:top w:val="single" w:color="B07CFF" w:sz="12"/>
+              <w:left w:val="single" w:color="B07CFF" w:sz="12"/>
+              <w:bottom w:val="single" w:color="B07CFF" w:sz="12"/>
+              <w:right w:val="single" w:color="B07CFF" w:sz="12"/>
             </w:tcBorders>
             <w:tcMar>
               <w:top w:type="dxa" w:w="80"/>
@@ -5709,11 +5460,11 @@
                 <w:bCs/>
                 <w:i w:val="false"/>
                 <w:iCs w:val="false"/>
-                <w:color w:val="F28C28"/>
+                <w:color w:val="B07CFF"/>
                 <w:sz w:val="18"/>
                 <w:szCs w:val="18"/>
               </w:rPr>
-              <w:t xml:space="preserve">TYPE in the ADK web UI</w:t>
+              <w:t xml:space="preserve">DO</w:t>
             </w:r>
           </w:p>
           <w:p>
@@ -5722,15 +5473,15 @@
             </w:pPr>
             <w:r>
               <w:rPr>
-                <w:rFonts w:ascii="Consolas" w:cs="Consolas" w:eastAsia="Consolas" w:hAnsi="Consolas"/>
-                <w:b w:val="false"/>
-                <w:bCs w:val="false"/>
-                <w:i w:val="false"/>
-                <w:iCs w:val="false"/>
-                <w:sz w:val="19"/>
-                <w:szCs w:val="19"/>
-              </w:rPr>
-              <w:t xml:space="preserve">What should we worry about this week?</w:t>
+                <w:rFonts w:ascii="Calibri" w:cs="Calibri" w:eastAsia="Calibri" w:hAnsi="Calibri"/>
+                <w:b w:val="false"/>
+                <w:bCs w:val="false"/>
+                <w:i w:val="false"/>
+                <w:iCs w:val="false"/>
+                <w:sz w:val="20"/>
+                <w:szCs w:val="20"/>
+              </w:rPr>
+              <w:t xml:space="preserve">Table of contents ▸ 7—What the data says ▸ the hook query</w:t>
             </w:r>
           </w:p>
           <w:p>
@@ -5761,7 +5512,7 @@
                 <w:sz w:val="19"/>
                 <w:szCs w:val="19"/>
               </w:rPr>
-              <w:t xml:space="preserve">One to escalate: CYMBAL-04 vs FENGYUN 1C DEB, Fri 25 Sep 20:16 UTC, 301.1 m, worst-case 1.01e-04. CYMBAL-01's pass is two minutes away and can't be acted on. About 15 s.</w:t>
+              <w:t xml:space="preserve">About a quarter of what crosses our altitude comes from two events: the 2007 anti-satellite test and the 2009 collision.</w:t>
             </w:r>
           </w:p>
         </w:tc>
@@ -5807,10 +5558,10 @@
           <w:tcPr>
             <w:tcW w:type="dxa" w:w="10080"/>
             <w:tcBorders>
-              <w:top w:val="single" w:color="2BB3B1" w:sz="12"/>
-              <w:left w:val="single" w:color="2BB3B1" w:sz="12"/>
-              <w:bottom w:val="single" w:color="2BB3B1" w:sz="12"/>
-              <w:right w:val="single" w:color="2BB3B1" w:sz="12"/>
+              <w:top w:val="single" w:color="B07CFF" w:sz="12"/>
+              <w:left w:val="single" w:color="B07CFF" w:sz="12"/>
+              <w:bottom w:val="single" w:color="B07CFF" w:sz="12"/>
+              <w:right w:val="single" w:color="B07CFF" w:sz="12"/>
             </w:tcBorders>
             <w:tcMar>
               <w:top w:type="dxa" w:w="80"/>
@@ -5830,11 +5581,11 @@
                 <w:bCs/>
                 <w:i w:val="false"/>
                 <w:iCs w:val="false"/>
-                <w:color w:val="2BB3B1"/>
+                <w:color w:val="B07CFF"/>
                 <w:sz w:val="18"/>
                 <w:szCs w:val="18"/>
               </w:rPr>
-              <w:t xml:space="preserve">SAY</w:t>
+              <w:t xml:space="preserve">DO</w:t>
             </w:r>
           </w:p>
           <w:p>
@@ -5846,12 +5597,43 @@
                 <w:rFonts w:ascii="Calibri" w:cs="Calibri" w:eastAsia="Calibri" w:hAnsi="Calibri"/>
                 <w:b w:val="false"/>
                 <w:bCs w:val="false"/>
-                <w:i/>
-                <w:iCs/>
+                <w:i w:val="false"/>
+                <w:iCs w:val="false"/>
                 <w:sz w:val="20"/>
                 <w:szCs w:val="20"/>
               </w:rPr>
-              <w:t xml:space="preserve">While it works: ADK is the frame, Gemini is the reasoning, and it reads BigQuery through Google's managed MCP server.</w:t>
+              <w:t xml:space="preserve">Table of contents ▸ 10—The honest numbers</w:t>
+            </w:r>
+          </w:p>
+          <w:p>
+            <w:pPr>
+              <w:spacing w:after="0" w:before="60" w:line="264"/>
+            </w:pPr>
+            <w:r>
+              <w:rPr>
+                <w:rFonts w:ascii="Calibri" w:cs="Calibri" w:eastAsia="Calibri" w:hAnsi="Calibri"/>
+                <w:b/>
+                <w:bCs/>
+                <w:i w:val="false"/>
+                <w:iCs w:val="false"/>
+                <w:color w:val="2ECC71"/>
+                <w:sz w:val="19"/>
+                <w:szCs w:val="19"/>
+              </w:rPr>
+              <w:t xml:space="preserve">→ </w:t>
+            </w:r>
+            <w:r>
+              <w:rPr>
+                <w:rFonts w:ascii="Calibri" w:cs="Calibri" w:eastAsia="Calibri" w:hAnsi="Calibri"/>
+                <w:b w:val="false"/>
+                <w:bCs w:val="false"/>
+                <w:i w:val="false"/>
+                <w:iCs w:val="false"/>
+                <w:color w:val="9AA4B2"/>
+                <w:sz w:val="19"/>
+                <w:szCs w:val="19"/>
+              </w:rPr>
+              <w:t xml:space="preserve">850 approaches under 10 km this week: 1 ESCALATE, 7 WATCH, 842 noise.</w:t>
             </w:r>
           </w:p>
         </w:tc>
@@ -5872,6 +5654,193 @@
           <w:szCs w:val="22"/>
         </w:rPr>
         <w:t xml:space="preserve"/>
+      </w:r>
+    </w:p>
+    <w:p>
+      <w:pPr>
+        <w:spacing w:after="80" w:before="40" w:line="264"/>
+      </w:pPr>
+      <w:r>
+        <w:rPr>
+          <w:rFonts w:ascii="Calibri" w:cs="Calibri" w:eastAsia="Calibri" w:hAnsi="Calibri"/>
+          <w:b w:val="false"/>
+          <w:bCs w:val="false"/>
+          <w:i w:val="false"/>
+          <w:iCs w:val="false"/>
+          <w:sz w:val="22"/>
+          <w:szCs w:val="22"/>
+        </w:rPr>
+        <w:t xml:space="preserve">The notebook also carries the real messes we hit (the end of the old TLE format, stale tracking, a timestamp BigQuery refused) and a validation section that re-reads the loaded tables. Mention them only if someone asks: they're what the data lane will live through.</w:t>
+      </w:r>
+    </w:p>
+    <w:p>
+      <w:pPr>
+        <w:spacing w:after="80" w:before="40" w:line="264"/>
+      </w:pPr>
+      <w:r>
+        <w:rPr>
+          <w:rFonts w:ascii="Calibri" w:cs="Calibri" w:eastAsia="Calibri" w:hAnsi="Calibri"/>
+          <w:b/>
+          <w:bCs/>
+          <w:i w:val="false"/>
+          <w:iCs w:val="false"/>
+          <w:color w:val="FF5C5C"/>
+          <w:sz w:val="20"/>
+          <w:szCs w:val="20"/>
+        </w:rPr>
+        <w:t xml:space="preserve">GOTCHA  </w:t>
+      </w:r>
+      <w:r>
+        <w:rPr>
+          <w:rFonts w:ascii="Calibri" w:cs="Calibri" w:eastAsia="Calibri" w:hAnsi="Calibri"/>
+          <w:b w:val="false"/>
+          <w:bCs w:val="false"/>
+          <w:i w:val="false"/>
+          <w:iCs w:val="false"/>
+          <w:sz w:val="20"/>
+          <w:szCs w:val="20"/>
+        </w:rPr>
+        <w:t xml:space="preserve">If the outputs are gone (kernel restarted), don't re-run live: the screen takes two minutes. Say the numbers from this page and move on.</w:t>
+      </w:r>
+    </w:p>
+    <w:p>
+      <w:pPr>
+        <w:pStyle w:val="Heading3"/>
+        <w:keepNext/>
+        <w:spacing w:after="40" w:before="160"/>
+      </w:pPr>
+      <w:r>
+        <w:rPr>
+          <w:rFonts w:ascii="Calibri" w:cs="Calibri" w:eastAsia="Calibri" w:hAnsi="Calibri"/>
+          <w:b/>
+          <w:bCs/>
+          <w:i w:val="false"/>
+          <w:iCs w:val="false"/>
+          <w:color w:val="3D8BFF"/>
+          <w:sz w:val="22"/>
+          <w:szCs w:val="22"/>
+        </w:rPr>
+        <w:t xml:space="preserve">3. Build: an agent on the required stack   ·   TAB · ADK WEB UI · PORT 8000   ·   ~1.5 min</w:t>
+      </w:r>
+    </w:p>
+    <w:p>
+      <w:pPr>
+        <w:spacing w:after="80" w:before="40" w:line="264"/>
+      </w:pPr>
+      <w:r>
+        <w:rPr>
+          <w:rFonts w:ascii="Calibri" w:cs="Calibri" w:eastAsia="Calibri" w:hAnsi="Calibri"/>
+          <w:b/>
+          <w:bCs/>
+          <w:i w:val="false"/>
+          <w:iCs w:val="false"/>
+          <w:color w:val="2ECC71"/>
+          <w:sz w:val="20"/>
+          <w:szCs w:val="20"/>
+        </w:rPr>
+        <w:t xml:space="preserve">WHY  </w:t>
+      </w:r>
+      <w:r>
+        <w:rPr>
+          <w:rFonts w:ascii="Calibri" w:cs="Calibri" w:eastAsia="Calibri" w:hAnsi="Calibri"/>
+          <w:b w:val="false"/>
+          <w:bCs w:val="false"/>
+          <w:i w:val="false"/>
+          <w:iCs w:val="false"/>
+          <w:sz w:val="22"/>
+          <w:szCs w:val="22"/>
+        </w:rPr>
+        <w:t xml:space="preserve">The agent lane's required stack, visible in one answer: ADK, Gemini, BigQuery, a managed MCP server.</w:t>
+      </w:r>
+    </w:p>
+    <w:p>
+      <w:pPr>
+        <w:spacing w:after="80" w:before="40" w:line="264"/>
+      </w:pPr>
+      <w:r>
+        <w:rPr>
+          <w:rFonts w:ascii="Calibri" w:cs="Calibri" w:eastAsia="Calibri" w:hAnsi="Calibri"/>
+          <w:b/>
+          <w:bCs/>
+          <w:i w:val="false"/>
+          <w:iCs w:val="false"/>
+          <w:color w:val="2BB3B1"/>
+          <w:sz w:val="20"/>
+          <w:szCs w:val="20"/>
+        </w:rPr>
+        <w:t xml:space="preserve">SAY  </w:t>
+      </w:r>
+      <w:r>
+        <w:rPr>
+          <w:rFonts w:ascii="Calibri" w:cs="Calibri" w:eastAsia="Calibri" w:hAnsi="Calibri"/>
+          <w:b w:val="false"/>
+          <w:bCs w:val="false"/>
+          <w:i/>
+          <w:iCs/>
+          <w:sz w:val="22"/>
+          <w:szCs w:val="22"/>
+        </w:rPr>
+        <w:t xml:space="preserve">Second step: build the agent. Same required stack as yours: ADK, Gemini, BigQuery, and a Google-managed MCP server it uses to query the tables.</w:t>
+      </w:r>
+    </w:p>
+    <w:p>
+      <w:pPr>
+        <w:spacing w:after="80" w:before="40" w:line="264"/>
+      </w:pPr>
+      <w:r>
+        <w:rPr>
+          <w:rFonts w:ascii="Calibri" w:cs="Calibri" w:eastAsia="Calibri" w:hAnsi="Calibri"/>
+          <w:b/>
+          <w:bCs/>
+          <w:i w:val="false"/>
+          <w:iCs w:val="false"/>
+          <w:color w:val="2BB3B1"/>
+          <w:sz w:val="20"/>
+          <w:szCs w:val="20"/>
+        </w:rPr>
+        <w:t xml:space="preserve">SAY  </w:t>
+      </w:r>
+      <w:r>
+        <w:rPr>
+          <w:rFonts w:ascii="Calibri" w:cs="Calibri" w:eastAsia="Calibri" w:hAnsi="Calibri"/>
+          <w:b w:val="false"/>
+          <w:bCs w:val="false"/>
+          <w:i/>
+          <w:iCs/>
+          <w:sz w:val="22"/>
+          <w:szCs w:val="22"/>
+        </w:rPr>
+        <w:t xml:space="preserve">Watch what it does: it decided that question needs a query, wrote it, ran it through the MCP server, and summarised. Nobody wrote that SQL for it.</w:t>
+      </w:r>
+    </w:p>
+    <w:p>
+      <w:pPr>
+        <w:spacing w:after="80" w:before="40" w:line="264"/>
+      </w:pPr>
+      <w:r>
+        <w:rPr>
+          <w:rFonts w:ascii="Calibri" w:cs="Calibri" w:eastAsia="Calibri" w:hAnsi="Calibri"/>
+          <w:b/>
+          <w:bCs/>
+          <w:i w:val="false"/>
+          <w:iCs w:val="false"/>
+          <w:color w:val="B07CFF"/>
+          <w:sz w:val="20"/>
+          <w:szCs w:val="20"/>
+        </w:rPr>
+        <w:t xml:space="preserve">NEEDS  </w:t>
+      </w:r>
+      <w:r>
+        <w:rPr>
+          <w:rFonts w:ascii="Calibri" w:cs="Calibri" w:eastAsia="Calibri" w:hAnsi="Calibri"/>
+          <w:b w:val="false"/>
+          <w:bCs w:val="false"/>
+          <w:i w:val="false"/>
+          <w:iCs w:val="false"/>
+          <w:sz w:val="20"/>
+          <w:szCs w:val="20"/>
+        </w:rPr>
+        <w:t xml:space="preserve">cymbal_ops selected, new session.</w:t>
       </w:r>
     </w:p>
     <w:tbl>
@@ -5897,10 +5866,10 @@
           <w:tcPr>
             <w:tcW w:type="dxa" w:w="10080"/>
             <w:tcBorders>
-              <w:top w:val="single" w:color="B07CFF" w:sz="12"/>
-              <w:left w:val="single" w:color="B07CFF" w:sz="12"/>
-              <w:bottom w:val="single" w:color="B07CFF" w:sz="12"/>
-              <w:right w:val="single" w:color="B07CFF" w:sz="12"/>
+              <w:top w:val="single" w:color="F28C28" w:sz="12"/>
+              <w:left w:val="single" w:color="F28C28" w:sz="36"/>
+              <w:bottom w:val="single" w:color="F28C28" w:sz="12"/>
+              <w:right w:val="single" w:color="F28C28" w:sz="12"/>
             </w:tcBorders>
             <w:tcMar>
               <w:top w:type="dxa" w:w="80"/>
@@ -5920,11 +5889,11 @@
                 <w:bCs/>
                 <w:i w:val="false"/>
                 <w:iCs w:val="false"/>
-                <w:color w:val="B07CFF"/>
+                <w:color w:val="F28C28"/>
                 <w:sz w:val="18"/>
                 <w:szCs w:val="18"/>
               </w:rPr>
-              <w:t xml:space="preserve">DO</w:t>
+              <w:t xml:space="preserve">TYPE in the ADK web UI</w:t>
             </w:r>
           </w:p>
           <w:p>
@@ -5933,15 +5902,15 @@
             </w:pPr>
             <w:r>
               <w:rPr>
-                <w:rFonts w:ascii="Calibri" w:cs="Calibri" w:eastAsia="Calibri" w:hAnsi="Calibri"/>
-                <w:b w:val="false"/>
-                <w:bCs w:val="false"/>
-                <w:i w:val="false"/>
-                <w:iCs w:val="false"/>
-                <w:sz w:val="20"/>
-                <w:szCs w:val="20"/>
-              </w:rPr>
-              <w:t xml:space="preserve">Events panel ▸ click an execute_sql_readonly call</w:t>
+                <w:rFonts w:ascii="Consolas" w:cs="Consolas" w:eastAsia="Consolas" w:hAnsi="Consolas"/>
+                <w:b w:val="false"/>
+                <w:bCs w:val="false"/>
+                <w:i w:val="false"/>
+                <w:iCs w:val="false"/>
+                <w:sz w:val="19"/>
+                <w:szCs w:val="19"/>
+              </w:rPr>
+              <w:t xml:space="preserve">What should we worry about this week?</w:t>
             </w:r>
           </w:p>
           <w:p>
@@ -5972,7 +5941,7 @@
                 <w:sz w:val="19"/>
                 <w:szCs w:val="19"/>
               </w:rPr>
-              <w:t xml:space="preserve">The SQL the agent wrote against the conjunctions table.</w:t>
+              <w:t xml:space="preserve">One to escalate: CYMBAL-04 vs FENGYUN 1C DEB, Fri 25 Sep 20:16 UTC, 301.1 m, worst-case 1.01e-04. CYMBAL-01's pass is two minutes away and can't be acted on. About 15 s.</w:t>
             </w:r>
           </w:p>
         </w:tc>
@@ -5993,176 +5962,6 @@
           <w:szCs w:val="22"/>
         </w:rPr>
         <w:t xml:space="preserve"/>
-      </w:r>
-    </w:p>
-    <w:p>
-      <w:pPr>
-        <w:spacing w:after="80" w:before="40" w:line="264"/>
-      </w:pPr>
-      <w:r>
-        <w:rPr>
-          <w:rFonts w:ascii="Calibri" w:cs="Calibri" w:eastAsia="Calibri" w:hAnsi="Calibri"/>
-          <w:b/>
-          <w:bCs/>
-          <w:i w:val="false"/>
-          <w:iCs w:val="false"/>
-          <w:color w:val="FF5C5C"/>
-          <w:sz w:val="20"/>
-          <w:szCs w:val="20"/>
-        </w:rPr>
-        <w:t xml:space="preserve">GOTCHA  </w:t>
-      </w:r>
-      <w:r>
-        <w:rPr>
-          <w:rFonts w:ascii="Calibri" w:cs="Calibri" w:eastAsia="Calibri" w:hAnsi="Calibri"/>
-          <w:b w:val="false"/>
-          <w:bCs w:val="false"/>
-          <w:i w:val="false"/>
-          <w:iCs w:val="false"/>
-          <w:sz w:val="20"/>
-          <w:szCs w:val="20"/>
-        </w:rPr>
-        <w:t xml:space="preserve">Slow? Keep talking: every call has a time limit and retries. Past a minute, go to the console tab: its chat box is the same agent.</w:t>
-      </w:r>
-    </w:p>
-    <w:p>
-      <w:pPr>
-        <w:pStyle w:val="Heading3"/>
-        <w:keepNext/>
-        <w:spacing w:after="40" w:before="160"/>
-      </w:pPr>
-      <w:r>
-        <w:rPr>
-          <w:rFonts w:ascii="Calibri" w:cs="Calibri" w:eastAsia="Calibri" w:hAnsi="Calibri"/>
-          <w:b/>
-          <w:bCs/>
-          <w:i w:val="false"/>
-          <w:iCs w:val="false"/>
-          <w:color w:val="3D8BFF"/>
-          <w:sz w:val="22"/>
-          <w:szCs w:val="22"/>
-        </w:rPr>
-        <w:t xml:space="preserve">4. Differentiate: our own tool, and the code sandbox   ·   TAB · ADK WEB UI · SAME SESSION   ·   ~2 min</w:t>
-      </w:r>
-    </w:p>
-    <w:p>
-      <w:pPr>
-        <w:spacing w:after="80" w:before="40" w:line="264"/>
-      </w:pPr>
-      <w:r>
-        <w:rPr>
-          <w:rFonts w:ascii="Calibri" w:cs="Calibri" w:eastAsia="Calibri" w:hAnsi="Calibri"/>
-          <w:b/>
-          <w:bCs/>
-          <w:i w:val="false"/>
-          <w:iCs w:val="false"/>
-          <w:color w:val="2ECC71"/>
-          <w:sz w:val="20"/>
-          <w:szCs w:val="20"/>
-        </w:rPr>
-        <w:t xml:space="preserve">WHY  </w:t>
-      </w:r>
-      <w:r>
-        <w:rPr>
-          <w:rFonts w:ascii="Calibri" w:cs="Calibri" w:eastAsia="Calibri" w:hAnsi="Calibri"/>
-          <w:b w:val="false"/>
-          <w:bCs w:val="false"/>
-          <w:i w:val="false"/>
-          <w:iCs w:val="false"/>
-          <w:sz w:val="22"/>
-          <w:szCs w:val="22"/>
-        </w:rPr>
-        <w:t xml:space="preserve">Two of the requirements in one question: at least one tool you wrote, and the one differentiator your challenge names.</w:t>
-      </w:r>
-    </w:p>
-    <w:p>
-      <w:pPr>
-        <w:spacing w:after="80" w:before="40" w:line="264"/>
-      </w:pPr>
-      <w:r>
-        <w:rPr>
-          <w:rFonts w:ascii="Calibri" w:cs="Calibri" w:eastAsia="Calibri" w:hAnsi="Calibri"/>
-          <w:b/>
-          <w:bCs/>
-          <w:i w:val="false"/>
-          <w:iCs w:val="false"/>
-          <w:color w:val="2BB3B1"/>
-          <w:sz w:val="20"/>
-          <w:szCs w:val="20"/>
-        </w:rPr>
-        <w:t xml:space="preserve">SAY  </w:t>
-      </w:r>
-      <w:r>
-        <w:rPr>
-          <w:rFonts w:ascii="Calibri" w:cs="Calibri" w:eastAsia="Calibri" w:hAnsi="Calibri"/>
-          <w:b w:val="false"/>
-          <w:bCs w:val="false"/>
-          <w:i/>
-          <w:iCs/>
-          <w:sz w:val="22"/>
-          <w:szCs w:val="22"/>
-        </w:rPr>
-        <w:t xml:space="preserve">Third step: differentiate. Every challenge names one thing only it has. Ours is a code sandbox: the agent writes Python and runs it somewhere isolated, not in its own process.</w:t>
-      </w:r>
-    </w:p>
-    <w:p>
-      <w:pPr>
-        <w:spacing w:after="80" w:before="40" w:line="264"/>
-      </w:pPr>
-      <w:r>
-        <w:rPr>
-          <w:rFonts w:ascii="Calibri" w:cs="Calibri" w:eastAsia="Calibri" w:hAnsi="Calibri"/>
-          <w:b/>
-          <w:bCs/>
-          <w:i w:val="false"/>
-          <w:iCs w:val="false"/>
-          <w:color w:val="2BB3B1"/>
-          <w:sz w:val="20"/>
-          <w:szCs w:val="20"/>
-        </w:rPr>
-        <w:t xml:space="preserve">SAY  </w:t>
-      </w:r>
-      <w:r>
-        <w:rPr>
-          <w:rFonts w:ascii="Calibri" w:cs="Calibri" w:eastAsia="Calibri" w:hAnsi="Calibri"/>
-          <w:b w:val="false"/>
-          <w:bCs w:val="false"/>
-          <w:i/>
-          <w:iCs/>
-          <w:sz w:val="22"/>
-          <w:szCs w:val="22"/>
-        </w:rPr>
-        <w:t xml:space="preserve">And this is why we require a custom tool even though MCP can run queries: assess_conjunction decides whether the tracking is fresh enough to act on, whether the other object can move, and what counts as clear. That's judgment, and judgment is code.</w:t>
-      </w:r>
-    </w:p>
-    <w:p>
-      <w:pPr>
-        <w:spacing w:after="80" w:before="40" w:line="264"/>
-      </w:pPr>
-      <w:r>
-        <w:rPr>
-          <w:rFonts w:ascii="Calibri" w:cs="Calibri" w:eastAsia="Calibri" w:hAnsi="Calibri"/>
-          <w:b/>
-          <w:bCs/>
-          <w:i w:val="false"/>
-          <w:iCs w:val="false"/>
-          <w:color w:val="2BB3B1"/>
-          <w:sz w:val="20"/>
-          <w:szCs w:val="20"/>
-        </w:rPr>
-        <w:t xml:space="preserve">SAY  </w:t>
-      </w:r>
-      <w:r>
-        <w:rPr>
-          <w:rFonts w:ascii="Calibri" w:cs="Calibri" w:eastAsia="Calibri" w:hAnsi="Calibri"/>
-          <w:b w:val="false"/>
-          <w:bCs w:val="false"/>
-          <w:i/>
-          <w:iCs/>
-          <w:sz w:val="22"/>
-          <w:szCs w:val="22"/>
-        </w:rPr>
-        <w:t xml:space="preserve">Burning earlier is cheaper: half the fuel, and the difference is more than a day of the satellite's life.</w:t>
       </w:r>
     </w:p>
     <w:tbl>
@@ -6188,10 +5987,10 @@
           <w:tcPr>
             <w:tcW w:type="dxa" w:w="10080"/>
             <w:tcBorders>
-              <w:top w:val="single" w:color="F28C28" w:sz="12"/>
-              <w:left w:val="single" w:color="F28C28" w:sz="36"/>
-              <w:bottom w:val="single" w:color="F28C28" w:sz="12"/>
-              <w:right w:val="single" w:color="F28C28" w:sz="12"/>
+              <w:top w:val="single" w:color="2BB3B1" w:sz="12"/>
+              <w:left w:val="single" w:color="2BB3B1" w:sz="12"/>
+              <w:bottom w:val="single" w:color="2BB3B1" w:sz="12"/>
+              <w:right w:val="single" w:color="2BB3B1" w:sz="12"/>
             </w:tcBorders>
             <w:tcMar>
               <w:top w:type="dxa" w:w="80"/>
@@ -6211,11 +6010,11 @@
                 <w:bCs/>
                 <w:i w:val="false"/>
                 <w:iCs w:val="false"/>
-                <w:color w:val="F28C28"/>
+                <w:color w:val="2BB3B1"/>
                 <w:sz w:val="18"/>
                 <w:szCs w:val="18"/>
               </w:rPr>
-              <w:t xml:space="preserve">FOLLOW-UP (same session)</w:t>
+              <w:t xml:space="preserve">SAY</w:t>
             </w:r>
           </w:p>
           <w:p>
@@ -6224,46 +6023,15 @@
             </w:pPr>
             <w:r>
               <w:rPr>
-                <w:rFonts w:ascii="Consolas" w:cs="Consolas" w:eastAsia="Consolas" w:hAnsi="Consolas"/>
-                <w:b w:val="false"/>
-                <w:bCs w:val="false"/>
-                <w:i w:val="false"/>
-                <w:iCs w:val="false"/>
-                <w:sz w:val="19"/>
-                <w:szCs w:val="19"/>
-              </w:rPr>
-              <w:t xml:space="preserve">What is the smallest burn that gets CYMBAL-04 clear? Compare burning at 04:00 and at 12:00 UTC today, and tell me what each costs.</w:t>
-            </w:r>
-          </w:p>
-          <w:p>
-            <w:pPr>
-              <w:spacing w:after="0" w:before="60" w:line="264"/>
-            </w:pPr>
-            <w:r>
-              <w:rPr>
-                <w:rFonts w:ascii="Calibri" w:cs="Calibri" w:eastAsia="Calibri" w:hAnsi="Calibri"/>
-                <w:b/>
-                <w:bCs/>
-                <w:i w:val="false"/>
-                <w:iCs w:val="false"/>
-                <w:color w:val="2ECC71"/>
-                <w:sz w:val="19"/>
-                <w:szCs w:val="19"/>
-              </w:rPr>
-              <w:t xml:space="preserve">→ </w:t>
-            </w:r>
-            <w:r>
-              <w:rPr>
-                <w:rFonts w:ascii="Calibri" w:cs="Calibri" w:eastAsia="Calibri" w:hAnsi="Calibri"/>
-                <w:b w:val="false"/>
-                <w:bCs w:val="false"/>
-                <w:i w:val="false"/>
-                <w:iCs w:val="false"/>
-                <w:color w:val="9AA4B2"/>
-                <w:sz w:val="19"/>
-                <w:szCs w:val="19"/>
-              </w:rPr>
-              <w:t xml:space="preserve">04:00: 0.0181 m/s prograde → 3,036 m, 1.54 days of mission life. 12:00: 0.0343 m/s → 3,035 m, 2.92 days. About 30 s.</w:t>
+                <w:rFonts w:ascii="Calibri" w:cs="Calibri" w:eastAsia="Calibri" w:hAnsi="Calibri"/>
+                <w:b w:val="false"/>
+                <w:bCs w:val="false"/>
+                <w:i/>
+                <w:iCs/>
+                <w:sz w:val="20"/>
+                <w:szCs w:val="20"/>
+              </w:rPr>
+              <w:t xml:space="preserve">While it works: ADK is the frame, Gemini is the reasoning, and it reads BigQuery through Google's managed MCP server.</w:t>
             </w:r>
           </w:p>
         </w:tc>
@@ -6309,10 +6077,10 @@
           <w:tcPr>
             <w:tcW w:type="dxa" w:w="10080"/>
             <w:tcBorders>
-              <w:top w:val="single" w:color="2BB3B1" w:sz="12"/>
-              <w:left w:val="single" w:color="2BB3B1" w:sz="12"/>
-              <w:bottom w:val="single" w:color="2BB3B1" w:sz="12"/>
-              <w:right w:val="single" w:color="2BB3B1" w:sz="12"/>
+              <w:top w:val="single" w:color="B07CFF" w:sz="12"/>
+              <w:left w:val="single" w:color="B07CFF" w:sz="12"/>
+              <w:bottom w:val="single" w:color="B07CFF" w:sz="12"/>
+              <w:right w:val="single" w:color="B07CFF" w:sz="12"/>
             </w:tcBorders>
             <w:tcMar>
               <w:top w:type="dxa" w:w="80"/>
@@ -6332,11 +6100,11 @@
                 <w:bCs/>
                 <w:i w:val="false"/>
                 <w:iCs w:val="false"/>
-                <w:color w:val="2BB3B1"/>
+                <w:color w:val="B07CFF"/>
                 <w:sz w:val="18"/>
                 <w:szCs w:val="18"/>
               </w:rPr>
-              <w:t xml:space="preserve">SAY</w:t>
+              <w:t xml:space="preserve">DO</w:t>
             </w:r>
           </w:p>
           <w:p>
@@ -6348,12 +6116,43 @@
                 <w:rFonts w:ascii="Calibri" w:cs="Calibri" w:eastAsia="Calibri" w:hAnsi="Calibri"/>
                 <w:b w:val="false"/>
                 <w:bCs w:val="false"/>
-                <w:i/>
-                <w:iCs/>
+                <w:i w:val="false"/>
+                <w:iCs w:val="false"/>
                 <w:sz w:val="20"/>
                 <w:szCs w:val="20"/>
               </w:rPr>
-              <w:t xml:space="preserve">While it works: assess_conjunction is our own Python tool; the physics runs in the Agent Runtime code sandbox; maneuver_cost prices it.</w:t>
+              <w:t xml:space="preserve">Events panel ▸ click an execute_sql_readonly call</w:t>
+            </w:r>
+          </w:p>
+          <w:p>
+            <w:pPr>
+              <w:spacing w:after="0" w:before="60" w:line="264"/>
+            </w:pPr>
+            <w:r>
+              <w:rPr>
+                <w:rFonts w:ascii="Calibri" w:cs="Calibri" w:eastAsia="Calibri" w:hAnsi="Calibri"/>
+                <w:b/>
+                <w:bCs/>
+                <w:i w:val="false"/>
+                <w:iCs w:val="false"/>
+                <w:color w:val="2ECC71"/>
+                <w:sz w:val="19"/>
+                <w:szCs w:val="19"/>
+              </w:rPr>
+              <w:t xml:space="preserve">→ </w:t>
+            </w:r>
+            <w:r>
+              <w:rPr>
+                <w:rFonts w:ascii="Calibri" w:cs="Calibri" w:eastAsia="Calibri" w:hAnsi="Calibri"/>
+                <w:b w:val="false"/>
+                <w:bCs w:val="false"/>
+                <w:i w:val="false"/>
+                <w:iCs w:val="false"/>
+                <w:color w:val="9AA4B2"/>
+                <w:sz w:val="19"/>
+                <w:szCs w:val="19"/>
+              </w:rPr>
+              <w:t xml:space="preserve">The SQL the agent wrote against the conjunctions table.</w:t>
             </w:r>
           </w:p>
         </w:tc>
@@ -6374,6 +6173,176 @@
           <w:szCs w:val="22"/>
         </w:rPr>
         <w:t xml:space="preserve"/>
+      </w:r>
+    </w:p>
+    <w:p>
+      <w:pPr>
+        <w:spacing w:after="80" w:before="40" w:line="264"/>
+      </w:pPr>
+      <w:r>
+        <w:rPr>
+          <w:rFonts w:ascii="Calibri" w:cs="Calibri" w:eastAsia="Calibri" w:hAnsi="Calibri"/>
+          <w:b/>
+          <w:bCs/>
+          <w:i w:val="false"/>
+          <w:iCs w:val="false"/>
+          <w:color w:val="FF5C5C"/>
+          <w:sz w:val="20"/>
+          <w:szCs w:val="20"/>
+        </w:rPr>
+        <w:t xml:space="preserve">GOTCHA  </w:t>
+      </w:r>
+      <w:r>
+        <w:rPr>
+          <w:rFonts w:ascii="Calibri" w:cs="Calibri" w:eastAsia="Calibri" w:hAnsi="Calibri"/>
+          <w:b w:val="false"/>
+          <w:bCs w:val="false"/>
+          <w:i w:val="false"/>
+          <w:iCs w:val="false"/>
+          <w:sz w:val="20"/>
+          <w:szCs w:val="20"/>
+        </w:rPr>
+        <w:t xml:space="preserve">Slow? Keep talking: every call has a time limit and retries. Past a minute, go to the console tab: its chat box is the same agent.</w:t>
+      </w:r>
+    </w:p>
+    <w:p>
+      <w:pPr>
+        <w:pStyle w:val="Heading3"/>
+        <w:keepNext/>
+        <w:spacing w:after="40" w:before="160"/>
+      </w:pPr>
+      <w:r>
+        <w:rPr>
+          <w:rFonts w:ascii="Calibri" w:cs="Calibri" w:eastAsia="Calibri" w:hAnsi="Calibri"/>
+          <w:b/>
+          <w:bCs/>
+          <w:i w:val="false"/>
+          <w:iCs w:val="false"/>
+          <w:color w:val="3D8BFF"/>
+          <w:sz w:val="22"/>
+          <w:szCs w:val="22"/>
+        </w:rPr>
+        <w:t xml:space="preserve">4. Differentiate: our own tool, and the code sandbox   ·   TAB · ADK WEB UI · SAME SESSION   ·   ~2 min</w:t>
+      </w:r>
+    </w:p>
+    <w:p>
+      <w:pPr>
+        <w:spacing w:after="80" w:before="40" w:line="264"/>
+      </w:pPr>
+      <w:r>
+        <w:rPr>
+          <w:rFonts w:ascii="Calibri" w:cs="Calibri" w:eastAsia="Calibri" w:hAnsi="Calibri"/>
+          <w:b/>
+          <w:bCs/>
+          <w:i w:val="false"/>
+          <w:iCs w:val="false"/>
+          <w:color w:val="2ECC71"/>
+          <w:sz w:val="20"/>
+          <w:szCs w:val="20"/>
+        </w:rPr>
+        <w:t xml:space="preserve">WHY  </w:t>
+      </w:r>
+      <w:r>
+        <w:rPr>
+          <w:rFonts w:ascii="Calibri" w:cs="Calibri" w:eastAsia="Calibri" w:hAnsi="Calibri"/>
+          <w:b w:val="false"/>
+          <w:bCs w:val="false"/>
+          <w:i w:val="false"/>
+          <w:iCs w:val="false"/>
+          <w:sz w:val="22"/>
+          <w:szCs w:val="22"/>
+        </w:rPr>
+        <w:t xml:space="preserve">Two of the requirements in one question: at least one tool you wrote, and the one differentiator your challenge names.</w:t>
+      </w:r>
+    </w:p>
+    <w:p>
+      <w:pPr>
+        <w:spacing w:after="80" w:before="40" w:line="264"/>
+      </w:pPr>
+      <w:r>
+        <w:rPr>
+          <w:rFonts w:ascii="Calibri" w:cs="Calibri" w:eastAsia="Calibri" w:hAnsi="Calibri"/>
+          <w:b/>
+          <w:bCs/>
+          <w:i w:val="false"/>
+          <w:iCs w:val="false"/>
+          <w:color w:val="2BB3B1"/>
+          <w:sz w:val="20"/>
+          <w:szCs w:val="20"/>
+        </w:rPr>
+        <w:t xml:space="preserve">SAY  </w:t>
+      </w:r>
+      <w:r>
+        <w:rPr>
+          <w:rFonts w:ascii="Calibri" w:cs="Calibri" w:eastAsia="Calibri" w:hAnsi="Calibri"/>
+          <w:b w:val="false"/>
+          <w:bCs w:val="false"/>
+          <w:i/>
+          <w:iCs/>
+          <w:sz w:val="22"/>
+          <w:szCs w:val="22"/>
+        </w:rPr>
+        <w:t xml:space="preserve">Third step: differentiate. Every challenge names one thing only it has. Ours is a code sandbox: the agent writes Python and runs it somewhere isolated, not in its own process.</w:t>
+      </w:r>
+    </w:p>
+    <w:p>
+      <w:pPr>
+        <w:spacing w:after="80" w:before="40" w:line="264"/>
+      </w:pPr>
+      <w:r>
+        <w:rPr>
+          <w:rFonts w:ascii="Calibri" w:cs="Calibri" w:eastAsia="Calibri" w:hAnsi="Calibri"/>
+          <w:b/>
+          <w:bCs/>
+          <w:i w:val="false"/>
+          <w:iCs w:val="false"/>
+          <w:color w:val="2BB3B1"/>
+          <w:sz w:val="20"/>
+          <w:szCs w:val="20"/>
+        </w:rPr>
+        <w:t xml:space="preserve">SAY  </w:t>
+      </w:r>
+      <w:r>
+        <w:rPr>
+          <w:rFonts w:ascii="Calibri" w:cs="Calibri" w:eastAsia="Calibri" w:hAnsi="Calibri"/>
+          <w:b w:val="false"/>
+          <w:bCs w:val="false"/>
+          <w:i/>
+          <w:iCs/>
+          <w:sz w:val="22"/>
+          <w:szCs w:val="22"/>
+        </w:rPr>
+        <w:t xml:space="preserve">And this is why we require a custom tool even though MCP can run queries: assess_conjunction decides whether the tracking is fresh enough to act on, whether the other object can move, and what counts as clear. That's judgment, and judgment is code.</w:t>
+      </w:r>
+    </w:p>
+    <w:p>
+      <w:pPr>
+        <w:spacing w:after="80" w:before="40" w:line="264"/>
+      </w:pPr>
+      <w:r>
+        <w:rPr>
+          <w:rFonts w:ascii="Calibri" w:cs="Calibri" w:eastAsia="Calibri" w:hAnsi="Calibri"/>
+          <w:b/>
+          <w:bCs/>
+          <w:i w:val="false"/>
+          <w:iCs w:val="false"/>
+          <w:color w:val="2BB3B1"/>
+          <w:sz w:val="20"/>
+          <w:szCs w:val="20"/>
+        </w:rPr>
+        <w:t xml:space="preserve">SAY  </w:t>
+      </w:r>
+      <w:r>
+        <w:rPr>
+          <w:rFonts w:ascii="Calibri" w:cs="Calibri" w:eastAsia="Calibri" w:hAnsi="Calibri"/>
+          <w:b w:val="false"/>
+          <w:bCs w:val="false"/>
+          <w:i/>
+          <w:iCs/>
+          <w:sz w:val="22"/>
+          <w:szCs w:val="22"/>
+        </w:rPr>
+        <w:t xml:space="preserve">Burning earlier is cheaper: half the fuel, and the difference is more than a day of the satellite's life.</w:t>
       </w:r>
     </w:p>
     <w:tbl>
@@ -6399,10 +6368,10 @@
           <w:tcPr>
             <w:tcW w:type="dxa" w:w="10080"/>
             <w:tcBorders>
-              <w:top w:val="single" w:color="B07CFF" w:sz="12"/>
-              <w:left w:val="single" w:color="B07CFF" w:sz="12"/>
-              <w:bottom w:val="single" w:color="B07CFF" w:sz="12"/>
-              <w:right w:val="single" w:color="B07CFF" w:sz="12"/>
+              <w:top w:val="single" w:color="F28C28" w:sz="12"/>
+              <w:left w:val="single" w:color="F28C28" w:sz="36"/>
+              <w:bottom w:val="single" w:color="F28C28" w:sz="12"/>
+              <w:right w:val="single" w:color="F28C28" w:sz="12"/>
             </w:tcBorders>
             <w:tcMar>
               <w:top w:type="dxa" w:w="80"/>
@@ -6422,11 +6391,11 @@
                 <w:bCs/>
                 <w:i w:val="false"/>
                 <w:iCs w:val="false"/>
-                <w:color w:val="B07CFF"/>
+                <w:color w:val="F28C28"/>
                 <w:sz w:val="18"/>
                 <w:szCs w:val="18"/>
               </w:rPr>
-              <w:t xml:space="preserve">DO</w:t>
+              <w:t xml:space="preserve">FOLLOW-UP (same session)</w:t>
             </w:r>
           </w:p>
           <w:p>
@@ -6435,15 +6404,15 @@
             </w:pPr>
             <w:r>
               <w:rPr>
-                <w:rFonts w:ascii="Calibri" w:cs="Calibri" w:eastAsia="Calibri" w:hAnsi="Calibri"/>
-                <w:b w:val="false"/>
-                <w:bCs w:val="false"/>
-                <w:i w:val="false"/>
-                <w:iCs w:val="false"/>
-                <w:sz w:val="20"/>
-                <w:szCs w:val="20"/>
-              </w:rPr>
-              <w:t xml:space="preserve">Events panel ▸ click the run_in_sandbox call</w:t>
+                <w:rFonts w:ascii="Consolas" w:cs="Consolas" w:eastAsia="Consolas" w:hAnsi="Consolas"/>
+                <w:b w:val="false"/>
+                <w:bCs w:val="false"/>
+                <w:i w:val="false"/>
+                <w:iCs w:val="false"/>
+                <w:sz w:val="19"/>
+                <w:szCs w:val="19"/>
+              </w:rPr>
+              <w:t xml:space="preserve">What is the smallest burn that gets CYMBAL-04 clear? Compare burning at 04:00 and at 12:00 UTC today, and tell me what each costs.</w:t>
             </w:r>
           </w:p>
           <w:p>
@@ -6474,7 +6443,7 @@
                 <w:sz w:val="19"/>
                 <w:szCs w:val="19"/>
               </w:rPr>
-              <w:t xml:space="preserve">Four lines of Python the model wrote, using our orbit_whatif module.</w:t>
+              <w:t xml:space="preserve">04:00: 0.0181 m/s prograde → 3,036 m, 1.54 days of mission life. 12:00: 0.0343 m/s → 3,035 m, 2.92 days. About 30 s.</w:t>
             </w:r>
           </w:p>
         </w:tc>
@@ -6495,146 +6464,6 @@
           <w:szCs w:val="22"/>
         </w:rPr>
         <w:t xml:space="preserve"/>
-      </w:r>
-    </w:p>
-    <w:p>
-      <w:pPr>
-        <w:spacing w:after="80" w:before="40" w:line="264"/>
-      </w:pPr>
-      <w:r>
-        <w:rPr>
-          <w:rFonts w:ascii="Calibri" w:cs="Calibri" w:eastAsia="Calibri" w:hAnsi="Calibri"/>
-          <w:b/>
-          <w:bCs/>
-          <w:i w:val="false"/>
-          <w:iCs w:val="false"/>
-          <w:color w:val="FF5C5C"/>
-          <w:sz w:val="20"/>
-          <w:szCs w:val="20"/>
-        </w:rPr>
-        <w:t xml:space="preserve">GOTCHA  </w:t>
-      </w:r>
-      <w:r>
-        <w:rPr>
-          <w:rFonts w:ascii="Calibri" w:cs="Calibri" w:eastAsia="Calibri" w:hAnsi="Calibri"/>
-          <w:b w:val="false"/>
-          <w:bCs w:val="false"/>
-          <w:i w:val="false"/>
-          <w:iCs w:val="false"/>
-          <w:sz w:val="20"/>
-          <w:szCs w:val="20"/>
-        </w:rPr>
-        <w:t xml:space="preserve">Past a minute: say "the console will show us the same answer" and move to step 5. The console replays a real run of this question.</w:t>
-      </w:r>
-    </w:p>
-    <w:p>
-      <w:pPr>
-        <w:pStyle w:val="Heading3"/>
-        <w:keepNext/>
-        <w:spacing w:after="40" w:before="160"/>
-      </w:pPr>
-      <w:r>
-        <w:rPr>
-          <w:rFonts w:ascii="Calibri" w:cs="Calibri" w:eastAsia="Calibri" w:hAnsi="Calibri"/>
-          <w:b/>
-          <w:bCs/>
-          <w:i w:val="false"/>
-          <w:iCs w:val="false"/>
-          <w:color w:val="3D8BFF"/>
-          <w:sz w:val="22"/>
-          <w:szCs w:val="22"/>
-        </w:rPr>
-        <w:t xml:space="preserve">5. Deploy: the same agent, running in the cloud   ·   TAB · GOOGLE CLOUD CONSOLE · CLOUD RUN   ·   ~0.5 min</w:t>
-      </w:r>
-    </w:p>
-    <w:p>
-      <w:pPr>
-        <w:spacing w:after="80" w:before="40" w:line="264"/>
-      </w:pPr>
-      <w:r>
-        <w:rPr>
-          <w:rFonts w:ascii="Calibri" w:cs="Calibri" w:eastAsia="Calibri" w:hAnsi="Calibri"/>
-          <w:b/>
-          <w:bCs/>
-          <w:i w:val="false"/>
-          <w:iCs w:val="false"/>
-          <w:color w:val="2ECC71"/>
-          <w:sz w:val="20"/>
-          <w:szCs w:val="20"/>
-        </w:rPr>
-        <w:t xml:space="preserve">WHY  </w:t>
-      </w:r>
-      <w:r>
-        <w:rPr>
-          <w:rFonts w:ascii="Calibri" w:cs="Calibri" w:eastAsia="Calibri" w:hAnsi="Calibri"/>
-          <w:b w:val="false"/>
-          <w:bCs w:val="false"/>
-          <w:i w:val="false"/>
-          <w:iCs w:val="false"/>
-          <w:sz w:val="22"/>
-          <w:szCs w:val="22"/>
-        </w:rPr>
-        <w:t xml:space="preserve">Deploy is a required step on their path; seeing it is one command makes it less scary.</w:t>
-      </w:r>
-    </w:p>
-    <w:p>
-      <w:pPr>
-        <w:spacing w:after="80" w:before="40" w:line="264"/>
-      </w:pPr>
-      <w:r>
-        <w:rPr>
-          <w:rFonts w:ascii="Calibri" w:cs="Calibri" w:eastAsia="Calibri" w:hAnsi="Calibri"/>
-          <w:b/>
-          <w:bCs/>
-          <w:i w:val="false"/>
-          <w:iCs w:val="false"/>
-          <w:color w:val="2BB3B1"/>
-          <w:sz w:val="20"/>
-          <w:szCs w:val="20"/>
-        </w:rPr>
-        <w:t xml:space="preserve">SAY  </w:t>
-      </w:r>
-      <w:r>
-        <w:rPr>
-          <w:rFonts w:ascii="Calibri" w:cs="Calibri" w:eastAsia="Calibri" w:hAnsi="Calibri"/>
-          <w:b w:val="false"/>
-          <w:bCs w:val="false"/>
-          <w:i/>
-          <w:iCs/>
-          <w:sz w:val="22"/>
-          <w:szCs w:val="22"/>
-        </w:rPr>
-        <w:t xml:space="preserve">Fourth: deploy. Same agent, on Cloud Run, authentication required, one command. Yours goes to Cloud Run or Agent Runtime, your choice.</w:t>
-      </w:r>
-    </w:p>
-    <w:p>
-      <w:pPr>
-        <w:spacing w:after="80" w:before="40" w:line="264"/>
-      </w:pPr>
-      <w:r>
-        <w:rPr>
-          <w:rFonts w:ascii="Calibri" w:cs="Calibri" w:eastAsia="Calibri" w:hAnsi="Calibri"/>
-          <w:b/>
-          <w:bCs/>
-          <w:i w:val="false"/>
-          <w:iCs w:val="false"/>
-          <w:color w:val="B07CFF"/>
-          <w:sz w:val="20"/>
-          <w:szCs w:val="20"/>
-        </w:rPr>
-        <w:t xml:space="preserve">NEEDS  </w:t>
-      </w:r>
-      <w:r>
-        <w:rPr>
-          <w:rFonts w:ascii="Calibri" w:cs="Calibri" w:eastAsia="Calibri" w:hAnsi="Calibri"/>
-          <w:b w:val="false"/>
-          <w:bCs w:val="false"/>
-          <w:i w:val="false"/>
-          <w:iCs w:val="false"/>
-          <w:sz w:val="20"/>
-          <w:szCs w:val="20"/>
-        </w:rPr>
-        <w:t xml:space="preserve">Navigation menu ▸ Cloud Run ▸ cymbal-ops, already open.</w:t>
       </w:r>
     </w:p>
     <w:tbl>
@@ -6660,10 +6489,10 @@
           <w:tcPr>
             <w:tcW w:type="dxa" w:w="10080"/>
             <w:tcBorders>
-              <w:top w:val="single" w:color="B07CFF" w:sz="12"/>
-              <w:left w:val="single" w:color="B07CFF" w:sz="12"/>
-              <w:bottom w:val="single" w:color="B07CFF" w:sz="12"/>
-              <w:right w:val="single" w:color="B07CFF" w:sz="12"/>
+              <w:top w:val="single" w:color="2BB3B1" w:sz="12"/>
+              <w:left w:val="single" w:color="2BB3B1" w:sz="12"/>
+              <w:bottom w:val="single" w:color="2BB3B1" w:sz="12"/>
+              <w:right w:val="single" w:color="2BB3B1" w:sz="12"/>
             </w:tcBorders>
             <w:tcMar>
               <w:top w:type="dxa" w:w="80"/>
@@ -6683,11 +6512,11 @@
                 <w:bCs/>
                 <w:i w:val="false"/>
                 <w:iCs w:val="false"/>
-                <w:color w:val="B07CFF"/>
+                <w:color w:val="2BB3B1"/>
                 <w:sz w:val="18"/>
                 <w:szCs w:val="18"/>
               </w:rPr>
-              <w:t xml:space="preserve">DO</w:t>
+              <w:t xml:space="preserve">SAY</w:t>
             </w:r>
           </w:p>
           <w:p>
@@ -6699,43 +6528,12 @@
                 <w:rFonts w:ascii="Calibri" w:cs="Calibri" w:eastAsia="Calibri" w:hAnsi="Calibri"/>
                 <w:b w:val="false"/>
                 <w:bCs w:val="false"/>
-                <w:i w:val="false"/>
-                <w:iCs w:val="false"/>
+                <w:i/>
+                <w:iCs/>
                 <w:sz w:val="20"/>
                 <w:szCs w:val="20"/>
               </w:rPr>
-              <w:t xml:space="preserve">Point at the service URL, Authentication: Require authentication, and the one instance.</w:t>
-            </w:r>
-          </w:p>
-          <w:p>
-            <w:pPr>
-              <w:spacing w:after="0" w:before="60" w:line="264"/>
-            </w:pPr>
-            <w:r>
-              <w:rPr>
-                <w:rFonts w:ascii="Calibri" w:cs="Calibri" w:eastAsia="Calibri" w:hAnsi="Calibri"/>
-                <w:b/>
-                <w:bCs/>
-                <w:i w:val="false"/>
-                <w:iCs w:val="false"/>
-                <w:color w:val="2ECC71"/>
-                <w:sz w:val="19"/>
-                <w:szCs w:val="19"/>
-              </w:rPr>
-              <w:t xml:space="preserve">→ </w:t>
-            </w:r>
-            <w:r>
-              <w:rPr>
-                <w:rFonts w:ascii="Calibri" w:cs="Calibri" w:eastAsia="Calibri" w:hAnsi="Calibri"/>
-                <w:b w:val="false"/>
-                <w:bCs w:val="false"/>
-                <w:i w:val="false"/>
-                <w:iCs w:val="false"/>
-                <w:color w:val="9AA4B2"/>
-                <w:sz w:val="19"/>
-                <w:szCs w:val="19"/>
-              </w:rPr>
-              <w:t xml:space="preserve">cymbal-ops, healthy, one revision.</w:t>
+              <w:t xml:space="preserve">While it works: assess_conjunction is our own Python tool; the physics runs in the Agent Runtime code sandbox; maneuver_cost prices it.</w:t>
             </w:r>
           </w:p>
         </w:tc>
@@ -6781,10 +6579,10 @@
           <w:tcPr>
             <w:tcW w:type="dxa" w:w="10080"/>
             <w:tcBorders>
-              <w:top w:val="single" w:color="2BB3B1" w:sz="12"/>
-              <w:left w:val="single" w:color="2BB3B1" w:sz="12"/>
-              <w:bottom w:val="single" w:color="2BB3B1" w:sz="12"/>
-              <w:right w:val="single" w:color="2BB3B1" w:sz="12"/>
+              <w:top w:val="single" w:color="B07CFF" w:sz="12"/>
+              <w:left w:val="single" w:color="B07CFF" w:sz="12"/>
+              <w:bottom w:val="single" w:color="B07CFF" w:sz="12"/>
+              <w:right w:val="single" w:color="B07CFF" w:sz="12"/>
             </w:tcBorders>
             <w:tcMar>
               <w:top w:type="dxa" w:w="80"/>
@@ -6804,11 +6602,11 @@
                 <w:bCs/>
                 <w:i w:val="false"/>
                 <w:iCs w:val="false"/>
-                <w:color w:val="2BB3B1"/>
+                <w:color w:val="B07CFF"/>
                 <w:sz w:val="18"/>
                 <w:szCs w:val="18"/>
               </w:rPr>
-              <w:t xml:space="preserve">SAY</w:t>
+              <w:t xml:space="preserve">DO</w:t>
             </w:r>
           </w:p>
           <w:p>
@@ -6820,12 +6618,43 @@
                 <w:rFonts w:ascii="Calibri" w:cs="Calibri" w:eastAsia="Calibri" w:hAnsi="Calibri"/>
                 <w:b w:val="false"/>
                 <w:bCs w:val="false"/>
-                <w:i/>
-                <w:iCs/>
+                <w:i w:val="false"/>
+                <w:iCs w:val="false"/>
                 <w:sz w:val="20"/>
                 <w:szCs w:val="20"/>
               </w:rPr>
-              <w:t xml:space="preserve">One command put it there: bash agent/deploy.sh. Your agent has to actually run somewhere too.</w:t>
+              <w:t xml:space="preserve">Events panel ▸ click the run_in_sandbox call</w:t>
+            </w:r>
+          </w:p>
+          <w:p>
+            <w:pPr>
+              <w:spacing w:after="0" w:before="60" w:line="264"/>
+            </w:pPr>
+            <w:r>
+              <w:rPr>
+                <w:rFonts w:ascii="Calibri" w:cs="Calibri" w:eastAsia="Calibri" w:hAnsi="Calibri"/>
+                <w:b/>
+                <w:bCs/>
+                <w:i w:val="false"/>
+                <w:iCs w:val="false"/>
+                <w:color w:val="2ECC71"/>
+                <w:sz w:val="19"/>
+                <w:szCs w:val="19"/>
+              </w:rPr>
+              <w:t xml:space="preserve">→ </w:t>
+            </w:r>
+            <w:r>
+              <w:rPr>
+                <w:rFonts w:ascii="Calibri" w:cs="Calibri" w:eastAsia="Calibri" w:hAnsi="Calibri"/>
+                <w:b w:val="false"/>
+                <w:bCs w:val="false"/>
+                <w:i w:val="false"/>
+                <w:iCs w:val="false"/>
+                <w:color w:val="9AA4B2"/>
+                <w:sz w:val="19"/>
+                <w:szCs w:val="19"/>
+              </w:rPr>
+              <w:t xml:space="preserve">Four lines of Python the model wrote, using our orbit_whatif module.</w:t>
             </w:r>
           </w:p>
         </w:tc>
@@ -6846,6 +6675,36 @@
           <w:szCs w:val="22"/>
         </w:rPr>
         <w:t xml:space="preserve"/>
+      </w:r>
+    </w:p>
+    <w:p>
+      <w:pPr>
+        <w:spacing w:after="80" w:before="40" w:line="264"/>
+      </w:pPr>
+      <w:r>
+        <w:rPr>
+          <w:rFonts w:ascii="Calibri" w:cs="Calibri" w:eastAsia="Calibri" w:hAnsi="Calibri"/>
+          <w:b/>
+          <w:bCs/>
+          <w:i w:val="false"/>
+          <w:iCs w:val="false"/>
+          <w:color w:val="FF5C5C"/>
+          <w:sz w:val="20"/>
+          <w:szCs w:val="20"/>
+        </w:rPr>
+        <w:t xml:space="preserve">GOTCHA  </w:t>
+      </w:r>
+      <w:r>
+        <w:rPr>
+          <w:rFonts w:ascii="Calibri" w:cs="Calibri" w:eastAsia="Calibri" w:hAnsi="Calibri"/>
+          <w:b w:val="false"/>
+          <w:bCs w:val="false"/>
+          <w:i w:val="false"/>
+          <w:iCs w:val="false"/>
+          <w:sz w:val="20"/>
+          <w:szCs w:val="20"/>
+        </w:rPr>
+        <w:t xml:space="preserve">Past a minute: say "the console will show us the same answer" and move to step 5. The console replays a real run of this question.</w:t>
       </w:r>
     </w:p>
     <w:p>
@@ -6865,7 +6724,7 @@
           <w:sz w:val="22"/>
           <w:szCs w:val="22"/>
         </w:rPr>
-        <w:t xml:space="preserve">6. Show: the finished product   ·   TAB · CONSOLE · PORT 8080   ·   ~3 min</w:t>
+        <w:t xml:space="preserve">5. Deploy: the same agent, running in the cloud   ·   TAB · GOOGLE CLOUD CONSOLE · CLOUD RUN   ·   ~0.5 min</w:t>
       </w:r>
     </w:p>
     <w:p>
@@ -6895,7 +6754,7 @@
           <w:sz w:val="22"/>
           <w:szCs w:val="22"/>
         </w:rPr>
-        <w:t xml:space="preserve">What "an agent, not a chat box" looks like: plain code watches, the agent decides, a human approves. Two alerts, two opposite answers.</w:t>
+        <w:t xml:space="preserve">Deploy is a required step on their path; seeing it is one command makes it less scary.</w:t>
       </w:r>
     </w:p>
     <w:p>
@@ -6925,127 +6784,7 @@
           <w:sz w:val="22"/>
           <w:szCs w:val="22"/>
         </w:rPr>
-        <w:t xml:space="preserve">Last step, and it's what your judges will see: show it. This is the finished product. Time runs over the week; plain code, no AI, watches for anything that matters; and when something needs a decision, it wakes the agent.</w:t>
-      </w:r>
-    </w:p>
-    <w:p>
-      <w:pPr>
-        <w:spacing w:after="80" w:before="40" w:line="264"/>
-      </w:pPr>
-      <w:r>
-        <w:rPr>
-          <w:rFonts w:ascii="Calibri" w:cs="Calibri" w:eastAsia="Calibri" w:hAnsi="Calibri"/>
-          <w:b/>
-          <w:bCs/>
-          <w:i w:val="false"/>
-          <w:iCs w:val="false"/>
-          <w:color w:val="2BB3B1"/>
-          <w:sz w:val="20"/>
-          <w:szCs w:val="20"/>
-        </w:rPr>
-        <w:t xml:space="preserve">SAY  </w:t>
-      </w:r>
-      <w:r>
-        <w:rPr>
-          <w:rFonts w:ascii="Calibri" w:cs="Calibri" w:eastAsia="Calibri" w:hAnsi="Calibri"/>
-          <w:b w:val="false"/>
-          <w:bCs w:val="false"/>
-          <w:i/>
-          <w:iCs/>
-          <w:sz w:val="22"/>
-          <w:szCs w:val="22"/>
-        </w:rPr>
-        <w:t xml:space="preserve">Eighteen hours out, when the tracking is as good as it will get and there's still time to burn cheaply, the agent runs the playbook you just watched: assess, size the burn at two times, price it, write it up. Then it waits for a human. I approve.</w:t>
-      </w:r>
-    </w:p>
-    <w:p>
-      <w:pPr>
-        <w:spacing w:after="80" w:before="40" w:line="264"/>
-      </w:pPr>
-      <w:r>
-        <w:rPr>
-          <w:rFonts w:ascii="Calibri" w:cs="Calibri" w:eastAsia="Calibri" w:hAnsi="Calibri"/>
-          <w:b/>
-          <w:bCs/>
-          <w:i w:val="false"/>
-          <w:iCs w:val="false"/>
-          <w:color w:val="2BB3B1"/>
-          <w:sz w:val="20"/>
-          <w:szCs w:val="20"/>
-        </w:rPr>
-        <w:t xml:space="preserve">SAY  </w:t>
-      </w:r>
-      <w:r>
-        <w:rPr>
-          <w:rFonts w:ascii="Calibri" w:cs="Calibri" w:eastAsia="Calibri" w:hAnsi="Calibri"/>
-          <w:b w:val="false"/>
-          <w:bCs w:val="false"/>
-          <w:i/>
-          <w:iCs/>
-          <w:sz w:val="22"/>
-          <w:szCs w:val="22"/>
-        </w:rPr>
-        <w:t xml:space="preserve">There it goes. Without the burn, 301 metres. With it, three kilometres, for a day and a half of the satellite's life.</w:t>
-      </w:r>
-    </w:p>
-    <w:p>
-      <w:pPr>
-        <w:spacing w:after="80" w:before="40" w:line="264"/>
-      </w:pPr>
-      <w:r>
-        <w:rPr>
-          <w:rFonts w:ascii="Calibri" w:cs="Calibri" w:eastAsia="Calibri" w:hAnsi="Calibri"/>
-          <w:b/>
-          <w:bCs/>
-          <w:i w:val="false"/>
-          <w:iCs w:val="false"/>
-          <w:color w:val="2BB3B1"/>
-          <w:sz w:val="20"/>
-          <w:szCs w:val="20"/>
-        </w:rPr>
-        <w:t xml:space="preserve">SAY  </w:t>
-      </w:r>
-      <w:r>
-        <w:rPr>
-          <w:rFonts w:ascii="Calibri" w:cs="Calibri" w:eastAsia="Calibri" w:hAnsi="Calibri"/>
-          <w:b w:val="false"/>
-          <w:bCs w:val="false"/>
-          <w:i/>
-          <w:iCs/>
-          <w:sz w:val="22"/>
-          <w:szCs w:val="22"/>
-        </w:rPr>
-        <w:t xml:space="preserve">Now the other alert. On Friday this rocket body was stale: the tracking was a week old, so the agent asked for fresh tracking instead of spending fuel. Tuesday it arrives, and the right answer is: do nothing. Same agent, opposite answer. That's judgment.</w:t>
-      </w:r>
-    </w:p>
-    <w:p>
-      <w:pPr>
-        <w:spacing w:after="80" w:before="40" w:line="264"/>
-      </w:pPr>
-      <w:r>
-        <w:rPr>
-          <w:rFonts w:ascii="Calibri" w:cs="Calibri" w:eastAsia="Calibri" w:hAnsi="Calibri"/>
-          <w:b/>
-          <w:bCs/>
-          <w:i w:val="false"/>
-          <w:iCs w:val="false"/>
-          <w:color w:val="2BB3B1"/>
-          <w:sz w:val="20"/>
-          <w:szCs w:val="20"/>
-        </w:rPr>
-        <w:t xml:space="preserve">SAY  </w:t>
-      </w:r>
-      <w:r>
-        <w:rPr>
-          <w:rFonts w:ascii="Calibri" w:cs="Calibri" w:eastAsia="Calibri" w:hAnsi="Calibri"/>
-          <w:b w:val="false"/>
-          <w:bCs w:val="false"/>
-          <w:i/>
-          <w:iCs/>
-          <w:sz w:val="22"/>
-          <w:szCs w:val="22"/>
-        </w:rPr>
-        <w:t xml:space="preserve">The cards you just saw are a recording of a real run of the agent, played back so a demo on conference wifi runs the same every time. That's a trick worth stealing for your own Show step.</w:t>
+        <w:t xml:space="preserve">Fourth: deploy. Same agent, on Cloud Run, authentication required, one command. Yours goes to Cloud Run or Agent Runtime, your choice.</w:t>
       </w:r>
     </w:p>
     <w:p>
@@ -7075,25 +6814,7 @@
           <w:sz w:val="20"/>
           <w:szCs w:val="20"/>
         </w:rPr>
-        <w:t xml:space="preserve">Header says REPLAY. Clock Fri 25 Sep 01:00:00 UTC. If not: ⋯ ▸ Restart the week.</w:t>
-      </w:r>
-    </w:p>
-    <w:p>
-      <w:pPr>
-        <w:spacing w:after="80" w:before="40" w:line="264"/>
-      </w:pPr>
-      <w:r>
-        <w:rPr>
-          <w:rFonts w:ascii="Calibri" w:cs="Calibri" w:eastAsia="Calibri" w:hAnsi="Calibri"/>
-          <w:b w:val="false"/>
-          <w:bCs w:val="false"/>
-          <w:i w:val="false"/>
-          <w:iCs w:val="false"/>
-          <w:color w:val="9AA4B2"/>
-          <w:sz w:val="20"/>
-          <w:szCs w:val="20"/>
-        </w:rPr>
-        <w:t xml:space="preserve">Press Skip to next for each step. The clock stops by itself when the agent is woken and waits for Approve.</w:t>
+        <w:t xml:space="preserve">Navigation menu ▸ Cloud Run ▸ cymbal-ops, already open.</w:t>
       </w:r>
     </w:p>
     <w:tbl>
@@ -7163,7 +6884,7 @@
                 <w:sz w:val="20"/>
                 <w:szCs w:val="20"/>
               </w:rPr>
-              <w:t xml:space="preserve">Skip to next</w:t>
+              <w:t xml:space="preserve">Point at the service URL, Authentication: Require authentication, and the one instance.</w:t>
             </w:r>
           </w:p>
           <w:p>
@@ -7194,7 +6915,7 @@
                 <w:sz w:val="19"/>
                 <w:szCs w:val="19"/>
               </w:rPr>
-              <w:t xml:space="preserve">CYMBAL-01's pass at real time: the amber dot slides by at 382 m. "Too late to act" was already on the desk.</w:t>
+              <w:t xml:space="preserve">cymbal-ops, healthy, one revision.</w:t>
             </w:r>
           </w:p>
         </w:tc>
@@ -7240,10 +6961,10 @@
           <w:tcPr>
             <w:tcW w:type="dxa" w:w="10080"/>
             <w:tcBorders>
-              <w:top w:val="single" w:color="B07CFF" w:sz="12"/>
-              <w:left w:val="single" w:color="B07CFF" w:sz="12"/>
-              <w:bottom w:val="single" w:color="B07CFF" w:sz="12"/>
-              <w:right w:val="single" w:color="B07CFF" w:sz="12"/>
+              <w:top w:val="single" w:color="2BB3B1" w:sz="12"/>
+              <w:left w:val="single" w:color="2BB3B1" w:sz="12"/>
+              <w:bottom w:val="single" w:color="2BB3B1" w:sz="12"/>
+              <w:right w:val="single" w:color="2BB3B1" w:sz="12"/>
             </w:tcBorders>
             <w:tcMar>
               <w:top w:type="dxa" w:w="80"/>
@@ -7263,11 +6984,11 @@
                 <w:bCs/>
                 <w:i w:val="false"/>
                 <w:iCs w:val="false"/>
-                <w:color w:val="B07CFF"/>
+                <w:color w:val="2BB3B1"/>
                 <w:sz w:val="18"/>
                 <w:szCs w:val="18"/>
               </w:rPr>
-              <w:t xml:space="preserve">DO</w:t>
+              <w:t xml:space="preserve">SAY</w:t>
             </w:r>
           </w:p>
           <w:p>
@@ -7279,43 +7000,12 @@
                 <w:rFonts w:ascii="Calibri" w:cs="Calibri" w:eastAsia="Calibri" w:hAnsi="Calibri"/>
                 <w:b w:val="false"/>
                 <w:bCs w:val="false"/>
-                <w:i w:val="false"/>
-                <w:iCs w:val="false"/>
+                <w:i/>
+                <w:iCs/>
                 <w:sz w:val="20"/>
                 <w:szCs w:val="20"/>
               </w:rPr>
-              <w:t xml:space="preserve">Skip to next</w:t>
-            </w:r>
-          </w:p>
-          <w:p>
-            <w:pPr>
-              <w:spacing w:after="0" w:before="60" w:line="264"/>
-            </w:pPr>
-            <w:r>
-              <w:rPr>
-                <w:rFonts w:ascii="Calibri" w:cs="Calibri" w:eastAsia="Calibri" w:hAnsi="Calibri"/>
-                <w:b/>
-                <w:bCs/>
-                <w:i w:val="false"/>
-                <w:iCs w:val="false"/>
-                <w:color w:val="2ECC71"/>
-                <w:sz w:val="19"/>
-                <w:szCs w:val="19"/>
-              </w:rPr>
-              <w:t xml:space="preserve">→ </w:t>
-            </w:r>
-            <w:r>
-              <w:rPr>
-                <w:rFonts w:ascii="Calibri" w:cs="Calibri" w:eastAsia="Calibri" w:hAnsi="Calibri"/>
-                <w:b w:val="false"/>
-                <w:bCs w:val="false"/>
-                <w:i w:val="false"/>
-                <w:iCs w:val="false"/>
-                <w:color w:val="9AA4B2"/>
-                <w:sz w:val="19"/>
-                <w:szCs w:val="19"/>
-              </w:rPr>
-              <w:t xml:space="preserve">Decision needed: CYMBAL-04. The agent's steps tick in, then YOUR CALL: MANEUVER, 0.0181 m/s prograde at 04:00 → 3,036 m, 1.54 days.</w:t>
+              <w:t xml:space="preserve">One command put it there: bash agent/deploy.sh. Your agent has to actually run somewhere too.</w:t>
             </w:r>
           </w:p>
         </w:tc>
@@ -7336,6 +7026,254 @@
           <w:szCs w:val="22"/>
         </w:rPr>
         <w:t xml:space="preserve"/>
+      </w:r>
+    </w:p>
+    <w:p>
+      <w:pPr>
+        <w:pStyle w:val="Heading3"/>
+        <w:keepNext/>
+        <w:spacing w:after="40" w:before="160"/>
+      </w:pPr>
+      <w:r>
+        <w:rPr>
+          <w:rFonts w:ascii="Calibri" w:cs="Calibri" w:eastAsia="Calibri" w:hAnsi="Calibri"/>
+          <w:b/>
+          <w:bCs/>
+          <w:i w:val="false"/>
+          <w:iCs w:val="false"/>
+          <w:color w:val="3D8BFF"/>
+          <w:sz w:val="22"/>
+          <w:szCs w:val="22"/>
+        </w:rPr>
+        <w:t xml:space="preserve">6. Show: the finished product   ·   TAB · CONSOLE · PORT 8080   ·   ~3 min</w:t>
+      </w:r>
+    </w:p>
+    <w:p>
+      <w:pPr>
+        <w:spacing w:after="80" w:before="40" w:line="264"/>
+      </w:pPr>
+      <w:r>
+        <w:rPr>
+          <w:rFonts w:ascii="Calibri" w:cs="Calibri" w:eastAsia="Calibri" w:hAnsi="Calibri"/>
+          <w:b/>
+          <w:bCs/>
+          <w:i w:val="false"/>
+          <w:iCs w:val="false"/>
+          <w:color w:val="2ECC71"/>
+          <w:sz w:val="20"/>
+          <w:szCs w:val="20"/>
+        </w:rPr>
+        <w:t xml:space="preserve">WHY  </w:t>
+      </w:r>
+      <w:r>
+        <w:rPr>
+          <w:rFonts w:ascii="Calibri" w:cs="Calibri" w:eastAsia="Calibri" w:hAnsi="Calibri"/>
+          <w:b w:val="false"/>
+          <w:bCs w:val="false"/>
+          <w:i w:val="false"/>
+          <w:iCs w:val="false"/>
+          <w:sz w:val="22"/>
+          <w:szCs w:val="22"/>
+        </w:rPr>
+        <w:t xml:space="preserve">What "an agent, not a chat box" looks like: plain code watches, the agent decides, a human approves. Two alerts, two opposite answers.</w:t>
+      </w:r>
+    </w:p>
+    <w:p>
+      <w:pPr>
+        <w:spacing w:after="80" w:before="40" w:line="264"/>
+      </w:pPr>
+      <w:r>
+        <w:rPr>
+          <w:rFonts w:ascii="Calibri" w:cs="Calibri" w:eastAsia="Calibri" w:hAnsi="Calibri"/>
+          <w:b/>
+          <w:bCs/>
+          <w:i w:val="false"/>
+          <w:iCs w:val="false"/>
+          <w:color w:val="2BB3B1"/>
+          <w:sz w:val="20"/>
+          <w:szCs w:val="20"/>
+        </w:rPr>
+        <w:t xml:space="preserve">SAY  </w:t>
+      </w:r>
+      <w:r>
+        <w:rPr>
+          <w:rFonts w:ascii="Calibri" w:cs="Calibri" w:eastAsia="Calibri" w:hAnsi="Calibri"/>
+          <w:b w:val="false"/>
+          <w:bCs w:val="false"/>
+          <w:i/>
+          <w:iCs/>
+          <w:sz w:val="22"/>
+          <w:szCs w:val="22"/>
+        </w:rPr>
+        <w:t xml:space="preserve">Last step, and it's what your judges will see: show it. This is the finished product. Time runs over the week; plain code, no AI, watches for anything that matters; and when something needs a decision, it wakes the agent.</w:t>
+      </w:r>
+    </w:p>
+    <w:p>
+      <w:pPr>
+        <w:spacing w:after="80" w:before="40" w:line="264"/>
+      </w:pPr>
+      <w:r>
+        <w:rPr>
+          <w:rFonts w:ascii="Calibri" w:cs="Calibri" w:eastAsia="Calibri" w:hAnsi="Calibri"/>
+          <w:b/>
+          <w:bCs/>
+          <w:i w:val="false"/>
+          <w:iCs w:val="false"/>
+          <w:color w:val="2BB3B1"/>
+          <w:sz w:val="20"/>
+          <w:szCs w:val="20"/>
+        </w:rPr>
+        <w:t xml:space="preserve">SAY  </w:t>
+      </w:r>
+      <w:r>
+        <w:rPr>
+          <w:rFonts w:ascii="Calibri" w:cs="Calibri" w:eastAsia="Calibri" w:hAnsi="Calibri"/>
+          <w:b w:val="false"/>
+          <w:bCs w:val="false"/>
+          <w:i/>
+          <w:iCs/>
+          <w:sz w:val="22"/>
+          <w:szCs w:val="22"/>
+        </w:rPr>
+        <w:t xml:space="preserve">Eighteen hours out, when the tracking is as good as it will get and there's still time to burn cheaply, the agent runs the playbook you just watched: assess, size the burn at two times, price it, write it up. Then it waits for a human. I approve.</w:t>
+      </w:r>
+    </w:p>
+    <w:p>
+      <w:pPr>
+        <w:spacing w:after="80" w:before="40" w:line="264"/>
+      </w:pPr>
+      <w:r>
+        <w:rPr>
+          <w:rFonts w:ascii="Calibri" w:cs="Calibri" w:eastAsia="Calibri" w:hAnsi="Calibri"/>
+          <w:b/>
+          <w:bCs/>
+          <w:i w:val="false"/>
+          <w:iCs w:val="false"/>
+          <w:color w:val="2BB3B1"/>
+          <w:sz w:val="20"/>
+          <w:szCs w:val="20"/>
+        </w:rPr>
+        <w:t xml:space="preserve">SAY  </w:t>
+      </w:r>
+      <w:r>
+        <w:rPr>
+          <w:rFonts w:ascii="Calibri" w:cs="Calibri" w:eastAsia="Calibri" w:hAnsi="Calibri"/>
+          <w:b w:val="false"/>
+          <w:bCs w:val="false"/>
+          <w:i/>
+          <w:iCs/>
+          <w:sz w:val="22"/>
+          <w:szCs w:val="22"/>
+        </w:rPr>
+        <w:t xml:space="preserve">There it goes. Without the burn, 301 metres. With it, three kilometres, for a day and a half of the satellite's life.</w:t>
+      </w:r>
+    </w:p>
+    <w:p>
+      <w:pPr>
+        <w:spacing w:after="80" w:before="40" w:line="264"/>
+      </w:pPr>
+      <w:r>
+        <w:rPr>
+          <w:rFonts w:ascii="Calibri" w:cs="Calibri" w:eastAsia="Calibri" w:hAnsi="Calibri"/>
+          <w:b/>
+          <w:bCs/>
+          <w:i w:val="false"/>
+          <w:iCs w:val="false"/>
+          <w:color w:val="2BB3B1"/>
+          <w:sz w:val="20"/>
+          <w:szCs w:val="20"/>
+        </w:rPr>
+        <w:t xml:space="preserve">SAY  </w:t>
+      </w:r>
+      <w:r>
+        <w:rPr>
+          <w:rFonts w:ascii="Calibri" w:cs="Calibri" w:eastAsia="Calibri" w:hAnsi="Calibri"/>
+          <w:b w:val="false"/>
+          <w:bCs w:val="false"/>
+          <w:i/>
+          <w:iCs/>
+          <w:sz w:val="22"/>
+          <w:szCs w:val="22"/>
+        </w:rPr>
+        <w:t xml:space="preserve">Now the other alert. On Friday this rocket body was stale: the tracking was a week old, so the agent asked for fresh tracking instead of spending fuel. Tuesday it arrives, and the right answer is: do nothing. Same agent, opposite answer. That's judgment.</w:t>
+      </w:r>
+    </w:p>
+    <w:p>
+      <w:pPr>
+        <w:spacing w:after="80" w:before="40" w:line="264"/>
+      </w:pPr>
+      <w:r>
+        <w:rPr>
+          <w:rFonts w:ascii="Calibri" w:cs="Calibri" w:eastAsia="Calibri" w:hAnsi="Calibri"/>
+          <w:b/>
+          <w:bCs/>
+          <w:i w:val="false"/>
+          <w:iCs w:val="false"/>
+          <w:color w:val="2BB3B1"/>
+          <w:sz w:val="20"/>
+          <w:szCs w:val="20"/>
+        </w:rPr>
+        <w:t xml:space="preserve">SAY  </w:t>
+      </w:r>
+      <w:r>
+        <w:rPr>
+          <w:rFonts w:ascii="Calibri" w:cs="Calibri" w:eastAsia="Calibri" w:hAnsi="Calibri"/>
+          <w:b w:val="false"/>
+          <w:bCs w:val="false"/>
+          <w:i/>
+          <w:iCs/>
+          <w:sz w:val="22"/>
+          <w:szCs w:val="22"/>
+        </w:rPr>
+        <w:t xml:space="preserve">The cards you just saw are a recording of a real run of the agent, played back so a demo on conference wifi runs the same every time. That's a trick worth stealing for your own Show step.</w:t>
+      </w:r>
+    </w:p>
+    <w:p>
+      <w:pPr>
+        <w:spacing w:after="80" w:before="40" w:line="264"/>
+      </w:pPr>
+      <w:r>
+        <w:rPr>
+          <w:rFonts w:ascii="Calibri" w:cs="Calibri" w:eastAsia="Calibri" w:hAnsi="Calibri"/>
+          <w:b/>
+          <w:bCs/>
+          <w:i w:val="false"/>
+          <w:iCs w:val="false"/>
+          <w:color w:val="B07CFF"/>
+          <w:sz w:val="20"/>
+          <w:szCs w:val="20"/>
+        </w:rPr>
+        <w:t xml:space="preserve">NEEDS  </w:t>
+      </w:r>
+      <w:r>
+        <w:rPr>
+          <w:rFonts w:ascii="Calibri" w:cs="Calibri" w:eastAsia="Calibri" w:hAnsi="Calibri"/>
+          <w:b w:val="false"/>
+          <w:bCs w:val="false"/>
+          <w:i w:val="false"/>
+          <w:iCs w:val="false"/>
+          <w:sz w:val="20"/>
+          <w:szCs w:val="20"/>
+        </w:rPr>
+        <w:t xml:space="preserve">Header says REPLAY. Clock Fri 25 Sep 01:00:00 UTC. If not: ⋯ ▸ Restart the week.</w:t>
+      </w:r>
+    </w:p>
+    <w:p>
+      <w:pPr>
+        <w:spacing w:after="80" w:before="40" w:line="264"/>
+      </w:pPr>
+      <w:r>
+        <w:rPr>
+          <w:rFonts w:ascii="Calibri" w:cs="Calibri" w:eastAsia="Calibri" w:hAnsi="Calibri"/>
+          <w:b w:val="false"/>
+          <w:bCs w:val="false"/>
+          <w:i w:val="false"/>
+          <w:iCs w:val="false"/>
+          <w:color w:val="9AA4B2"/>
+          <w:sz w:val="20"/>
+          <w:szCs w:val="20"/>
+        </w:rPr>
+        <w:t xml:space="preserve">Press Skip to next for each step. The clock stops by itself when the agent is woken and waits for Approve.</w:t>
       </w:r>
     </w:p>
     <w:tbl>
@@ -7405,7 +7343,7 @@
                 <w:sz w:val="20"/>
                 <w:szCs w:val="20"/>
               </w:rPr>
-              <w:t xml:space="preserve">Approve</w:t>
+              <w:t xml:space="preserve">Skip to next</w:t>
             </w:r>
           </w:p>
           <w:p>
@@ -7436,7 +7374,7 @@
                 <w:sz w:val="19"/>
                 <w:szCs w:val="19"/>
               </w:rPr>
-              <w:t xml:space="preserve">Dotted green line: after the burn (scheduled), 3,036 m.</w:t>
+              <w:t xml:space="preserve">CYMBAL-01's pass at real time: the amber dot slides by at 382 m. "Too late to act" was already on the desk.</w:t>
             </w:r>
           </w:p>
         </w:tc>
@@ -7526,7 +7464,7 @@
                 <w:sz w:val="20"/>
                 <w:szCs w:val="20"/>
               </w:rPr>
-              <w:t xml:space="preserve">Skip to next ▸ Skip to next</w:t>
+              <w:t xml:space="preserve">Skip to next</w:t>
             </w:r>
           </w:p>
           <w:p>
@@ -7557,7 +7495,7 @@
                 <w:sz w:val="19"/>
                 <w:szCs w:val="19"/>
               </w:rPr>
-              <w:t xml:space="preserve">Burn executed at 04:00: the dot jumps up to the green line · CYMBAL-04's pass at real time: missed by 3,036 m, red ghost line at 301 m.</w:t>
+              <w:t xml:space="preserve">Decision needed: CYMBAL-04. The agent's steps tick in, then YOUR CALL: MANEUVER, 0.0181 m/s prograde at 04:00 → 3,036 m, 1.54 days.</w:t>
             </w:r>
           </w:p>
         </w:tc>
@@ -7647,7 +7585,7 @@
                 <w:sz w:val="20"/>
                 <w:szCs w:val="20"/>
               </w:rPr>
-              <w:t xml:space="preserve">Skip to next</w:t>
+              <w:t xml:space="preserve">Approve</w:t>
             </w:r>
           </w:p>
           <w:p>
@@ -7678,7 +7616,7 @@
                 <w:sz w:val="19"/>
                 <w:szCs w:val="19"/>
               </w:rPr>
-              <w:t xml:space="preserve">Tuesday: fresh tracking for SL-3 R/B (pink SIMULATED). The dot jumps from 421 m to 3,700 m and the agent says no burn.</w:t>
+              <w:t xml:space="preserve">Dotted green line: after the burn (scheduled), 3,036 m.</w:t>
             </w:r>
           </w:p>
         </w:tc>
@@ -7768,7 +7706,38 @@
                 <w:sz w:val="20"/>
                 <w:szCs w:val="20"/>
               </w:rPr>
-              <w:t xml:space="preserve">Approve</w:t>
+              <w:t xml:space="preserve">Skip to next ▸ Skip to next</w:t>
+            </w:r>
+          </w:p>
+          <w:p>
+            <w:pPr>
+              <w:spacing w:after="0" w:before="60" w:line="264"/>
+            </w:pPr>
+            <w:r>
+              <w:rPr>
+                <w:rFonts w:ascii="Calibri" w:cs="Calibri" w:eastAsia="Calibri" w:hAnsi="Calibri"/>
+                <w:b/>
+                <w:bCs/>
+                <w:i w:val="false"/>
+                <w:iCs w:val="false"/>
+                <w:color w:val="2ECC71"/>
+                <w:sz w:val="19"/>
+                <w:szCs w:val="19"/>
+              </w:rPr>
+              <w:t xml:space="preserve">→ </w:t>
+            </w:r>
+            <w:r>
+              <w:rPr>
+                <w:rFonts w:ascii="Calibri" w:cs="Calibri" w:eastAsia="Calibri" w:hAnsi="Calibri"/>
+                <w:b w:val="false"/>
+                <w:bCs w:val="false"/>
+                <w:i w:val="false"/>
+                <w:iCs w:val="false"/>
+                <w:color w:val="9AA4B2"/>
+                <w:sz w:val="19"/>
+                <w:szCs w:val="19"/>
+              </w:rPr>
+              <w:t xml:space="preserve">Burn executed at 04:00: the dot jumps up to the green line · CYMBAL-04's pass at real time: missed by 3,036 m, red ghost line at 301 m.</w:t>
             </w:r>
           </w:p>
         </w:tc>
@@ -7789,146 +7758,6 @@
           <w:szCs w:val="22"/>
         </w:rPr>
         <w:t xml:space="preserve"/>
-      </w:r>
-    </w:p>
-    <w:p>
-      <w:pPr>
-        <w:spacing w:after="80" w:before="40" w:line="264"/>
-      </w:pPr>
-      <w:r>
-        <w:rPr>
-          <w:rFonts w:ascii="Calibri" w:cs="Calibri" w:eastAsia="Calibri" w:hAnsi="Calibri"/>
-          <w:b/>
-          <w:bCs/>
-          <w:i w:val="false"/>
-          <w:iCs w:val="false"/>
-          <w:color w:val="FF5C5C"/>
-          <w:sz w:val="20"/>
-          <w:szCs w:val="20"/>
-        </w:rPr>
-        <w:t xml:space="preserve">GOTCHA  </w:t>
-      </w:r>
-      <w:r>
-        <w:rPr>
-          <w:rFonts w:ascii="Calibri" w:cs="Calibri" w:eastAsia="Calibri" w:hAnsi="Calibri"/>
-          <w:b w:val="false"/>
-          <w:bCs w:val="false"/>
-          <w:i w:val="false"/>
-          <w:iCs w:val="false"/>
-          <w:sz w:val="20"/>
-          <w:szCs w:val="20"/>
-        </w:rPr>
-        <w:t xml:space="preserve">If the header says LIVE AGENT, switch: ⋯ ▸ Agent ▸ replay · rehearsal, then Skip to next. Replay never calls Gemini.</w:t>
-      </w:r>
-    </w:p>
-    <w:p>
-      <w:pPr>
-        <w:pStyle w:val="Heading3"/>
-        <w:keepNext/>
-        <w:spacing w:after="40" w:before="160"/>
-      </w:pPr>
-      <w:r>
-        <w:rPr>
-          <w:rFonts w:ascii="Calibri" w:cs="Calibri" w:eastAsia="Calibri" w:hAnsi="Calibri"/>
-          <w:b/>
-          <w:bCs/>
-          <w:i w:val="false"/>
-          <w:iCs w:val="false"/>
-          <w:color w:val="3D8BFF"/>
-          <w:sz w:val="22"/>
-          <w:szCs w:val="22"/>
-        </w:rPr>
-        <w:t xml:space="preserve">7. Close: rigor and judgment   ·   TAB · CONSOLE · THE CYMBAL-04 CARD   ·   ~0.5 min</w:t>
-      </w:r>
-    </w:p>
-    <w:p>
-      <w:pPr>
-        <w:spacing w:after="80" w:before="40" w:line="264"/>
-      </w:pPr>
-      <w:r>
-        <w:rPr>
-          <w:rFonts w:ascii="Calibri" w:cs="Calibri" w:eastAsia="Calibri" w:hAnsi="Calibri"/>
-          <w:b/>
-          <w:bCs/>
-          <w:i w:val="false"/>
-          <w:iCs w:val="false"/>
-          <w:color w:val="2ECC71"/>
-          <w:sz w:val="20"/>
-          <w:szCs w:val="20"/>
-        </w:rPr>
-        <w:t xml:space="preserve">WHY  </w:t>
-      </w:r>
-      <w:r>
-        <w:rPr>
-          <w:rFonts w:ascii="Calibri" w:cs="Calibri" w:eastAsia="Calibri" w:hAnsi="Calibri"/>
-          <w:b w:val="false"/>
-          <w:bCs w:val="false"/>
-          <w:i w:val="false"/>
-          <w:iCs w:val="false"/>
-          <w:sz w:val="22"/>
-          <w:szCs w:val="22"/>
-        </w:rPr>
-        <w:t xml:space="preserve">Their judging rubric rewards rigor and judgment; the write-up shows what that looks like on paper.</w:t>
-      </w:r>
-    </w:p>
-    <w:p>
-      <w:pPr>
-        <w:spacing w:after="80" w:before="40" w:line="264"/>
-      </w:pPr>
-      <w:r>
-        <w:rPr>
-          <w:rFonts w:ascii="Calibri" w:cs="Calibri" w:eastAsia="Calibri" w:hAnsi="Calibri"/>
-          <w:b/>
-          <w:bCs/>
-          <w:i w:val="false"/>
-          <w:iCs w:val="false"/>
-          <w:color w:val="2BB3B1"/>
-          <w:sz w:val="20"/>
-          <w:szCs w:val="20"/>
-        </w:rPr>
-        <w:t xml:space="preserve">SAY  </w:t>
-      </w:r>
-      <w:r>
-        <w:rPr>
-          <w:rFonts w:ascii="Calibri" w:cs="Calibri" w:eastAsia="Calibri" w:hAnsi="Calibri"/>
-          <w:b w:val="false"/>
-          <w:bCs w:val="false"/>
-          <w:i/>
-          <w:iCs/>
-          <w:sz w:val="22"/>
-          <w:szCs w:val="22"/>
-        </w:rPr>
-        <w:t xml:space="preserve">Look at how it writes it up: the worst case, which needs no assumptions, next to the number under an assumed uncertainty, and a section on what we can't see. And the Tuesday update is labelled SIMULATED wherever it appears.</w:t>
-      </w:r>
-    </w:p>
-    <w:p>
-      <w:pPr>
-        <w:spacing w:after="80" w:before="40" w:line="264"/>
-      </w:pPr>
-      <w:r>
-        <w:rPr>
-          <w:rFonts w:ascii="Calibri" w:cs="Calibri" w:eastAsia="Calibri" w:hAnsi="Calibri"/>
-          <w:b/>
-          <w:bCs/>
-          <w:i w:val="false"/>
-          <w:iCs w:val="false"/>
-          <w:color w:val="2BB3B1"/>
-          <w:sz w:val="20"/>
-          <w:szCs w:val="20"/>
-        </w:rPr>
-        <w:t xml:space="preserve">SAY  </w:t>
-      </w:r>
-      <w:r>
-        <w:rPr>
-          <w:rFonts w:ascii="Calibri" w:cs="Calibri" w:eastAsia="Calibri" w:hAnsi="Calibri"/>
-          <w:b w:val="false"/>
-          <w:bCs w:val="false"/>
-          <w:i/>
-          <w:iCs/>
-          <w:sz w:val="22"/>
-          <w:szCs w:val="22"/>
-        </w:rPr>
-        <w:t xml:space="preserve">That's the bar: every number from a tool or a query, every assumption stated. Now go build yours.</w:t>
       </w:r>
     </w:p>
     <w:tbl>
@@ -7998,7 +7827,7 @@
                 <w:sz w:val="20"/>
                 <w:szCs w:val="20"/>
               </w:rPr>
-              <w:t xml:space="preserve">CYMBAL-04 agent card ▸ Conjunction Assessment &amp; Maneuver Recommendation</w:t>
+              <w:t xml:space="preserve">Skip to next</w:t>
             </w:r>
           </w:p>
           <w:p>
@@ -8029,7 +7858,7 @@
                 <w:sz w:val="19"/>
                 <w:szCs w:val="19"/>
               </w:rPr>
-              <w:t xml:space="preserve">Risk: worst case and assumed side by side · What we cannot see.</w:t>
+              <w:t xml:space="preserve">Tuesday: fresh tracking for SL-3 R/B (pink SIMULATED). The dot jumps from 421 m to 3,700 m and the agent says no burn.</w:t>
             </w:r>
           </w:p>
         </w:tc>
@@ -8075,6 +7904,357 @@
           <w:tcPr>
             <w:tcW w:type="dxa" w:w="10080"/>
             <w:tcBorders>
+              <w:top w:val="single" w:color="B07CFF" w:sz="12"/>
+              <w:left w:val="single" w:color="B07CFF" w:sz="12"/>
+              <w:bottom w:val="single" w:color="B07CFF" w:sz="12"/>
+              <w:right w:val="single" w:color="B07CFF" w:sz="12"/>
+            </w:tcBorders>
+            <w:tcMar>
+              <w:top w:type="dxa" w:w="80"/>
+              <w:left w:type="dxa" w:w="160"/>
+              <w:bottom w:type="dxa" w:w="80"/>
+              <w:right w:type="dxa" w:w="160"/>
+            </w:tcMar>
+          </w:tcPr>
+          <w:p>
+            <w:pPr>
+              <w:spacing w:after="40" w:before="0" w:line="264"/>
+            </w:pPr>
+            <w:r>
+              <w:rPr>
+                <w:rFonts w:ascii="Calibri" w:cs="Calibri" w:eastAsia="Calibri" w:hAnsi="Calibri"/>
+                <w:b/>
+                <w:bCs/>
+                <w:i w:val="false"/>
+                <w:iCs w:val="false"/>
+                <w:color w:val="B07CFF"/>
+                <w:sz w:val="18"/>
+                <w:szCs w:val="18"/>
+              </w:rPr>
+              <w:t xml:space="preserve">DO</w:t>
+            </w:r>
+          </w:p>
+          <w:p>
+            <w:pPr>
+              <w:spacing w:after="0" w:before="0" w:line="264"/>
+            </w:pPr>
+            <w:r>
+              <w:rPr>
+                <w:rFonts w:ascii="Calibri" w:cs="Calibri" w:eastAsia="Calibri" w:hAnsi="Calibri"/>
+                <w:b w:val="false"/>
+                <w:bCs w:val="false"/>
+                <w:i w:val="false"/>
+                <w:iCs w:val="false"/>
+                <w:sz w:val="20"/>
+                <w:szCs w:val="20"/>
+              </w:rPr>
+              <w:t xml:space="preserve">Approve</w:t>
+            </w:r>
+          </w:p>
+        </w:tc>
+      </w:tr>
+    </w:tbl>
+    <w:p>
+      <w:pPr>
+        <w:spacing w:after="20" w:before="0" w:line="264"/>
+      </w:pPr>
+      <w:r>
+        <w:rPr>
+          <w:rFonts w:ascii="Calibri" w:cs="Calibri" w:eastAsia="Calibri" w:hAnsi="Calibri"/>
+          <w:b w:val="false"/>
+          <w:bCs w:val="false"/>
+          <w:i w:val="false"/>
+          <w:iCs w:val="false"/>
+          <w:sz w:val="22"/>
+          <w:szCs w:val="22"/>
+        </w:rPr>
+        <w:t xml:space="preserve"/>
+      </w:r>
+    </w:p>
+    <w:p>
+      <w:pPr>
+        <w:spacing w:after="80" w:before="40" w:line="264"/>
+      </w:pPr>
+      <w:r>
+        <w:rPr>
+          <w:rFonts w:ascii="Calibri" w:cs="Calibri" w:eastAsia="Calibri" w:hAnsi="Calibri"/>
+          <w:b/>
+          <w:bCs/>
+          <w:i w:val="false"/>
+          <w:iCs w:val="false"/>
+          <w:color w:val="FF5C5C"/>
+          <w:sz w:val="20"/>
+          <w:szCs w:val="20"/>
+        </w:rPr>
+        <w:t xml:space="preserve">GOTCHA  </w:t>
+      </w:r>
+      <w:r>
+        <w:rPr>
+          <w:rFonts w:ascii="Calibri" w:cs="Calibri" w:eastAsia="Calibri" w:hAnsi="Calibri"/>
+          <w:b w:val="false"/>
+          <w:bCs w:val="false"/>
+          <w:i w:val="false"/>
+          <w:iCs w:val="false"/>
+          <w:sz w:val="20"/>
+          <w:szCs w:val="20"/>
+        </w:rPr>
+        <w:t xml:space="preserve">If the header says LIVE AGENT, switch: ⋯ ▸ Agent ▸ replay · rehearsal, then Skip to next. Replay never calls Gemini.</w:t>
+      </w:r>
+    </w:p>
+    <w:p>
+      <w:pPr>
+        <w:pStyle w:val="Heading3"/>
+        <w:keepNext/>
+        <w:spacing w:after="40" w:before="160"/>
+      </w:pPr>
+      <w:r>
+        <w:rPr>
+          <w:rFonts w:ascii="Calibri" w:cs="Calibri" w:eastAsia="Calibri" w:hAnsi="Calibri"/>
+          <w:b/>
+          <w:bCs/>
+          <w:i w:val="false"/>
+          <w:iCs w:val="false"/>
+          <w:color w:val="3D8BFF"/>
+          <w:sz w:val="22"/>
+          <w:szCs w:val="22"/>
+        </w:rPr>
+        <w:t xml:space="preserve">7. Close: rigor and judgment   ·   TAB · CONSOLE · THE CYMBAL-04 CARD   ·   ~0.5 min</w:t>
+      </w:r>
+    </w:p>
+    <w:p>
+      <w:pPr>
+        <w:spacing w:after="80" w:before="40" w:line="264"/>
+      </w:pPr>
+      <w:r>
+        <w:rPr>
+          <w:rFonts w:ascii="Calibri" w:cs="Calibri" w:eastAsia="Calibri" w:hAnsi="Calibri"/>
+          <w:b/>
+          <w:bCs/>
+          <w:i w:val="false"/>
+          <w:iCs w:val="false"/>
+          <w:color w:val="2ECC71"/>
+          <w:sz w:val="20"/>
+          <w:szCs w:val="20"/>
+        </w:rPr>
+        <w:t xml:space="preserve">WHY  </w:t>
+      </w:r>
+      <w:r>
+        <w:rPr>
+          <w:rFonts w:ascii="Calibri" w:cs="Calibri" w:eastAsia="Calibri" w:hAnsi="Calibri"/>
+          <w:b w:val="false"/>
+          <w:bCs w:val="false"/>
+          <w:i w:val="false"/>
+          <w:iCs w:val="false"/>
+          <w:sz w:val="22"/>
+          <w:szCs w:val="22"/>
+        </w:rPr>
+        <w:t xml:space="preserve">Their judging rubric rewards rigor and judgment; the write-up shows what that looks like on paper.</w:t>
+      </w:r>
+    </w:p>
+    <w:p>
+      <w:pPr>
+        <w:spacing w:after="80" w:before="40" w:line="264"/>
+      </w:pPr>
+      <w:r>
+        <w:rPr>
+          <w:rFonts w:ascii="Calibri" w:cs="Calibri" w:eastAsia="Calibri" w:hAnsi="Calibri"/>
+          <w:b/>
+          <w:bCs/>
+          <w:i w:val="false"/>
+          <w:iCs w:val="false"/>
+          <w:color w:val="2BB3B1"/>
+          <w:sz w:val="20"/>
+          <w:szCs w:val="20"/>
+        </w:rPr>
+        <w:t xml:space="preserve">SAY  </w:t>
+      </w:r>
+      <w:r>
+        <w:rPr>
+          <w:rFonts w:ascii="Calibri" w:cs="Calibri" w:eastAsia="Calibri" w:hAnsi="Calibri"/>
+          <w:b w:val="false"/>
+          <w:bCs w:val="false"/>
+          <w:i/>
+          <w:iCs/>
+          <w:sz w:val="22"/>
+          <w:szCs w:val="22"/>
+        </w:rPr>
+        <w:t xml:space="preserve">Look at how it writes it up: the worst case, which needs no assumptions, next to the number under an assumed uncertainty, and a section on what we can't see. And the Tuesday update is labelled SIMULATED wherever it appears.</w:t>
+      </w:r>
+    </w:p>
+    <w:p>
+      <w:pPr>
+        <w:spacing w:after="80" w:before="40" w:line="264"/>
+      </w:pPr>
+      <w:r>
+        <w:rPr>
+          <w:rFonts w:ascii="Calibri" w:cs="Calibri" w:eastAsia="Calibri" w:hAnsi="Calibri"/>
+          <w:b/>
+          <w:bCs/>
+          <w:i w:val="false"/>
+          <w:iCs w:val="false"/>
+          <w:color w:val="2BB3B1"/>
+          <w:sz w:val="20"/>
+          <w:szCs w:val="20"/>
+        </w:rPr>
+        <w:t xml:space="preserve">SAY  </w:t>
+      </w:r>
+      <w:r>
+        <w:rPr>
+          <w:rFonts w:ascii="Calibri" w:cs="Calibri" w:eastAsia="Calibri" w:hAnsi="Calibri"/>
+          <w:b w:val="false"/>
+          <w:bCs w:val="false"/>
+          <w:i/>
+          <w:iCs/>
+          <w:sz w:val="22"/>
+          <w:szCs w:val="22"/>
+        </w:rPr>
+        <w:t xml:space="preserve">That's the bar: every number from a tool or a query, every assumption stated. Now go build yours.</w:t>
+      </w:r>
+    </w:p>
+    <w:tbl>
+      <w:tblPr>
+        <w:tblW w:type="dxa" w:w="10080"/>
+        <w:tblBorders>
+          <w:top w:val="single" w:color="auto" w:sz="4"/>
+          <w:left w:val="single" w:color="auto" w:sz="4"/>
+          <w:bottom w:val="single" w:color="auto" w:sz="4"/>
+          <w:right w:val="single" w:color="auto" w:sz="4"/>
+          <w:insideH w:val="single" w:color="auto" w:sz="4"/>
+          <w:insideV w:val="single" w:color="auto" w:sz="4"/>
+        </w:tblBorders>
+      </w:tblPr>
+      <w:tblGrid>
+        <w:gridCol w:w="10080"/>
+      </w:tblGrid>
+      <w:tr>
+        <w:trPr>
+          <w:cantSplit/>
+        </w:trPr>
+        <w:tc>
+          <w:tcPr>
+            <w:tcW w:type="dxa" w:w="10080"/>
+            <w:tcBorders>
+              <w:top w:val="single" w:color="B07CFF" w:sz="12"/>
+              <w:left w:val="single" w:color="B07CFF" w:sz="12"/>
+              <w:bottom w:val="single" w:color="B07CFF" w:sz="12"/>
+              <w:right w:val="single" w:color="B07CFF" w:sz="12"/>
+            </w:tcBorders>
+            <w:tcMar>
+              <w:top w:type="dxa" w:w="80"/>
+              <w:left w:type="dxa" w:w="160"/>
+              <w:bottom w:type="dxa" w:w="80"/>
+              <w:right w:type="dxa" w:w="160"/>
+            </w:tcMar>
+          </w:tcPr>
+          <w:p>
+            <w:pPr>
+              <w:spacing w:after="40" w:before="0" w:line="264"/>
+            </w:pPr>
+            <w:r>
+              <w:rPr>
+                <w:rFonts w:ascii="Calibri" w:cs="Calibri" w:eastAsia="Calibri" w:hAnsi="Calibri"/>
+                <w:b/>
+                <w:bCs/>
+                <w:i w:val="false"/>
+                <w:iCs w:val="false"/>
+                <w:color w:val="B07CFF"/>
+                <w:sz w:val="18"/>
+                <w:szCs w:val="18"/>
+              </w:rPr>
+              <w:t xml:space="preserve">DO</w:t>
+            </w:r>
+          </w:p>
+          <w:p>
+            <w:pPr>
+              <w:spacing w:after="0" w:before="0" w:line="264"/>
+            </w:pPr>
+            <w:r>
+              <w:rPr>
+                <w:rFonts w:ascii="Calibri" w:cs="Calibri" w:eastAsia="Calibri" w:hAnsi="Calibri"/>
+                <w:b w:val="false"/>
+                <w:bCs w:val="false"/>
+                <w:i w:val="false"/>
+                <w:iCs w:val="false"/>
+                <w:sz w:val="20"/>
+                <w:szCs w:val="20"/>
+              </w:rPr>
+              <w:t xml:space="preserve">CYMBAL-04 agent card ▸ Conjunction Assessment &amp; Maneuver Recommendation</w:t>
+            </w:r>
+          </w:p>
+          <w:p>
+            <w:pPr>
+              <w:spacing w:after="0" w:before="60" w:line="264"/>
+            </w:pPr>
+            <w:r>
+              <w:rPr>
+                <w:rFonts w:ascii="Calibri" w:cs="Calibri" w:eastAsia="Calibri" w:hAnsi="Calibri"/>
+                <w:b/>
+                <w:bCs/>
+                <w:i w:val="false"/>
+                <w:iCs w:val="false"/>
+                <w:color w:val="2ECC71"/>
+                <w:sz w:val="19"/>
+                <w:szCs w:val="19"/>
+              </w:rPr>
+              <w:t xml:space="preserve">→ </w:t>
+            </w:r>
+            <w:r>
+              <w:rPr>
+                <w:rFonts w:ascii="Calibri" w:cs="Calibri" w:eastAsia="Calibri" w:hAnsi="Calibri"/>
+                <w:b w:val="false"/>
+                <w:bCs w:val="false"/>
+                <w:i w:val="false"/>
+                <w:iCs w:val="false"/>
+                <w:color w:val="9AA4B2"/>
+                <w:sz w:val="19"/>
+                <w:szCs w:val="19"/>
+              </w:rPr>
+              <w:t xml:space="preserve">Risk: worst case and assumed side by side · What we cannot see.</w:t>
+            </w:r>
+          </w:p>
+        </w:tc>
+      </w:tr>
+    </w:tbl>
+    <w:p>
+      <w:pPr>
+        <w:spacing w:after="20" w:before="0" w:line="264"/>
+      </w:pPr>
+      <w:r>
+        <w:rPr>
+          <w:rFonts w:ascii="Calibri" w:cs="Calibri" w:eastAsia="Calibri" w:hAnsi="Calibri"/>
+          <w:b w:val="false"/>
+          <w:bCs w:val="false"/>
+          <w:i w:val="false"/>
+          <w:iCs w:val="false"/>
+          <w:sz w:val="22"/>
+          <w:szCs w:val="22"/>
+        </w:rPr>
+        <w:t xml:space="preserve"/>
+      </w:r>
+    </w:p>
+    <w:tbl>
+      <w:tblPr>
+        <w:tblW w:type="dxa" w:w="10080"/>
+        <w:tblBorders>
+          <w:top w:val="single" w:color="auto" w:sz="4"/>
+          <w:left w:val="single" w:color="auto" w:sz="4"/>
+          <w:bottom w:val="single" w:color="auto" w:sz="4"/>
+          <w:right w:val="single" w:color="auto" w:sz="4"/>
+          <w:insideH w:val="single" w:color="auto" w:sz="4"/>
+          <w:insideV w:val="single" w:color="auto" w:sz="4"/>
+        </w:tblBorders>
+      </w:tblPr>
+      <w:tblGrid>
+        <w:gridCol w:w="10080"/>
+      </w:tblGrid>
+      <w:tr>
+        <w:trPr>
+          <w:cantSplit/>
+        </w:trPr>
+        <w:tc>
+          <w:tcPr>
+            <w:tcW w:type="dxa" w:w="10080"/>
+            <w:tcBorders>
               <w:top w:val="single" w:color="2BB3B1" w:sz="12"/>
               <w:left w:val="single" w:color="2BB3B1" w:sz="12"/>
               <w:bottom w:val="single" w:color="2BB3B1" w:sz="12"/>
@@ -8672,7 +8852,7 @@
           <w:sz w:val="22"/>
           <w:szCs w:val="22"/>
         </w:rPr>
-        <w:t xml:space="preserve">Two Web Preview tabs from one Cloud Shell (ports 8000 and 8080) at the same time.</w:t>
+        <w:t xml:space="preserve">The start block's two links each open their own Web Preview tab (ports 8000 and 8080), both working at once.</w:t>
       </w:r>
     </w:p>
     <w:p>

</xml_diff>

<commit_message>
Cloud Run keeps one instance warm; the teleprompter explains the Cloud Run page and the agent card
- agent/deploy.sh: minimum instances 1 by default, so the service never scales to zero and the first request
  on stage doesn't wait for a cold start (MIN_INSTANCES=0 lets it sleep again).
- start_demo.sh: a new step checks cymbal-ops and sets minimum instances to 1 if an earlier deploy left it at 0
  (or says the service isn't deployed).
- Teleprompter, step 5: what they're looking at (Cloud Run, the service, URL, authentication, minimum
  instances, revisions) and a talk track that names the two settings worth stealing.
- Teleprompter, step 6: a reminder of each piece of the purple agent card, top to bottom.

Co-Authored-By: Claude Opus 5.5 <noreply@anthropic.com>
Claude-Session: https://claude.ai/code/session_01XP7fEGExmmDaM7W6ayMgxX
</commit_message>
<xml_diff>
--- a/run-of-show/docs/PLANNING GUIDE - A4I kickoff demo.docx
+++ b/run-of-show/docs/PLANNING GUIDE - A4I kickoff demo.docx
@@ -6784,7 +6784,37 @@
           <w:sz w:val="22"/>
           <w:szCs w:val="22"/>
         </w:rPr>
-        <w:t xml:space="preserve">Fourth: deploy. Same agent, on Cloud Run, authentication required, one command. Yours goes to Cloud Run or Agent Runtime, your choice.</w:t>
+        <w:t xml:space="preserve">Fourth: deploy. This is Cloud Run: Google runs our container, we manage no servers. It's the same agent you just watched, on a real URL, one command.</w:t>
+      </w:r>
+    </w:p>
+    <w:p>
+      <w:pPr>
+        <w:spacing w:after="80" w:before="40" w:line="264"/>
+      </w:pPr>
+      <w:r>
+        <w:rPr>
+          <w:rFonts w:ascii="Calibri" w:cs="Calibri" w:eastAsia="Calibri" w:hAnsi="Calibri"/>
+          <w:b/>
+          <w:bCs/>
+          <w:i w:val="false"/>
+          <w:iCs w:val="false"/>
+          <w:color w:val="2BB3B1"/>
+          <w:sz w:val="20"/>
+          <w:szCs w:val="20"/>
+        </w:rPr>
+        <w:t xml:space="preserve">SAY  </w:t>
+      </w:r>
+      <w:r>
+        <w:rPr>
+          <w:rFonts w:ascii="Calibri" w:cs="Calibri" w:eastAsia="Calibri" w:hAnsi="Calibri"/>
+          <w:b w:val="false"/>
+          <w:bCs w:val="false"/>
+          <w:i/>
+          <w:iCs/>
+          <w:sz w:val="22"/>
+          <w:szCs w:val="22"/>
+        </w:rPr>
+        <w:t xml:space="preserve">Two settings worth stealing. Authentication required, because this agent can run code and query our data. And one instance kept warm, because the first request after a quiet hour is usually the one you make on stage. Yours goes to Cloud Run or Agent Runtime, your choice.</w:t>
       </w:r>
     </w:p>
     <w:p>
@@ -6840,10 +6870,10 @@
           <w:tcPr>
             <w:tcW w:type="dxa" w:w="10080"/>
             <w:tcBorders>
-              <w:top w:val="single" w:color="B07CFF" w:sz="12"/>
-              <w:left w:val="single" w:color="B07CFF" w:sz="12"/>
-              <w:bottom w:val="single" w:color="B07CFF" w:sz="12"/>
-              <w:right w:val="single" w:color="B07CFF" w:sz="12"/>
+              <w:top w:val="single" w:color="9AA4B2" w:sz="12"/>
+              <w:left w:val="single" w:color="9AA4B2" w:sz="12"/>
+              <w:bottom w:val="single" w:color="9AA4B2" w:sz="12"/>
+              <w:right w:val="single" w:color="9AA4B2" w:sz="12"/>
             </w:tcBorders>
             <w:tcMar>
               <w:top w:type="dxa" w:w="80"/>
@@ -6863,11 +6893,11 @@
                 <w:bCs/>
                 <w:i w:val="false"/>
                 <w:iCs w:val="false"/>
-                <w:color w:val="B07CFF"/>
+                <w:color w:val="9AA4B2"/>
                 <w:sz w:val="18"/>
                 <w:szCs w:val="18"/>
               </w:rPr>
-              <w:t xml:space="preserve">DO</w:t>
+              <w:t xml:space="preserve">WHAT THEY'RE LOOKING AT</w:t>
             </w:r>
           </w:p>
           <w:p>
@@ -6884,38 +6914,92 @@
                 <w:sz w:val="20"/>
                 <w:szCs w:val="20"/>
               </w:rPr>
-              <w:t xml:space="preserve">Point at the service URL, Authentication: Require authentication, and the one instance.</w:t>
-            </w:r>
-          </w:p>
-          <w:p>
-            <w:pPr>
-              <w:spacing w:after="0" w:before="60" w:line="264"/>
-            </w:pPr>
-            <w:r>
-              <w:rPr>
-                <w:rFonts w:ascii="Calibri" w:cs="Calibri" w:eastAsia="Calibri" w:hAnsi="Calibri"/>
-                <w:b/>
-                <w:bCs/>
-                <w:i w:val="false"/>
-                <w:iCs w:val="false"/>
-                <w:color w:val="2ECC71"/>
-                <w:sz w:val="19"/>
-                <w:szCs w:val="19"/>
-              </w:rPr>
-              <w:t xml:space="preserve">→ </w:t>
-            </w:r>
-            <w:r>
-              <w:rPr>
-                <w:rFonts w:ascii="Calibri" w:cs="Calibri" w:eastAsia="Calibri" w:hAnsi="Calibri"/>
-                <w:b w:val="false"/>
-                <w:bCs w:val="false"/>
-                <w:i w:val="false"/>
-                <w:iCs w:val="false"/>
-                <w:color w:val="9AA4B2"/>
-                <w:sz w:val="19"/>
-                <w:szCs w:val="19"/>
-              </w:rPr>
-              <w:t xml:space="preserve">cymbal-ops, healthy, one revision.</w:t>
+              <w:t xml:space="preserve">Cloud Run: Google runs your container for you, no servers to manage.</w:t>
+            </w:r>
+          </w:p>
+          <w:p>
+            <w:pPr>
+              <w:spacing w:after="0" w:before="0" w:line="264"/>
+            </w:pPr>
+            <w:r>
+              <w:rPr>
+                <w:rFonts w:ascii="Calibri" w:cs="Calibri" w:eastAsia="Calibri" w:hAnsi="Calibri"/>
+                <w:b w:val="false"/>
+                <w:bCs w:val="false"/>
+                <w:i w:val="false"/>
+                <w:iCs w:val="false"/>
+                <w:sz w:val="20"/>
+                <w:szCs w:val="20"/>
+              </w:rPr>
+              <w:t xml:space="preserve">cymbal-ops: the same agent as step 3, plus the ADK web UI, packaged as a container by adk deploy.</w:t>
+            </w:r>
+          </w:p>
+          <w:p>
+            <w:pPr>
+              <w:spacing w:after="0" w:before="0" w:line="264"/>
+            </w:pPr>
+            <w:r>
+              <w:rPr>
+                <w:rFonts w:ascii="Calibri" w:cs="Calibri" w:eastAsia="Calibri" w:hAnsi="Calibri"/>
+                <w:b w:val="false"/>
+                <w:bCs w:val="false"/>
+                <w:i w:val="false"/>
+                <w:iCs w:val="false"/>
+                <w:sz w:val="20"/>
+                <w:szCs w:val="20"/>
+              </w:rPr>
+              <w:t xml:space="preserve">URL: where it answers on the internet.</w:t>
+            </w:r>
+          </w:p>
+          <w:p>
+            <w:pPr>
+              <w:spacing w:after="0" w:before="0" w:line="264"/>
+            </w:pPr>
+            <w:r>
+              <w:rPr>
+                <w:rFonts w:ascii="Calibri" w:cs="Calibri" w:eastAsia="Calibri" w:hAnsi="Calibri"/>
+                <w:b w:val="false"/>
+                <w:bCs w:val="false"/>
+                <w:i w:val="false"/>
+                <w:iCs w:val="false"/>
+                <w:sz w:val="20"/>
+                <w:szCs w:val="20"/>
+              </w:rPr>
+              <w:t xml:space="preserve">Require authentication: only signed-in people with access can reach it. The agent can run code and query BigQuery; an open URL on a slide is an invitation.</w:t>
+            </w:r>
+          </w:p>
+          <w:p>
+            <w:pPr>
+              <w:spacing w:after="0" w:before="0" w:line="264"/>
+            </w:pPr>
+            <w:r>
+              <w:rPr>
+                <w:rFonts w:ascii="Calibri" w:cs="Calibri" w:eastAsia="Calibri" w:hAnsi="Calibri"/>
+                <w:b w:val="false"/>
+                <w:bCs w:val="false"/>
+                <w:i w:val="false"/>
+                <w:iCs w:val="false"/>
+                <w:sz w:val="20"/>
+                <w:szCs w:val="20"/>
+              </w:rPr>
+              <w:t xml:space="preserve">Minimum instances 1: one copy always running, so the first request after a quiet hour doesn't wait for a cold start.</w:t>
+            </w:r>
+          </w:p>
+          <w:p>
+            <w:pPr>
+              <w:spacing w:after="0" w:before="0" w:line="264"/>
+            </w:pPr>
+            <w:r>
+              <w:rPr>
+                <w:rFonts w:ascii="Calibri" w:cs="Calibri" w:eastAsia="Calibri" w:hAnsi="Calibri"/>
+                <w:b w:val="false"/>
+                <w:bCs w:val="false"/>
+                <w:i w:val="false"/>
+                <w:iCs w:val="false"/>
+                <w:sz w:val="20"/>
+                <w:szCs w:val="20"/>
+              </w:rPr>
+              <w:t xml:space="preserve">Revision: each deploy is a new version; Cloud Run can roll back to any of them.</w:t>
             </w:r>
           </w:p>
         </w:tc>
@@ -6961,10 +7045,10 @@
           <w:tcPr>
             <w:tcW w:type="dxa" w:w="10080"/>
             <w:tcBorders>
-              <w:top w:val="single" w:color="2BB3B1" w:sz="12"/>
-              <w:left w:val="single" w:color="2BB3B1" w:sz="12"/>
-              <w:bottom w:val="single" w:color="2BB3B1" w:sz="12"/>
-              <w:right w:val="single" w:color="2BB3B1" w:sz="12"/>
+              <w:top w:val="single" w:color="B07CFF" w:sz="12"/>
+              <w:left w:val="single" w:color="B07CFF" w:sz="12"/>
+              <w:bottom w:val="single" w:color="B07CFF" w:sz="12"/>
+              <w:right w:val="single" w:color="B07CFF" w:sz="12"/>
             </w:tcBorders>
             <w:tcMar>
               <w:top w:type="dxa" w:w="80"/>
@@ -6984,11 +7068,11 @@
                 <w:bCs/>
                 <w:i w:val="false"/>
                 <w:iCs w:val="false"/>
-                <w:color w:val="2BB3B1"/>
+                <w:color w:val="B07CFF"/>
                 <w:sz w:val="18"/>
                 <w:szCs w:val="18"/>
               </w:rPr>
-              <w:t xml:space="preserve">SAY</w:t>
+              <w:t xml:space="preserve">DO</w:t>
             </w:r>
           </w:p>
           <w:p>
@@ -7000,12 +7084,43 @@
                 <w:rFonts w:ascii="Calibri" w:cs="Calibri" w:eastAsia="Calibri" w:hAnsi="Calibri"/>
                 <w:b w:val="false"/>
                 <w:bCs w:val="false"/>
-                <w:i/>
-                <w:iCs/>
+                <w:i w:val="false"/>
+                <w:iCs w:val="false"/>
                 <w:sz w:val="20"/>
                 <w:szCs w:val="20"/>
               </w:rPr>
-              <w:t xml:space="preserve">One command put it there: bash agent/deploy.sh. Your agent has to actually run somewhere too.</w:t>
+              <w:t xml:space="preserve">Point at the service URL and Authentication: Require authentication. Minimum instances 1 is in the revision's details; if it isn't quick to find, just say it.</w:t>
+            </w:r>
+          </w:p>
+          <w:p>
+            <w:pPr>
+              <w:spacing w:after="0" w:before="60" w:line="264"/>
+            </w:pPr>
+            <w:r>
+              <w:rPr>
+                <w:rFonts w:ascii="Calibri" w:cs="Calibri" w:eastAsia="Calibri" w:hAnsi="Calibri"/>
+                <w:b/>
+                <w:bCs/>
+                <w:i w:val="false"/>
+                <w:iCs w:val="false"/>
+                <w:color w:val="2ECC71"/>
+                <w:sz w:val="19"/>
+                <w:szCs w:val="19"/>
+              </w:rPr>
+              <w:t xml:space="preserve">→ </w:t>
+            </w:r>
+            <w:r>
+              <w:rPr>
+                <w:rFonts w:ascii="Calibri" w:cs="Calibri" w:eastAsia="Calibri" w:hAnsi="Calibri"/>
+                <w:b w:val="false"/>
+                <w:bCs w:val="false"/>
+                <w:i w:val="false"/>
+                <w:iCs w:val="false"/>
+                <w:color w:val="9AA4B2"/>
+                <w:sz w:val="19"/>
+                <w:szCs w:val="19"/>
+              </w:rPr>
+              <w:t xml:space="preserve">cymbal-ops, healthy, one instance kept warm.</w:t>
             </w:r>
           </w:p>
         </w:tc>
@@ -7026,254 +7141,6 @@
           <w:szCs w:val="22"/>
         </w:rPr>
         <w:t xml:space="preserve"/>
-      </w:r>
-    </w:p>
-    <w:p>
-      <w:pPr>
-        <w:pStyle w:val="Heading3"/>
-        <w:keepNext/>
-        <w:spacing w:after="40" w:before="160"/>
-      </w:pPr>
-      <w:r>
-        <w:rPr>
-          <w:rFonts w:ascii="Calibri" w:cs="Calibri" w:eastAsia="Calibri" w:hAnsi="Calibri"/>
-          <w:b/>
-          <w:bCs/>
-          <w:i w:val="false"/>
-          <w:iCs w:val="false"/>
-          <w:color w:val="3D8BFF"/>
-          <w:sz w:val="22"/>
-          <w:szCs w:val="22"/>
-        </w:rPr>
-        <w:t xml:space="preserve">6. Show: the finished product   ·   TAB · CONSOLE · PORT 8080   ·   ~3 min</w:t>
-      </w:r>
-    </w:p>
-    <w:p>
-      <w:pPr>
-        <w:spacing w:after="80" w:before="40" w:line="264"/>
-      </w:pPr>
-      <w:r>
-        <w:rPr>
-          <w:rFonts w:ascii="Calibri" w:cs="Calibri" w:eastAsia="Calibri" w:hAnsi="Calibri"/>
-          <w:b/>
-          <w:bCs/>
-          <w:i w:val="false"/>
-          <w:iCs w:val="false"/>
-          <w:color w:val="2ECC71"/>
-          <w:sz w:val="20"/>
-          <w:szCs w:val="20"/>
-        </w:rPr>
-        <w:t xml:space="preserve">WHY  </w:t>
-      </w:r>
-      <w:r>
-        <w:rPr>
-          <w:rFonts w:ascii="Calibri" w:cs="Calibri" w:eastAsia="Calibri" w:hAnsi="Calibri"/>
-          <w:b w:val="false"/>
-          <w:bCs w:val="false"/>
-          <w:i w:val="false"/>
-          <w:iCs w:val="false"/>
-          <w:sz w:val="22"/>
-          <w:szCs w:val="22"/>
-        </w:rPr>
-        <w:t xml:space="preserve">What "an agent, not a chat box" looks like: plain code watches, the agent decides, a human approves. Two alerts, two opposite answers.</w:t>
-      </w:r>
-    </w:p>
-    <w:p>
-      <w:pPr>
-        <w:spacing w:after="80" w:before="40" w:line="264"/>
-      </w:pPr>
-      <w:r>
-        <w:rPr>
-          <w:rFonts w:ascii="Calibri" w:cs="Calibri" w:eastAsia="Calibri" w:hAnsi="Calibri"/>
-          <w:b/>
-          <w:bCs/>
-          <w:i w:val="false"/>
-          <w:iCs w:val="false"/>
-          <w:color w:val="2BB3B1"/>
-          <w:sz w:val="20"/>
-          <w:szCs w:val="20"/>
-        </w:rPr>
-        <w:t xml:space="preserve">SAY  </w:t>
-      </w:r>
-      <w:r>
-        <w:rPr>
-          <w:rFonts w:ascii="Calibri" w:cs="Calibri" w:eastAsia="Calibri" w:hAnsi="Calibri"/>
-          <w:b w:val="false"/>
-          <w:bCs w:val="false"/>
-          <w:i/>
-          <w:iCs/>
-          <w:sz w:val="22"/>
-          <w:szCs w:val="22"/>
-        </w:rPr>
-        <w:t xml:space="preserve">Last step, and it's what your judges will see: show it. This is the finished product. Time runs over the week; plain code, no AI, watches for anything that matters; and when something needs a decision, it wakes the agent.</w:t>
-      </w:r>
-    </w:p>
-    <w:p>
-      <w:pPr>
-        <w:spacing w:after="80" w:before="40" w:line="264"/>
-      </w:pPr>
-      <w:r>
-        <w:rPr>
-          <w:rFonts w:ascii="Calibri" w:cs="Calibri" w:eastAsia="Calibri" w:hAnsi="Calibri"/>
-          <w:b/>
-          <w:bCs/>
-          <w:i w:val="false"/>
-          <w:iCs w:val="false"/>
-          <w:color w:val="2BB3B1"/>
-          <w:sz w:val="20"/>
-          <w:szCs w:val="20"/>
-        </w:rPr>
-        <w:t xml:space="preserve">SAY  </w:t>
-      </w:r>
-      <w:r>
-        <w:rPr>
-          <w:rFonts w:ascii="Calibri" w:cs="Calibri" w:eastAsia="Calibri" w:hAnsi="Calibri"/>
-          <w:b w:val="false"/>
-          <w:bCs w:val="false"/>
-          <w:i/>
-          <w:iCs/>
-          <w:sz w:val="22"/>
-          <w:szCs w:val="22"/>
-        </w:rPr>
-        <w:t xml:space="preserve">Eighteen hours out, when the tracking is as good as it will get and there's still time to burn cheaply, the agent runs the playbook you just watched: assess, size the burn at two times, price it, write it up. Then it waits for a human. I approve.</w:t>
-      </w:r>
-    </w:p>
-    <w:p>
-      <w:pPr>
-        <w:spacing w:after="80" w:before="40" w:line="264"/>
-      </w:pPr>
-      <w:r>
-        <w:rPr>
-          <w:rFonts w:ascii="Calibri" w:cs="Calibri" w:eastAsia="Calibri" w:hAnsi="Calibri"/>
-          <w:b/>
-          <w:bCs/>
-          <w:i w:val="false"/>
-          <w:iCs w:val="false"/>
-          <w:color w:val="2BB3B1"/>
-          <w:sz w:val="20"/>
-          <w:szCs w:val="20"/>
-        </w:rPr>
-        <w:t xml:space="preserve">SAY  </w:t>
-      </w:r>
-      <w:r>
-        <w:rPr>
-          <w:rFonts w:ascii="Calibri" w:cs="Calibri" w:eastAsia="Calibri" w:hAnsi="Calibri"/>
-          <w:b w:val="false"/>
-          <w:bCs w:val="false"/>
-          <w:i/>
-          <w:iCs/>
-          <w:sz w:val="22"/>
-          <w:szCs w:val="22"/>
-        </w:rPr>
-        <w:t xml:space="preserve">There it goes. Without the burn, 301 metres. With it, three kilometres, for a day and a half of the satellite's life.</w:t>
-      </w:r>
-    </w:p>
-    <w:p>
-      <w:pPr>
-        <w:spacing w:after="80" w:before="40" w:line="264"/>
-      </w:pPr>
-      <w:r>
-        <w:rPr>
-          <w:rFonts w:ascii="Calibri" w:cs="Calibri" w:eastAsia="Calibri" w:hAnsi="Calibri"/>
-          <w:b/>
-          <w:bCs/>
-          <w:i w:val="false"/>
-          <w:iCs w:val="false"/>
-          <w:color w:val="2BB3B1"/>
-          <w:sz w:val="20"/>
-          <w:szCs w:val="20"/>
-        </w:rPr>
-        <w:t xml:space="preserve">SAY  </w:t>
-      </w:r>
-      <w:r>
-        <w:rPr>
-          <w:rFonts w:ascii="Calibri" w:cs="Calibri" w:eastAsia="Calibri" w:hAnsi="Calibri"/>
-          <w:b w:val="false"/>
-          <w:bCs w:val="false"/>
-          <w:i/>
-          <w:iCs/>
-          <w:sz w:val="22"/>
-          <w:szCs w:val="22"/>
-        </w:rPr>
-        <w:t xml:space="preserve">Now the other alert. On Friday this rocket body was stale: the tracking was a week old, so the agent asked for fresh tracking instead of spending fuel. Tuesday it arrives, and the right answer is: do nothing. Same agent, opposite answer. That's judgment.</w:t>
-      </w:r>
-    </w:p>
-    <w:p>
-      <w:pPr>
-        <w:spacing w:after="80" w:before="40" w:line="264"/>
-      </w:pPr>
-      <w:r>
-        <w:rPr>
-          <w:rFonts w:ascii="Calibri" w:cs="Calibri" w:eastAsia="Calibri" w:hAnsi="Calibri"/>
-          <w:b/>
-          <w:bCs/>
-          <w:i w:val="false"/>
-          <w:iCs w:val="false"/>
-          <w:color w:val="2BB3B1"/>
-          <w:sz w:val="20"/>
-          <w:szCs w:val="20"/>
-        </w:rPr>
-        <w:t xml:space="preserve">SAY  </w:t>
-      </w:r>
-      <w:r>
-        <w:rPr>
-          <w:rFonts w:ascii="Calibri" w:cs="Calibri" w:eastAsia="Calibri" w:hAnsi="Calibri"/>
-          <w:b w:val="false"/>
-          <w:bCs w:val="false"/>
-          <w:i/>
-          <w:iCs/>
-          <w:sz w:val="22"/>
-          <w:szCs w:val="22"/>
-        </w:rPr>
-        <w:t xml:space="preserve">The cards you just saw are a recording of a real run of the agent, played back so a demo on conference wifi runs the same every time. That's a trick worth stealing for your own Show step.</w:t>
-      </w:r>
-    </w:p>
-    <w:p>
-      <w:pPr>
-        <w:spacing w:after="80" w:before="40" w:line="264"/>
-      </w:pPr>
-      <w:r>
-        <w:rPr>
-          <w:rFonts w:ascii="Calibri" w:cs="Calibri" w:eastAsia="Calibri" w:hAnsi="Calibri"/>
-          <w:b/>
-          <w:bCs/>
-          <w:i w:val="false"/>
-          <w:iCs w:val="false"/>
-          <w:color w:val="B07CFF"/>
-          <w:sz w:val="20"/>
-          <w:szCs w:val="20"/>
-        </w:rPr>
-        <w:t xml:space="preserve">NEEDS  </w:t>
-      </w:r>
-      <w:r>
-        <w:rPr>
-          <w:rFonts w:ascii="Calibri" w:cs="Calibri" w:eastAsia="Calibri" w:hAnsi="Calibri"/>
-          <w:b w:val="false"/>
-          <w:bCs w:val="false"/>
-          <w:i w:val="false"/>
-          <w:iCs w:val="false"/>
-          <w:sz w:val="20"/>
-          <w:szCs w:val="20"/>
-        </w:rPr>
-        <w:t xml:space="preserve">Header says REPLAY. Clock Fri 25 Sep 01:00:00 UTC. If not: ⋯ ▸ Restart the week.</w:t>
-      </w:r>
-    </w:p>
-    <w:p>
-      <w:pPr>
-        <w:spacing w:after="80" w:before="40" w:line="264"/>
-      </w:pPr>
-      <w:r>
-        <w:rPr>
-          <w:rFonts w:ascii="Calibri" w:cs="Calibri" w:eastAsia="Calibri" w:hAnsi="Calibri"/>
-          <w:b w:val="false"/>
-          <w:bCs w:val="false"/>
-          <w:i w:val="false"/>
-          <w:iCs w:val="false"/>
-          <w:color w:val="9AA4B2"/>
-          <w:sz w:val="20"/>
-          <w:szCs w:val="20"/>
-        </w:rPr>
-        <w:t xml:space="preserve">Press Skip to next for each step. The clock stops by itself when the agent is woken and waits for Approve.</w:t>
       </w:r>
     </w:p>
     <w:tbl>
@@ -7299,10 +7166,10 @@
           <w:tcPr>
             <w:tcW w:type="dxa" w:w="10080"/>
             <w:tcBorders>
-              <w:top w:val="single" w:color="B07CFF" w:sz="12"/>
-              <w:left w:val="single" w:color="B07CFF" w:sz="12"/>
-              <w:bottom w:val="single" w:color="B07CFF" w:sz="12"/>
-              <w:right w:val="single" w:color="B07CFF" w:sz="12"/>
+              <w:top w:val="single" w:color="2BB3B1" w:sz="12"/>
+              <w:left w:val="single" w:color="2BB3B1" w:sz="12"/>
+              <w:bottom w:val="single" w:color="2BB3B1" w:sz="12"/>
+              <w:right w:val="single" w:color="2BB3B1" w:sz="12"/>
             </w:tcBorders>
             <w:tcMar>
               <w:top w:type="dxa" w:w="80"/>
@@ -7322,11 +7189,11 @@
                 <w:bCs/>
                 <w:i w:val="false"/>
                 <w:iCs w:val="false"/>
-                <w:color w:val="B07CFF"/>
+                <w:color w:val="2BB3B1"/>
                 <w:sz w:val="18"/>
                 <w:szCs w:val="18"/>
               </w:rPr>
-              <w:t xml:space="preserve">DO</w:t>
+              <w:t xml:space="preserve">SAY</w:t>
             </w:r>
           </w:p>
           <w:p>
@@ -7338,43 +7205,12 @@
                 <w:rFonts w:ascii="Calibri" w:cs="Calibri" w:eastAsia="Calibri" w:hAnsi="Calibri"/>
                 <w:b w:val="false"/>
                 <w:bCs w:val="false"/>
-                <w:i w:val="false"/>
-                <w:iCs w:val="false"/>
+                <w:i/>
+                <w:iCs/>
                 <w:sz w:val="20"/>
                 <w:szCs w:val="20"/>
               </w:rPr>
-              <w:t xml:space="preserve">Skip to next</w:t>
-            </w:r>
-          </w:p>
-          <w:p>
-            <w:pPr>
-              <w:spacing w:after="0" w:before="60" w:line="264"/>
-            </w:pPr>
-            <w:r>
-              <w:rPr>
-                <w:rFonts w:ascii="Calibri" w:cs="Calibri" w:eastAsia="Calibri" w:hAnsi="Calibri"/>
-                <w:b/>
-                <w:bCs/>
-                <w:i w:val="false"/>
-                <w:iCs w:val="false"/>
-                <w:color w:val="2ECC71"/>
-                <w:sz w:val="19"/>
-                <w:szCs w:val="19"/>
-              </w:rPr>
-              <w:t xml:space="preserve">→ </w:t>
-            </w:r>
-            <w:r>
-              <w:rPr>
-                <w:rFonts w:ascii="Calibri" w:cs="Calibri" w:eastAsia="Calibri" w:hAnsi="Calibri"/>
-                <w:b w:val="false"/>
-                <w:bCs w:val="false"/>
-                <w:i w:val="false"/>
-                <w:iCs w:val="false"/>
-                <w:color w:val="9AA4B2"/>
-                <w:sz w:val="19"/>
-                <w:szCs w:val="19"/>
-              </w:rPr>
-              <w:t xml:space="preserve">CYMBAL-01's pass at real time: the amber dot slides by at 382 m. "Too late to act" was already on the desk.</w:t>
+              <w:t xml:space="preserve">One command put it there: bash agent/deploy.sh. Your agent has to actually run somewhere too.</w:t>
             </w:r>
           </w:p>
         </w:tc>
@@ -7395,6 +7231,254 @@
           <w:szCs w:val="22"/>
         </w:rPr>
         <w:t xml:space="preserve"/>
+      </w:r>
+    </w:p>
+    <w:p>
+      <w:pPr>
+        <w:pStyle w:val="Heading3"/>
+        <w:keepNext/>
+        <w:spacing w:after="40" w:before="160"/>
+      </w:pPr>
+      <w:r>
+        <w:rPr>
+          <w:rFonts w:ascii="Calibri" w:cs="Calibri" w:eastAsia="Calibri" w:hAnsi="Calibri"/>
+          <w:b/>
+          <w:bCs/>
+          <w:i w:val="false"/>
+          <w:iCs w:val="false"/>
+          <w:color w:val="3D8BFF"/>
+          <w:sz w:val="22"/>
+          <w:szCs w:val="22"/>
+        </w:rPr>
+        <w:t xml:space="preserve">6. Show: the finished product   ·   TAB · CONSOLE · PORT 8080   ·   ~3 min</w:t>
+      </w:r>
+    </w:p>
+    <w:p>
+      <w:pPr>
+        <w:spacing w:after="80" w:before="40" w:line="264"/>
+      </w:pPr>
+      <w:r>
+        <w:rPr>
+          <w:rFonts w:ascii="Calibri" w:cs="Calibri" w:eastAsia="Calibri" w:hAnsi="Calibri"/>
+          <w:b/>
+          <w:bCs/>
+          <w:i w:val="false"/>
+          <w:iCs w:val="false"/>
+          <w:color w:val="2ECC71"/>
+          <w:sz w:val="20"/>
+          <w:szCs w:val="20"/>
+        </w:rPr>
+        <w:t xml:space="preserve">WHY  </w:t>
+      </w:r>
+      <w:r>
+        <w:rPr>
+          <w:rFonts w:ascii="Calibri" w:cs="Calibri" w:eastAsia="Calibri" w:hAnsi="Calibri"/>
+          <w:b w:val="false"/>
+          <w:bCs w:val="false"/>
+          <w:i w:val="false"/>
+          <w:iCs w:val="false"/>
+          <w:sz w:val="22"/>
+          <w:szCs w:val="22"/>
+        </w:rPr>
+        <w:t xml:space="preserve">What "an agent, not a chat box" looks like: plain code watches, the agent decides, a human approves. Two alerts, two opposite answers.</w:t>
+      </w:r>
+    </w:p>
+    <w:p>
+      <w:pPr>
+        <w:spacing w:after="80" w:before="40" w:line="264"/>
+      </w:pPr>
+      <w:r>
+        <w:rPr>
+          <w:rFonts w:ascii="Calibri" w:cs="Calibri" w:eastAsia="Calibri" w:hAnsi="Calibri"/>
+          <w:b/>
+          <w:bCs/>
+          <w:i w:val="false"/>
+          <w:iCs w:val="false"/>
+          <w:color w:val="2BB3B1"/>
+          <w:sz w:val="20"/>
+          <w:szCs w:val="20"/>
+        </w:rPr>
+        <w:t xml:space="preserve">SAY  </w:t>
+      </w:r>
+      <w:r>
+        <w:rPr>
+          <w:rFonts w:ascii="Calibri" w:cs="Calibri" w:eastAsia="Calibri" w:hAnsi="Calibri"/>
+          <w:b w:val="false"/>
+          <w:bCs w:val="false"/>
+          <w:i/>
+          <w:iCs/>
+          <w:sz w:val="22"/>
+          <w:szCs w:val="22"/>
+        </w:rPr>
+        <w:t xml:space="preserve">Last step, and it's what your judges will see: show it. This is the finished product. Time runs over the week; plain code, no AI, watches for anything that matters; and when something needs a decision, it wakes the agent.</w:t>
+      </w:r>
+    </w:p>
+    <w:p>
+      <w:pPr>
+        <w:spacing w:after="80" w:before="40" w:line="264"/>
+      </w:pPr>
+      <w:r>
+        <w:rPr>
+          <w:rFonts w:ascii="Calibri" w:cs="Calibri" w:eastAsia="Calibri" w:hAnsi="Calibri"/>
+          <w:b/>
+          <w:bCs/>
+          <w:i w:val="false"/>
+          <w:iCs w:val="false"/>
+          <w:color w:val="2BB3B1"/>
+          <w:sz w:val="20"/>
+          <w:szCs w:val="20"/>
+        </w:rPr>
+        <w:t xml:space="preserve">SAY  </w:t>
+      </w:r>
+      <w:r>
+        <w:rPr>
+          <w:rFonts w:ascii="Calibri" w:cs="Calibri" w:eastAsia="Calibri" w:hAnsi="Calibri"/>
+          <w:b w:val="false"/>
+          <w:bCs w:val="false"/>
+          <w:i/>
+          <w:iCs/>
+          <w:sz w:val="22"/>
+          <w:szCs w:val="22"/>
+        </w:rPr>
+        <w:t xml:space="preserve">Eighteen hours out, when the tracking is as good as it will get and there's still time to burn cheaply, the agent runs the playbook you just watched: assess, size the burn at two times, price it, write it up. Then it waits for a human. I approve.</w:t>
+      </w:r>
+    </w:p>
+    <w:p>
+      <w:pPr>
+        <w:spacing w:after="80" w:before="40" w:line="264"/>
+      </w:pPr>
+      <w:r>
+        <w:rPr>
+          <w:rFonts w:ascii="Calibri" w:cs="Calibri" w:eastAsia="Calibri" w:hAnsi="Calibri"/>
+          <w:b/>
+          <w:bCs/>
+          <w:i w:val="false"/>
+          <w:iCs w:val="false"/>
+          <w:color w:val="2BB3B1"/>
+          <w:sz w:val="20"/>
+          <w:szCs w:val="20"/>
+        </w:rPr>
+        <w:t xml:space="preserve">SAY  </w:t>
+      </w:r>
+      <w:r>
+        <w:rPr>
+          <w:rFonts w:ascii="Calibri" w:cs="Calibri" w:eastAsia="Calibri" w:hAnsi="Calibri"/>
+          <w:b w:val="false"/>
+          <w:bCs w:val="false"/>
+          <w:i/>
+          <w:iCs/>
+          <w:sz w:val="22"/>
+          <w:szCs w:val="22"/>
+        </w:rPr>
+        <w:t xml:space="preserve">There it goes. Without the burn, 301 metres. With it, three kilometres, for a day and a half of the satellite's life.</w:t>
+      </w:r>
+    </w:p>
+    <w:p>
+      <w:pPr>
+        <w:spacing w:after="80" w:before="40" w:line="264"/>
+      </w:pPr>
+      <w:r>
+        <w:rPr>
+          <w:rFonts w:ascii="Calibri" w:cs="Calibri" w:eastAsia="Calibri" w:hAnsi="Calibri"/>
+          <w:b/>
+          <w:bCs/>
+          <w:i w:val="false"/>
+          <w:iCs w:val="false"/>
+          <w:color w:val="2BB3B1"/>
+          <w:sz w:val="20"/>
+          <w:szCs w:val="20"/>
+        </w:rPr>
+        <w:t xml:space="preserve">SAY  </w:t>
+      </w:r>
+      <w:r>
+        <w:rPr>
+          <w:rFonts w:ascii="Calibri" w:cs="Calibri" w:eastAsia="Calibri" w:hAnsi="Calibri"/>
+          <w:b w:val="false"/>
+          <w:bCs w:val="false"/>
+          <w:i/>
+          <w:iCs/>
+          <w:sz w:val="22"/>
+          <w:szCs w:val="22"/>
+        </w:rPr>
+        <w:t xml:space="preserve">Now the other alert. On Friday this rocket body was stale: the tracking was a week old, so the agent asked for fresh tracking instead of spending fuel. Tuesday it arrives, and the right answer is: do nothing. Same agent, opposite answer. That's judgment.</w:t>
+      </w:r>
+    </w:p>
+    <w:p>
+      <w:pPr>
+        <w:spacing w:after="80" w:before="40" w:line="264"/>
+      </w:pPr>
+      <w:r>
+        <w:rPr>
+          <w:rFonts w:ascii="Calibri" w:cs="Calibri" w:eastAsia="Calibri" w:hAnsi="Calibri"/>
+          <w:b/>
+          <w:bCs/>
+          <w:i w:val="false"/>
+          <w:iCs w:val="false"/>
+          <w:color w:val="2BB3B1"/>
+          <w:sz w:val="20"/>
+          <w:szCs w:val="20"/>
+        </w:rPr>
+        <w:t xml:space="preserve">SAY  </w:t>
+      </w:r>
+      <w:r>
+        <w:rPr>
+          <w:rFonts w:ascii="Calibri" w:cs="Calibri" w:eastAsia="Calibri" w:hAnsi="Calibri"/>
+          <w:b w:val="false"/>
+          <w:bCs w:val="false"/>
+          <w:i/>
+          <w:iCs/>
+          <w:sz w:val="22"/>
+          <w:szCs w:val="22"/>
+        </w:rPr>
+        <w:t xml:space="preserve">The cards you just saw are a recording of a real run of the agent, played back so a demo on conference wifi runs the same every time. That's a trick worth stealing for your own Show step.</w:t>
+      </w:r>
+    </w:p>
+    <w:p>
+      <w:pPr>
+        <w:spacing w:after="80" w:before="40" w:line="264"/>
+      </w:pPr>
+      <w:r>
+        <w:rPr>
+          <w:rFonts w:ascii="Calibri" w:cs="Calibri" w:eastAsia="Calibri" w:hAnsi="Calibri"/>
+          <w:b/>
+          <w:bCs/>
+          <w:i w:val="false"/>
+          <w:iCs w:val="false"/>
+          <w:color w:val="B07CFF"/>
+          <w:sz w:val="20"/>
+          <w:szCs w:val="20"/>
+        </w:rPr>
+        <w:t xml:space="preserve">NEEDS  </w:t>
+      </w:r>
+      <w:r>
+        <w:rPr>
+          <w:rFonts w:ascii="Calibri" w:cs="Calibri" w:eastAsia="Calibri" w:hAnsi="Calibri"/>
+          <w:b w:val="false"/>
+          <w:bCs w:val="false"/>
+          <w:i w:val="false"/>
+          <w:iCs w:val="false"/>
+          <w:sz w:val="20"/>
+          <w:szCs w:val="20"/>
+        </w:rPr>
+        <w:t xml:space="preserve">Header says REPLAY. Clock Fri 25 Sep 01:00:00 UTC. If not: ⋯ ▸ Restart the week.</w:t>
+      </w:r>
+    </w:p>
+    <w:p>
+      <w:pPr>
+        <w:spacing w:after="80" w:before="40" w:line="264"/>
+      </w:pPr>
+      <w:r>
+        <w:rPr>
+          <w:rFonts w:ascii="Calibri" w:cs="Calibri" w:eastAsia="Calibri" w:hAnsi="Calibri"/>
+          <w:b w:val="false"/>
+          <w:bCs w:val="false"/>
+          <w:i w:val="false"/>
+          <w:iCs w:val="false"/>
+          <w:color w:val="9AA4B2"/>
+          <w:sz w:val="20"/>
+          <w:szCs w:val="20"/>
+        </w:rPr>
+        <w:t xml:space="preserve">Press Skip to next for each step. The clock stops by itself when the agent is woken and waits for Approve.</w:t>
       </w:r>
     </w:p>
     <w:tbl>
@@ -7495,7 +7579,7 @@
                 <w:sz w:val="19"/>
                 <w:szCs w:val="19"/>
               </w:rPr>
-              <w:t xml:space="preserve">Decision needed: CYMBAL-04. The agent's steps tick in, then YOUR CALL: MANEUVER, 0.0181 m/s prograde at 04:00 → 3,036 m, 1.54 days.</w:t>
+              <w:t xml:space="preserve">CYMBAL-01's pass at real time: the amber dot slides by at 382 m. "Too late to act" was already on the desk.</w:t>
             </w:r>
           </w:p>
         </w:tc>
@@ -7585,7 +7669,7 @@
                 <w:sz w:val="20"/>
                 <w:szCs w:val="20"/>
               </w:rPr>
-              <w:t xml:space="preserve">Approve</w:t>
+              <w:t xml:space="preserve">Skip to next</w:t>
             </w:r>
           </w:p>
           <w:p>
@@ -7616,7 +7700,7 @@
                 <w:sz w:val="19"/>
                 <w:szCs w:val="19"/>
               </w:rPr>
-              <w:t xml:space="preserve">Dotted green line: after the burn (scheduled), 3,036 m.</w:t>
+              <w:t xml:space="preserve">Decision needed: CYMBAL-04. The agent's steps tick in, then YOUR CALL: MANEUVER, 0.0181 m/s prograde at 04:00 → 3,036 m, 1.54 days.</w:t>
             </w:r>
           </w:p>
         </w:tc>
@@ -7662,10 +7746,10 @@
           <w:tcPr>
             <w:tcW w:type="dxa" w:w="10080"/>
             <w:tcBorders>
-              <w:top w:val="single" w:color="B07CFF" w:sz="12"/>
-              <w:left w:val="single" w:color="B07CFF" w:sz="12"/>
-              <w:bottom w:val="single" w:color="B07CFF" w:sz="12"/>
-              <w:right w:val="single" w:color="B07CFF" w:sz="12"/>
+              <w:top w:val="single" w:color="9AA4B2" w:sz="12"/>
+              <w:left w:val="single" w:color="9AA4B2" w:sz="12"/>
+              <w:bottom w:val="single" w:color="9AA4B2" w:sz="12"/>
+              <w:right w:val="single" w:color="9AA4B2" w:sz="12"/>
             </w:tcBorders>
             <w:tcMar>
               <w:top w:type="dxa" w:w="80"/>
@@ -7685,11 +7769,11 @@
                 <w:bCs/>
                 <w:i w:val="false"/>
                 <w:iCs w:val="false"/>
-                <w:color w:val="B07CFF"/>
+                <w:color w:val="9AA4B2"/>
                 <w:sz w:val="18"/>
                 <w:szCs w:val="18"/>
               </w:rPr>
-              <w:t xml:space="preserve">DO</w:t>
+              <w:t xml:space="preserve">THE PURPLE AGENT CARD, TOP TO BOTTOM</w:t>
             </w:r>
           </w:p>
           <w:p>
@@ -7706,38 +7790,92 @@
                 <w:sz w:val="20"/>
                 <w:szCs w:val="20"/>
               </w:rPr>
-              <w:t xml:space="preserve">Skip to next ▸ Skip to next</w:t>
-            </w:r>
-          </w:p>
-          <w:p>
-            <w:pPr>
-              <w:spacing w:after="0" w:before="60" w:line="264"/>
-            </w:pPr>
-            <w:r>
-              <w:rPr>
-                <w:rFonts w:ascii="Calibri" w:cs="Calibri" w:eastAsia="Calibri" w:hAnsi="Calibri"/>
-                <w:b/>
-                <w:bCs/>
-                <w:i w:val="false"/>
-                <w:iCs w:val="false"/>
-                <w:color w:val="2ECC71"/>
-                <w:sz w:val="19"/>
-                <w:szCs w:val="19"/>
-              </w:rPr>
-              <w:t xml:space="preserve">→ </w:t>
-            </w:r>
-            <w:r>
-              <w:rPr>
-                <w:rFonts w:ascii="Calibri" w:cs="Calibri" w:eastAsia="Calibri" w:hAnsi="Calibri"/>
-                <w:b w:val="false"/>
-                <w:bCs w:val="false"/>
-                <w:i w:val="false"/>
-                <w:iCs w:val="false"/>
-                <w:color w:val="9AA4B2"/>
-                <w:sz w:val="19"/>
-                <w:szCs w:val="19"/>
-              </w:rPr>
-              <w:t xml:space="preserve">Burn executed at 04:00: the dot jumps up to the green line · CYMBAL-04's pass at real time: missed by 3,036 m, red ghost line at 301 m.</w:t>
+              <w:t xml:space="preserve">Watcher's line: why it woke the agent. 18 h out (tracking as good as it gets, still time to burn cheaply), worst case 1 in 10,000, tracking fresh.</w:t>
+            </w:r>
+          </w:p>
+          <w:p>
+            <w:pPr>
+              <w:spacing w:after="0" w:before="0" w:line="264"/>
+            </w:pPr>
+            <w:r>
+              <w:rPr>
+                <w:rFonts w:ascii="Calibri" w:cs="Calibri" w:eastAsia="Calibri" w:hAnsi="Calibri"/>
+                <w:b w:val="false"/>
+                <w:bCs w:val="false"/>
+                <w:i w:val="false"/>
+                <w:iCs w:val="false"/>
+                <w:sz w:val="20"/>
+                <w:szCs w:val="20"/>
+              </w:rPr>
+              <w:t xml:space="preserve">assess_conjunction (our tool): the facts from BigQuery; is the tracking fresh, can the debris dodge (no); stages the case in the sandbox.</w:t>
+            </w:r>
+          </w:p>
+          <w:p>
+            <w:pPr>
+              <w:spacing w:after="0" w:before="0" w:line="264"/>
+            </w:pPr>
+            <w:r>
+              <w:rPr>
+                <w:rFonts w:ascii="Calibri" w:cs="Calibri" w:eastAsia="Calibri" w:hAnsi="Calibri"/>
+                <w:b w:val="false"/>
+                <w:bCs w:val="false"/>
+                <w:i w:val="false"/>
+                <w:iCs w:val="false"/>
+                <w:sz w:val="20"/>
+                <w:szCs w:val="20"/>
+              </w:rPr>
+              <w:t xml:space="preserve">run_in_sandbox: the agent's own Python, run in the Agent Runtime code sandbox. Sizes the burn at 04:00 (0.0181 m/s) and noon (0.0343 m/s).</w:t>
+            </w:r>
+          </w:p>
+          <w:p>
+            <w:pPr>
+              <w:spacing w:after="0" w:before="0" w:line="264"/>
+            </w:pPr>
+            <w:r>
+              <w:rPr>
+                <w:rFonts w:ascii="Calibri" w:cs="Calibri" w:eastAsia="Calibri" w:hAnsi="Calibri"/>
+                <w:b w:val="false"/>
+                <w:bCs w:val="false"/>
+                <w:i w:val="false"/>
+                <w:iCs w:val="false"/>
+                <w:sz w:val="20"/>
+                <w:szCs w:val="20"/>
+              </w:rPr>
+              <w:t xml:space="preserve">maneuver_cost ×2: each burn in days of satellite life: 1.54 vs 2.92.</w:t>
+            </w:r>
+          </w:p>
+          <w:p>
+            <w:pPr>
+              <w:spacing w:after="0" w:before="0" w:line="264"/>
+            </w:pPr>
+            <w:r>
+              <w:rPr>
+                <w:rFonts w:ascii="Calibri" w:cs="Calibri" w:eastAsia="Calibri" w:hAnsi="Calibri"/>
+                <w:b w:val="false"/>
+                <w:bCs w:val="false"/>
+                <w:i w:val="false"/>
+                <w:iCs w:val="false"/>
+                <w:sz w:val="20"/>
+                <w:szCs w:val="20"/>
+              </w:rPr>
+              <w:t xml:space="preserve">build_assessment: writes it up, re-reading every fact from BigQuery.</w:t>
+            </w:r>
+          </w:p>
+          <w:p>
+            <w:pPr>
+              <w:spacing w:after="0" w:before="0" w:line="264"/>
+            </w:pPr>
+            <w:r>
+              <w:rPr>
+                <w:rFonts w:ascii="Calibri" w:cs="Calibri" w:eastAsia="Calibri" w:hAnsi="Calibri"/>
+                <w:b w:val="false"/>
+                <w:bCs w:val="false"/>
+                <w:i w:val="false"/>
+                <w:iCs w:val="false"/>
+                <w:sz w:val="20"/>
+                <w:szCs w:val="20"/>
+              </w:rPr>
+              <w:t xml:space="preserve">Then: the agent's words · the bold summary · the write-up (click to open) · Approve / Hold · how long it took (about 23 s).</w:t>
             </w:r>
           </w:p>
         </w:tc>
@@ -7827,7 +7965,7 @@
                 <w:sz w:val="20"/>
                 <w:szCs w:val="20"/>
               </w:rPr>
-              <w:t xml:space="preserve">Skip to next</w:t>
+              <w:t xml:space="preserve">Approve</w:t>
             </w:r>
           </w:p>
           <w:p>
@@ -7858,7 +7996,7 @@
                 <w:sz w:val="19"/>
                 <w:szCs w:val="19"/>
               </w:rPr>
-              <w:t xml:space="preserve">Tuesday: fresh tracking for SL-3 R/B (pink SIMULATED). The dot jumps from 421 m to 3,700 m and the agent says no burn.</w:t>
+              <w:t xml:space="preserve">Dotted green line: after the burn (scheduled), 3,036 m.</w:t>
             </w:r>
           </w:p>
         </w:tc>
@@ -7948,7 +8086,38 @@
                 <w:sz w:val="20"/>
                 <w:szCs w:val="20"/>
               </w:rPr>
-              <w:t xml:space="preserve">Approve</w:t>
+              <w:t xml:space="preserve">Skip to next ▸ Skip to next</w:t>
+            </w:r>
+          </w:p>
+          <w:p>
+            <w:pPr>
+              <w:spacing w:after="0" w:before="60" w:line="264"/>
+            </w:pPr>
+            <w:r>
+              <w:rPr>
+                <w:rFonts w:ascii="Calibri" w:cs="Calibri" w:eastAsia="Calibri" w:hAnsi="Calibri"/>
+                <w:b/>
+                <w:bCs/>
+                <w:i w:val="false"/>
+                <w:iCs w:val="false"/>
+                <w:color w:val="2ECC71"/>
+                <w:sz w:val="19"/>
+                <w:szCs w:val="19"/>
+              </w:rPr>
+              <w:t xml:space="preserve">→ </w:t>
+            </w:r>
+            <w:r>
+              <w:rPr>
+                <w:rFonts w:ascii="Calibri" w:cs="Calibri" w:eastAsia="Calibri" w:hAnsi="Calibri"/>
+                <w:b w:val="false"/>
+                <w:bCs w:val="false"/>
+                <w:i w:val="false"/>
+                <w:iCs w:val="false"/>
+                <w:color w:val="9AA4B2"/>
+                <w:sz w:val="19"/>
+                <w:szCs w:val="19"/>
+              </w:rPr>
+              <w:t xml:space="preserve">Burn executed at 04:00: the dot jumps up to the green line · CYMBAL-04's pass at real time: missed by 3,036 m, red ghost line at 301 m.</w:t>
             </w:r>
           </w:p>
         </w:tc>
@@ -7969,146 +8138,6 @@
           <w:szCs w:val="22"/>
         </w:rPr>
         <w:t xml:space="preserve"/>
-      </w:r>
-    </w:p>
-    <w:p>
-      <w:pPr>
-        <w:spacing w:after="80" w:before="40" w:line="264"/>
-      </w:pPr>
-      <w:r>
-        <w:rPr>
-          <w:rFonts w:ascii="Calibri" w:cs="Calibri" w:eastAsia="Calibri" w:hAnsi="Calibri"/>
-          <w:b/>
-          <w:bCs/>
-          <w:i w:val="false"/>
-          <w:iCs w:val="false"/>
-          <w:color w:val="FF5C5C"/>
-          <w:sz w:val="20"/>
-          <w:szCs w:val="20"/>
-        </w:rPr>
-        <w:t xml:space="preserve">GOTCHA  </w:t>
-      </w:r>
-      <w:r>
-        <w:rPr>
-          <w:rFonts w:ascii="Calibri" w:cs="Calibri" w:eastAsia="Calibri" w:hAnsi="Calibri"/>
-          <w:b w:val="false"/>
-          <w:bCs w:val="false"/>
-          <w:i w:val="false"/>
-          <w:iCs w:val="false"/>
-          <w:sz w:val="20"/>
-          <w:szCs w:val="20"/>
-        </w:rPr>
-        <w:t xml:space="preserve">If the header says LIVE AGENT, switch: ⋯ ▸ Agent ▸ replay · rehearsal, then Skip to next. Replay never calls Gemini.</w:t>
-      </w:r>
-    </w:p>
-    <w:p>
-      <w:pPr>
-        <w:pStyle w:val="Heading3"/>
-        <w:keepNext/>
-        <w:spacing w:after="40" w:before="160"/>
-      </w:pPr>
-      <w:r>
-        <w:rPr>
-          <w:rFonts w:ascii="Calibri" w:cs="Calibri" w:eastAsia="Calibri" w:hAnsi="Calibri"/>
-          <w:b/>
-          <w:bCs/>
-          <w:i w:val="false"/>
-          <w:iCs w:val="false"/>
-          <w:color w:val="3D8BFF"/>
-          <w:sz w:val="22"/>
-          <w:szCs w:val="22"/>
-        </w:rPr>
-        <w:t xml:space="preserve">7. Close: rigor and judgment   ·   TAB · CONSOLE · THE CYMBAL-04 CARD   ·   ~0.5 min</w:t>
-      </w:r>
-    </w:p>
-    <w:p>
-      <w:pPr>
-        <w:spacing w:after="80" w:before="40" w:line="264"/>
-      </w:pPr>
-      <w:r>
-        <w:rPr>
-          <w:rFonts w:ascii="Calibri" w:cs="Calibri" w:eastAsia="Calibri" w:hAnsi="Calibri"/>
-          <w:b/>
-          <w:bCs/>
-          <w:i w:val="false"/>
-          <w:iCs w:val="false"/>
-          <w:color w:val="2ECC71"/>
-          <w:sz w:val="20"/>
-          <w:szCs w:val="20"/>
-        </w:rPr>
-        <w:t xml:space="preserve">WHY  </w:t>
-      </w:r>
-      <w:r>
-        <w:rPr>
-          <w:rFonts w:ascii="Calibri" w:cs="Calibri" w:eastAsia="Calibri" w:hAnsi="Calibri"/>
-          <w:b w:val="false"/>
-          <w:bCs w:val="false"/>
-          <w:i w:val="false"/>
-          <w:iCs w:val="false"/>
-          <w:sz w:val="22"/>
-          <w:szCs w:val="22"/>
-        </w:rPr>
-        <w:t xml:space="preserve">Their judging rubric rewards rigor and judgment; the write-up shows what that looks like on paper.</w:t>
-      </w:r>
-    </w:p>
-    <w:p>
-      <w:pPr>
-        <w:spacing w:after="80" w:before="40" w:line="264"/>
-      </w:pPr>
-      <w:r>
-        <w:rPr>
-          <w:rFonts w:ascii="Calibri" w:cs="Calibri" w:eastAsia="Calibri" w:hAnsi="Calibri"/>
-          <w:b/>
-          <w:bCs/>
-          <w:i w:val="false"/>
-          <w:iCs w:val="false"/>
-          <w:color w:val="2BB3B1"/>
-          <w:sz w:val="20"/>
-          <w:szCs w:val="20"/>
-        </w:rPr>
-        <w:t xml:space="preserve">SAY  </w:t>
-      </w:r>
-      <w:r>
-        <w:rPr>
-          <w:rFonts w:ascii="Calibri" w:cs="Calibri" w:eastAsia="Calibri" w:hAnsi="Calibri"/>
-          <w:b w:val="false"/>
-          <w:bCs w:val="false"/>
-          <w:i/>
-          <w:iCs/>
-          <w:sz w:val="22"/>
-          <w:szCs w:val="22"/>
-        </w:rPr>
-        <w:t xml:space="preserve">Look at how it writes it up: the worst case, which needs no assumptions, next to the number under an assumed uncertainty, and a section on what we can't see. And the Tuesday update is labelled SIMULATED wherever it appears.</w:t>
-      </w:r>
-    </w:p>
-    <w:p>
-      <w:pPr>
-        <w:spacing w:after="80" w:before="40" w:line="264"/>
-      </w:pPr>
-      <w:r>
-        <w:rPr>
-          <w:rFonts w:ascii="Calibri" w:cs="Calibri" w:eastAsia="Calibri" w:hAnsi="Calibri"/>
-          <w:b/>
-          <w:bCs/>
-          <w:i w:val="false"/>
-          <w:iCs w:val="false"/>
-          <w:color w:val="2BB3B1"/>
-          <w:sz w:val="20"/>
-          <w:szCs w:val="20"/>
-        </w:rPr>
-        <w:t xml:space="preserve">SAY  </w:t>
-      </w:r>
-      <w:r>
-        <w:rPr>
-          <w:rFonts w:ascii="Calibri" w:cs="Calibri" w:eastAsia="Calibri" w:hAnsi="Calibri"/>
-          <w:b w:val="false"/>
-          <w:bCs w:val="false"/>
-          <w:i/>
-          <w:iCs/>
-          <w:sz w:val="22"/>
-          <w:szCs w:val="22"/>
-        </w:rPr>
-        <w:t xml:space="preserve">That's the bar: every number from a tool or a query, every assumption stated. Now go build yours.</w:t>
       </w:r>
     </w:p>
     <w:tbl>
@@ -8178,7 +8207,7 @@
                 <w:sz w:val="20"/>
                 <w:szCs w:val="20"/>
               </w:rPr>
-              <w:t xml:space="preserve">CYMBAL-04 agent card ▸ Conjunction Assessment &amp; Maneuver Recommendation</w:t>
+              <w:t xml:space="preserve">Skip to next</w:t>
             </w:r>
           </w:p>
           <w:p>
@@ -8209,7 +8238,7 @@
                 <w:sz w:val="19"/>
                 <w:szCs w:val="19"/>
               </w:rPr>
-              <w:t xml:space="preserve">Risk: worst case and assumed side by side · What we cannot see.</w:t>
+              <w:t xml:space="preserve">Tuesday: fresh tracking for SL-3 R/B (pink SIMULATED). The dot jumps from 421 m to 3,700 m and the agent says no burn.</w:t>
             </w:r>
           </w:p>
         </w:tc>
@@ -8255,6 +8284,357 @@
           <w:tcPr>
             <w:tcW w:type="dxa" w:w="10080"/>
             <w:tcBorders>
+              <w:top w:val="single" w:color="B07CFF" w:sz="12"/>
+              <w:left w:val="single" w:color="B07CFF" w:sz="12"/>
+              <w:bottom w:val="single" w:color="B07CFF" w:sz="12"/>
+              <w:right w:val="single" w:color="B07CFF" w:sz="12"/>
+            </w:tcBorders>
+            <w:tcMar>
+              <w:top w:type="dxa" w:w="80"/>
+              <w:left w:type="dxa" w:w="160"/>
+              <w:bottom w:type="dxa" w:w="80"/>
+              <w:right w:type="dxa" w:w="160"/>
+            </w:tcMar>
+          </w:tcPr>
+          <w:p>
+            <w:pPr>
+              <w:spacing w:after="40" w:before="0" w:line="264"/>
+            </w:pPr>
+            <w:r>
+              <w:rPr>
+                <w:rFonts w:ascii="Calibri" w:cs="Calibri" w:eastAsia="Calibri" w:hAnsi="Calibri"/>
+                <w:b/>
+                <w:bCs/>
+                <w:i w:val="false"/>
+                <w:iCs w:val="false"/>
+                <w:color w:val="B07CFF"/>
+                <w:sz w:val="18"/>
+                <w:szCs w:val="18"/>
+              </w:rPr>
+              <w:t xml:space="preserve">DO</w:t>
+            </w:r>
+          </w:p>
+          <w:p>
+            <w:pPr>
+              <w:spacing w:after="0" w:before="0" w:line="264"/>
+            </w:pPr>
+            <w:r>
+              <w:rPr>
+                <w:rFonts w:ascii="Calibri" w:cs="Calibri" w:eastAsia="Calibri" w:hAnsi="Calibri"/>
+                <w:b w:val="false"/>
+                <w:bCs w:val="false"/>
+                <w:i w:val="false"/>
+                <w:iCs w:val="false"/>
+                <w:sz w:val="20"/>
+                <w:szCs w:val="20"/>
+              </w:rPr>
+              <w:t xml:space="preserve">Approve</w:t>
+            </w:r>
+          </w:p>
+        </w:tc>
+      </w:tr>
+    </w:tbl>
+    <w:p>
+      <w:pPr>
+        <w:spacing w:after="20" w:before="0" w:line="264"/>
+      </w:pPr>
+      <w:r>
+        <w:rPr>
+          <w:rFonts w:ascii="Calibri" w:cs="Calibri" w:eastAsia="Calibri" w:hAnsi="Calibri"/>
+          <w:b w:val="false"/>
+          <w:bCs w:val="false"/>
+          <w:i w:val="false"/>
+          <w:iCs w:val="false"/>
+          <w:sz w:val="22"/>
+          <w:szCs w:val="22"/>
+        </w:rPr>
+        <w:t xml:space="preserve"/>
+      </w:r>
+    </w:p>
+    <w:p>
+      <w:pPr>
+        <w:spacing w:after="80" w:before="40" w:line="264"/>
+      </w:pPr>
+      <w:r>
+        <w:rPr>
+          <w:rFonts w:ascii="Calibri" w:cs="Calibri" w:eastAsia="Calibri" w:hAnsi="Calibri"/>
+          <w:b/>
+          <w:bCs/>
+          <w:i w:val="false"/>
+          <w:iCs w:val="false"/>
+          <w:color w:val="FF5C5C"/>
+          <w:sz w:val="20"/>
+          <w:szCs w:val="20"/>
+        </w:rPr>
+        <w:t xml:space="preserve">GOTCHA  </w:t>
+      </w:r>
+      <w:r>
+        <w:rPr>
+          <w:rFonts w:ascii="Calibri" w:cs="Calibri" w:eastAsia="Calibri" w:hAnsi="Calibri"/>
+          <w:b w:val="false"/>
+          <w:bCs w:val="false"/>
+          <w:i w:val="false"/>
+          <w:iCs w:val="false"/>
+          <w:sz w:val="20"/>
+          <w:szCs w:val="20"/>
+        </w:rPr>
+        <w:t xml:space="preserve">If the header says LIVE AGENT, switch: ⋯ ▸ Agent ▸ replay · rehearsal, then Skip to next. Replay never calls Gemini.</w:t>
+      </w:r>
+    </w:p>
+    <w:p>
+      <w:pPr>
+        <w:pStyle w:val="Heading3"/>
+        <w:keepNext/>
+        <w:spacing w:after="40" w:before="160"/>
+      </w:pPr>
+      <w:r>
+        <w:rPr>
+          <w:rFonts w:ascii="Calibri" w:cs="Calibri" w:eastAsia="Calibri" w:hAnsi="Calibri"/>
+          <w:b/>
+          <w:bCs/>
+          <w:i w:val="false"/>
+          <w:iCs w:val="false"/>
+          <w:color w:val="3D8BFF"/>
+          <w:sz w:val="22"/>
+          <w:szCs w:val="22"/>
+        </w:rPr>
+        <w:t xml:space="preserve">7. Close: rigor and judgment   ·   TAB · CONSOLE · THE CYMBAL-04 CARD   ·   ~0.5 min</w:t>
+      </w:r>
+    </w:p>
+    <w:p>
+      <w:pPr>
+        <w:spacing w:after="80" w:before="40" w:line="264"/>
+      </w:pPr>
+      <w:r>
+        <w:rPr>
+          <w:rFonts w:ascii="Calibri" w:cs="Calibri" w:eastAsia="Calibri" w:hAnsi="Calibri"/>
+          <w:b/>
+          <w:bCs/>
+          <w:i w:val="false"/>
+          <w:iCs w:val="false"/>
+          <w:color w:val="2ECC71"/>
+          <w:sz w:val="20"/>
+          <w:szCs w:val="20"/>
+        </w:rPr>
+        <w:t xml:space="preserve">WHY  </w:t>
+      </w:r>
+      <w:r>
+        <w:rPr>
+          <w:rFonts w:ascii="Calibri" w:cs="Calibri" w:eastAsia="Calibri" w:hAnsi="Calibri"/>
+          <w:b w:val="false"/>
+          <w:bCs w:val="false"/>
+          <w:i w:val="false"/>
+          <w:iCs w:val="false"/>
+          <w:sz w:val="22"/>
+          <w:szCs w:val="22"/>
+        </w:rPr>
+        <w:t xml:space="preserve">Their judging rubric rewards rigor and judgment; the write-up shows what that looks like on paper.</w:t>
+      </w:r>
+    </w:p>
+    <w:p>
+      <w:pPr>
+        <w:spacing w:after="80" w:before="40" w:line="264"/>
+      </w:pPr>
+      <w:r>
+        <w:rPr>
+          <w:rFonts w:ascii="Calibri" w:cs="Calibri" w:eastAsia="Calibri" w:hAnsi="Calibri"/>
+          <w:b/>
+          <w:bCs/>
+          <w:i w:val="false"/>
+          <w:iCs w:val="false"/>
+          <w:color w:val="2BB3B1"/>
+          <w:sz w:val="20"/>
+          <w:szCs w:val="20"/>
+        </w:rPr>
+        <w:t xml:space="preserve">SAY  </w:t>
+      </w:r>
+      <w:r>
+        <w:rPr>
+          <w:rFonts w:ascii="Calibri" w:cs="Calibri" w:eastAsia="Calibri" w:hAnsi="Calibri"/>
+          <w:b w:val="false"/>
+          <w:bCs w:val="false"/>
+          <w:i/>
+          <w:iCs/>
+          <w:sz w:val="22"/>
+          <w:szCs w:val="22"/>
+        </w:rPr>
+        <w:t xml:space="preserve">Look at how it writes it up: the worst case, which needs no assumptions, next to the number under an assumed uncertainty, and a section on what we can't see. And the Tuesday update is labelled SIMULATED wherever it appears.</w:t>
+      </w:r>
+    </w:p>
+    <w:p>
+      <w:pPr>
+        <w:spacing w:after="80" w:before="40" w:line="264"/>
+      </w:pPr>
+      <w:r>
+        <w:rPr>
+          <w:rFonts w:ascii="Calibri" w:cs="Calibri" w:eastAsia="Calibri" w:hAnsi="Calibri"/>
+          <w:b/>
+          <w:bCs/>
+          <w:i w:val="false"/>
+          <w:iCs w:val="false"/>
+          <w:color w:val="2BB3B1"/>
+          <w:sz w:val="20"/>
+          <w:szCs w:val="20"/>
+        </w:rPr>
+        <w:t xml:space="preserve">SAY  </w:t>
+      </w:r>
+      <w:r>
+        <w:rPr>
+          <w:rFonts w:ascii="Calibri" w:cs="Calibri" w:eastAsia="Calibri" w:hAnsi="Calibri"/>
+          <w:b w:val="false"/>
+          <w:bCs w:val="false"/>
+          <w:i/>
+          <w:iCs/>
+          <w:sz w:val="22"/>
+          <w:szCs w:val="22"/>
+        </w:rPr>
+        <w:t xml:space="preserve">That's the bar: every number from a tool or a query, every assumption stated. Now go build yours.</w:t>
+      </w:r>
+    </w:p>
+    <w:tbl>
+      <w:tblPr>
+        <w:tblW w:type="dxa" w:w="10080"/>
+        <w:tblBorders>
+          <w:top w:val="single" w:color="auto" w:sz="4"/>
+          <w:left w:val="single" w:color="auto" w:sz="4"/>
+          <w:bottom w:val="single" w:color="auto" w:sz="4"/>
+          <w:right w:val="single" w:color="auto" w:sz="4"/>
+          <w:insideH w:val="single" w:color="auto" w:sz="4"/>
+          <w:insideV w:val="single" w:color="auto" w:sz="4"/>
+        </w:tblBorders>
+      </w:tblPr>
+      <w:tblGrid>
+        <w:gridCol w:w="10080"/>
+      </w:tblGrid>
+      <w:tr>
+        <w:trPr>
+          <w:cantSplit/>
+        </w:trPr>
+        <w:tc>
+          <w:tcPr>
+            <w:tcW w:type="dxa" w:w="10080"/>
+            <w:tcBorders>
+              <w:top w:val="single" w:color="B07CFF" w:sz="12"/>
+              <w:left w:val="single" w:color="B07CFF" w:sz="12"/>
+              <w:bottom w:val="single" w:color="B07CFF" w:sz="12"/>
+              <w:right w:val="single" w:color="B07CFF" w:sz="12"/>
+            </w:tcBorders>
+            <w:tcMar>
+              <w:top w:type="dxa" w:w="80"/>
+              <w:left w:type="dxa" w:w="160"/>
+              <w:bottom w:type="dxa" w:w="80"/>
+              <w:right w:type="dxa" w:w="160"/>
+            </w:tcMar>
+          </w:tcPr>
+          <w:p>
+            <w:pPr>
+              <w:spacing w:after="40" w:before="0" w:line="264"/>
+            </w:pPr>
+            <w:r>
+              <w:rPr>
+                <w:rFonts w:ascii="Calibri" w:cs="Calibri" w:eastAsia="Calibri" w:hAnsi="Calibri"/>
+                <w:b/>
+                <w:bCs/>
+                <w:i w:val="false"/>
+                <w:iCs w:val="false"/>
+                <w:color w:val="B07CFF"/>
+                <w:sz w:val="18"/>
+                <w:szCs w:val="18"/>
+              </w:rPr>
+              <w:t xml:space="preserve">DO</w:t>
+            </w:r>
+          </w:p>
+          <w:p>
+            <w:pPr>
+              <w:spacing w:after="0" w:before="0" w:line="264"/>
+            </w:pPr>
+            <w:r>
+              <w:rPr>
+                <w:rFonts w:ascii="Calibri" w:cs="Calibri" w:eastAsia="Calibri" w:hAnsi="Calibri"/>
+                <w:b w:val="false"/>
+                <w:bCs w:val="false"/>
+                <w:i w:val="false"/>
+                <w:iCs w:val="false"/>
+                <w:sz w:val="20"/>
+                <w:szCs w:val="20"/>
+              </w:rPr>
+              <w:t xml:space="preserve">CYMBAL-04 agent card ▸ Conjunction Assessment &amp; Maneuver Recommendation</w:t>
+            </w:r>
+          </w:p>
+          <w:p>
+            <w:pPr>
+              <w:spacing w:after="0" w:before="60" w:line="264"/>
+            </w:pPr>
+            <w:r>
+              <w:rPr>
+                <w:rFonts w:ascii="Calibri" w:cs="Calibri" w:eastAsia="Calibri" w:hAnsi="Calibri"/>
+                <w:b/>
+                <w:bCs/>
+                <w:i w:val="false"/>
+                <w:iCs w:val="false"/>
+                <w:color w:val="2ECC71"/>
+                <w:sz w:val="19"/>
+                <w:szCs w:val="19"/>
+              </w:rPr>
+              <w:t xml:space="preserve">→ </w:t>
+            </w:r>
+            <w:r>
+              <w:rPr>
+                <w:rFonts w:ascii="Calibri" w:cs="Calibri" w:eastAsia="Calibri" w:hAnsi="Calibri"/>
+                <w:b w:val="false"/>
+                <w:bCs w:val="false"/>
+                <w:i w:val="false"/>
+                <w:iCs w:val="false"/>
+                <w:color w:val="9AA4B2"/>
+                <w:sz w:val="19"/>
+                <w:szCs w:val="19"/>
+              </w:rPr>
+              <w:t xml:space="preserve">Risk: worst case and assumed side by side · What we cannot see.</w:t>
+            </w:r>
+          </w:p>
+        </w:tc>
+      </w:tr>
+    </w:tbl>
+    <w:p>
+      <w:pPr>
+        <w:spacing w:after="20" w:before="0" w:line="264"/>
+      </w:pPr>
+      <w:r>
+        <w:rPr>
+          <w:rFonts w:ascii="Calibri" w:cs="Calibri" w:eastAsia="Calibri" w:hAnsi="Calibri"/>
+          <w:b w:val="false"/>
+          <w:bCs w:val="false"/>
+          <w:i w:val="false"/>
+          <w:iCs w:val="false"/>
+          <w:sz w:val="22"/>
+          <w:szCs w:val="22"/>
+        </w:rPr>
+        <w:t xml:space="preserve"/>
+      </w:r>
+    </w:p>
+    <w:tbl>
+      <w:tblPr>
+        <w:tblW w:type="dxa" w:w="10080"/>
+        <w:tblBorders>
+          <w:top w:val="single" w:color="auto" w:sz="4"/>
+          <w:left w:val="single" w:color="auto" w:sz="4"/>
+          <w:bottom w:val="single" w:color="auto" w:sz="4"/>
+          <w:right w:val="single" w:color="auto" w:sz="4"/>
+          <w:insideH w:val="single" w:color="auto" w:sz="4"/>
+          <w:insideV w:val="single" w:color="auto" w:sz="4"/>
+        </w:tblBorders>
+      </w:tblPr>
+      <w:tblGrid>
+        <w:gridCol w:w="10080"/>
+      </w:tblGrid>
+      <w:tr>
+        <w:trPr>
+          <w:cantSplit/>
+        </w:trPr>
+        <w:tc>
+          <w:tcPr>
+            <w:tcW w:type="dxa" w:w="10080"/>
+            <w:tcBorders>
               <w:top w:val="single" w:color="2BB3B1" w:sz="12"/>
               <w:left w:val="single" w:color="2BB3B1" w:sz="12"/>
               <w:bottom w:val="single" w:color="2BB3B1" w:sz="12"/>
@@ -8831,6 +9211,28 @@
           <w:szCs w:val="22"/>
         </w:rPr>
         <w:t xml:space="preserve">ADK web UI 2.7.0: the name of the events / trace panel and that clicking a tool call shows its arguments.</w:t>
+      </w:r>
+    </w:p>
+    <w:p>
+      <w:pPr>
+        <w:pStyle w:val="ListParagraph"/>
+        <w:numPr>
+          <w:ilvl w:val="0"/>
+          <w:numId w:val="2"/>
+        </w:numPr>
+        <w:spacing w:after="40" w:before="20" w:line="264"/>
+      </w:pPr>
+      <w:r>
+        <w:rPr>
+          <w:rFonts w:ascii="Calibri" w:cs="Calibri" w:eastAsia="Calibri" w:hAnsi="Calibri"/>
+          <w:b w:val="false"/>
+          <w:bCs w:val="false"/>
+          <w:i w:val="false"/>
+          <w:iCs w:val="false"/>
+          <w:sz w:val="22"/>
+          <w:szCs w:val="22"/>
+        </w:rPr>
+        <w:t xml:space="preserve">Cloud Run page: where Minimum instances 1 shows for cymbal-ops without clicking around (put the exact place on the teleprompter).</w:t>
       </w:r>
     </w:p>
     <w:p>

</xml_diff>

<commit_message>
Talk track: who on a team gets you how far, and why we demo from Cloud Shell
- Teleprompter: an "If your team has…" line on every step: the data lane's SQL/pandas person, the agent
  lane's Python developer and instruction writer, the domain expert who decides what the custom tool judges,
  deploying early, and the web developer who can build a face like the console. Step 1 and the close frame
  the console as the far end of the path, not the bar: a working agent in the ADK web UI is a good finish.
- Step 2: we picked this dataset; yours comes loaded and you can bring any data that serves your user and
  clears the license bar. Step 5: the demo runs in Cloud Shell to keep it simple; in real life you'd test
  the deployed copy too.
- Notebook intro: "Why this dataset?", the same point. README box: the far end, not the bar.

Co-Authored-By: Claude Opus 5.5 <noreply@anthropic.com>
Claude-Session: https://claude.ai/code/session_01XP7fEGExmmDaM7W6ayMgxX
</commit_message>
<xml_diff>
--- a/run-of-show/docs/PLANNING GUIDE - A4I kickoff demo.docx
+++ b/run-of-show/docs/PLANNING GUIDE - A4I kickoff demo.docx
@@ -4744,6 +4744,36 @@
           <w:bCs/>
           <w:i w:val="false"/>
           <w:iCs w:val="false"/>
+          <w:color w:val="2BB3B1"/>
+          <w:sz w:val="20"/>
+          <w:szCs w:val="20"/>
+        </w:rPr>
+        <w:t xml:space="preserve">SAY  </w:t>
+      </w:r>
+      <w:r>
+        <w:rPr>
+          <w:rFonts w:ascii="Calibri" w:cs="Calibri" w:eastAsia="Calibri" w:hAnsi="Calibri"/>
+          <w:b w:val="false"/>
+          <w:bCs w:val="false"/>
+          <w:i/>
+          <w:iCs/>
+          <w:sz w:val="22"/>
+          <w:szCs w:val="22"/>
+        </w:rPr>
+        <w:t xml:space="preserve">One thing before we start: this is the far end, not the bar. Plenty of teams will finish in the ADK web UI with a solid agent, and that's a good finish. If your team has the right people and the time, you can get as far as this. I'll point out who does what as we go.</w:t>
+      </w:r>
+    </w:p>
+    <w:p>
+      <w:pPr>
+        <w:spacing w:after="80" w:before="40" w:line="264"/>
+      </w:pPr>
+      <w:r>
+        <w:rPr>
+          <w:rFonts w:ascii="Calibri" w:cs="Calibri" w:eastAsia="Calibri" w:hAnsi="Calibri"/>
+          <w:b/>
+          <w:bCs/>
+          <w:i w:val="false"/>
+          <w:iCs w:val="false"/>
           <w:color w:val="B07CFF"/>
           <w:sz w:val="20"/>
           <w:szCs w:val="20"/>
@@ -5033,176 +5063,6 @@
         <w:t xml:space="preserve"/>
       </w:r>
     </w:p>
-    <w:p>
-      <w:pPr>
-        <w:pStyle w:val="Heading3"/>
-        <w:keepNext/>
-        <w:spacing w:after="40" w:before="160"/>
-      </w:pPr>
-      <w:r>
-        <w:rPr>
-          <w:rFonts w:ascii="Calibri" w:cs="Calibri" w:eastAsia="Calibri" w:hAnsi="Calibri"/>
-          <w:b/>
-          <w:bCs/>
-          <w:i w:val="false"/>
-          <w:iCs w:val="false"/>
-          <w:color w:val="3D8BFF"/>
-          <w:sz w:val="22"/>
-          <w:szCs w:val="22"/>
-        </w:rPr>
-        <w:t xml:space="preserve">2. Load &amp; Explore: load it, distrust it, validate it   ·   TAB · COLAB ENTERPRISE · THE DATA NOTEBOOK   ·   ~1.5 min</w:t>
-      </w:r>
-    </w:p>
-    <w:p>
-      <w:pPr>
-        <w:spacing w:after="80" w:before="40" w:line="264"/>
-      </w:pPr>
-      <w:r>
-        <w:rPr>
-          <w:rFonts w:ascii="Calibri" w:cs="Calibri" w:eastAsia="Calibri" w:hAnsi="Calibri"/>
-          <w:b/>
-          <w:bCs/>
-          <w:i w:val="false"/>
-          <w:iCs w:val="false"/>
-          <w:color w:val="2ECC71"/>
-          <w:sz w:val="20"/>
-          <w:szCs w:val="20"/>
-        </w:rPr>
-        <w:t xml:space="preserve">WHY  </w:t>
-      </w:r>
-      <w:r>
-        <w:rPr>
-          <w:rFonts w:ascii="Calibri" w:cs="Calibri" w:eastAsia="Calibri" w:hAnsi="Calibri"/>
-          <w:b w:val="false"/>
-          <w:bCs w:val="false"/>
-          <w:i w:val="false"/>
-          <w:iCs w:val="false"/>
-          <w:sz w:val="22"/>
-          <w:szCs w:val="22"/>
-        </w:rPr>
-        <w:t xml:space="preserve">The data lane's job: load real data, find what's wrong with it, and hand the agent clean, validated tables in BigQuery.</w:t>
-      </w:r>
-    </w:p>
-    <w:p>
-      <w:pPr>
-        <w:spacing w:after="80" w:before="40" w:line="264"/>
-      </w:pPr>
-      <w:r>
-        <w:rPr>
-          <w:rFonts w:ascii="Calibri" w:cs="Calibri" w:eastAsia="Calibri" w:hAnsi="Calibri"/>
-          <w:b/>
-          <w:bCs/>
-          <w:i w:val="false"/>
-          <w:iCs w:val="false"/>
-          <w:color w:val="2BB3B1"/>
-          <w:sz w:val="20"/>
-          <w:szCs w:val="20"/>
-        </w:rPr>
-        <w:t xml:space="preserve">SAY  </w:t>
-      </w:r>
-      <w:r>
-        <w:rPr>
-          <w:rFonts w:ascii="Calibri" w:cs="Calibri" w:eastAsia="Calibri" w:hAnsi="Calibri"/>
-          <w:b w:val="false"/>
-          <w:bCs w:val="false"/>
-          <w:i/>
-          <w:iCs/>
-          <w:sz w:val="22"/>
-          <w:szCs w:val="22"/>
-        </w:rPr>
-        <w:t xml:space="preserve">First thing every team does: load and explore. Here's the obvious first answer: anything that can reach our altitude is a threat. That's thousands of objects. And it's wrong, because being at the same height isn't being in the same place at the same second.</w:t>
-      </w:r>
-    </w:p>
-    <w:p>
-      <w:pPr>
-        <w:spacing w:after="80" w:before="40" w:line="264"/>
-      </w:pPr>
-      <w:r>
-        <w:rPr>
-          <w:rFonts w:ascii="Calibri" w:cs="Calibri" w:eastAsia="Calibri" w:hAnsi="Calibri"/>
-          <w:b/>
-          <w:bCs/>
-          <w:i w:val="false"/>
-          <w:iCs w:val="false"/>
-          <w:color w:val="2BB3B1"/>
-          <w:sz w:val="20"/>
-          <w:szCs w:val="20"/>
-        </w:rPr>
-        <w:t xml:space="preserve">SAY  </w:t>
-      </w:r>
-      <w:r>
-        <w:rPr>
-          <w:rFonts w:ascii="Calibri" w:cs="Calibri" w:eastAsia="Calibri" w:hAnsi="Calibri"/>
-          <w:b w:val="false"/>
-          <w:bCs w:val="false"/>
-          <w:i/>
-          <w:iCs/>
-          <w:sz w:val="22"/>
-          <w:szCs w:val="22"/>
-        </w:rPr>
-        <w:t xml:space="preserve">This is the query that surprises people: a big share of what's up there came from two moments, 2007 and 2009. Kessler syndrome in one table.</w:t>
-      </w:r>
-    </w:p>
-    <w:p>
-      <w:pPr>
-        <w:spacing w:after="80" w:before="40" w:line="264"/>
-      </w:pPr>
-      <w:r>
-        <w:rPr>
-          <w:rFonts w:ascii="Calibri" w:cs="Calibri" w:eastAsia="Calibri" w:hAnsi="Calibri"/>
-          <w:b/>
-          <w:bCs/>
-          <w:i w:val="false"/>
-          <w:iCs w:val="false"/>
-          <w:color w:val="2BB3B1"/>
-          <w:sz w:val="20"/>
-          <w:szCs w:val="20"/>
-        </w:rPr>
-        <w:t xml:space="preserve">SAY  </w:t>
-      </w:r>
-      <w:r>
-        <w:rPr>
-          <w:rFonts w:ascii="Calibri" w:cs="Calibri" w:eastAsia="Calibri" w:hAnsi="Calibri"/>
-          <w:b w:val="false"/>
-          <w:bCs w:val="false"/>
-          <w:i/>
-          <w:iCs/>
-          <w:sz w:val="22"/>
-          <w:szCs w:val="22"/>
-        </w:rPr>
-        <w:t xml:space="preserve">And here's the honest answer for the week: 850 close approaches, and one worth escalating. Everything after this point is about that one.</w:t>
-      </w:r>
-    </w:p>
-    <w:p>
-      <w:pPr>
-        <w:spacing w:after="80" w:before="40" w:line="264"/>
-      </w:pPr>
-      <w:r>
-        <w:rPr>
-          <w:rFonts w:ascii="Calibri" w:cs="Calibri" w:eastAsia="Calibri" w:hAnsi="Calibri"/>
-          <w:b/>
-          <w:bCs/>
-          <w:i w:val="false"/>
-          <w:iCs w:val="false"/>
-          <w:color w:val="B07CFF"/>
-          <w:sz w:val="20"/>
-          <w:szCs w:val="20"/>
-        </w:rPr>
-        <w:t xml:space="preserve">NEEDS  </w:t>
-      </w:r>
-      <w:r>
-        <w:rPr>
-          <w:rFonts w:ascii="Calibri" w:cs="Calibri" w:eastAsia="Calibri" w:hAnsi="Calibri"/>
-          <w:b w:val="false"/>
-          <w:bCs w:val="false"/>
-          <w:i w:val="false"/>
-          <w:iCs w:val="false"/>
-          <w:sz w:val="20"/>
-          <w:szCs w:val="20"/>
-        </w:rPr>
-        <w:t xml:space="preserve">demo_01_load_explore.ipynb, already run end to end (Runtime ▸ Run all, this morning, same project).</w:t>
-      </w:r>
-    </w:p>
     <w:tbl>
       <w:tblPr>
         <w:tblW w:type="dxa" w:w="10080"/>
@@ -5226,10 +5086,10 @@
           <w:tcPr>
             <w:tcW w:type="dxa" w:w="10080"/>
             <w:tcBorders>
-              <w:top w:val="single" w:color="B07CFF" w:sz="12"/>
-              <w:left w:val="single" w:color="B07CFF" w:sz="12"/>
-              <w:bottom w:val="single" w:color="B07CFF" w:sz="12"/>
-              <w:right w:val="single" w:color="B07CFF" w:sz="12"/>
+              <w:top w:val="single" w:color="2ECC71" w:sz="12"/>
+              <w:left w:val="single" w:color="2ECC71" w:sz="12"/>
+              <w:bottom w:val="single" w:color="2ECC71" w:sz="12"/>
+              <w:right w:val="single" w:color="2ECC71" w:sz="12"/>
             </w:tcBorders>
             <w:tcMar>
               <w:top w:type="dxa" w:w="80"/>
@@ -5249,11 +5109,11 @@
                 <w:bCs/>
                 <w:i w:val="false"/>
                 <w:iCs w:val="false"/>
-                <w:color w:val="B07CFF"/>
+                <w:color w:val="2ECC71"/>
                 <w:sz w:val="18"/>
                 <w:szCs w:val="18"/>
               </w:rPr>
-              <w:t xml:space="preserve">DO</w:t>
+              <w:t xml:space="preserve">IF YOUR TEAM HAS…</w:t>
             </w:r>
           </w:p>
           <w:p>
@@ -5270,38 +5130,7 @@
                 <w:sz w:val="20"/>
                 <w:szCs w:val="20"/>
               </w:rPr>
-              <w:t xml:space="preserve">Table of contents ▸ 3—The wrong answer first</w:t>
-            </w:r>
-          </w:p>
-          <w:p>
-            <w:pPr>
-              <w:spacing w:after="0" w:before="60" w:line="264"/>
-            </w:pPr>
-            <w:r>
-              <w:rPr>
-                <w:rFonts w:ascii="Calibri" w:cs="Calibri" w:eastAsia="Calibri" w:hAnsi="Calibri"/>
-                <w:b/>
-                <w:bCs/>
-                <w:i w:val="false"/>
-                <w:iCs w:val="false"/>
-                <w:color w:val="2ECC71"/>
-                <w:sz w:val="19"/>
-                <w:szCs w:val="19"/>
-              </w:rPr>
-              <w:t xml:space="preserve">→ </w:t>
-            </w:r>
-            <w:r>
-              <w:rPr>
-                <w:rFonts w:ascii="Calibri" w:cs="Calibri" w:eastAsia="Calibri" w:hAnsi="Calibri"/>
-                <w:b w:val="false"/>
-                <w:bCs w:val="false"/>
-                <w:i w:val="false"/>
-                <w:iCs w:val="false"/>
-                <w:color w:val="9AA4B2"/>
-                <w:sz w:val="19"/>
-                <w:szCs w:val="19"/>
-              </w:rPr>
-              <w:t xml:space="preserve">Thousands of objects whose orbit crosses our 880 km altitude. Every one of them really is at our height.</w:t>
+              <w:t xml:space="preserve">This is the far end of the path, not the bar. A working agent in adk web is a good finish. A team with a front-end developer and time to spare can get this far.</w:t>
             </w:r>
           </w:p>
         </w:tc>
@@ -5322,6 +5151,206 @@
           <w:szCs w:val="22"/>
         </w:rPr>
         <w:t xml:space="preserve"/>
+      </w:r>
+    </w:p>
+    <w:p>
+      <w:pPr>
+        <w:pStyle w:val="Heading3"/>
+        <w:keepNext/>
+        <w:spacing w:after="40" w:before="160"/>
+      </w:pPr>
+      <w:r>
+        <w:rPr>
+          <w:rFonts w:ascii="Calibri" w:cs="Calibri" w:eastAsia="Calibri" w:hAnsi="Calibri"/>
+          <w:b/>
+          <w:bCs/>
+          <w:i w:val="false"/>
+          <w:iCs w:val="false"/>
+          <w:color w:val="3D8BFF"/>
+          <w:sz w:val="22"/>
+          <w:szCs w:val="22"/>
+        </w:rPr>
+        <w:t xml:space="preserve">2. Load &amp; Explore: load it, distrust it, validate it   ·   TAB · COLAB ENTERPRISE · THE DATA NOTEBOOK   ·   ~1.5 min</w:t>
+      </w:r>
+    </w:p>
+    <w:p>
+      <w:pPr>
+        <w:spacing w:after="80" w:before="40" w:line="264"/>
+      </w:pPr>
+      <w:r>
+        <w:rPr>
+          <w:rFonts w:ascii="Calibri" w:cs="Calibri" w:eastAsia="Calibri" w:hAnsi="Calibri"/>
+          <w:b/>
+          <w:bCs/>
+          <w:i w:val="false"/>
+          <w:iCs w:val="false"/>
+          <w:color w:val="2ECC71"/>
+          <w:sz w:val="20"/>
+          <w:szCs w:val="20"/>
+        </w:rPr>
+        <w:t xml:space="preserve">WHY  </w:t>
+      </w:r>
+      <w:r>
+        <w:rPr>
+          <w:rFonts w:ascii="Calibri" w:cs="Calibri" w:eastAsia="Calibri" w:hAnsi="Calibri"/>
+          <w:b w:val="false"/>
+          <w:bCs w:val="false"/>
+          <w:i w:val="false"/>
+          <w:iCs w:val="false"/>
+          <w:sz w:val="22"/>
+          <w:szCs w:val="22"/>
+        </w:rPr>
+        <w:t xml:space="preserve">The data lane's job: load real data, find what's wrong with it, and hand the agent clean, validated tables in BigQuery.</w:t>
+      </w:r>
+    </w:p>
+    <w:p>
+      <w:pPr>
+        <w:spacing w:after="80" w:before="40" w:line="264"/>
+      </w:pPr>
+      <w:r>
+        <w:rPr>
+          <w:rFonts w:ascii="Calibri" w:cs="Calibri" w:eastAsia="Calibri" w:hAnsi="Calibri"/>
+          <w:b/>
+          <w:bCs/>
+          <w:i w:val="false"/>
+          <w:iCs w:val="false"/>
+          <w:color w:val="2BB3B1"/>
+          <w:sz w:val="20"/>
+          <w:szCs w:val="20"/>
+        </w:rPr>
+        <w:t xml:space="preserve">SAY  </w:t>
+      </w:r>
+      <w:r>
+        <w:rPr>
+          <w:rFonts w:ascii="Calibri" w:cs="Calibri" w:eastAsia="Calibri" w:hAnsi="Calibri"/>
+          <w:b w:val="false"/>
+          <w:bCs w:val="false"/>
+          <w:i/>
+          <w:iCs/>
+          <w:sz w:val="22"/>
+          <w:szCs w:val="22"/>
+        </w:rPr>
+        <w:t xml:space="preserve">First thing every team does: load and explore. Here's the obvious first answer: anything that can reach our altitude is a threat. That's thousands of objects. And it's wrong, because being at the same height isn't being in the same place at the same second.</w:t>
+      </w:r>
+    </w:p>
+    <w:p>
+      <w:pPr>
+        <w:spacing w:after="80" w:before="40" w:line="264"/>
+      </w:pPr>
+      <w:r>
+        <w:rPr>
+          <w:rFonts w:ascii="Calibri" w:cs="Calibri" w:eastAsia="Calibri" w:hAnsi="Calibri"/>
+          <w:b/>
+          <w:bCs/>
+          <w:i w:val="false"/>
+          <w:iCs w:val="false"/>
+          <w:color w:val="2BB3B1"/>
+          <w:sz w:val="20"/>
+          <w:szCs w:val="20"/>
+        </w:rPr>
+        <w:t xml:space="preserve">SAY  </w:t>
+      </w:r>
+      <w:r>
+        <w:rPr>
+          <w:rFonts w:ascii="Calibri" w:cs="Calibri" w:eastAsia="Calibri" w:hAnsi="Calibri"/>
+          <w:b w:val="false"/>
+          <w:bCs w:val="false"/>
+          <w:i/>
+          <w:iCs/>
+          <w:sz w:val="22"/>
+          <w:szCs w:val="22"/>
+        </w:rPr>
+        <w:t xml:space="preserve">This is the query that surprises people: a big share of what's up there came from two moments, 2007 and 2009. Kessler syndrome in one table.</w:t>
+      </w:r>
+    </w:p>
+    <w:p>
+      <w:pPr>
+        <w:spacing w:after="80" w:before="40" w:line="264"/>
+      </w:pPr>
+      <w:r>
+        <w:rPr>
+          <w:rFonts w:ascii="Calibri" w:cs="Calibri" w:eastAsia="Calibri" w:hAnsi="Calibri"/>
+          <w:b/>
+          <w:bCs/>
+          <w:i w:val="false"/>
+          <w:iCs w:val="false"/>
+          <w:color w:val="2BB3B1"/>
+          <w:sz w:val="20"/>
+          <w:szCs w:val="20"/>
+        </w:rPr>
+        <w:t xml:space="preserve">SAY  </w:t>
+      </w:r>
+      <w:r>
+        <w:rPr>
+          <w:rFonts w:ascii="Calibri" w:cs="Calibri" w:eastAsia="Calibri" w:hAnsi="Calibri"/>
+          <w:b w:val="false"/>
+          <w:bCs w:val="false"/>
+          <w:i/>
+          <w:iCs/>
+          <w:sz w:val="22"/>
+          <w:szCs w:val="22"/>
+        </w:rPr>
+        <w:t xml:space="preserve">And here's the honest answer for the week: 850 close approaches, and one worth escalating. Everything after this point is about that one.</w:t>
+      </w:r>
+    </w:p>
+    <w:p>
+      <w:pPr>
+        <w:spacing w:after="80" w:before="40" w:line="264"/>
+      </w:pPr>
+      <w:r>
+        <w:rPr>
+          <w:rFonts w:ascii="Calibri" w:cs="Calibri" w:eastAsia="Calibri" w:hAnsi="Calibri"/>
+          <w:b/>
+          <w:bCs/>
+          <w:i w:val="false"/>
+          <w:iCs w:val="false"/>
+          <w:color w:val="2BB3B1"/>
+          <w:sz w:val="20"/>
+          <w:szCs w:val="20"/>
+        </w:rPr>
+        <w:t xml:space="preserve">SAY  </w:t>
+      </w:r>
+      <w:r>
+        <w:rPr>
+          <w:rFonts w:ascii="Calibri" w:cs="Calibri" w:eastAsia="Calibri" w:hAnsi="Calibri"/>
+          <w:b w:val="false"/>
+          <w:bCs w:val="false"/>
+          <w:i/>
+          <w:iCs/>
+          <w:sz w:val="22"/>
+          <w:szCs w:val="22"/>
+        </w:rPr>
+        <w:t xml:space="preserve">We picked this dataset because it's public, real and messy. Yours comes loaded for you, and you're not limited to it: bring any data that serves your user, as long as the license clears the bar. If your team has someone at home in SQL or pandas, this is their lane.</w:t>
+      </w:r>
+    </w:p>
+    <w:p>
+      <w:pPr>
+        <w:spacing w:after="80" w:before="40" w:line="264"/>
+      </w:pPr>
+      <w:r>
+        <w:rPr>
+          <w:rFonts w:ascii="Calibri" w:cs="Calibri" w:eastAsia="Calibri" w:hAnsi="Calibri"/>
+          <w:b/>
+          <w:bCs/>
+          <w:i w:val="false"/>
+          <w:iCs w:val="false"/>
+          <w:color w:val="B07CFF"/>
+          <w:sz w:val="20"/>
+          <w:szCs w:val="20"/>
+        </w:rPr>
+        <w:t xml:space="preserve">NEEDS  </w:t>
+      </w:r>
+      <w:r>
+        <w:rPr>
+          <w:rFonts w:ascii="Calibri" w:cs="Calibri" w:eastAsia="Calibri" w:hAnsi="Calibri"/>
+          <w:b w:val="false"/>
+          <w:bCs w:val="false"/>
+          <w:i w:val="false"/>
+          <w:iCs w:val="false"/>
+          <w:sz w:val="20"/>
+          <w:szCs w:val="20"/>
+        </w:rPr>
+        <w:t xml:space="preserve">demo_01_load_explore.ipynb, already run end to end (Runtime ▸ Run all, this morning, same project).</w:t>
       </w:r>
     </w:p>
     <w:tbl>
@@ -5347,10 +5376,10 @@
           <w:tcPr>
             <w:tcW w:type="dxa" w:w="10080"/>
             <w:tcBorders>
-              <w:top w:val="single" w:color="2BB3B1" w:sz="12"/>
-              <w:left w:val="single" w:color="2BB3B1" w:sz="12"/>
-              <w:bottom w:val="single" w:color="2BB3B1" w:sz="12"/>
-              <w:right w:val="single" w:color="2BB3B1" w:sz="12"/>
+              <w:top w:val="single" w:color="B07CFF" w:sz="12"/>
+              <w:left w:val="single" w:color="B07CFF" w:sz="12"/>
+              <w:bottom w:val="single" w:color="B07CFF" w:sz="12"/>
+              <w:right w:val="single" w:color="B07CFF" w:sz="12"/>
             </w:tcBorders>
             <w:tcMar>
               <w:top w:type="dxa" w:w="80"/>
@@ -5370,11 +5399,11 @@
                 <w:bCs/>
                 <w:i w:val="false"/>
                 <w:iCs w:val="false"/>
-                <w:color w:val="2BB3B1"/>
+                <w:color w:val="B07CFF"/>
                 <w:sz w:val="18"/>
                 <w:szCs w:val="18"/>
               </w:rPr>
-              <w:t xml:space="preserve">SAY</w:t>
+              <w:t xml:space="preserve">DO</w:t>
             </w:r>
           </w:p>
           <w:p>
@@ -5386,12 +5415,43 @@
                 <w:rFonts w:ascii="Calibri" w:cs="Calibri" w:eastAsia="Calibri" w:hAnsi="Calibri"/>
                 <w:b w:val="false"/>
                 <w:bCs w:val="false"/>
-                <w:i/>
-                <w:iCs/>
+                <w:i w:val="false"/>
+                <w:iCs w:val="false"/>
                 <w:sz w:val="20"/>
                 <w:szCs w:val="20"/>
               </w:rPr>
-              <w:t xml:space="preserve">Same height is not same place. Altitude is a filter, not an answer.</w:t>
+              <w:t xml:space="preserve">Table of contents ▸ 3—The wrong answer first</w:t>
+            </w:r>
+          </w:p>
+          <w:p>
+            <w:pPr>
+              <w:spacing w:after="0" w:before="60" w:line="264"/>
+            </w:pPr>
+            <w:r>
+              <w:rPr>
+                <w:rFonts w:ascii="Calibri" w:cs="Calibri" w:eastAsia="Calibri" w:hAnsi="Calibri"/>
+                <w:b/>
+                <w:bCs/>
+                <w:i w:val="false"/>
+                <w:iCs w:val="false"/>
+                <w:color w:val="2ECC71"/>
+                <w:sz w:val="19"/>
+                <w:szCs w:val="19"/>
+              </w:rPr>
+              <w:t xml:space="preserve">→ </w:t>
+            </w:r>
+            <w:r>
+              <w:rPr>
+                <w:rFonts w:ascii="Calibri" w:cs="Calibri" w:eastAsia="Calibri" w:hAnsi="Calibri"/>
+                <w:b w:val="false"/>
+                <w:bCs w:val="false"/>
+                <w:i w:val="false"/>
+                <w:iCs w:val="false"/>
+                <w:color w:val="9AA4B2"/>
+                <w:sz w:val="19"/>
+                <w:szCs w:val="19"/>
+              </w:rPr>
+              <w:t xml:space="preserve">Thousands of objects whose orbit crosses our 880 km altitude. Every one of them really is at our height.</w:t>
             </w:r>
           </w:p>
         </w:tc>
@@ -5437,10 +5497,10 @@
           <w:tcPr>
             <w:tcW w:type="dxa" w:w="10080"/>
             <w:tcBorders>
-              <w:top w:val="single" w:color="B07CFF" w:sz="12"/>
-              <w:left w:val="single" w:color="B07CFF" w:sz="12"/>
-              <w:bottom w:val="single" w:color="B07CFF" w:sz="12"/>
-              <w:right w:val="single" w:color="B07CFF" w:sz="12"/>
+              <w:top w:val="single" w:color="2BB3B1" w:sz="12"/>
+              <w:left w:val="single" w:color="2BB3B1" w:sz="12"/>
+              <w:bottom w:val="single" w:color="2BB3B1" w:sz="12"/>
+              <w:right w:val="single" w:color="2BB3B1" w:sz="12"/>
             </w:tcBorders>
             <w:tcMar>
               <w:top w:type="dxa" w:w="80"/>
@@ -5460,11 +5520,11 @@
                 <w:bCs/>
                 <w:i w:val="false"/>
                 <w:iCs w:val="false"/>
-                <w:color w:val="B07CFF"/>
+                <w:color w:val="2BB3B1"/>
                 <w:sz w:val="18"/>
                 <w:szCs w:val="18"/>
               </w:rPr>
-              <w:t xml:space="preserve">DO</w:t>
+              <w:t xml:space="preserve">SAY</w:t>
             </w:r>
           </w:p>
           <w:p>
@@ -5476,43 +5536,12 @@
                 <w:rFonts w:ascii="Calibri" w:cs="Calibri" w:eastAsia="Calibri" w:hAnsi="Calibri"/>
                 <w:b w:val="false"/>
                 <w:bCs w:val="false"/>
-                <w:i w:val="false"/>
-                <w:iCs w:val="false"/>
+                <w:i/>
+                <w:iCs/>
                 <w:sz w:val="20"/>
                 <w:szCs w:val="20"/>
               </w:rPr>
-              <w:t xml:space="preserve">Table of contents ▸ 7—What the data says ▸ the hook query</w:t>
-            </w:r>
-          </w:p>
-          <w:p>
-            <w:pPr>
-              <w:spacing w:after="0" w:before="60" w:line="264"/>
-            </w:pPr>
-            <w:r>
-              <w:rPr>
-                <w:rFonts w:ascii="Calibri" w:cs="Calibri" w:eastAsia="Calibri" w:hAnsi="Calibri"/>
-                <w:b/>
-                <w:bCs/>
-                <w:i w:val="false"/>
-                <w:iCs w:val="false"/>
-                <w:color w:val="2ECC71"/>
-                <w:sz w:val="19"/>
-                <w:szCs w:val="19"/>
-              </w:rPr>
-              <w:t xml:space="preserve">→ </w:t>
-            </w:r>
-            <w:r>
-              <w:rPr>
-                <w:rFonts w:ascii="Calibri" w:cs="Calibri" w:eastAsia="Calibri" w:hAnsi="Calibri"/>
-                <w:b w:val="false"/>
-                <w:bCs w:val="false"/>
-                <w:i w:val="false"/>
-                <w:iCs w:val="false"/>
-                <w:color w:val="9AA4B2"/>
-                <w:sz w:val="19"/>
-                <w:szCs w:val="19"/>
-              </w:rPr>
-              <w:t xml:space="preserve">About a quarter of what crosses our altitude comes from two events: the 2007 anti-satellite test and the 2009 collision.</w:t>
+              <w:t xml:space="preserve">Same height is not same place. Altitude is a filter, not an answer.</w:t>
             </w:r>
           </w:p>
         </w:tc>
@@ -5602,7 +5631,7 @@
                 <w:sz w:val="20"/>
                 <w:szCs w:val="20"/>
               </w:rPr>
-              <w:t xml:space="preserve">Table of contents ▸ 10—The honest numbers</w:t>
+              <w:t xml:space="preserve">Table of contents ▸ 7—What the data says ▸ the hook query</w:t>
             </w:r>
           </w:p>
           <w:p>
@@ -5633,7 +5662,7 @@
                 <w:sz w:val="19"/>
                 <w:szCs w:val="19"/>
               </w:rPr>
-              <w:t xml:space="preserve">850 approaches under 10 km this week: 1 ESCALATE, 7 WATCH, 842 noise.</w:t>
+              <w:t xml:space="preserve">About a quarter of what crosses our altitude comes from two events: the 2007 anti-satellite test and the 2009 collision.</w:t>
             </w:r>
           </w:p>
         </w:tc>
@@ -5654,193 +5683,6 @@
           <w:szCs w:val="22"/>
         </w:rPr>
         <w:t xml:space="preserve"/>
-      </w:r>
-    </w:p>
-    <w:p>
-      <w:pPr>
-        <w:spacing w:after="80" w:before="40" w:line="264"/>
-      </w:pPr>
-      <w:r>
-        <w:rPr>
-          <w:rFonts w:ascii="Calibri" w:cs="Calibri" w:eastAsia="Calibri" w:hAnsi="Calibri"/>
-          <w:b w:val="false"/>
-          <w:bCs w:val="false"/>
-          <w:i w:val="false"/>
-          <w:iCs w:val="false"/>
-          <w:sz w:val="22"/>
-          <w:szCs w:val="22"/>
-        </w:rPr>
-        <w:t xml:space="preserve">The notebook also carries the real messes we hit (the end of the old TLE format, stale tracking, a timestamp BigQuery refused) and a validation section that re-reads the loaded tables. Mention them only if someone asks: they're what the data lane will live through.</w:t>
-      </w:r>
-    </w:p>
-    <w:p>
-      <w:pPr>
-        <w:spacing w:after="80" w:before="40" w:line="264"/>
-      </w:pPr>
-      <w:r>
-        <w:rPr>
-          <w:rFonts w:ascii="Calibri" w:cs="Calibri" w:eastAsia="Calibri" w:hAnsi="Calibri"/>
-          <w:b/>
-          <w:bCs/>
-          <w:i w:val="false"/>
-          <w:iCs w:val="false"/>
-          <w:color w:val="FF5C5C"/>
-          <w:sz w:val="20"/>
-          <w:szCs w:val="20"/>
-        </w:rPr>
-        <w:t xml:space="preserve">GOTCHA  </w:t>
-      </w:r>
-      <w:r>
-        <w:rPr>
-          <w:rFonts w:ascii="Calibri" w:cs="Calibri" w:eastAsia="Calibri" w:hAnsi="Calibri"/>
-          <w:b w:val="false"/>
-          <w:bCs w:val="false"/>
-          <w:i w:val="false"/>
-          <w:iCs w:val="false"/>
-          <w:sz w:val="20"/>
-          <w:szCs w:val="20"/>
-        </w:rPr>
-        <w:t xml:space="preserve">If the outputs are gone (kernel restarted), don't re-run live: the screen takes two minutes. Say the numbers from this page and move on.</w:t>
-      </w:r>
-    </w:p>
-    <w:p>
-      <w:pPr>
-        <w:pStyle w:val="Heading3"/>
-        <w:keepNext/>
-        <w:spacing w:after="40" w:before="160"/>
-      </w:pPr>
-      <w:r>
-        <w:rPr>
-          <w:rFonts w:ascii="Calibri" w:cs="Calibri" w:eastAsia="Calibri" w:hAnsi="Calibri"/>
-          <w:b/>
-          <w:bCs/>
-          <w:i w:val="false"/>
-          <w:iCs w:val="false"/>
-          <w:color w:val="3D8BFF"/>
-          <w:sz w:val="22"/>
-          <w:szCs w:val="22"/>
-        </w:rPr>
-        <w:t xml:space="preserve">3. Build: an agent on the required stack   ·   TAB · ADK WEB UI · PORT 8000   ·   ~1.5 min</w:t>
-      </w:r>
-    </w:p>
-    <w:p>
-      <w:pPr>
-        <w:spacing w:after="80" w:before="40" w:line="264"/>
-      </w:pPr>
-      <w:r>
-        <w:rPr>
-          <w:rFonts w:ascii="Calibri" w:cs="Calibri" w:eastAsia="Calibri" w:hAnsi="Calibri"/>
-          <w:b/>
-          <w:bCs/>
-          <w:i w:val="false"/>
-          <w:iCs w:val="false"/>
-          <w:color w:val="2ECC71"/>
-          <w:sz w:val="20"/>
-          <w:szCs w:val="20"/>
-        </w:rPr>
-        <w:t xml:space="preserve">WHY  </w:t>
-      </w:r>
-      <w:r>
-        <w:rPr>
-          <w:rFonts w:ascii="Calibri" w:cs="Calibri" w:eastAsia="Calibri" w:hAnsi="Calibri"/>
-          <w:b w:val="false"/>
-          <w:bCs w:val="false"/>
-          <w:i w:val="false"/>
-          <w:iCs w:val="false"/>
-          <w:sz w:val="22"/>
-          <w:szCs w:val="22"/>
-        </w:rPr>
-        <w:t xml:space="preserve">The agent lane's required stack, visible in one answer: ADK, Gemini, BigQuery, a managed MCP server.</w:t>
-      </w:r>
-    </w:p>
-    <w:p>
-      <w:pPr>
-        <w:spacing w:after="80" w:before="40" w:line="264"/>
-      </w:pPr>
-      <w:r>
-        <w:rPr>
-          <w:rFonts w:ascii="Calibri" w:cs="Calibri" w:eastAsia="Calibri" w:hAnsi="Calibri"/>
-          <w:b/>
-          <w:bCs/>
-          <w:i w:val="false"/>
-          <w:iCs w:val="false"/>
-          <w:color w:val="2BB3B1"/>
-          <w:sz w:val="20"/>
-          <w:szCs w:val="20"/>
-        </w:rPr>
-        <w:t xml:space="preserve">SAY  </w:t>
-      </w:r>
-      <w:r>
-        <w:rPr>
-          <w:rFonts w:ascii="Calibri" w:cs="Calibri" w:eastAsia="Calibri" w:hAnsi="Calibri"/>
-          <w:b w:val="false"/>
-          <w:bCs w:val="false"/>
-          <w:i/>
-          <w:iCs/>
-          <w:sz w:val="22"/>
-          <w:szCs w:val="22"/>
-        </w:rPr>
-        <w:t xml:space="preserve">Second step: build the agent. Same required stack as yours: ADK, Gemini, BigQuery, and a Google-managed MCP server it uses to query the tables.</w:t>
-      </w:r>
-    </w:p>
-    <w:p>
-      <w:pPr>
-        <w:spacing w:after="80" w:before="40" w:line="264"/>
-      </w:pPr>
-      <w:r>
-        <w:rPr>
-          <w:rFonts w:ascii="Calibri" w:cs="Calibri" w:eastAsia="Calibri" w:hAnsi="Calibri"/>
-          <w:b/>
-          <w:bCs/>
-          <w:i w:val="false"/>
-          <w:iCs w:val="false"/>
-          <w:color w:val="2BB3B1"/>
-          <w:sz w:val="20"/>
-          <w:szCs w:val="20"/>
-        </w:rPr>
-        <w:t xml:space="preserve">SAY  </w:t>
-      </w:r>
-      <w:r>
-        <w:rPr>
-          <w:rFonts w:ascii="Calibri" w:cs="Calibri" w:eastAsia="Calibri" w:hAnsi="Calibri"/>
-          <w:b w:val="false"/>
-          <w:bCs w:val="false"/>
-          <w:i/>
-          <w:iCs/>
-          <w:sz w:val="22"/>
-          <w:szCs w:val="22"/>
-        </w:rPr>
-        <w:t xml:space="preserve">Watch what it does: it decided that question needs a query, wrote it, ran it through the MCP server, and summarised. Nobody wrote that SQL for it.</w:t>
-      </w:r>
-    </w:p>
-    <w:p>
-      <w:pPr>
-        <w:spacing w:after="80" w:before="40" w:line="264"/>
-      </w:pPr>
-      <w:r>
-        <w:rPr>
-          <w:rFonts w:ascii="Calibri" w:cs="Calibri" w:eastAsia="Calibri" w:hAnsi="Calibri"/>
-          <w:b/>
-          <w:bCs/>
-          <w:i w:val="false"/>
-          <w:iCs w:val="false"/>
-          <w:color w:val="B07CFF"/>
-          <w:sz w:val="20"/>
-          <w:szCs w:val="20"/>
-        </w:rPr>
-        <w:t xml:space="preserve">NEEDS  </w:t>
-      </w:r>
-      <w:r>
-        <w:rPr>
-          <w:rFonts w:ascii="Calibri" w:cs="Calibri" w:eastAsia="Calibri" w:hAnsi="Calibri"/>
-          <w:b w:val="false"/>
-          <w:bCs w:val="false"/>
-          <w:i w:val="false"/>
-          <w:iCs w:val="false"/>
-          <w:sz w:val="20"/>
-          <w:szCs w:val="20"/>
-        </w:rPr>
-        <w:t xml:space="preserve">cymbal_ops selected, new session.</w:t>
       </w:r>
     </w:p>
     <w:tbl>
@@ -5866,10 +5708,10 @@
           <w:tcPr>
             <w:tcW w:type="dxa" w:w="10080"/>
             <w:tcBorders>
-              <w:top w:val="single" w:color="F28C28" w:sz="12"/>
-              <w:left w:val="single" w:color="F28C28" w:sz="36"/>
-              <w:bottom w:val="single" w:color="F28C28" w:sz="12"/>
-              <w:right w:val="single" w:color="F28C28" w:sz="12"/>
+              <w:top w:val="single" w:color="B07CFF" w:sz="12"/>
+              <w:left w:val="single" w:color="B07CFF" w:sz="12"/>
+              <w:bottom w:val="single" w:color="B07CFF" w:sz="12"/>
+              <w:right w:val="single" w:color="B07CFF" w:sz="12"/>
             </w:tcBorders>
             <w:tcMar>
               <w:top w:type="dxa" w:w="80"/>
@@ -5889,11 +5731,11 @@
                 <w:bCs/>
                 <w:i w:val="false"/>
                 <w:iCs w:val="false"/>
-                <w:color w:val="F28C28"/>
+                <w:color w:val="B07CFF"/>
                 <w:sz w:val="18"/>
                 <w:szCs w:val="18"/>
               </w:rPr>
-              <w:t xml:space="preserve">TYPE in the ADK web UI</w:t>
+              <w:t xml:space="preserve">DO</w:t>
             </w:r>
           </w:p>
           <w:p>
@@ -5902,15 +5744,15 @@
             </w:pPr>
             <w:r>
               <w:rPr>
-                <w:rFonts w:ascii="Consolas" w:cs="Consolas" w:eastAsia="Consolas" w:hAnsi="Consolas"/>
-                <w:b w:val="false"/>
-                <w:bCs w:val="false"/>
-                <w:i w:val="false"/>
-                <w:iCs w:val="false"/>
-                <w:sz w:val="19"/>
-                <w:szCs w:val="19"/>
-              </w:rPr>
-              <w:t xml:space="preserve">What should we worry about this week?</w:t>
+                <w:rFonts w:ascii="Calibri" w:cs="Calibri" w:eastAsia="Calibri" w:hAnsi="Calibri"/>
+                <w:b w:val="false"/>
+                <w:bCs w:val="false"/>
+                <w:i w:val="false"/>
+                <w:iCs w:val="false"/>
+                <w:sz w:val="20"/>
+                <w:szCs w:val="20"/>
+              </w:rPr>
+              <w:t xml:space="preserve">Table of contents ▸ 10—The honest numbers</w:t>
             </w:r>
           </w:p>
           <w:p>
@@ -5941,7 +5783,7 @@
                 <w:sz w:val="19"/>
                 <w:szCs w:val="19"/>
               </w:rPr>
-              <w:t xml:space="preserve">One to escalate: CYMBAL-04 vs FENGYUN 1C DEB, Fri 25 Sep 20:16 UTC, 301.1 m, worst-case 1.01e-04. CYMBAL-01's pass is two minutes away and can't be acted on. About 15 s.</w:t>
+              <w:t xml:space="preserve">850 approaches under 10 km this week: 1 ESCALATE, 7 WATCH, 842 noise.</w:t>
             </w:r>
           </w:p>
         </w:tc>
@@ -5987,10 +5829,10 @@
           <w:tcPr>
             <w:tcW w:type="dxa" w:w="10080"/>
             <w:tcBorders>
-              <w:top w:val="single" w:color="2BB3B1" w:sz="12"/>
-              <w:left w:val="single" w:color="2BB3B1" w:sz="12"/>
-              <w:bottom w:val="single" w:color="2BB3B1" w:sz="12"/>
-              <w:right w:val="single" w:color="2BB3B1" w:sz="12"/>
+              <w:top w:val="single" w:color="2ECC71" w:sz="12"/>
+              <w:left w:val="single" w:color="2ECC71" w:sz="12"/>
+              <w:bottom w:val="single" w:color="2ECC71" w:sz="12"/>
+              <w:right w:val="single" w:color="2ECC71" w:sz="12"/>
             </w:tcBorders>
             <w:tcMar>
               <w:top w:type="dxa" w:w="80"/>
@@ -6010,11 +5852,11 @@
                 <w:bCs/>
                 <w:i w:val="false"/>
                 <w:iCs w:val="false"/>
-                <w:color w:val="2BB3B1"/>
+                <w:color w:val="2ECC71"/>
                 <w:sz w:val="18"/>
                 <w:szCs w:val="18"/>
               </w:rPr>
-              <w:t xml:space="preserve">SAY</w:t>
+              <w:t xml:space="preserve">IF YOUR TEAM HAS…</w:t>
             </w:r>
           </w:p>
           <w:p>
@@ -6026,12 +5868,12 @@
                 <w:rFonts w:ascii="Calibri" w:cs="Calibri" w:eastAsia="Calibri" w:hAnsi="Calibri"/>
                 <w:b w:val="false"/>
                 <w:bCs w:val="false"/>
-                <w:i/>
-                <w:iCs/>
+                <w:i w:val="false"/>
+                <w:iCs w:val="false"/>
                 <w:sz w:val="20"/>
                 <w:szCs w:val="20"/>
               </w:rPr>
-              <w:t xml:space="preserve">While it works: ADK is the frame, Gemini is the reasoning, and it reads BigQuery through Google's managed MCP server.</w:t>
+              <w:t xml:space="preserve">Someone at home in SQL or pandas: the data lane. We picked public orbital data; your challenge loads its own, and you can bring any dataset that serves your user and clears the license bar.</w:t>
             </w:r>
           </w:p>
         </w:tc>
@@ -6052,6 +5894,223 @@
           <w:szCs w:val="22"/>
         </w:rPr>
         <w:t xml:space="preserve"/>
+      </w:r>
+    </w:p>
+    <w:p>
+      <w:pPr>
+        <w:spacing w:after="80" w:before="40" w:line="264"/>
+      </w:pPr>
+      <w:r>
+        <w:rPr>
+          <w:rFonts w:ascii="Calibri" w:cs="Calibri" w:eastAsia="Calibri" w:hAnsi="Calibri"/>
+          <w:b w:val="false"/>
+          <w:bCs w:val="false"/>
+          <w:i w:val="false"/>
+          <w:iCs w:val="false"/>
+          <w:sz w:val="22"/>
+          <w:szCs w:val="22"/>
+        </w:rPr>
+        <w:t xml:space="preserve">The notebook also carries the real messes we hit (the end of the old TLE format, stale tracking, a timestamp BigQuery refused) and a validation section that re-reads the loaded tables. Mention them only if someone asks: they're what the data lane will live through.</w:t>
+      </w:r>
+    </w:p>
+    <w:p>
+      <w:pPr>
+        <w:spacing w:after="80" w:before="40" w:line="264"/>
+      </w:pPr>
+      <w:r>
+        <w:rPr>
+          <w:rFonts w:ascii="Calibri" w:cs="Calibri" w:eastAsia="Calibri" w:hAnsi="Calibri"/>
+          <w:b/>
+          <w:bCs/>
+          <w:i w:val="false"/>
+          <w:iCs w:val="false"/>
+          <w:color w:val="FF5C5C"/>
+          <w:sz w:val="20"/>
+          <w:szCs w:val="20"/>
+        </w:rPr>
+        <w:t xml:space="preserve">GOTCHA  </w:t>
+      </w:r>
+      <w:r>
+        <w:rPr>
+          <w:rFonts w:ascii="Calibri" w:cs="Calibri" w:eastAsia="Calibri" w:hAnsi="Calibri"/>
+          <w:b w:val="false"/>
+          <w:bCs w:val="false"/>
+          <w:i w:val="false"/>
+          <w:iCs w:val="false"/>
+          <w:sz w:val="20"/>
+          <w:szCs w:val="20"/>
+        </w:rPr>
+        <w:t xml:space="preserve">If the outputs are gone (kernel restarted), don't re-run live: the screen takes two minutes. Say the numbers from this page and move on.</w:t>
+      </w:r>
+    </w:p>
+    <w:p>
+      <w:pPr>
+        <w:pStyle w:val="Heading3"/>
+        <w:keepNext/>
+        <w:spacing w:after="40" w:before="160"/>
+      </w:pPr>
+      <w:r>
+        <w:rPr>
+          <w:rFonts w:ascii="Calibri" w:cs="Calibri" w:eastAsia="Calibri" w:hAnsi="Calibri"/>
+          <w:b/>
+          <w:bCs/>
+          <w:i w:val="false"/>
+          <w:iCs w:val="false"/>
+          <w:color w:val="3D8BFF"/>
+          <w:sz w:val="22"/>
+          <w:szCs w:val="22"/>
+        </w:rPr>
+        <w:t xml:space="preserve">3. Build: an agent on the required stack   ·   TAB · ADK WEB UI · PORT 8000   ·   ~1.5 min</w:t>
+      </w:r>
+    </w:p>
+    <w:p>
+      <w:pPr>
+        <w:spacing w:after="80" w:before="40" w:line="264"/>
+      </w:pPr>
+      <w:r>
+        <w:rPr>
+          <w:rFonts w:ascii="Calibri" w:cs="Calibri" w:eastAsia="Calibri" w:hAnsi="Calibri"/>
+          <w:b/>
+          <w:bCs/>
+          <w:i w:val="false"/>
+          <w:iCs w:val="false"/>
+          <w:color w:val="2ECC71"/>
+          <w:sz w:val="20"/>
+          <w:szCs w:val="20"/>
+        </w:rPr>
+        <w:t xml:space="preserve">WHY  </w:t>
+      </w:r>
+      <w:r>
+        <w:rPr>
+          <w:rFonts w:ascii="Calibri" w:cs="Calibri" w:eastAsia="Calibri" w:hAnsi="Calibri"/>
+          <w:b w:val="false"/>
+          <w:bCs w:val="false"/>
+          <w:i w:val="false"/>
+          <w:iCs w:val="false"/>
+          <w:sz w:val="22"/>
+          <w:szCs w:val="22"/>
+        </w:rPr>
+        <w:t xml:space="preserve">The agent lane's required stack, visible in one answer: ADK, Gemini, BigQuery, a managed MCP server.</w:t>
+      </w:r>
+    </w:p>
+    <w:p>
+      <w:pPr>
+        <w:spacing w:after="80" w:before="40" w:line="264"/>
+      </w:pPr>
+      <w:r>
+        <w:rPr>
+          <w:rFonts w:ascii="Calibri" w:cs="Calibri" w:eastAsia="Calibri" w:hAnsi="Calibri"/>
+          <w:b/>
+          <w:bCs/>
+          <w:i w:val="false"/>
+          <w:iCs w:val="false"/>
+          <w:color w:val="2BB3B1"/>
+          <w:sz w:val="20"/>
+          <w:szCs w:val="20"/>
+        </w:rPr>
+        <w:t xml:space="preserve">SAY  </w:t>
+      </w:r>
+      <w:r>
+        <w:rPr>
+          <w:rFonts w:ascii="Calibri" w:cs="Calibri" w:eastAsia="Calibri" w:hAnsi="Calibri"/>
+          <w:b w:val="false"/>
+          <w:bCs w:val="false"/>
+          <w:i/>
+          <w:iCs/>
+          <w:sz w:val="22"/>
+          <w:szCs w:val="22"/>
+        </w:rPr>
+        <w:t xml:space="preserve">Second step: build the agent. Same required stack as yours: ADK, Gemini, BigQuery, and a Google-managed MCP server it uses to query the tables.</w:t>
+      </w:r>
+    </w:p>
+    <w:p>
+      <w:pPr>
+        <w:spacing w:after="80" w:before="40" w:line="264"/>
+      </w:pPr>
+      <w:r>
+        <w:rPr>
+          <w:rFonts w:ascii="Calibri" w:cs="Calibri" w:eastAsia="Calibri" w:hAnsi="Calibri"/>
+          <w:b/>
+          <w:bCs/>
+          <w:i w:val="false"/>
+          <w:iCs w:val="false"/>
+          <w:color w:val="2BB3B1"/>
+          <w:sz w:val="20"/>
+          <w:szCs w:val="20"/>
+        </w:rPr>
+        <w:t xml:space="preserve">SAY  </w:t>
+      </w:r>
+      <w:r>
+        <w:rPr>
+          <w:rFonts w:ascii="Calibri" w:cs="Calibri" w:eastAsia="Calibri" w:hAnsi="Calibri"/>
+          <w:b w:val="false"/>
+          <w:bCs w:val="false"/>
+          <w:i/>
+          <w:iCs/>
+          <w:sz w:val="22"/>
+          <w:szCs w:val="22"/>
+        </w:rPr>
+        <w:t xml:space="preserve">Watch what it does: it decided that question needs a query, wrote it, ran it through the MCP server, and summarised. Nobody wrote that SQL for it.</w:t>
+      </w:r>
+    </w:p>
+    <w:p>
+      <w:pPr>
+        <w:spacing w:after="80" w:before="40" w:line="264"/>
+      </w:pPr>
+      <w:r>
+        <w:rPr>
+          <w:rFonts w:ascii="Calibri" w:cs="Calibri" w:eastAsia="Calibri" w:hAnsi="Calibri"/>
+          <w:b/>
+          <w:bCs/>
+          <w:i w:val="false"/>
+          <w:iCs w:val="false"/>
+          <w:color w:val="2BB3B1"/>
+          <w:sz w:val="20"/>
+          <w:szCs w:val="20"/>
+        </w:rPr>
+        <w:t xml:space="preserve">SAY  </w:t>
+      </w:r>
+      <w:r>
+        <w:rPr>
+          <w:rFonts w:ascii="Calibri" w:cs="Calibri" w:eastAsia="Calibri" w:hAnsi="Calibri"/>
+          <w:b w:val="false"/>
+          <w:bCs w:val="false"/>
+          <w:i/>
+          <w:iCs/>
+          <w:sz w:val="22"/>
+          <w:szCs w:val="22"/>
+        </w:rPr>
+        <w:t xml:space="preserve">This is the core every team should reach. A Python developer and someone who writes clear instructions can get you here; the prompt is harder than it looks.</w:t>
+      </w:r>
+    </w:p>
+    <w:p>
+      <w:pPr>
+        <w:spacing w:after="80" w:before="40" w:line="264"/>
+      </w:pPr>
+      <w:r>
+        <w:rPr>
+          <w:rFonts w:ascii="Calibri" w:cs="Calibri" w:eastAsia="Calibri" w:hAnsi="Calibri"/>
+          <w:b/>
+          <w:bCs/>
+          <w:i w:val="false"/>
+          <w:iCs w:val="false"/>
+          <w:color w:val="B07CFF"/>
+          <w:sz w:val="20"/>
+          <w:szCs w:val="20"/>
+        </w:rPr>
+        <w:t xml:space="preserve">NEEDS  </w:t>
+      </w:r>
+      <w:r>
+        <w:rPr>
+          <w:rFonts w:ascii="Calibri" w:cs="Calibri" w:eastAsia="Calibri" w:hAnsi="Calibri"/>
+          <w:b w:val="false"/>
+          <w:bCs w:val="false"/>
+          <w:i w:val="false"/>
+          <w:iCs w:val="false"/>
+          <w:sz w:val="20"/>
+          <w:szCs w:val="20"/>
+        </w:rPr>
+        <w:t xml:space="preserve">cymbal_ops selected, new session.</w:t>
       </w:r>
     </w:p>
     <w:tbl>
@@ -6077,10 +6136,10 @@
           <w:tcPr>
             <w:tcW w:type="dxa" w:w="10080"/>
             <w:tcBorders>
-              <w:top w:val="single" w:color="B07CFF" w:sz="12"/>
-              <w:left w:val="single" w:color="B07CFF" w:sz="12"/>
-              <w:bottom w:val="single" w:color="B07CFF" w:sz="12"/>
-              <w:right w:val="single" w:color="B07CFF" w:sz="12"/>
+              <w:top w:val="single" w:color="F28C28" w:sz="12"/>
+              <w:left w:val="single" w:color="F28C28" w:sz="36"/>
+              <w:bottom w:val="single" w:color="F28C28" w:sz="12"/>
+              <w:right w:val="single" w:color="F28C28" w:sz="12"/>
             </w:tcBorders>
             <w:tcMar>
               <w:top w:type="dxa" w:w="80"/>
@@ -6100,11 +6159,11 @@
                 <w:bCs/>
                 <w:i w:val="false"/>
                 <w:iCs w:val="false"/>
-                <w:color w:val="B07CFF"/>
+                <w:color w:val="F28C28"/>
                 <w:sz w:val="18"/>
                 <w:szCs w:val="18"/>
               </w:rPr>
-              <w:t xml:space="preserve">DO</w:t>
+              <w:t xml:space="preserve">TYPE in the ADK web UI</w:t>
             </w:r>
           </w:p>
           <w:p>
@@ -6113,15 +6172,15 @@
             </w:pPr>
             <w:r>
               <w:rPr>
-                <w:rFonts w:ascii="Calibri" w:cs="Calibri" w:eastAsia="Calibri" w:hAnsi="Calibri"/>
-                <w:b w:val="false"/>
-                <w:bCs w:val="false"/>
-                <w:i w:val="false"/>
-                <w:iCs w:val="false"/>
-                <w:sz w:val="20"/>
-                <w:szCs w:val="20"/>
-              </w:rPr>
-              <w:t xml:space="preserve">Events panel ▸ click an execute_sql_readonly call</w:t>
+                <w:rFonts w:ascii="Consolas" w:cs="Consolas" w:eastAsia="Consolas" w:hAnsi="Consolas"/>
+                <w:b w:val="false"/>
+                <w:bCs w:val="false"/>
+                <w:i w:val="false"/>
+                <w:iCs w:val="false"/>
+                <w:sz w:val="19"/>
+                <w:szCs w:val="19"/>
+              </w:rPr>
+              <w:t xml:space="preserve">What should we worry about this week?</w:t>
             </w:r>
           </w:p>
           <w:p>
@@ -6152,7 +6211,7 @@
                 <w:sz w:val="19"/>
                 <w:szCs w:val="19"/>
               </w:rPr>
-              <w:t xml:space="preserve">The SQL the agent wrote against the conjunctions table.</w:t>
+              <w:t xml:space="preserve">One to escalate: CYMBAL-04 vs FENGYUN 1C DEB, Fri 25 Sep 20:16 UTC, 301.1 m, worst-case 1.01e-04. CYMBAL-01's pass is two minutes away and can't be acted on. About 15 s.</w:t>
             </w:r>
           </w:p>
         </w:tc>
@@ -6173,176 +6232,6 @@
           <w:szCs w:val="22"/>
         </w:rPr>
         <w:t xml:space="preserve"/>
-      </w:r>
-    </w:p>
-    <w:p>
-      <w:pPr>
-        <w:spacing w:after="80" w:before="40" w:line="264"/>
-      </w:pPr>
-      <w:r>
-        <w:rPr>
-          <w:rFonts w:ascii="Calibri" w:cs="Calibri" w:eastAsia="Calibri" w:hAnsi="Calibri"/>
-          <w:b/>
-          <w:bCs/>
-          <w:i w:val="false"/>
-          <w:iCs w:val="false"/>
-          <w:color w:val="FF5C5C"/>
-          <w:sz w:val="20"/>
-          <w:szCs w:val="20"/>
-        </w:rPr>
-        <w:t xml:space="preserve">GOTCHA  </w:t>
-      </w:r>
-      <w:r>
-        <w:rPr>
-          <w:rFonts w:ascii="Calibri" w:cs="Calibri" w:eastAsia="Calibri" w:hAnsi="Calibri"/>
-          <w:b w:val="false"/>
-          <w:bCs w:val="false"/>
-          <w:i w:val="false"/>
-          <w:iCs w:val="false"/>
-          <w:sz w:val="20"/>
-          <w:szCs w:val="20"/>
-        </w:rPr>
-        <w:t xml:space="preserve">Slow? Keep talking: every call has a time limit and retries. Past a minute, go to the console tab: its chat box is the same agent.</w:t>
-      </w:r>
-    </w:p>
-    <w:p>
-      <w:pPr>
-        <w:pStyle w:val="Heading3"/>
-        <w:keepNext/>
-        <w:spacing w:after="40" w:before="160"/>
-      </w:pPr>
-      <w:r>
-        <w:rPr>
-          <w:rFonts w:ascii="Calibri" w:cs="Calibri" w:eastAsia="Calibri" w:hAnsi="Calibri"/>
-          <w:b/>
-          <w:bCs/>
-          <w:i w:val="false"/>
-          <w:iCs w:val="false"/>
-          <w:color w:val="3D8BFF"/>
-          <w:sz w:val="22"/>
-          <w:szCs w:val="22"/>
-        </w:rPr>
-        <w:t xml:space="preserve">4. Differentiate: our own tool, and the code sandbox   ·   TAB · ADK WEB UI · SAME SESSION   ·   ~2 min</w:t>
-      </w:r>
-    </w:p>
-    <w:p>
-      <w:pPr>
-        <w:spacing w:after="80" w:before="40" w:line="264"/>
-      </w:pPr>
-      <w:r>
-        <w:rPr>
-          <w:rFonts w:ascii="Calibri" w:cs="Calibri" w:eastAsia="Calibri" w:hAnsi="Calibri"/>
-          <w:b/>
-          <w:bCs/>
-          <w:i w:val="false"/>
-          <w:iCs w:val="false"/>
-          <w:color w:val="2ECC71"/>
-          <w:sz w:val="20"/>
-          <w:szCs w:val="20"/>
-        </w:rPr>
-        <w:t xml:space="preserve">WHY  </w:t>
-      </w:r>
-      <w:r>
-        <w:rPr>
-          <w:rFonts w:ascii="Calibri" w:cs="Calibri" w:eastAsia="Calibri" w:hAnsi="Calibri"/>
-          <w:b w:val="false"/>
-          <w:bCs w:val="false"/>
-          <w:i w:val="false"/>
-          <w:iCs w:val="false"/>
-          <w:sz w:val="22"/>
-          <w:szCs w:val="22"/>
-        </w:rPr>
-        <w:t xml:space="preserve">Two of the requirements in one question: at least one tool you wrote, and the one differentiator your challenge names.</w:t>
-      </w:r>
-    </w:p>
-    <w:p>
-      <w:pPr>
-        <w:spacing w:after="80" w:before="40" w:line="264"/>
-      </w:pPr>
-      <w:r>
-        <w:rPr>
-          <w:rFonts w:ascii="Calibri" w:cs="Calibri" w:eastAsia="Calibri" w:hAnsi="Calibri"/>
-          <w:b/>
-          <w:bCs/>
-          <w:i w:val="false"/>
-          <w:iCs w:val="false"/>
-          <w:color w:val="2BB3B1"/>
-          <w:sz w:val="20"/>
-          <w:szCs w:val="20"/>
-        </w:rPr>
-        <w:t xml:space="preserve">SAY  </w:t>
-      </w:r>
-      <w:r>
-        <w:rPr>
-          <w:rFonts w:ascii="Calibri" w:cs="Calibri" w:eastAsia="Calibri" w:hAnsi="Calibri"/>
-          <w:b w:val="false"/>
-          <w:bCs w:val="false"/>
-          <w:i/>
-          <w:iCs/>
-          <w:sz w:val="22"/>
-          <w:szCs w:val="22"/>
-        </w:rPr>
-        <w:t xml:space="preserve">Third step: differentiate. Every challenge names one thing only it has. Ours is a code sandbox: the agent writes Python and runs it somewhere isolated, not in its own process.</w:t>
-      </w:r>
-    </w:p>
-    <w:p>
-      <w:pPr>
-        <w:spacing w:after="80" w:before="40" w:line="264"/>
-      </w:pPr>
-      <w:r>
-        <w:rPr>
-          <w:rFonts w:ascii="Calibri" w:cs="Calibri" w:eastAsia="Calibri" w:hAnsi="Calibri"/>
-          <w:b/>
-          <w:bCs/>
-          <w:i w:val="false"/>
-          <w:iCs w:val="false"/>
-          <w:color w:val="2BB3B1"/>
-          <w:sz w:val="20"/>
-          <w:szCs w:val="20"/>
-        </w:rPr>
-        <w:t xml:space="preserve">SAY  </w:t>
-      </w:r>
-      <w:r>
-        <w:rPr>
-          <w:rFonts w:ascii="Calibri" w:cs="Calibri" w:eastAsia="Calibri" w:hAnsi="Calibri"/>
-          <w:b w:val="false"/>
-          <w:bCs w:val="false"/>
-          <w:i/>
-          <w:iCs/>
-          <w:sz w:val="22"/>
-          <w:szCs w:val="22"/>
-        </w:rPr>
-        <w:t xml:space="preserve">And this is why we require a custom tool even though MCP can run queries: assess_conjunction decides whether the tracking is fresh enough to act on, whether the other object can move, and what counts as clear. That's judgment, and judgment is code.</w:t>
-      </w:r>
-    </w:p>
-    <w:p>
-      <w:pPr>
-        <w:spacing w:after="80" w:before="40" w:line="264"/>
-      </w:pPr>
-      <w:r>
-        <w:rPr>
-          <w:rFonts w:ascii="Calibri" w:cs="Calibri" w:eastAsia="Calibri" w:hAnsi="Calibri"/>
-          <w:b/>
-          <w:bCs/>
-          <w:i w:val="false"/>
-          <w:iCs w:val="false"/>
-          <w:color w:val="2BB3B1"/>
-          <w:sz w:val="20"/>
-          <w:szCs w:val="20"/>
-        </w:rPr>
-        <w:t xml:space="preserve">SAY  </w:t>
-      </w:r>
-      <w:r>
-        <w:rPr>
-          <w:rFonts w:ascii="Calibri" w:cs="Calibri" w:eastAsia="Calibri" w:hAnsi="Calibri"/>
-          <w:b w:val="false"/>
-          <w:bCs w:val="false"/>
-          <w:i/>
-          <w:iCs/>
-          <w:sz w:val="22"/>
-          <w:szCs w:val="22"/>
-        </w:rPr>
-        <w:t xml:space="preserve">Burning earlier is cheaper: half the fuel, and the difference is more than a day of the satellite's life.</w:t>
       </w:r>
     </w:p>
     <w:tbl>
@@ -6368,10 +6257,10 @@
           <w:tcPr>
             <w:tcW w:type="dxa" w:w="10080"/>
             <w:tcBorders>
-              <w:top w:val="single" w:color="F28C28" w:sz="12"/>
-              <w:left w:val="single" w:color="F28C28" w:sz="36"/>
-              <w:bottom w:val="single" w:color="F28C28" w:sz="12"/>
-              <w:right w:val="single" w:color="F28C28" w:sz="12"/>
+              <w:top w:val="single" w:color="2BB3B1" w:sz="12"/>
+              <w:left w:val="single" w:color="2BB3B1" w:sz="12"/>
+              <w:bottom w:val="single" w:color="2BB3B1" w:sz="12"/>
+              <w:right w:val="single" w:color="2BB3B1" w:sz="12"/>
             </w:tcBorders>
             <w:tcMar>
               <w:top w:type="dxa" w:w="80"/>
@@ -6391,11 +6280,11 @@
                 <w:bCs/>
                 <w:i w:val="false"/>
                 <w:iCs w:val="false"/>
-                <w:color w:val="F28C28"/>
+                <w:color w:val="2BB3B1"/>
                 <w:sz w:val="18"/>
                 <w:szCs w:val="18"/>
               </w:rPr>
-              <w:t xml:space="preserve">FOLLOW-UP (same session)</w:t>
+              <w:t xml:space="preserve">SAY</w:t>
             </w:r>
           </w:p>
           <w:p>
@@ -6404,46 +6293,15 @@
             </w:pPr>
             <w:r>
               <w:rPr>
-                <w:rFonts w:ascii="Consolas" w:cs="Consolas" w:eastAsia="Consolas" w:hAnsi="Consolas"/>
-                <w:b w:val="false"/>
-                <w:bCs w:val="false"/>
-                <w:i w:val="false"/>
-                <w:iCs w:val="false"/>
-                <w:sz w:val="19"/>
-                <w:szCs w:val="19"/>
-              </w:rPr>
-              <w:t xml:space="preserve">What is the smallest burn that gets CYMBAL-04 clear? Compare burning at 04:00 and at 12:00 UTC today, and tell me what each costs.</w:t>
-            </w:r>
-          </w:p>
-          <w:p>
-            <w:pPr>
-              <w:spacing w:after="0" w:before="60" w:line="264"/>
-            </w:pPr>
-            <w:r>
-              <w:rPr>
-                <w:rFonts w:ascii="Calibri" w:cs="Calibri" w:eastAsia="Calibri" w:hAnsi="Calibri"/>
-                <w:b/>
-                <w:bCs/>
-                <w:i w:val="false"/>
-                <w:iCs w:val="false"/>
-                <w:color w:val="2ECC71"/>
-                <w:sz w:val="19"/>
-                <w:szCs w:val="19"/>
-              </w:rPr>
-              <w:t xml:space="preserve">→ </w:t>
-            </w:r>
-            <w:r>
-              <w:rPr>
-                <w:rFonts w:ascii="Calibri" w:cs="Calibri" w:eastAsia="Calibri" w:hAnsi="Calibri"/>
-                <w:b w:val="false"/>
-                <w:bCs w:val="false"/>
-                <w:i w:val="false"/>
-                <w:iCs w:val="false"/>
-                <w:color w:val="9AA4B2"/>
-                <w:sz w:val="19"/>
-                <w:szCs w:val="19"/>
-              </w:rPr>
-              <w:t xml:space="preserve">04:00: 0.0181 m/s prograde → 3,036 m, 1.54 days of mission life. 12:00: 0.0343 m/s → 3,035 m, 2.92 days. About 30 s.</w:t>
+                <w:rFonts w:ascii="Calibri" w:cs="Calibri" w:eastAsia="Calibri" w:hAnsi="Calibri"/>
+                <w:b w:val="false"/>
+                <w:bCs w:val="false"/>
+                <w:i/>
+                <w:iCs/>
+                <w:sz w:val="20"/>
+                <w:szCs w:val="20"/>
+              </w:rPr>
+              <w:t xml:space="preserve">While it works: ADK is the frame, Gemini is the reasoning, and it reads BigQuery through Google's managed MCP server.</w:t>
             </w:r>
           </w:p>
         </w:tc>
@@ -6489,10 +6347,10 @@
           <w:tcPr>
             <w:tcW w:type="dxa" w:w="10080"/>
             <w:tcBorders>
-              <w:top w:val="single" w:color="2BB3B1" w:sz="12"/>
-              <w:left w:val="single" w:color="2BB3B1" w:sz="12"/>
-              <w:bottom w:val="single" w:color="2BB3B1" w:sz="12"/>
-              <w:right w:val="single" w:color="2BB3B1" w:sz="12"/>
+              <w:top w:val="single" w:color="B07CFF" w:sz="12"/>
+              <w:left w:val="single" w:color="B07CFF" w:sz="12"/>
+              <w:bottom w:val="single" w:color="B07CFF" w:sz="12"/>
+              <w:right w:val="single" w:color="B07CFF" w:sz="12"/>
             </w:tcBorders>
             <w:tcMar>
               <w:top w:type="dxa" w:w="80"/>
@@ -6512,11 +6370,11 @@
                 <w:bCs/>
                 <w:i w:val="false"/>
                 <w:iCs w:val="false"/>
-                <w:color w:val="2BB3B1"/>
+                <w:color w:val="B07CFF"/>
                 <w:sz w:val="18"/>
                 <w:szCs w:val="18"/>
               </w:rPr>
-              <w:t xml:space="preserve">SAY</w:t>
+              <w:t xml:space="preserve">DO</w:t>
             </w:r>
           </w:p>
           <w:p>
@@ -6528,12 +6386,43 @@
                 <w:rFonts w:ascii="Calibri" w:cs="Calibri" w:eastAsia="Calibri" w:hAnsi="Calibri"/>
                 <w:b w:val="false"/>
                 <w:bCs w:val="false"/>
-                <w:i/>
-                <w:iCs/>
+                <w:i w:val="false"/>
+                <w:iCs w:val="false"/>
                 <w:sz w:val="20"/>
                 <w:szCs w:val="20"/>
               </w:rPr>
-              <w:t xml:space="preserve">While it works: assess_conjunction is our own Python tool; the physics runs in the Agent Runtime code sandbox; maneuver_cost prices it.</w:t>
+              <w:t xml:space="preserve">Events panel ▸ click an execute_sql_readonly call</w:t>
+            </w:r>
+          </w:p>
+          <w:p>
+            <w:pPr>
+              <w:spacing w:after="0" w:before="60" w:line="264"/>
+            </w:pPr>
+            <w:r>
+              <w:rPr>
+                <w:rFonts w:ascii="Calibri" w:cs="Calibri" w:eastAsia="Calibri" w:hAnsi="Calibri"/>
+                <w:b/>
+                <w:bCs/>
+                <w:i w:val="false"/>
+                <w:iCs w:val="false"/>
+                <w:color w:val="2ECC71"/>
+                <w:sz w:val="19"/>
+                <w:szCs w:val="19"/>
+              </w:rPr>
+              <w:t xml:space="preserve">→ </w:t>
+            </w:r>
+            <w:r>
+              <w:rPr>
+                <w:rFonts w:ascii="Calibri" w:cs="Calibri" w:eastAsia="Calibri" w:hAnsi="Calibri"/>
+                <w:b w:val="false"/>
+                <w:bCs w:val="false"/>
+                <w:i w:val="false"/>
+                <w:iCs w:val="false"/>
+                <w:color w:val="9AA4B2"/>
+                <w:sz w:val="19"/>
+                <w:szCs w:val="19"/>
+              </w:rPr>
+              <w:t xml:space="preserve">The SQL the agent wrote against the conjunctions table.</w:t>
             </w:r>
           </w:p>
         </w:tc>
@@ -6579,10 +6468,10 @@
           <w:tcPr>
             <w:tcW w:type="dxa" w:w="10080"/>
             <w:tcBorders>
-              <w:top w:val="single" w:color="B07CFF" w:sz="12"/>
-              <w:left w:val="single" w:color="B07CFF" w:sz="12"/>
-              <w:bottom w:val="single" w:color="B07CFF" w:sz="12"/>
-              <w:right w:val="single" w:color="B07CFF" w:sz="12"/>
+              <w:top w:val="single" w:color="2ECC71" w:sz="12"/>
+              <w:left w:val="single" w:color="2ECC71" w:sz="12"/>
+              <w:bottom w:val="single" w:color="2ECC71" w:sz="12"/>
+              <w:right w:val="single" w:color="2ECC71" w:sz="12"/>
             </w:tcBorders>
             <w:tcMar>
               <w:top w:type="dxa" w:w="80"/>
@@ -6602,11 +6491,11 @@
                 <w:bCs/>
                 <w:i w:val="false"/>
                 <w:iCs w:val="false"/>
-                <w:color w:val="B07CFF"/>
+                <w:color w:val="2ECC71"/>
                 <w:sz w:val="18"/>
                 <w:szCs w:val="18"/>
               </w:rPr>
-              <w:t xml:space="preserve">DO</w:t>
+              <w:t xml:space="preserve">IF YOUR TEAM HAS…</w:t>
             </w:r>
           </w:p>
           <w:p>
@@ -6623,38 +6512,7 @@
                 <w:sz w:val="20"/>
                 <w:szCs w:val="20"/>
               </w:rPr>
-              <w:t xml:space="preserve">Events panel ▸ click the run_in_sandbox call</w:t>
-            </w:r>
-          </w:p>
-          <w:p>
-            <w:pPr>
-              <w:spacing w:after="0" w:before="60" w:line="264"/>
-            </w:pPr>
-            <w:r>
-              <w:rPr>
-                <w:rFonts w:ascii="Calibri" w:cs="Calibri" w:eastAsia="Calibri" w:hAnsi="Calibri"/>
-                <w:b/>
-                <w:bCs/>
-                <w:i w:val="false"/>
-                <w:iCs w:val="false"/>
-                <w:color w:val="2ECC71"/>
-                <w:sz w:val="19"/>
-                <w:szCs w:val="19"/>
-              </w:rPr>
-              <w:t xml:space="preserve">→ </w:t>
-            </w:r>
-            <w:r>
-              <w:rPr>
-                <w:rFonts w:ascii="Calibri" w:cs="Calibri" w:eastAsia="Calibri" w:hAnsi="Calibri"/>
-                <w:b w:val="false"/>
-                <w:bCs w:val="false"/>
-                <w:i w:val="false"/>
-                <w:iCs w:val="false"/>
-                <w:color w:val="9AA4B2"/>
-                <w:sz w:val="19"/>
-                <w:szCs w:val="19"/>
-              </w:rPr>
-              <w:t xml:space="preserve">Four lines of Python the model wrote, using our orbit_whatif module.</w:t>
+              <w:t xml:space="preserve">A Python developer and someone who writes clear instructions: the agent lane. This is the core every team should reach.</w:t>
             </w:r>
           </w:p>
         </w:tc>
@@ -6704,7 +6562,7 @@
           <w:sz w:val="20"/>
           <w:szCs w:val="20"/>
         </w:rPr>
-        <w:t xml:space="preserve">Past a minute: say "the console will show us the same answer" and move to step 5. The console replays a real run of this question.</w:t>
+        <w:t xml:space="preserve">Slow? Keep talking: every call has a time limit and retries. Past a minute, go to the console tab: its chat box is the same agent.</w:t>
       </w:r>
     </w:p>
     <w:p>
@@ -6724,7 +6582,7 @@
           <w:sz w:val="22"/>
           <w:szCs w:val="22"/>
         </w:rPr>
-        <w:t xml:space="preserve">5. Deploy: the same agent, running in the cloud   ·   TAB · GOOGLE CLOUD CONSOLE · CLOUD RUN   ·   ~0.5 min</w:t>
+        <w:t xml:space="preserve">4. Differentiate: our own tool, and the code sandbox   ·   TAB · ADK WEB UI · SAME SESSION   ·   ~2 min</w:t>
       </w:r>
     </w:p>
     <w:p>
@@ -6754,7 +6612,7 @@
           <w:sz w:val="22"/>
           <w:szCs w:val="22"/>
         </w:rPr>
-        <w:t xml:space="preserve">Deploy is a required step on their path; seeing it is one command makes it less scary.</w:t>
+        <w:t xml:space="preserve">Two of the requirements in one question: at least one tool you wrote, and the one differentiator your challenge names.</w:t>
       </w:r>
     </w:p>
     <w:p>
@@ -6784,7 +6642,7 @@
           <w:sz w:val="22"/>
           <w:szCs w:val="22"/>
         </w:rPr>
-        <w:t xml:space="preserve">Fourth: deploy. This is Cloud Run: Google runs our container, we manage no servers. It's the same agent you just watched, on a real URL, one command.</w:t>
+        <w:t xml:space="preserve">Third step: differentiate. Every challenge names one thing only it has. Ours is a code sandbox: the agent writes Python and runs it somewhere isolated, not in its own process.</w:t>
       </w:r>
     </w:p>
     <w:p>
@@ -6814,7 +6672,7 @@
           <w:sz w:val="22"/>
           <w:szCs w:val="22"/>
         </w:rPr>
-        <w:t xml:space="preserve">Two settings worth stealing. Authentication required, because this agent can run code and query our data. And one instance kept warm, because the first request after a quiet hour is usually the one you make on stage. Yours goes to Cloud Run or Agent Runtime, your choice.</w:t>
+        <w:t xml:space="preserve">And this is why we require a custom tool even though MCP can run queries: assess_conjunction decides whether the tracking is fresh enough to act on, whether the other object can move, and what counts as clear. That's judgment, and judgment is code.</w:t>
       </w:r>
     </w:p>
     <w:p>
@@ -6828,23 +6686,53 @@
           <w:bCs/>
           <w:i w:val="false"/>
           <w:iCs w:val="false"/>
-          <w:color w:val="B07CFF"/>
+          <w:color w:val="2BB3B1"/>
           <w:sz w:val="20"/>
           <w:szCs w:val="20"/>
         </w:rPr>
-        <w:t xml:space="preserve">NEEDS  </w:t>
-      </w:r>
-      <w:r>
-        <w:rPr>
-          <w:rFonts w:ascii="Calibri" w:cs="Calibri" w:eastAsia="Calibri" w:hAnsi="Calibri"/>
-          <w:b w:val="false"/>
-          <w:bCs w:val="false"/>
-          <w:i w:val="false"/>
-          <w:iCs w:val="false"/>
+        <w:t xml:space="preserve">SAY  </w:t>
+      </w:r>
+      <w:r>
+        <w:rPr>
+          <w:rFonts w:ascii="Calibri" w:cs="Calibri" w:eastAsia="Calibri" w:hAnsi="Calibri"/>
+          <w:b w:val="false"/>
+          <w:bCs w:val="false"/>
+          <w:i/>
+          <w:iCs/>
+          <w:sz w:val="22"/>
+          <w:szCs w:val="22"/>
+        </w:rPr>
+        <w:t xml:space="preserve">Burning earlier is cheaper: half the fuel, and the difference is more than a day of the satellite's life.</w:t>
+      </w:r>
+    </w:p>
+    <w:p>
+      <w:pPr>
+        <w:spacing w:after="80" w:before="40" w:line="264"/>
+      </w:pPr>
+      <w:r>
+        <w:rPr>
+          <w:rFonts w:ascii="Calibri" w:cs="Calibri" w:eastAsia="Calibri" w:hAnsi="Calibri"/>
+          <w:b/>
+          <w:bCs/>
+          <w:i w:val="false"/>
+          <w:iCs w:val="false"/>
+          <w:color w:val="2BB3B1"/>
           <w:sz w:val="20"/>
           <w:szCs w:val="20"/>
         </w:rPr>
-        <w:t xml:space="preserve">Navigation menu ▸ Cloud Run ▸ cymbal-ops, already open.</w:t>
+        <w:t xml:space="preserve">SAY  </w:t>
+      </w:r>
+      <w:r>
+        <w:rPr>
+          <w:rFonts w:ascii="Calibri" w:cs="Calibri" w:eastAsia="Calibri" w:hAnsi="Calibri"/>
+          <w:b w:val="false"/>
+          <w:bCs w:val="false"/>
+          <w:i/>
+          <w:iCs/>
+          <w:sz w:val="22"/>
+          <w:szCs w:val="22"/>
+        </w:rPr>
+        <w:t xml:space="preserve">If your team has someone who knows the problem's world, a nurse, a planner, an engineer, they're the one who decides what the custom tool should judge. And your differentiator is the one thing judges will look for; don't leave it for last.</w:t>
       </w:r>
     </w:p>
     <w:tbl>
@@ -6870,10 +6758,10 @@
           <w:tcPr>
             <w:tcW w:type="dxa" w:w="10080"/>
             <w:tcBorders>
-              <w:top w:val="single" w:color="9AA4B2" w:sz="12"/>
-              <w:left w:val="single" w:color="9AA4B2" w:sz="12"/>
-              <w:bottom w:val="single" w:color="9AA4B2" w:sz="12"/>
-              <w:right w:val="single" w:color="9AA4B2" w:sz="12"/>
+              <w:top w:val="single" w:color="F28C28" w:sz="12"/>
+              <w:left w:val="single" w:color="F28C28" w:sz="36"/>
+              <w:bottom w:val="single" w:color="F28C28" w:sz="12"/>
+              <w:right w:val="single" w:color="F28C28" w:sz="12"/>
             </w:tcBorders>
             <w:tcMar>
               <w:top w:type="dxa" w:w="80"/>
@@ -6893,11 +6781,11 @@
                 <w:bCs/>
                 <w:i w:val="false"/>
                 <w:iCs w:val="false"/>
-                <w:color w:val="9AA4B2"/>
+                <w:color w:val="F28C28"/>
                 <w:sz w:val="18"/>
                 <w:szCs w:val="18"/>
               </w:rPr>
-              <w:t xml:space="preserve">WHAT THEY'RE LOOKING AT</w:t>
+              <w:t xml:space="preserve">FOLLOW-UP (same session)</w:t>
             </w:r>
           </w:p>
           <w:p>
@@ -6906,100 +6794,46 @@
             </w:pPr>
             <w:r>
               <w:rPr>
-                <w:rFonts w:ascii="Calibri" w:cs="Calibri" w:eastAsia="Calibri" w:hAnsi="Calibri"/>
-                <w:b w:val="false"/>
-                <w:bCs w:val="false"/>
-                <w:i w:val="false"/>
-                <w:iCs w:val="false"/>
-                <w:sz w:val="20"/>
-                <w:szCs w:val="20"/>
-              </w:rPr>
-              <w:t xml:space="preserve">Cloud Run: Google runs your container for you, no servers to manage.</w:t>
-            </w:r>
-          </w:p>
-          <w:p>
-            <w:pPr>
-              <w:spacing w:after="0" w:before="0" w:line="264"/>
-            </w:pPr>
-            <w:r>
-              <w:rPr>
-                <w:rFonts w:ascii="Calibri" w:cs="Calibri" w:eastAsia="Calibri" w:hAnsi="Calibri"/>
-                <w:b w:val="false"/>
-                <w:bCs w:val="false"/>
-                <w:i w:val="false"/>
-                <w:iCs w:val="false"/>
-                <w:sz w:val="20"/>
-                <w:szCs w:val="20"/>
-              </w:rPr>
-              <w:t xml:space="preserve">cymbal-ops: the same agent as step 3, plus the ADK web UI, packaged as a container by adk deploy.</w:t>
-            </w:r>
-          </w:p>
-          <w:p>
-            <w:pPr>
-              <w:spacing w:after="0" w:before="0" w:line="264"/>
-            </w:pPr>
-            <w:r>
-              <w:rPr>
-                <w:rFonts w:ascii="Calibri" w:cs="Calibri" w:eastAsia="Calibri" w:hAnsi="Calibri"/>
-                <w:b w:val="false"/>
-                <w:bCs w:val="false"/>
-                <w:i w:val="false"/>
-                <w:iCs w:val="false"/>
-                <w:sz w:val="20"/>
-                <w:szCs w:val="20"/>
-              </w:rPr>
-              <w:t xml:space="preserve">URL: where it answers on the internet.</w:t>
-            </w:r>
-          </w:p>
-          <w:p>
-            <w:pPr>
-              <w:spacing w:after="0" w:before="0" w:line="264"/>
-            </w:pPr>
-            <w:r>
-              <w:rPr>
-                <w:rFonts w:ascii="Calibri" w:cs="Calibri" w:eastAsia="Calibri" w:hAnsi="Calibri"/>
-                <w:b w:val="false"/>
-                <w:bCs w:val="false"/>
-                <w:i w:val="false"/>
-                <w:iCs w:val="false"/>
-                <w:sz w:val="20"/>
-                <w:szCs w:val="20"/>
-              </w:rPr>
-              <w:t xml:space="preserve">Require authentication: only signed-in people with access can reach it. The agent can run code and query BigQuery; an open URL on a slide is an invitation.</w:t>
-            </w:r>
-          </w:p>
-          <w:p>
-            <w:pPr>
-              <w:spacing w:after="0" w:before="0" w:line="264"/>
-            </w:pPr>
-            <w:r>
-              <w:rPr>
-                <w:rFonts w:ascii="Calibri" w:cs="Calibri" w:eastAsia="Calibri" w:hAnsi="Calibri"/>
-                <w:b w:val="false"/>
-                <w:bCs w:val="false"/>
-                <w:i w:val="false"/>
-                <w:iCs w:val="false"/>
-                <w:sz w:val="20"/>
-                <w:szCs w:val="20"/>
-              </w:rPr>
-              <w:t xml:space="preserve">Minimum instances 1: one copy always running, so the first request after a quiet hour doesn't wait for a cold start.</w:t>
-            </w:r>
-          </w:p>
-          <w:p>
-            <w:pPr>
-              <w:spacing w:after="0" w:before="0" w:line="264"/>
-            </w:pPr>
-            <w:r>
-              <w:rPr>
-                <w:rFonts w:ascii="Calibri" w:cs="Calibri" w:eastAsia="Calibri" w:hAnsi="Calibri"/>
-                <w:b w:val="false"/>
-                <w:bCs w:val="false"/>
-                <w:i w:val="false"/>
-                <w:iCs w:val="false"/>
-                <w:sz w:val="20"/>
-                <w:szCs w:val="20"/>
-              </w:rPr>
-              <w:t xml:space="preserve">Revision: each deploy is a new version; Cloud Run can roll back to any of them.</w:t>
+                <w:rFonts w:ascii="Consolas" w:cs="Consolas" w:eastAsia="Consolas" w:hAnsi="Consolas"/>
+                <w:b w:val="false"/>
+                <w:bCs w:val="false"/>
+                <w:i w:val="false"/>
+                <w:iCs w:val="false"/>
+                <w:sz w:val="19"/>
+                <w:szCs w:val="19"/>
+              </w:rPr>
+              <w:t xml:space="preserve">What is the smallest burn that gets CYMBAL-04 clear? Compare burning at 04:00 and at 12:00 UTC today, and tell me what each costs.</w:t>
+            </w:r>
+          </w:p>
+          <w:p>
+            <w:pPr>
+              <w:spacing w:after="0" w:before="60" w:line="264"/>
+            </w:pPr>
+            <w:r>
+              <w:rPr>
+                <w:rFonts w:ascii="Calibri" w:cs="Calibri" w:eastAsia="Calibri" w:hAnsi="Calibri"/>
+                <w:b/>
+                <w:bCs/>
+                <w:i w:val="false"/>
+                <w:iCs w:val="false"/>
+                <w:color w:val="2ECC71"/>
+                <w:sz w:val="19"/>
+                <w:szCs w:val="19"/>
+              </w:rPr>
+              <w:t xml:space="preserve">→ </w:t>
+            </w:r>
+            <w:r>
+              <w:rPr>
+                <w:rFonts w:ascii="Calibri" w:cs="Calibri" w:eastAsia="Calibri" w:hAnsi="Calibri"/>
+                <w:b w:val="false"/>
+                <w:bCs w:val="false"/>
+                <w:i w:val="false"/>
+                <w:iCs w:val="false"/>
+                <w:color w:val="9AA4B2"/>
+                <w:sz w:val="19"/>
+                <w:szCs w:val="19"/>
+              </w:rPr>
+              <w:t xml:space="preserve">04:00: 0.0181 m/s prograde → 3,036 m, 1.54 days of mission life. 12:00: 0.0343 m/s → 3,035 m, 2.92 days. About 30 s.</w:t>
             </w:r>
           </w:p>
         </w:tc>
@@ -7045,10 +6879,10 @@
           <w:tcPr>
             <w:tcW w:type="dxa" w:w="10080"/>
             <w:tcBorders>
-              <w:top w:val="single" w:color="B07CFF" w:sz="12"/>
-              <w:left w:val="single" w:color="B07CFF" w:sz="12"/>
-              <w:bottom w:val="single" w:color="B07CFF" w:sz="12"/>
-              <w:right w:val="single" w:color="B07CFF" w:sz="12"/>
+              <w:top w:val="single" w:color="2BB3B1" w:sz="12"/>
+              <w:left w:val="single" w:color="2BB3B1" w:sz="12"/>
+              <w:bottom w:val="single" w:color="2BB3B1" w:sz="12"/>
+              <w:right w:val="single" w:color="2BB3B1" w:sz="12"/>
             </w:tcBorders>
             <w:tcMar>
               <w:top w:type="dxa" w:w="80"/>
@@ -7068,11 +6902,11 @@
                 <w:bCs/>
                 <w:i w:val="false"/>
                 <w:iCs w:val="false"/>
-                <w:color w:val="B07CFF"/>
+                <w:color w:val="2BB3B1"/>
                 <w:sz w:val="18"/>
                 <w:szCs w:val="18"/>
               </w:rPr>
-              <w:t xml:space="preserve">DO</w:t>
+              <w:t xml:space="preserve">SAY</w:t>
             </w:r>
           </w:p>
           <w:p>
@@ -7084,43 +6918,12 @@
                 <w:rFonts w:ascii="Calibri" w:cs="Calibri" w:eastAsia="Calibri" w:hAnsi="Calibri"/>
                 <w:b w:val="false"/>
                 <w:bCs w:val="false"/>
-                <w:i w:val="false"/>
-                <w:iCs w:val="false"/>
+                <w:i/>
+                <w:iCs/>
                 <w:sz w:val="20"/>
                 <w:szCs w:val="20"/>
               </w:rPr>
-              <w:t xml:space="preserve">Point at the service URL and Authentication: Require authentication. Minimum instances 1 is in the revision's details; if it isn't quick to find, just say it.</w:t>
-            </w:r>
-          </w:p>
-          <w:p>
-            <w:pPr>
-              <w:spacing w:after="0" w:before="60" w:line="264"/>
-            </w:pPr>
-            <w:r>
-              <w:rPr>
-                <w:rFonts w:ascii="Calibri" w:cs="Calibri" w:eastAsia="Calibri" w:hAnsi="Calibri"/>
-                <w:b/>
-                <w:bCs/>
-                <w:i w:val="false"/>
-                <w:iCs w:val="false"/>
-                <w:color w:val="2ECC71"/>
-                <w:sz w:val="19"/>
-                <w:szCs w:val="19"/>
-              </w:rPr>
-              <w:t xml:space="preserve">→ </w:t>
-            </w:r>
-            <w:r>
-              <w:rPr>
-                <w:rFonts w:ascii="Calibri" w:cs="Calibri" w:eastAsia="Calibri" w:hAnsi="Calibri"/>
-                <w:b w:val="false"/>
-                <w:bCs w:val="false"/>
-                <w:i w:val="false"/>
-                <w:iCs w:val="false"/>
-                <w:color w:val="9AA4B2"/>
-                <w:sz w:val="19"/>
-                <w:szCs w:val="19"/>
-              </w:rPr>
-              <w:t xml:space="preserve">cymbal-ops, healthy, one instance kept warm.</w:t>
+              <w:t xml:space="preserve">While it works: assess_conjunction is our own Python tool; the physics runs in the Agent Runtime code sandbox; maneuver_cost prices it.</w:t>
             </w:r>
           </w:p>
         </w:tc>
@@ -7166,10 +6969,10 @@
           <w:tcPr>
             <w:tcW w:type="dxa" w:w="10080"/>
             <w:tcBorders>
-              <w:top w:val="single" w:color="2BB3B1" w:sz="12"/>
-              <w:left w:val="single" w:color="2BB3B1" w:sz="12"/>
-              <w:bottom w:val="single" w:color="2BB3B1" w:sz="12"/>
-              <w:right w:val="single" w:color="2BB3B1" w:sz="12"/>
+              <w:top w:val="single" w:color="B07CFF" w:sz="12"/>
+              <w:left w:val="single" w:color="B07CFF" w:sz="12"/>
+              <w:bottom w:val="single" w:color="B07CFF" w:sz="12"/>
+              <w:right w:val="single" w:color="B07CFF" w:sz="12"/>
             </w:tcBorders>
             <w:tcMar>
               <w:top w:type="dxa" w:w="80"/>
@@ -7189,11 +6992,11 @@
                 <w:bCs/>
                 <w:i w:val="false"/>
                 <w:iCs w:val="false"/>
-                <w:color w:val="2BB3B1"/>
+                <w:color w:val="B07CFF"/>
                 <w:sz w:val="18"/>
                 <w:szCs w:val="18"/>
               </w:rPr>
-              <w:t xml:space="preserve">SAY</w:t>
+              <w:t xml:space="preserve">DO</w:t>
             </w:r>
           </w:p>
           <w:p>
@@ -7205,12 +7008,43 @@
                 <w:rFonts w:ascii="Calibri" w:cs="Calibri" w:eastAsia="Calibri" w:hAnsi="Calibri"/>
                 <w:b w:val="false"/>
                 <w:bCs w:val="false"/>
-                <w:i/>
-                <w:iCs/>
+                <w:i w:val="false"/>
+                <w:iCs w:val="false"/>
                 <w:sz w:val="20"/>
                 <w:szCs w:val="20"/>
               </w:rPr>
-              <w:t xml:space="preserve">One command put it there: bash agent/deploy.sh. Your agent has to actually run somewhere too.</w:t>
+              <w:t xml:space="preserve">Events panel ▸ click the run_in_sandbox call</w:t>
+            </w:r>
+          </w:p>
+          <w:p>
+            <w:pPr>
+              <w:spacing w:after="0" w:before="60" w:line="264"/>
+            </w:pPr>
+            <w:r>
+              <w:rPr>
+                <w:rFonts w:ascii="Calibri" w:cs="Calibri" w:eastAsia="Calibri" w:hAnsi="Calibri"/>
+                <w:b/>
+                <w:bCs/>
+                <w:i w:val="false"/>
+                <w:iCs w:val="false"/>
+                <w:color w:val="2ECC71"/>
+                <w:sz w:val="19"/>
+                <w:szCs w:val="19"/>
+              </w:rPr>
+              <w:t xml:space="preserve">→ </w:t>
+            </w:r>
+            <w:r>
+              <w:rPr>
+                <w:rFonts w:ascii="Calibri" w:cs="Calibri" w:eastAsia="Calibri" w:hAnsi="Calibri"/>
+                <w:b w:val="false"/>
+                <w:bCs w:val="false"/>
+                <w:i w:val="false"/>
+                <w:iCs w:val="false"/>
+                <w:color w:val="9AA4B2"/>
+                <w:sz w:val="19"/>
+                <w:szCs w:val="19"/>
+              </w:rPr>
+              <w:t xml:space="preserve">Four lines of Python the model wrote, using our orbit_whatif module.</w:t>
             </w:r>
           </w:p>
         </w:tc>
@@ -7231,254 +7065,6 @@
           <w:szCs w:val="22"/>
         </w:rPr>
         <w:t xml:space="preserve"/>
-      </w:r>
-    </w:p>
-    <w:p>
-      <w:pPr>
-        <w:pStyle w:val="Heading3"/>
-        <w:keepNext/>
-        <w:spacing w:after="40" w:before="160"/>
-      </w:pPr>
-      <w:r>
-        <w:rPr>
-          <w:rFonts w:ascii="Calibri" w:cs="Calibri" w:eastAsia="Calibri" w:hAnsi="Calibri"/>
-          <w:b/>
-          <w:bCs/>
-          <w:i w:val="false"/>
-          <w:iCs w:val="false"/>
-          <w:color w:val="3D8BFF"/>
-          <w:sz w:val="22"/>
-          <w:szCs w:val="22"/>
-        </w:rPr>
-        <w:t xml:space="preserve">6. Show: the finished product   ·   TAB · CONSOLE · PORT 8080   ·   ~3 min</w:t>
-      </w:r>
-    </w:p>
-    <w:p>
-      <w:pPr>
-        <w:spacing w:after="80" w:before="40" w:line="264"/>
-      </w:pPr>
-      <w:r>
-        <w:rPr>
-          <w:rFonts w:ascii="Calibri" w:cs="Calibri" w:eastAsia="Calibri" w:hAnsi="Calibri"/>
-          <w:b/>
-          <w:bCs/>
-          <w:i w:val="false"/>
-          <w:iCs w:val="false"/>
-          <w:color w:val="2ECC71"/>
-          <w:sz w:val="20"/>
-          <w:szCs w:val="20"/>
-        </w:rPr>
-        <w:t xml:space="preserve">WHY  </w:t>
-      </w:r>
-      <w:r>
-        <w:rPr>
-          <w:rFonts w:ascii="Calibri" w:cs="Calibri" w:eastAsia="Calibri" w:hAnsi="Calibri"/>
-          <w:b w:val="false"/>
-          <w:bCs w:val="false"/>
-          <w:i w:val="false"/>
-          <w:iCs w:val="false"/>
-          <w:sz w:val="22"/>
-          <w:szCs w:val="22"/>
-        </w:rPr>
-        <w:t xml:space="preserve">What "an agent, not a chat box" looks like: plain code watches, the agent decides, a human approves. Two alerts, two opposite answers.</w:t>
-      </w:r>
-    </w:p>
-    <w:p>
-      <w:pPr>
-        <w:spacing w:after="80" w:before="40" w:line="264"/>
-      </w:pPr>
-      <w:r>
-        <w:rPr>
-          <w:rFonts w:ascii="Calibri" w:cs="Calibri" w:eastAsia="Calibri" w:hAnsi="Calibri"/>
-          <w:b/>
-          <w:bCs/>
-          <w:i w:val="false"/>
-          <w:iCs w:val="false"/>
-          <w:color w:val="2BB3B1"/>
-          <w:sz w:val="20"/>
-          <w:szCs w:val="20"/>
-        </w:rPr>
-        <w:t xml:space="preserve">SAY  </w:t>
-      </w:r>
-      <w:r>
-        <w:rPr>
-          <w:rFonts w:ascii="Calibri" w:cs="Calibri" w:eastAsia="Calibri" w:hAnsi="Calibri"/>
-          <w:b w:val="false"/>
-          <w:bCs w:val="false"/>
-          <w:i/>
-          <w:iCs/>
-          <w:sz w:val="22"/>
-          <w:szCs w:val="22"/>
-        </w:rPr>
-        <w:t xml:space="preserve">Last step, and it's what your judges will see: show it. This is the finished product. Time runs over the week; plain code, no AI, watches for anything that matters; and when something needs a decision, it wakes the agent.</w:t>
-      </w:r>
-    </w:p>
-    <w:p>
-      <w:pPr>
-        <w:spacing w:after="80" w:before="40" w:line="264"/>
-      </w:pPr>
-      <w:r>
-        <w:rPr>
-          <w:rFonts w:ascii="Calibri" w:cs="Calibri" w:eastAsia="Calibri" w:hAnsi="Calibri"/>
-          <w:b/>
-          <w:bCs/>
-          <w:i w:val="false"/>
-          <w:iCs w:val="false"/>
-          <w:color w:val="2BB3B1"/>
-          <w:sz w:val="20"/>
-          <w:szCs w:val="20"/>
-        </w:rPr>
-        <w:t xml:space="preserve">SAY  </w:t>
-      </w:r>
-      <w:r>
-        <w:rPr>
-          <w:rFonts w:ascii="Calibri" w:cs="Calibri" w:eastAsia="Calibri" w:hAnsi="Calibri"/>
-          <w:b w:val="false"/>
-          <w:bCs w:val="false"/>
-          <w:i/>
-          <w:iCs/>
-          <w:sz w:val="22"/>
-          <w:szCs w:val="22"/>
-        </w:rPr>
-        <w:t xml:space="preserve">Eighteen hours out, when the tracking is as good as it will get and there's still time to burn cheaply, the agent runs the playbook you just watched: assess, size the burn at two times, price it, write it up. Then it waits for a human. I approve.</w:t>
-      </w:r>
-    </w:p>
-    <w:p>
-      <w:pPr>
-        <w:spacing w:after="80" w:before="40" w:line="264"/>
-      </w:pPr>
-      <w:r>
-        <w:rPr>
-          <w:rFonts w:ascii="Calibri" w:cs="Calibri" w:eastAsia="Calibri" w:hAnsi="Calibri"/>
-          <w:b/>
-          <w:bCs/>
-          <w:i w:val="false"/>
-          <w:iCs w:val="false"/>
-          <w:color w:val="2BB3B1"/>
-          <w:sz w:val="20"/>
-          <w:szCs w:val="20"/>
-        </w:rPr>
-        <w:t xml:space="preserve">SAY  </w:t>
-      </w:r>
-      <w:r>
-        <w:rPr>
-          <w:rFonts w:ascii="Calibri" w:cs="Calibri" w:eastAsia="Calibri" w:hAnsi="Calibri"/>
-          <w:b w:val="false"/>
-          <w:bCs w:val="false"/>
-          <w:i/>
-          <w:iCs/>
-          <w:sz w:val="22"/>
-          <w:szCs w:val="22"/>
-        </w:rPr>
-        <w:t xml:space="preserve">There it goes. Without the burn, 301 metres. With it, three kilometres, for a day and a half of the satellite's life.</w:t>
-      </w:r>
-    </w:p>
-    <w:p>
-      <w:pPr>
-        <w:spacing w:after="80" w:before="40" w:line="264"/>
-      </w:pPr>
-      <w:r>
-        <w:rPr>
-          <w:rFonts w:ascii="Calibri" w:cs="Calibri" w:eastAsia="Calibri" w:hAnsi="Calibri"/>
-          <w:b/>
-          <w:bCs/>
-          <w:i w:val="false"/>
-          <w:iCs w:val="false"/>
-          <w:color w:val="2BB3B1"/>
-          <w:sz w:val="20"/>
-          <w:szCs w:val="20"/>
-        </w:rPr>
-        <w:t xml:space="preserve">SAY  </w:t>
-      </w:r>
-      <w:r>
-        <w:rPr>
-          <w:rFonts w:ascii="Calibri" w:cs="Calibri" w:eastAsia="Calibri" w:hAnsi="Calibri"/>
-          <w:b w:val="false"/>
-          <w:bCs w:val="false"/>
-          <w:i/>
-          <w:iCs/>
-          <w:sz w:val="22"/>
-          <w:szCs w:val="22"/>
-        </w:rPr>
-        <w:t xml:space="preserve">Now the other alert. On Friday this rocket body was stale: the tracking was a week old, so the agent asked for fresh tracking instead of spending fuel. Tuesday it arrives, and the right answer is: do nothing. Same agent, opposite answer. That's judgment.</w:t>
-      </w:r>
-    </w:p>
-    <w:p>
-      <w:pPr>
-        <w:spacing w:after="80" w:before="40" w:line="264"/>
-      </w:pPr>
-      <w:r>
-        <w:rPr>
-          <w:rFonts w:ascii="Calibri" w:cs="Calibri" w:eastAsia="Calibri" w:hAnsi="Calibri"/>
-          <w:b/>
-          <w:bCs/>
-          <w:i w:val="false"/>
-          <w:iCs w:val="false"/>
-          <w:color w:val="2BB3B1"/>
-          <w:sz w:val="20"/>
-          <w:szCs w:val="20"/>
-        </w:rPr>
-        <w:t xml:space="preserve">SAY  </w:t>
-      </w:r>
-      <w:r>
-        <w:rPr>
-          <w:rFonts w:ascii="Calibri" w:cs="Calibri" w:eastAsia="Calibri" w:hAnsi="Calibri"/>
-          <w:b w:val="false"/>
-          <w:bCs w:val="false"/>
-          <w:i/>
-          <w:iCs/>
-          <w:sz w:val="22"/>
-          <w:szCs w:val="22"/>
-        </w:rPr>
-        <w:t xml:space="preserve">The cards you just saw are a recording of a real run of the agent, played back so a demo on conference wifi runs the same every time. That's a trick worth stealing for your own Show step.</w:t>
-      </w:r>
-    </w:p>
-    <w:p>
-      <w:pPr>
-        <w:spacing w:after="80" w:before="40" w:line="264"/>
-      </w:pPr>
-      <w:r>
-        <w:rPr>
-          <w:rFonts w:ascii="Calibri" w:cs="Calibri" w:eastAsia="Calibri" w:hAnsi="Calibri"/>
-          <w:b/>
-          <w:bCs/>
-          <w:i w:val="false"/>
-          <w:iCs w:val="false"/>
-          <w:color w:val="B07CFF"/>
-          <w:sz w:val="20"/>
-          <w:szCs w:val="20"/>
-        </w:rPr>
-        <w:t xml:space="preserve">NEEDS  </w:t>
-      </w:r>
-      <w:r>
-        <w:rPr>
-          <w:rFonts w:ascii="Calibri" w:cs="Calibri" w:eastAsia="Calibri" w:hAnsi="Calibri"/>
-          <w:b w:val="false"/>
-          <w:bCs w:val="false"/>
-          <w:i w:val="false"/>
-          <w:iCs w:val="false"/>
-          <w:sz w:val="20"/>
-          <w:szCs w:val="20"/>
-        </w:rPr>
-        <w:t xml:space="preserve">Header says REPLAY. Clock Fri 25 Sep 01:00:00 UTC. If not: ⋯ ▸ Restart the week.</w:t>
-      </w:r>
-    </w:p>
-    <w:p>
-      <w:pPr>
-        <w:spacing w:after="80" w:before="40" w:line="264"/>
-      </w:pPr>
-      <w:r>
-        <w:rPr>
-          <w:rFonts w:ascii="Calibri" w:cs="Calibri" w:eastAsia="Calibri" w:hAnsi="Calibri"/>
-          <w:b w:val="false"/>
-          <w:bCs w:val="false"/>
-          <w:i w:val="false"/>
-          <w:iCs w:val="false"/>
-          <w:color w:val="9AA4B2"/>
-          <w:sz w:val="20"/>
-          <w:szCs w:val="20"/>
-        </w:rPr>
-        <w:t xml:space="preserve">Press Skip to next for each step. The clock stops by itself when the agent is woken and waits for Approve.</w:t>
       </w:r>
     </w:p>
     <w:tbl>
@@ -7504,10 +7090,10 @@
           <w:tcPr>
             <w:tcW w:type="dxa" w:w="10080"/>
             <w:tcBorders>
-              <w:top w:val="single" w:color="B07CFF" w:sz="12"/>
-              <w:left w:val="single" w:color="B07CFF" w:sz="12"/>
-              <w:bottom w:val="single" w:color="B07CFF" w:sz="12"/>
-              <w:right w:val="single" w:color="B07CFF" w:sz="12"/>
+              <w:top w:val="single" w:color="2ECC71" w:sz="12"/>
+              <w:left w:val="single" w:color="2ECC71" w:sz="12"/>
+              <w:bottom w:val="single" w:color="2ECC71" w:sz="12"/>
+              <w:right w:val="single" w:color="2ECC71" w:sz="12"/>
             </w:tcBorders>
             <w:tcMar>
               <w:top w:type="dxa" w:w="80"/>
@@ -7527,11 +7113,11 @@
                 <w:bCs/>
                 <w:i w:val="false"/>
                 <w:iCs w:val="false"/>
-                <w:color w:val="B07CFF"/>
+                <w:color w:val="2ECC71"/>
                 <w:sz w:val="18"/>
                 <w:szCs w:val="18"/>
               </w:rPr>
-              <w:t xml:space="preserve">DO</w:t>
+              <w:t xml:space="preserve">IF YOUR TEAM HAS…</w:t>
             </w:r>
           </w:p>
           <w:p>
@@ -7548,38 +7134,7 @@
                 <w:sz w:val="20"/>
                 <w:szCs w:val="20"/>
               </w:rPr>
-              <w:t xml:space="preserve">Skip to next</w:t>
-            </w:r>
-          </w:p>
-          <w:p>
-            <w:pPr>
-              <w:spacing w:after="0" w:before="60" w:line="264"/>
-            </w:pPr>
-            <w:r>
-              <w:rPr>
-                <w:rFonts w:ascii="Calibri" w:cs="Calibri" w:eastAsia="Calibri" w:hAnsi="Calibri"/>
-                <w:b/>
-                <w:bCs/>
-                <w:i w:val="false"/>
-                <w:iCs w:val="false"/>
-                <w:color w:val="2ECC71"/>
-                <w:sz w:val="19"/>
-                <w:szCs w:val="19"/>
-              </w:rPr>
-              <w:t xml:space="preserve">→ </w:t>
-            </w:r>
-            <w:r>
-              <w:rPr>
-                <w:rFonts w:ascii="Calibri" w:cs="Calibri" w:eastAsia="Calibri" w:hAnsi="Calibri"/>
-                <w:b w:val="false"/>
-                <w:bCs w:val="false"/>
-                <w:i w:val="false"/>
-                <w:iCs w:val="false"/>
-                <w:color w:val="9AA4B2"/>
-                <w:sz w:val="19"/>
-                <w:szCs w:val="19"/>
-              </w:rPr>
-              <w:t xml:space="preserve">CYMBAL-01's pass at real time: the amber dot slides by at 382 m. "Too late to act" was already on the desk.</w:t>
+              <w:t xml:space="preserve">Someone who knows the problem domain: they decide what the custom tool judges. Your challenge's differentiator is the one thing judges will look for; don't leave it for last.</w:t>
             </w:r>
           </w:p>
         </w:tc>
@@ -7600,6 +7155,206 @@
           <w:szCs w:val="22"/>
         </w:rPr>
         <w:t xml:space="preserve"/>
+      </w:r>
+    </w:p>
+    <w:p>
+      <w:pPr>
+        <w:spacing w:after="80" w:before="40" w:line="264"/>
+      </w:pPr>
+      <w:r>
+        <w:rPr>
+          <w:rFonts w:ascii="Calibri" w:cs="Calibri" w:eastAsia="Calibri" w:hAnsi="Calibri"/>
+          <w:b/>
+          <w:bCs/>
+          <w:i w:val="false"/>
+          <w:iCs w:val="false"/>
+          <w:color w:val="FF5C5C"/>
+          <w:sz w:val="20"/>
+          <w:szCs w:val="20"/>
+        </w:rPr>
+        <w:t xml:space="preserve">GOTCHA  </w:t>
+      </w:r>
+      <w:r>
+        <w:rPr>
+          <w:rFonts w:ascii="Calibri" w:cs="Calibri" w:eastAsia="Calibri" w:hAnsi="Calibri"/>
+          <w:b w:val="false"/>
+          <w:bCs w:val="false"/>
+          <w:i w:val="false"/>
+          <w:iCs w:val="false"/>
+          <w:sz w:val="20"/>
+          <w:szCs w:val="20"/>
+        </w:rPr>
+        <w:t xml:space="preserve">Past a minute: say "the console will show us the same answer" and move to step 5. The console replays a real run of this question.</w:t>
+      </w:r>
+    </w:p>
+    <w:p>
+      <w:pPr>
+        <w:pStyle w:val="Heading3"/>
+        <w:keepNext/>
+        <w:spacing w:after="40" w:before="160"/>
+      </w:pPr>
+      <w:r>
+        <w:rPr>
+          <w:rFonts w:ascii="Calibri" w:cs="Calibri" w:eastAsia="Calibri" w:hAnsi="Calibri"/>
+          <w:b/>
+          <w:bCs/>
+          <w:i w:val="false"/>
+          <w:iCs w:val="false"/>
+          <w:color w:val="3D8BFF"/>
+          <w:sz w:val="22"/>
+          <w:szCs w:val="22"/>
+        </w:rPr>
+        <w:t xml:space="preserve">5. Deploy: the same agent, running in the cloud   ·   TAB · GOOGLE CLOUD CONSOLE · CLOUD RUN   ·   ~0.5 min</w:t>
+      </w:r>
+    </w:p>
+    <w:p>
+      <w:pPr>
+        <w:spacing w:after="80" w:before="40" w:line="264"/>
+      </w:pPr>
+      <w:r>
+        <w:rPr>
+          <w:rFonts w:ascii="Calibri" w:cs="Calibri" w:eastAsia="Calibri" w:hAnsi="Calibri"/>
+          <w:b/>
+          <w:bCs/>
+          <w:i w:val="false"/>
+          <w:iCs w:val="false"/>
+          <w:color w:val="2ECC71"/>
+          <w:sz w:val="20"/>
+          <w:szCs w:val="20"/>
+        </w:rPr>
+        <w:t xml:space="preserve">WHY  </w:t>
+      </w:r>
+      <w:r>
+        <w:rPr>
+          <w:rFonts w:ascii="Calibri" w:cs="Calibri" w:eastAsia="Calibri" w:hAnsi="Calibri"/>
+          <w:b w:val="false"/>
+          <w:bCs w:val="false"/>
+          <w:i w:val="false"/>
+          <w:iCs w:val="false"/>
+          <w:sz w:val="22"/>
+          <w:szCs w:val="22"/>
+        </w:rPr>
+        <w:t xml:space="preserve">Deploy is a required step on their path; seeing it is one command makes it less scary.</w:t>
+      </w:r>
+    </w:p>
+    <w:p>
+      <w:pPr>
+        <w:spacing w:after="80" w:before="40" w:line="264"/>
+      </w:pPr>
+      <w:r>
+        <w:rPr>
+          <w:rFonts w:ascii="Calibri" w:cs="Calibri" w:eastAsia="Calibri" w:hAnsi="Calibri"/>
+          <w:b/>
+          <w:bCs/>
+          <w:i w:val="false"/>
+          <w:iCs w:val="false"/>
+          <w:color w:val="2BB3B1"/>
+          <w:sz w:val="20"/>
+          <w:szCs w:val="20"/>
+        </w:rPr>
+        <w:t xml:space="preserve">SAY  </w:t>
+      </w:r>
+      <w:r>
+        <w:rPr>
+          <w:rFonts w:ascii="Calibri" w:cs="Calibri" w:eastAsia="Calibri" w:hAnsi="Calibri"/>
+          <w:b w:val="false"/>
+          <w:bCs w:val="false"/>
+          <w:i/>
+          <w:iCs/>
+          <w:sz w:val="22"/>
+          <w:szCs w:val="22"/>
+        </w:rPr>
+        <w:t xml:space="preserve">Fourth: deploy. This is Cloud Run: Google runs our container, we manage no servers. It's the same agent you just watched, on a real URL, one command.</w:t>
+      </w:r>
+    </w:p>
+    <w:p>
+      <w:pPr>
+        <w:spacing w:after="80" w:before="40" w:line="264"/>
+      </w:pPr>
+      <w:r>
+        <w:rPr>
+          <w:rFonts w:ascii="Calibri" w:cs="Calibri" w:eastAsia="Calibri" w:hAnsi="Calibri"/>
+          <w:b/>
+          <w:bCs/>
+          <w:i w:val="false"/>
+          <w:iCs w:val="false"/>
+          <w:color w:val="2BB3B1"/>
+          <w:sz w:val="20"/>
+          <w:szCs w:val="20"/>
+        </w:rPr>
+        <w:t xml:space="preserve">SAY  </w:t>
+      </w:r>
+      <w:r>
+        <w:rPr>
+          <w:rFonts w:ascii="Calibri" w:cs="Calibri" w:eastAsia="Calibri" w:hAnsi="Calibri"/>
+          <w:b w:val="false"/>
+          <w:bCs w:val="false"/>
+          <w:i/>
+          <w:iCs/>
+          <w:sz w:val="22"/>
+          <w:szCs w:val="22"/>
+        </w:rPr>
+        <w:t xml:space="preserve">Two settings worth stealing. Authentication required, because this agent can run code and query our data. And one instance kept warm, because the first request after a quiet hour is usually the one you make on stage. Yours goes to Cloud Run or Agent Runtime, your choice.</w:t>
+      </w:r>
+    </w:p>
+    <w:p>
+      <w:pPr>
+        <w:spacing w:after="80" w:before="40" w:line="264"/>
+      </w:pPr>
+      <w:r>
+        <w:rPr>
+          <w:rFonts w:ascii="Calibri" w:cs="Calibri" w:eastAsia="Calibri" w:hAnsi="Calibri"/>
+          <w:b/>
+          <w:bCs/>
+          <w:i w:val="false"/>
+          <w:iCs w:val="false"/>
+          <w:color w:val="2BB3B1"/>
+          <w:sz w:val="20"/>
+          <w:szCs w:val="20"/>
+        </w:rPr>
+        <w:t xml:space="preserve">SAY  </w:t>
+      </w:r>
+      <w:r>
+        <w:rPr>
+          <w:rFonts w:ascii="Calibri" w:cs="Calibri" w:eastAsia="Calibri" w:hAnsi="Calibri"/>
+          <w:b w:val="false"/>
+          <w:bCs w:val="false"/>
+          <w:i/>
+          <w:iCs/>
+          <w:sz w:val="22"/>
+          <w:szCs w:val="22"/>
+        </w:rPr>
+        <w:t xml:space="preserve">One honest note: what you watched a minute ago ran in Cloud Shell, not on Cloud Run. Same code, same model, same data. With the clock running, local keeps things simple; in real life, at some point, you'd run your tests against the deployed copy too. Deploy early anyway, so your front end isn't waiting on you.</w:t>
+      </w:r>
+    </w:p>
+    <w:p>
+      <w:pPr>
+        <w:spacing w:after="80" w:before="40" w:line="264"/>
+      </w:pPr>
+      <w:r>
+        <w:rPr>
+          <w:rFonts w:ascii="Calibri" w:cs="Calibri" w:eastAsia="Calibri" w:hAnsi="Calibri"/>
+          <w:b/>
+          <w:bCs/>
+          <w:i w:val="false"/>
+          <w:iCs w:val="false"/>
+          <w:color w:val="B07CFF"/>
+          <w:sz w:val="20"/>
+          <w:szCs w:val="20"/>
+        </w:rPr>
+        <w:t xml:space="preserve">NEEDS  </w:t>
+      </w:r>
+      <w:r>
+        <w:rPr>
+          <w:rFonts w:ascii="Calibri" w:cs="Calibri" w:eastAsia="Calibri" w:hAnsi="Calibri"/>
+          <w:b w:val="false"/>
+          <w:bCs w:val="false"/>
+          <w:i w:val="false"/>
+          <w:iCs w:val="false"/>
+          <w:sz w:val="20"/>
+          <w:szCs w:val="20"/>
+        </w:rPr>
+        <w:t xml:space="preserve">Navigation menu ▸ Cloud Run ▸ cymbal-ops, already open.</w:t>
       </w:r>
     </w:p>
     <w:tbl>
@@ -7625,10 +7380,10 @@
           <w:tcPr>
             <w:tcW w:type="dxa" w:w="10080"/>
             <w:tcBorders>
-              <w:top w:val="single" w:color="B07CFF" w:sz="12"/>
-              <w:left w:val="single" w:color="B07CFF" w:sz="12"/>
-              <w:bottom w:val="single" w:color="B07CFF" w:sz="12"/>
-              <w:right w:val="single" w:color="B07CFF" w:sz="12"/>
+              <w:top w:val="single" w:color="9AA4B2" w:sz="12"/>
+              <w:left w:val="single" w:color="9AA4B2" w:sz="12"/>
+              <w:bottom w:val="single" w:color="9AA4B2" w:sz="12"/>
+              <w:right w:val="single" w:color="9AA4B2" w:sz="12"/>
             </w:tcBorders>
             <w:tcMar>
               <w:top w:type="dxa" w:w="80"/>
@@ -7648,11 +7403,11 @@
                 <w:bCs/>
                 <w:i w:val="false"/>
                 <w:iCs w:val="false"/>
-                <w:color w:val="B07CFF"/>
+                <w:color w:val="9AA4B2"/>
                 <w:sz w:val="18"/>
                 <w:szCs w:val="18"/>
               </w:rPr>
-              <w:t xml:space="preserve">DO</w:t>
+              <w:t xml:space="preserve">WHAT THEY'RE LOOKING AT</w:t>
             </w:r>
           </w:p>
           <w:p>
@@ -7669,38 +7424,92 @@
                 <w:sz w:val="20"/>
                 <w:szCs w:val="20"/>
               </w:rPr>
-              <w:t xml:space="preserve">Skip to next</w:t>
-            </w:r>
-          </w:p>
-          <w:p>
-            <w:pPr>
-              <w:spacing w:after="0" w:before="60" w:line="264"/>
-            </w:pPr>
-            <w:r>
-              <w:rPr>
-                <w:rFonts w:ascii="Calibri" w:cs="Calibri" w:eastAsia="Calibri" w:hAnsi="Calibri"/>
-                <w:b/>
-                <w:bCs/>
-                <w:i w:val="false"/>
-                <w:iCs w:val="false"/>
-                <w:color w:val="2ECC71"/>
-                <w:sz w:val="19"/>
-                <w:szCs w:val="19"/>
-              </w:rPr>
-              <w:t xml:space="preserve">→ </w:t>
-            </w:r>
-            <w:r>
-              <w:rPr>
-                <w:rFonts w:ascii="Calibri" w:cs="Calibri" w:eastAsia="Calibri" w:hAnsi="Calibri"/>
-                <w:b w:val="false"/>
-                <w:bCs w:val="false"/>
-                <w:i w:val="false"/>
-                <w:iCs w:val="false"/>
-                <w:color w:val="9AA4B2"/>
-                <w:sz w:val="19"/>
-                <w:szCs w:val="19"/>
-              </w:rPr>
-              <w:t xml:space="preserve">Decision needed: CYMBAL-04. The agent's steps tick in, then YOUR CALL: MANEUVER, 0.0181 m/s prograde at 04:00 → 3,036 m, 1.54 days.</w:t>
+              <w:t xml:space="preserve">Cloud Run: Google runs your container for you, no servers to manage.</w:t>
+            </w:r>
+          </w:p>
+          <w:p>
+            <w:pPr>
+              <w:spacing w:after="0" w:before="0" w:line="264"/>
+            </w:pPr>
+            <w:r>
+              <w:rPr>
+                <w:rFonts w:ascii="Calibri" w:cs="Calibri" w:eastAsia="Calibri" w:hAnsi="Calibri"/>
+                <w:b w:val="false"/>
+                <w:bCs w:val="false"/>
+                <w:i w:val="false"/>
+                <w:iCs w:val="false"/>
+                <w:sz w:val="20"/>
+                <w:szCs w:val="20"/>
+              </w:rPr>
+              <w:t xml:space="preserve">cymbal-ops: the same agent as step 3, plus the ADK web UI, packaged as a container by adk deploy.</w:t>
+            </w:r>
+          </w:p>
+          <w:p>
+            <w:pPr>
+              <w:spacing w:after="0" w:before="0" w:line="264"/>
+            </w:pPr>
+            <w:r>
+              <w:rPr>
+                <w:rFonts w:ascii="Calibri" w:cs="Calibri" w:eastAsia="Calibri" w:hAnsi="Calibri"/>
+                <w:b w:val="false"/>
+                <w:bCs w:val="false"/>
+                <w:i w:val="false"/>
+                <w:iCs w:val="false"/>
+                <w:sz w:val="20"/>
+                <w:szCs w:val="20"/>
+              </w:rPr>
+              <w:t xml:space="preserve">URL: where it answers on the internet.</w:t>
+            </w:r>
+          </w:p>
+          <w:p>
+            <w:pPr>
+              <w:spacing w:after="0" w:before="0" w:line="264"/>
+            </w:pPr>
+            <w:r>
+              <w:rPr>
+                <w:rFonts w:ascii="Calibri" w:cs="Calibri" w:eastAsia="Calibri" w:hAnsi="Calibri"/>
+                <w:b w:val="false"/>
+                <w:bCs w:val="false"/>
+                <w:i w:val="false"/>
+                <w:iCs w:val="false"/>
+                <w:sz w:val="20"/>
+                <w:szCs w:val="20"/>
+              </w:rPr>
+              <w:t xml:space="preserve">Require authentication: only signed-in people with access can reach it. The agent can run code and query BigQuery; an open URL on a slide is an invitation.</w:t>
+            </w:r>
+          </w:p>
+          <w:p>
+            <w:pPr>
+              <w:spacing w:after="0" w:before="0" w:line="264"/>
+            </w:pPr>
+            <w:r>
+              <w:rPr>
+                <w:rFonts w:ascii="Calibri" w:cs="Calibri" w:eastAsia="Calibri" w:hAnsi="Calibri"/>
+                <w:b w:val="false"/>
+                <w:bCs w:val="false"/>
+                <w:i w:val="false"/>
+                <w:iCs w:val="false"/>
+                <w:sz w:val="20"/>
+                <w:szCs w:val="20"/>
+              </w:rPr>
+              <w:t xml:space="preserve">Minimum instances 1: one copy always running, so the first request after a quiet hour doesn't wait for a cold start.</w:t>
+            </w:r>
+          </w:p>
+          <w:p>
+            <w:pPr>
+              <w:spacing w:after="0" w:before="0" w:line="264"/>
+            </w:pPr>
+            <w:r>
+              <w:rPr>
+                <w:rFonts w:ascii="Calibri" w:cs="Calibri" w:eastAsia="Calibri" w:hAnsi="Calibri"/>
+                <w:b w:val="false"/>
+                <w:bCs w:val="false"/>
+                <w:i w:val="false"/>
+                <w:iCs w:val="false"/>
+                <w:sz w:val="20"/>
+                <w:szCs w:val="20"/>
+              </w:rPr>
+              <w:t xml:space="preserve">Revision: each deploy is a new version; Cloud Run can roll back to any of them.</w:t>
             </w:r>
           </w:p>
         </w:tc>
@@ -7746,10 +7555,10 @@
           <w:tcPr>
             <w:tcW w:type="dxa" w:w="10080"/>
             <w:tcBorders>
-              <w:top w:val="single" w:color="9AA4B2" w:sz="12"/>
-              <w:left w:val="single" w:color="9AA4B2" w:sz="12"/>
-              <w:bottom w:val="single" w:color="9AA4B2" w:sz="12"/>
-              <w:right w:val="single" w:color="9AA4B2" w:sz="12"/>
+              <w:top w:val="single" w:color="B07CFF" w:sz="12"/>
+              <w:left w:val="single" w:color="B07CFF" w:sz="12"/>
+              <w:bottom w:val="single" w:color="B07CFF" w:sz="12"/>
+              <w:right w:val="single" w:color="B07CFF" w:sz="12"/>
             </w:tcBorders>
             <w:tcMar>
               <w:top w:type="dxa" w:w="80"/>
@@ -7769,11 +7578,11 @@
                 <w:bCs/>
                 <w:i w:val="false"/>
                 <w:iCs w:val="false"/>
-                <w:color w:val="9AA4B2"/>
+                <w:color w:val="B07CFF"/>
                 <w:sz w:val="18"/>
                 <w:szCs w:val="18"/>
               </w:rPr>
-              <w:t xml:space="preserve">THE PURPLE AGENT CARD, TOP TO BOTTOM</w:t>
+              <w:t xml:space="preserve">DO</w:t>
             </w:r>
           </w:p>
           <w:p>
@@ -7790,92 +7599,38 @@
                 <w:sz w:val="20"/>
                 <w:szCs w:val="20"/>
               </w:rPr>
-              <w:t xml:space="preserve">Watcher's line: why it woke the agent. 18 h out (tracking as good as it gets, still time to burn cheaply), worst case 1 in 10,000, tracking fresh.</w:t>
-            </w:r>
-          </w:p>
-          <w:p>
-            <w:pPr>
-              <w:spacing w:after="0" w:before="0" w:line="264"/>
-            </w:pPr>
-            <w:r>
-              <w:rPr>
-                <w:rFonts w:ascii="Calibri" w:cs="Calibri" w:eastAsia="Calibri" w:hAnsi="Calibri"/>
-                <w:b w:val="false"/>
-                <w:bCs w:val="false"/>
-                <w:i w:val="false"/>
-                <w:iCs w:val="false"/>
-                <w:sz w:val="20"/>
-                <w:szCs w:val="20"/>
-              </w:rPr>
-              <w:t xml:space="preserve">assess_conjunction (our tool): the facts from BigQuery; is the tracking fresh, can the debris dodge (no); stages the case in the sandbox.</w:t>
-            </w:r>
-          </w:p>
-          <w:p>
-            <w:pPr>
-              <w:spacing w:after="0" w:before="0" w:line="264"/>
-            </w:pPr>
-            <w:r>
-              <w:rPr>
-                <w:rFonts w:ascii="Calibri" w:cs="Calibri" w:eastAsia="Calibri" w:hAnsi="Calibri"/>
-                <w:b w:val="false"/>
-                <w:bCs w:val="false"/>
-                <w:i w:val="false"/>
-                <w:iCs w:val="false"/>
-                <w:sz w:val="20"/>
-                <w:szCs w:val="20"/>
-              </w:rPr>
-              <w:t xml:space="preserve">run_in_sandbox: the agent's own Python, run in the Agent Runtime code sandbox. Sizes the burn at 04:00 (0.0181 m/s) and noon (0.0343 m/s).</w:t>
-            </w:r>
-          </w:p>
-          <w:p>
-            <w:pPr>
-              <w:spacing w:after="0" w:before="0" w:line="264"/>
-            </w:pPr>
-            <w:r>
-              <w:rPr>
-                <w:rFonts w:ascii="Calibri" w:cs="Calibri" w:eastAsia="Calibri" w:hAnsi="Calibri"/>
-                <w:b w:val="false"/>
-                <w:bCs w:val="false"/>
-                <w:i w:val="false"/>
-                <w:iCs w:val="false"/>
-                <w:sz w:val="20"/>
-                <w:szCs w:val="20"/>
-              </w:rPr>
-              <w:t xml:space="preserve">maneuver_cost ×2: each burn in days of satellite life: 1.54 vs 2.92.</w:t>
-            </w:r>
-          </w:p>
-          <w:p>
-            <w:pPr>
-              <w:spacing w:after="0" w:before="0" w:line="264"/>
-            </w:pPr>
-            <w:r>
-              <w:rPr>
-                <w:rFonts w:ascii="Calibri" w:cs="Calibri" w:eastAsia="Calibri" w:hAnsi="Calibri"/>
-                <w:b w:val="false"/>
-                <w:bCs w:val="false"/>
-                <w:i w:val="false"/>
-                <w:iCs w:val="false"/>
-                <w:sz w:val="20"/>
-                <w:szCs w:val="20"/>
-              </w:rPr>
-              <w:t xml:space="preserve">build_assessment: writes it up, re-reading every fact from BigQuery.</w:t>
-            </w:r>
-          </w:p>
-          <w:p>
-            <w:pPr>
-              <w:spacing w:after="0" w:before="0" w:line="264"/>
-            </w:pPr>
-            <w:r>
-              <w:rPr>
-                <w:rFonts w:ascii="Calibri" w:cs="Calibri" w:eastAsia="Calibri" w:hAnsi="Calibri"/>
-                <w:b w:val="false"/>
-                <w:bCs w:val="false"/>
-                <w:i w:val="false"/>
-                <w:iCs w:val="false"/>
-                <w:sz w:val="20"/>
-                <w:szCs w:val="20"/>
-              </w:rPr>
-              <w:t xml:space="preserve">Then: the agent's words · the bold summary · the write-up (click to open) · Approve / Hold · how long it took (about 23 s).</w:t>
+              <w:t xml:space="preserve">Point at the service URL and Authentication: Require authentication. Minimum instances 1 is in the revision's details; if it isn't quick to find, just say it.</w:t>
+            </w:r>
+          </w:p>
+          <w:p>
+            <w:pPr>
+              <w:spacing w:after="0" w:before="60" w:line="264"/>
+            </w:pPr>
+            <w:r>
+              <w:rPr>
+                <w:rFonts w:ascii="Calibri" w:cs="Calibri" w:eastAsia="Calibri" w:hAnsi="Calibri"/>
+                <w:b/>
+                <w:bCs/>
+                <w:i w:val="false"/>
+                <w:iCs w:val="false"/>
+                <w:color w:val="2ECC71"/>
+                <w:sz w:val="19"/>
+                <w:szCs w:val="19"/>
+              </w:rPr>
+              <w:t xml:space="preserve">→ </w:t>
+            </w:r>
+            <w:r>
+              <w:rPr>
+                <w:rFonts w:ascii="Calibri" w:cs="Calibri" w:eastAsia="Calibri" w:hAnsi="Calibri"/>
+                <w:b w:val="false"/>
+                <w:bCs w:val="false"/>
+                <w:i w:val="false"/>
+                <w:iCs w:val="false"/>
+                <w:color w:val="9AA4B2"/>
+                <w:sz w:val="19"/>
+                <w:szCs w:val="19"/>
+              </w:rPr>
+              <w:t xml:space="preserve">cymbal-ops, healthy, one instance kept warm.</w:t>
             </w:r>
           </w:p>
         </w:tc>
@@ -7921,10 +7676,10 @@
           <w:tcPr>
             <w:tcW w:type="dxa" w:w="10080"/>
             <w:tcBorders>
-              <w:top w:val="single" w:color="B07CFF" w:sz="12"/>
-              <w:left w:val="single" w:color="B07CFF" w:sz="12"/>
-              <w:bottom w:val="single" w:color="B07CFF" w:sz="12"/>
-              <w:right w:val="single" w:color="B07CFF" w:sz="12"/>
+              <w:top w:val="single" w:color="2BB3B1" w:sz="12"/>
+              <w:left w:val="single" w:color="2BB3B1" w:sz="12"/>
+              <w:bottom w:val="single" w:color="2BB3B1" w:sz="12"/>
+              <w:right w:val="single" w:color="2BB3B1" w:sz="12"/>
             </w:tcBorders>
             <w:tcMar>
               <w:top w:type="dxa" w:w="80"/>
@@ -7944,11 +7699,11 @@
                 <w:bCs/>
                 <w:i w:val="false"/>
                 <w:iCs w:val="false"/>
-                <w:color w:val="B07CFF"/>
+                <w:color w:val="2BB3B1"/>
                 <w:sz w:val="18"/>
                 <w:szCs w:val="18"/>
               </w:rPr>
-              <w:t xml:space="preserve">DO</w:t>
+              <w:t xml:space="preserve">SAY</w:t>
             </w:r>
           </w:p>
           <w:p>
@@ -7960,43 +7715,12 @@
                 <w:rFonts w:ascii="Calibri" w:cs="Calibri" w:eastAsia="Calibri" w:hAnsi="Calibri"/>
                 <w:b w:val="false"/>
                 <w:bCs w:val="false"/>
-                <w:i w:val="false"/>
-                <w:iCs w:val="false"/>
+                <w:i/>
+                <w:iCs/>
                 <w:sz w:val="20"/>
                 <w:szCs w:val="20"/>
               </w:rPr>
-              <w:t xml:space="preserve">Approve</w:t>
-            </w:r>
-          </w:p>
-          <w:p>
-            <w:pPr>
-              <w:spacing w:after="0" w:before="60" w:line="264"/>
-            </w:pPr>
-            <w:r>
-              <w:rPr>
-                <w:rFonts w:ascii="Calibri" w:cs="Calibri" w:eastAsia="Calibri" w:hAnsi="Calibri"/>
-                <w:b/>
-                <w:bCs/>
-                <w:i w:val="false"/>
-                <w:iCs w:val="false"/>
-                <w:color w:val="2ECC71"/>
-                <w:sz w:val="19"/>
-                <w:szCs w:val="19"/>
-              </w:rPr>
-              <w:t xml:space="preserve">→ </w:t>
-            </w:r>
-            <w:r>
-              <w:rPr>
-                <w:rFonts w:ascii="Calibri" w:cs="Calibri" w:eastAsia="Calibri" w:hAnsi="Calibri"/>
-                <w:b w:val="false"/>
-                <w:bCs w:val="false"/>
-                <w:i w:val="false"/>
-                <w:iCs w:val="false"/>
-                <w:color w:val="9AA4B2"/>
-                <w:sz w:val="19"/>
-                <w:szCs w:val="19"/>
-              </w:rPr>
-              <w:t xml:space="preserve">Dotted green line: after the burn (scheduled), 3,036 m.</w:t>
+              <w:t xml:space="preserve">One command put it there: bash agent/deploy.sh. Your agent has to actually run somewhere too.</w:t>
             </w:r>
           </w:p>
         </w:tc>
@@ -8042,10 +7766,10 @@
           <w:tcPr>
             <w:tcW w:type="dxa" w:w="10080"/>
             <w:tcBorders>
-              <w:top w:val="single" w:color="B07CFF" w:sz="12"/>
-              <w:left w:val="single" w:color="B07CFF" w:sz="12"/>
-              <w:bottom w:val="single" w:color="B07CFF" w:sz="12"/>
-              <w:right w:val="single" w:color="B07CFF" w:sz="12"/>
+              <w:top w:val="single" w:color="2BB3B1" w:sz="12"/>
+              <w:left w:val="single" w:color="2BB3B1" w:sz="12"/>
+              <w:bottom w:val="single" w:color="2BB3B1" w:sz="12"/>
+              <w:right w:val="single" w:color="2BB3B1" w:sz="12"/>
             </w:tcBorders>
             <w:tcMar>
               <w:top w:type="dxa" w:w="80"/>
@@ -8065,11 +7789,11 @@
                 <w:bCs/>
                 <w:i w:val="false"/>
                 <w:iCs w:val="false"/>
-                <w:color w:val="B07CFF"/>
+                <w:color w:val="2BB3B1"/>
                 <w:sz w:val="18"/>
                 <w:szCs w:val="18"/>
               </w:rPr>
-              <w:t xml:space="preserve">DO</w:t>
+              <w:t xml:space="preserve">SAY</w:t>
             </w:r>
           </w:p>
           <w:p>
@@ -8081,43 +7805,12 @@
                 <w:rFonts w:ascii="Calibri" w:cs="Calibri" w:eastAsia="Calibri" w:hAnsi="Calibri"/>
                 <w:b w:val="false"/>
                 <w:bCs w:val="false"/>
-                <w:i w:val="false"/>
-                <w:iCs w:val="false"/>
+                <w:i/>
+                <w:iCs/>
                 <w:sz w:val="20"/>
                 <w:szCs w:val="20"/>
               </w:rPr>
-              <w:t xml:space="preserve">Skip to next ▸ Skip to next</w:t>
-            </w:r>
-          </w:p>
-          <w:p>
-            <w:pPr>
-              <w:spacing w:after="0" w:before="60" w:line="264"/>
-            </w:pPr>
-            <w:r>
-              <w:rPr>
-                <w:rFonts w:ascii="Calibri" w:cs="Calibri" w:eastAsia="Calibri" w:hAnsi="Calibri"/>
-                <w:b/>
-                <w:bCs/>
-                <w:i w:val="false"/>
-                <w:iCs w:val="false"/>
-                <w:color w:val="2ECC71"/>
-                <w:sz w:val="19"/>
-                <w:szCs w:val="19"/>
-              </w:rPr>
-              <w:t xml:space="preserve">→ </w:t>
-            </w:r>
-            <w:r>
-              <w:rPr>
-                <w:rFonts w:ascii="Calibri" w:cs="Calibri" w:eastAsia="Calibri" w:hAnsi="Calibri"/>
-                <w:b w:val="false"/>
-                <w:bCs w:val="false"/>
-                <w:i w:val="false"/>
-                <w:iCs w:val="false"/>
-                <w:color w:val="9AA4B2"/>
-                <w:sz w:val="19"/>
-                <w:szCs w:val="19"/>
-              </w:rPr>
-              <w:t xml:space="preserve">Burn executed at 04:00: the dot jumps up to the green line · CYMBAL-04's pass at real time: missed by 3,036 m, red ghost line at 301 m.</w:t>
+              <w:t xml:space="preserve">Today we demo from Cloud Shell: with the clock running, local keeps it simple. In real life you'd test the deployed copy too.</w:t>
             </w:r>
           </w:p>
         </w:tc>
@@ -8163,10 +7856,10 @@
           <w:tcPr>
             <w:tcW w:type="dxa" w:w="10080"/>
             <w:tcBorders>
-              <w:top w:val="single" w:color="B07CFF" w:sz="12"/>
-              <w:left w:val="single" w:color="B07CFF" w:sz="12"/>
-              <w:bottom w:val="single" w:color="B07CFF" w:sz="12"/>
-              <w:right w:val="single" w:color="B07CFF" w:sz="12"/>
+              <w:top w:val="single" w:color="2ECC71" w:sz="12"/>
+              <w:left w:val="single" w:color="2ECC71" w:sz="12"/>
+              <w:bottom w:val="single" w:color="2ECC71" w:sz="12"/>
+              <w:right w:val="single" w:color="2ECC71" w:sz="12"/>
             </w:tcBorders>
             <w:tcMar>
               <w:top w:type="dxa" w:w="80"/>
@@ -8186,11 +7879,11 @@
                 <w:bCs/>
                 <w:i w:val="false"/>
                 <w:iCs w:val="false"/>
-                <w:color w:val="B07CFF"/>
+                <w:color w:val="2ECC71"/>
                 <w:sz w:val="18"/>
                 <w:szCs w:val="18"/>
               </w:rPr>
-              <w:t xml:space="preserve">DO</w:t>
+              <w:t xml:space="preserve">IF YOUR TEAM HAS…</w:t>
             </w:r>
           </w:p>
           <w:p>
@@ -8207,38 +7900,7 @@
                 <w:sz w:val="20"/>
                 <w:szCs w:val="20"/>
               </w:rPr>
-              <w:t xml:space="preserve">Skip to next</w:t>
-            </w:r>
-          </w:p>
-          <w:p>
-            <w:pPr>
-              <w:spacing w:after="0" w:before="60" w:line="264"/>
-            </w:pPr>
-            <w:r>
-              <w:rPr>
-                <w:rFonts w:ascii="Calibri" w:cs="Calibri" w:eastAsia="Calibri" w:hAnsi="Calibri"/>
-                <w:b/>
-                <w:bCs/>
-                <w:i w:val="false"/>
-                <w:iCs w:val="false"/>
-                <w:color w:val="2ECC71"/>
-                <w:sz w:val="19"/>
-                <w:szCs w:val="19"/>
-              </w:rPr>
-              <w:t xml:space="preserve">→ </w:t>
-            </w:r>
-            <w:r>
-              <w:rPr>
-                <w:rFonts w:ascii="Calibri" w:cs="Calibri" w:eastAsia="Calibri" w:hAnsi="Calibri"/>
-                <w:b w:val="false"/>
-                <w:bCs w:val="false"/>
-                <w:i w:val="false"/>
-                <w:iCs w:val="false"/>
-                <w:color w:val="9AA4B2"/>
-                <w:sz w:val="19"/>
-                <w:szCs w:val="19"/>
-              </w:rPr>
-              <w:t xml:space="preserve">Tuesday: fresh tracking for SL-3 R/B (pink SIMULATED). The dot jumps from 421 m to 3,700 m and the agent says no burn.</w:t>
+              <w:t xml:space="preserve">Whoever owns the agent deploys it early, so the front end isn't blocked. One command.</w:t>
             </w:r>
           </w:p>
         </w:tc>
@@ -8259,6 +7921,284 @@
           <w:szCs w:val="22"/>
         </w:rPr>
         <w:t xml:space="preserve"/>
+      </w:r>
+    </w:p>
+    <w:p>
+      <w:pPr>
+        <w:pStyle w:val="Heading3"/>
+        <w:keepNext/>
+        <w:spacing w:after="40" w:before="160"/>
+      </w:pPr>
+      <w:r>
+        <w:rPr>
+          <w:rFonts w:ascii="Calibri" w:cs="Calibri" w:eastAsia="Calibri" w:hAnsi="Calibri"/>
+          <w:b/>
+          <w:bCs/>
+          <w:i w:val="false"/>
+          <w:iCs w:val="false"/>
+          <w:color w:val="3D8BFF"/>
+          <w:sz w:val="22"/>
+          <w:szCs w:val="22"/>
+        </w:rPr>
+        <w:t xml:space="preserve">6. Show: the finished product   ·   TAB · CONSOLE · PORT 8080   ·   ~3 min</w:t>
+      </w:r>
+    </w:p>
+    <w:p>
+      <w:pPr>
+        <w:spacing w:after="80" w:before="40" w:line="264"/>
+      </w:pPr>
+      <w:r>
+        <w:rPr>
+          <w:rFonts w:ascii="Calibri" w:cs="Calibri" w:eastAsia="Calibri" w:hAnsi="Calibri"/>
+          <w:b/>
+          <w:bCs/>
+          <w:i w:val="false"/>
+          <w:iCs w:val="false"/>
+          <w:color w:val="2ECC71"/>
+          <w:sz w:val="20"/>
+          <w:szCs w:val="20"/>
+        </w:rPr>
+        <w:t xml:space="preserve">WHY  </w:t>
+      </w:r>
+      <w:r>
+        <w:rPr>
+          <w:rFonts w:ascii="Calibri" w:cs="Calibri" w:eastAsia="Calibri" w:hAnsi="Calibri"/>
+          <w:b w:val="false"/>
+          <w:bCs w:val="false"/>
+          <w:i w:val="false"/>
+          <w:iCs w:val="false"/>
+          <w:sz w:val="22"/>
+          <w:szCs w:val="22"/>
+        </w:rPr>
+        <w:t xml:space="preserve">What "an agent, not a chat box" looks like: plain code watches, the agent decides, a human approves. Two alerts, two opposite answers.</w:t>
+      </w:r>
+    </w:p>
+    <w:p>
+      <w:pPr>
+        <w:spacing w:after="80" w:before="40" w:line="264"/>
+      </w:pPr>
+      <w:r>
+        <w:rPr>
+          <w:rFonts w:ascii="Calibri" w:cs="Calibri" w:eastAsia="Calibri" w:hAnsi="Calibri"/>
+          <w:b/>
+          <w:bCs/>
+          <w:i w:val="false"/>
+          <w:iCs w:val="false"/>
+          <w:color w:val="2BB3B1"/>
+          <w:sz w:val="20"/>
+          <w:szCs w:val="20"/>
+        </w:rPr>
+        <w:t xml:space="preserve">SAY  </w:t>
+      </w:r>
+      <w:r>
+        <w:rPr>
+          <w:rFonts w:ascii="Calibri" w:cs="Calibri" w:eastAsia="Calibri" w:hAnsi="Calibri"/>
+          <w:b w:val="false"/>
+          <w:bCs w:val="false"/>
+          <w:i/>
+          <w:iCs/>
+          <w:sz w:val="22"/>
+          <w:szCs w:val="22"/>
+        </w:rPr>
+        <w:t xml:space="preserve">Last step, and it's what your judges will see: show it. This is the finished product. Time runs over the week; plain code, no AI, watches for anything that matters; and when something needs a decision, it wakes the agent.</w:t>
+      </w:r>
+    </w:p>
+    <w:p>
+      <w:pPr>
+        <w:spacing w:after="80" w:before="40" w:line="264"/>
+      </w:pPr>
+      <w:r>
+        <w:rPr>
+          <w:rFonts w:ascii="Calibri" w:cs="Calibri" w:eastAsia="Calibri" w:hAnsi="Calibri"/>
+          <w:b/>
+          <w:bCs/>
+          <w:i w:val="false"/>
+          <w:iCs w:val="false"/>
+          <w:color w:val="2BB3B1"/>
+          <w:sz w:val="20"/>
+          <w:szCs w:val="20"/>
+        </w:rPr>
+        <w:t xml:space="preserve">SAY  </w:t>
+      </w:r>
+      <w:r>
+        <w:rPr>
+          <w:rFonts w:ascii="Calibri" w:cs="Calibri" w:eastAsia="Calibri" w:hAnsi="Calibri"/>
+          <w:b w:val="false"/>
+          <w:bCs w:val="false"/>
+          <w:i/>
+          <w:iCs/>
+          <w:sz w:val="22"/>
+          <w:szCs w:val="22"/>
+        </w:rPr>
+        <w:t xml:space="preserve">Eighteen hours out, when the tracking is as good as it will get and there's still time to burn cheaply, the agent runs the playbook you just watched: assess, size the burn at two times, price it, write it up. Then it waits for a human. I approve.</w:t>
+      </w:r>
+    </w:p>
+    <w:p>
+      <w:pPr>
+        <w:spacing w:after="80" w:before="40" w:line="264"/>
+      </w:pPr>
+      <w:r>
+        <w:rPr>
+          <w:rFonts w:ascii="Calibri" w:cs="Calibri" w:eastAsia="Calibri" w:hAnsi="Calibri"/>
+          <w:b/>
+          <w:bCs/>
+          <w:i w:val="false"/>
+          <w:iCs w:val="false"/>
+          <w:color w:val="2BB3B1"/>
+          <w:sz w:val="20"/>
+          <w:szCs w:val="20"/>
+        </w:rPr>
+        <w:t xml:space="preserve">SAY  </w:t>
+      </w:r>
+      <w:r>
+        <w:rPr>
+          <w:rFonts w:ascii="Calibri" w:cs="Calibri" w:eastAsia="Calibri" w:hAnsi="Calibri"/>
+          <w:b w:val="false"/>
+          <w:bCs w:val="false"/>
+          <w:i/>
+          <w:iCs/>
+          <w:sz w:val="22"/>
+          <w:szCs w:val="22"/>
+        </w:rPr>
+        <w:t xml:space="preserve">There it goes. Without the burn, 301 metres. With it, three kilometres, for a day and a half of the satellite's life.</w:t>
+      </w:r>
+    </w:p>
+    <w:p>
+      <w:pPr>
+        <w:spacing w:after="80" w:before="40" w:line="264"/>
+      </w:pPr>
+      <w:r>
+        <w:rPr>
+          <w:rFonts w:ascii="Calibri" w:cs="Calibri" w:eastAsia="Calibri" w:hAnsi="Calibri"/>
+          <w:b/>
+          <w:bCs/>
+          <w:i w:val="false"/>
+          <w:iCs w:val="false"/>
+          <w:color w:val="2BB3B1"/>
+          <w:sz w:val="20"/>
+          <w:szCs w:val="20"/>
+        </w:rPr>
+        <w:t xml:space="preserve">SAY  </w:t>
+      </w:r>
+      <w:r>
+        <w:rPr>
+          <w:rFonts w:ascii="Calibri" w:cs="Calibri" w:eastAsia="Calibri" w:hAnsi="Calibri"/>
+          <w:b w:val="false"/>
+          <w:bCs w:val="false"/>
+          <w:i/>
+          <w:iCs/>
+          <w:sz w:val="22"/>
+          <w:szCs w:val="22"/>
+        </w:rPr>
+        <w:t xml:space="preserve">Now the other alert. On Friday this rocket body was stale: the tracking was a week old, so the agent asked for fresh tracking instead of spending fuel. Tuesday it arrives, and the right answer is: do nothing. Same agent, opposite answer. That's judgment.</w:t>
+      </w:r>
+    </w:p>
+    <w:p>
+      <w:pPr>
+        <w:spacing w:after="80" w:before="40" w:line="264"/>
+      </w:pPr>
+      <w:r>
+        <w:rPr>
+          <w:rFonts w:ascii="Calibri" w:cs="Calibri" w:eastAsia="Calibri" w:hAnsi="Calibri"/>
+          <w:b/>
+          <w:bCs/>
+          <w:i w:val="false"/>
+          <w:iCs w:val="false"/>
+          <w:color w:val="2BB3B1"/>
+          <w:sz w:val="20"/>
+          <w:szCs w:val="20"/>
+        </w:rPr>
+        <w:t xml:space="preserve">SAY  </w:t>
+      </w:r>
+      <w:r>
+        <w:rPr>
+          <w:rFonts w:ascii="Calibri" w:cs="Calibri" w:eastAsia="Calibri" w:hAnsi="Calibri"/>
+          <w:b w:val="false"/>
+          <w:bCs w:val="false"/>
+          <w:i/>
+          <w:iCs/>
+          <w:sz w:val="22"/>
+          <w:szCs w:val="22"/>
+        </w:rPr>
+        <w:t xml:space="preserve">The cards you just saw are a recording of a real run of the agent, played back so a demo on conference wifi runs the same every time. That's a trick worth stealing for your own Show step.</w:t>
+      </w:r>
+    </w:p>
+    <w:p>
+      <w:pPr>
+        <w:spacing w:after="80" w:before="40" w:line="264"/>
+      </w:pPr>
+      <w:r>
+        <w:rPr>
+          <w:rFonts w:ascii="Calibri" w:cs="Calibri" w:eastAsia="Calibri" w:hAnsi="Calibri"/>
+          <w:b/>
+          <w:bCs/>
+          <w:i w:val="false"/>
+          <w:iCs w:val="false"/>
+          <w:color w:val="2BB3B1"/>
+          <w:sz w:val="20"/>
+          <w:szCs w:val="20"/>
+        </w:rPr>
+        <w:t xml:space="preserve">SAY  </w:t>
+      </w:r>
+      <w:r>
+        <w:rPr>
+          <w:rFonts w:ascii="Calibri" w:cs="Calibri" w:eastAsia="Calibri" w:hAnsi="Calibri"/>
+          <w:b w:val="false"/>
+          <w:bCs w:val="false"/>
+          <w:i/>
+          <w:iCs/>
+          <w:sz w:val="22"/>
+          <w:szCs w:val="22"/>
+        </w:rPr>
+        <w:t xml:space="preserve">Could your team build a screen like this today? If you have a web developer and the time, yes, and keep it small. If not, the ADK web UI is a legitimate finish. Judges ask why you chose your interface; have an answer.</w:t>
+      </w:r>
+    </w:p>
+    <w:p>
+      <w:pPr>
+        <w:spacing w:after="80" w:before="40" w:line="264"/>
+      </w:pPr>
+      <w:r>
+        <w:rPr>
+          <w:rFonts w:ascii="Calibri" w:cs="Calibri" w:eastAsia="Calibri" w:hAnsi="Calibri"/>
+          <w:b/>
+          <w:bCs/>
+          <w:i w:val="false"/>
+          <w:iCs w:val="false"/>
+          <w:color w:val="B07CFF"/>
+          <w:sz w:val="20"/>
+          <w:szCs w:val="20"/>
+        </w:rPr>
+        <w:t xml:space="preserve">NEEDS  </w:t>
+      </w:r>
+      <w:r>
+        <w:rPr>
+          <w:rFonts w:ascii="Calibri" w:cs="Calibri" w:eastAsia="Calibri" w:hAnsi="Calibri"/>
+          <w:b w:val="false"/>
+          <w:bCs w:val="false"/>
+          <w:i w:val="false"/>
+          <w:iCs w:val="false"/>
+          <w:sz w:val="20"/>
+          <w:szCs w:val="20"/>
+        </w:rPr>
+        <w:t xml:space="preserve">Header says REPLAY. Clock Fri 25 Sep 01:00:00 UTC. If not: ⋯ ▸ Restart the week.</w:t>
+      </w:r>
+    </w:p>
+    <w:p>
+      <w:pPr>
+        <w:spacing w:after="80" w:before="40" w:line="264"/>
+      </w:pPr>
+      <w:r>
+        <w:rPr>
+          <w:rFonts w:ascii="Calibri" w:cs="Calibri" w:eastAsia="Calibri" w:hAnsi="Calibri"/>
+          <w:b w:val="false"/>
+          <w:bCs w:val="false"/>
+          <w:i w:val="false"/>
+          <w:iCs w:val="false"/>
+          <w:color w:val="9AA4B2"/>
+          <w:sz w:val="20"/>
+          <w:szCs w:val="20"/>
+        </w:rPr>
+        <w:t xml:space="preserve">Press Skip to next for each step. The clock stops by itself when the agent is woken and waits for Approve.</w:t>
       </w:r>
     </w:p>
     <w:tbl>
@@ -8328,7 +8268,877 @@
                 <w:sz w:val="20"/>
                 <w:szCs w:val="20"/>
               </w:rPr>
+              <w:t xml:space="preserve">Skip to next</w:t>
+            </w:r>
+          </w:p>
+          <w:p>
+            <w:pPr>
+              <w:spacing w:after="0" w:before="60" w:line="264"/>
+            </w:pPr>
+            <w:r>
+              <w:rPr>
+                <w:rFonts w:ascii="Calibri" w:cs="Calibri" w:eastAsia="Calibri" w:hAnsi="Calibri"/>
+                <w:b/>
+                <w:bCs/>
+                <w:i w:val="false"/>
+                <w:iCs w:val="false"/>
+                <w:color w:val="2ECC71"/>
+                <w:sz w:val="19"/>
+                <w:szCs w:val="19"/>
+              </w:rPr>
+              <w:t xml:space="preserve">→ </w:t>
+            </w:r>
+            <w:r>
+              <w:rPr>
+                <w:rFonts w:ascii="Calibri" w:cs="Calibri" w:eastAsia="Calibri" w:hAnsi="Calibri"/>
+                <w:b w:val="false"/>
+                <w:bCs w:val="false"/>
+                <w:i w:val="false"/>
+                <w:iCs w:val="false"/>
+                <w:color w:val="9AA4B2"/>
+                <w:sz w:val="19"/>
+                <w:szCs w:val="19"/>
+              </w:rPr>
+              <w:t xml:space="preserve">CYMBAL-01's pass at real time: the amber dot slides by at 382 m. "Too late to act" was already on the desk.</w:t>
+            </w:r>
+          </w:p>
+        </w:tc>
+      </w:tr>
+    </w:tbl>
+    <w:p>
+      <w:pPr>
+        <w:spacing w:after="20" w:before="0" w:line="264"/>
+      </w:pPr>
+      <w:r>
+        <w:rPr>
+          <w:rFonts w:ascii="Calibri" w:cs="Calibri" w:eastAsia="Calibri" w:hAnsi="Calibri"/>
+          <w:b w:val="false"/>
+          <w:bCs w:val="false"/>
+          <w:i w:val="false"/>
+          <w:iCs w:val="false"/>
+          <w:sz w:val="22"/>
+          <w:szCs w:val="22"/>
+        </w:rPr>
+        <w:t xml:space="preserve"/>
+      </w:r>
+    </w:p>
+    <w:tbl>
+      <w:tblPr>
+        <w:tblW w:type="dxa" w:w="10080"/>
+        <w:tblBorders>
+          <w:top w:val="single" w:color="auto" w:sz="4"/>
+          <w:left w:val="single" w:color="auto" w:sz="4"/>
+          <w:bottom w:val="single" w:color="auto" w:sz="4"/>
+          <w:right w:val="single" w:color="auto" w:sz="4"/>
+          <w:insideH w:val="single" w:color="auto" w:sz="4"/>
+          <w:insideV w:val="single" w:color="auto" w:sz="4"/>
+        </w:tblBorders>
+      </w:tblPr>
+      <w:tblGrid>
+        <w:gridCol w:w="10080"/>
+      </w:tblGrid>
+      <w:tr>
+        <w:trPr>
+          <w:cantSplit/>
+        </w:trPr>
+        <w:tc>
+          <w:tcPr>
+            <w:tcW w:type="dxa" w:w="10080"/>
+            <w:tcBorders>
+              <w:top w:val="single" w:color="B07CFF" w:sz="12"/>
+              <w:left w:val="single" w:color="B07CFF" w:sz="12"/>
+              <w:bottom w:val="single" w:color="B07CFF" w:sz="12"/>
+              <w:right w:val="single" w:color="B07CFF" w:sz="12"/>
+            </w:tcBorders>
+            <w:tcMar>
+              <w:top w:type="dxa" w:w="80"/>
+              <w:left w:type="dxa" w:w="160"/>
+              <w:bottom w:type="dxa" w:w="80"/>
+              <w:right w:type="dxa" w:w="160"/>
+            </w:tcMar>
+          </w:tcPr>
+          <w:p>
+            <w:pPr>
+              <w:spacing w:after="40" w:before="0" w:line="264"/>
+            </w:pPr>
+            <w:r>
+              <w:rPr>
+                <w:rFonts w:ascii="Calibri" w:cs="Calibri" w:eastAsia="Calibri" w:hAnsi="Calibri"/>
+                <w:b/>
+                <w:bCs/>
+                <w:i w:val="false"/>
+                <w:iCs w:val="false"/>
+                <w:color w:val="B07CFF"/>
+                <w:sz w:val="18"/>
+                <w:szCs w:val="18"/>
+              </w:rPr>
+              <w:t xml:space="preserve">DO</w:t>
+            </w:r>
+          </w:p>
+          <w:p>
+            <w:pPr>
+              <w:spacing w:after="0" w:before="0" w:line="264"/>
+            </w:pPr>
+            <w:r>
+              <w:rPr>
+                <w:rFonts w:ascii="Calibri" w:cs="Calibri" w:eastAsia="Calibri" w:hAnsi="Calibri"/>
+                <w:b w:val="false"/>
+                <w:bCs w:val="false"/>
+                <w:i w:val="false"/>
+                <w:iCs w:val="false"/>
+                <w:sz w:val="20"/>
+                <w:szCs w:val="20"/>
+              </w:rPr>
+              <w:t xml:space="preserve">Skip to next</w:t>
+            </w:r>
+          </w:p>
+          <w:p>
+            <w:pPr>
+              <w:spacing w:after="0" w:before="60" w:line="264"/>
+            </w:pPr>
+            <w:r>
+              <w:rPr>
+                <w:rFonts w:ascii="Calibri" w:cs="Calibri" w:eastAsia="Calibri" w:hAnsi="Calibri"/>
+                <w:b/>
+                <w:bCs/>
+                <w:i w:val="false"/>
+                <w:iCs w:val="false"/>
+                <w:color w:val="2ECC71"/>
+                <w:sz w:val="19"/>
+                <w:szCs w:val="19"/>
+              </w:rPr>
+              <w:t xml:space="preserve">→ </w:t>
+            </w:r>
+            <w:r>
+              <w:rPr>
+                <w:rFonts w:ascii="Calibri" w:cs="Calibri" w:eastAsia="Calibri" w:hAnsi="Calibri"/>
+                <w:b w:val="false"/>
+                <w:bCs w:val="false"/>
+                <w:i w:val="false"/>
+                <w:iCs w:val="false"/>
+                <w:color w:val="9AA4B2"/>
+                <w:sz w:val="19"/>
+                <w:szCs w:val="19"/>
+              </w:rPr>
+              <w:t xml:space="preserve">Decision needed: CYMBAL-04. The agent's steps tick in, then YOUR CALL: MANEUVER, 0.0181 m/s prograde at 04:00 → 3,036 m, 1.54 days.</w:t>
+            </w:r>
+          </w:p>
+        </w:tc>
+      </w:tr>
+    </w:tbl>
+    <w:p>
+      <w:pPr>
+        <w:spacing w:after="20" w:before="0" w:line="264"/>
+      </w:pPr>
+      <w:r>
+        <w:rPr>
+          <w:rFonts w:ascii="Calibri" w:cs="Calibri" w:eastAsia="Calibri" w:hAnsi="Calibri"/>
+          <w:b w:val="false"/>
+          <w:bCs w:val="false"/>
+          <w:i w:val="false"/>
+          <w:iCs w:val="false"/>
+          <w:sz w:val="22"/>
+          <w:szCs w:val="22"/>
+        </w:rPr>
+        <w:t xml:space="preserve"/>
+      </w:r>
+    </w:p>
+    <w:tbl>
+      <w:tblPr>
+        <w:tblW w:type="dxa" w:w="10080"/>
+        <w:tblBorders>
+          <w:top w:val="single" w:color="auto" w:sz="4"/>
+          <w:left w:val="single" w:color="auto" w:sz="4"/>
+          <w:bottom w:val="single" w:color="auto" w:sz="4"/>
+          <w:right w:val="single" w:color="auto" w:sz="4"/>
+          <w:insideH w:val="single" w:color="auto" w:sz="4"/>
+          <w:insideV w:val="single" w:color="auto" w:sz="4"/>
+        </w:tblBorders>
+      </w:tblPr>
+      <w:tblGrid>
+        <w:gridCol w:w="10080"/>
+      </w:tblGrid>
+      <w:tr>
+        <w:trPr>
+          <w:cantSplit/>
+        </w:trPr>
+        <w:tc>
+          <w:tcPr>
+            <w:tcW w:type="dxa" w:w="10080"/>
+            <w:tcBorders>
+              <w:top w:val="single" w:color="9AA4B2" w:sz="12"/>
+              <w:left w:val="single" w:color="9AA4B2" w:sz="12"/>
+              <w:bottom w:val="single" w:color="9AA4B2" w:sz="12"/>
+              <w:right w:val="single" w:color="9AA4B2" w:sz="12"/>
+            </w:tcBorders>
+            <w:tcMar>
+              <w:top w:type="dxa" w:w="80"/>
+              <w:left w:type="dxa" w:w="160"/>
+              <w:bottom w:type="dxa" w:w="80"/>
+              <w:right w:type="dxa" w:w="160"/>
+            </w:tcMar>
+          </w:tcPr>
+          <w:p>
+            <w:pPr>
+              <w:spacing w:after="40" w:before="0" w:line="264"/>
+            </w:pPr>
+            <w:r>
+              <w:rPr>
+                <w:rFonts w:ascii="Calibri" w:cs="Calibri" w:eastAsia="Calibri" w:hAnsi="Calibri"/>
+                <w:b/>
+                <w:bCs/>
+                <w:i w:val="false"/>
+                <w:iCs w:val="false"/>
+                <w:color w:val="9AA4B2"/>
+                <w:sz w:val="18"/>
+                <w:szCs w:val="18"/>
+              </w:rPr>
+              <w:t xml:space="preserve">THE PURPLE AGENT CARD, TOP TO BOTTOM</w:t>
+            </w:r>
+          </w:p>
+          <w:p>
+            <w:pPr>
+              <w:spacing w:after="0" w:before="0" w:line="264"/>
+            </w:pPr>
+            <w:r>
+              <w:rPr>
+                <w:rFonts w:ascii="Calibri" w:cs="Calibri" w:eastAsia="Calibri" w:hAnsi="Calibri"/>
+                <w:b w:val="false"/>
+                <w:bCs w:val="false"/>
+                <w:i w:val="false"/>
+                <w:iCs w:val="false"/>
+                <w:sz w:val="20"/>
+                <w:szCs w:val="20"/>
+              </w:rPr>
+              <w:t xml:space="preserve">Watcher's line: why it woke the agent. 18 h out (tracking as good as it gets, still time to burn cheaply), worst case 1 in 10,000, tracking fresh.</w:t>
+            </w:r>
+          </w:p>
+          <w:p>
+            <w:pPr>
+              <w:spacing w:after="0" w:before="0" w:line="264"/>
+            </w:pPr>
+            <w:r>
+              <w:rPr>
+                <w:rFonts w:ascii="Calibri" w:cs="Calibri" w:eastAsia="Calibri" w:hAnsi="Calibri"/>
+                <w:b w:val="false"/>
+                <w:bCs w:val="false"/>
+                <w:i w:val="false"/>
+                <w:iCs w:val="false"/>
+                <w:sz w:val="20"/>
+                <w:szCs w:val="20"/>
+              </w:rPr>
+              <w:t xml:space="preserve">assess_conjunction (our tool): the facts from BigQuery; is the tracking fresh, can the debris dodge (no); stages the case in the sandbox.</w:t>
+            </w:r>
+          </w:p>
+          <w:p>
+            <w:pPr>
+              <w:spacing w:after="0" w:before="0" w:line="264"/>
+            </w:pPr>
+            <w:r>
+              <w:rPr>
+                <w:rFonts w:ascii="Calibri" w:cs="Calibri" w:eastAsia="Calibri" w:hAnsi="Calibri"/>
+                <w:b w:val="false"/>
+                <w:bCs w:val="false"/>
+                <w:i w:val="false"/>
+                <w:iCs w:val="false"/>
+                <w:sz w:val="20"/>
+                <w:szCs w:val="20"/>
+              </w:rPr>
+              <w:t xml:space="preserve">run_in_sandbox: the agent's own Python, run in the Agent Runtime code sandbox. Sizes the burn at 04:00 (0.0181 m/s) and noon (0.0343 m/s).</w:t>
+            </w:r>
+          </w:p>
+          <w:p>
+            <w:pPr>
+              <w:spacing w:after="0" w:before="0" w:line="264"/>
+            </w:pPr>
+            <w:r>
+              <w:rPr>
+                <w:rFonts w:ascii="Calibri" w:cs="Calibri" w:eastAsia="Calibri" w:hAnsi="Calibri"/>
+                <w:b w:val="false"/>
+                <w:bCs w:val="false"/>
+                <w:i w:val="false"/>
+                <w:iCs w:val="false"/>
+                <w:sz w:val="20"/>
+                <w:szCs w:val="20"/>
+              </w:rPr>
+              <w:t xml:space="preserve">maneuver_cost ×2: each burn in days of satellite life: 1.54 vs 2.92.</w:t>
+            </w:r>
+          </w:p>
+          <w:p>
+            <w:pPr>
+              <w:spacing w:after="0" w:before="0" w:line="264"/>
+            </w:pPr>
+            <w:r>
+              <w:rPr>
+                <w:rFonts w:ascii="Calibri" w:cs="Calibri" w:eastAsia="Calibri" w:hAnsi="Calibri"/>
+                <w:b w:val="false"/>
+                <w:bCs w:val="false"/>
+                <w:i w:val="false"/>
+                <w:iCs w:val="false"/>
+                <w:sz w:val="20"/>
+                <w:szCs w:val="20"/>
+              </w:rPr>
+              <w:t xml:space="preserve">build_assessment: writes it up, re-reading every fact from BigQuery.</w:t>
+            </w:r>
+          </w:p>
+          <w:p>
+            <w:pPr>
+              <w:spacing w:after="0" w:before="0" w:line="264"/>
+            </w:pPr>
+            <w:r>
+              <w:rPr>
+                <w:rFonts w:ascii="Calibri" w:cs="Calibri" w:eastAsia="Calibri" w:hAnsi="Calibri"/>
+                <w:b w:val="false"/>
+                <w:bCs w:val="false"/>
+                <w:i w:val="false"/>
+                <w:iCs w:val="false"/>
+                <w:sz w:val="20"/>
+                <w:szCs w:val="20"/>
+              </w:rPr>
+              <w:t xml:space="preserve">Then: the agent's words · the bold summary · the write-up (click to open) · Approve / Hold · how long it took (about 23 s).</w:t>
+            </w:r>
+          </w:p>
+        </w:tc>
+      </w:tr>
+    </w:tbl>
+    <w:p>
+      <w:pPr>
+        <w:spacing w:after="20" w:before="0" w:line="264"/>
+      </w:pPr>
+      <w:r>
+        <w:rPr>
+          <w:rFonts w:ascii="Calibri" w:cs="Calibri" w:eastAsia="Calibri" w:hAnsi="Calibri"/>
+          <w:b w:val="false"/>
+          <w:bCs w:val="false"/>
+          <w:i w:val="false"/>
+          <w:iCs w:val="false"/>
+          <w:sz w:val="22"/>
+          <w:szCs w:val="22"/>
+        </w:rPr>
+        <w:t xml:space="preserve"/>
+      </w:r>
+    </w:p>
+    <w:tbl>
+      <w:tblPr>
+        <w:tblW w:type="dxa" w:w="10080"/>
+        <w:tblBorders>
+          <w:top w:val="single" w:color="auto" w:sz="4"/>
+          <w:left w:val="single" w:color="auto" w:sz="4"/>
+          <w:bottom w:val="single" w:color="auto" w:sz="4"/>
+          <w:right w:val="single" w:color="auto" w:sz="4"/>
+          <w:insideH w:val="single" w:color="auto" w:sz="4"/>
+          <w:insideV w:val="single" w:color="auto" w:sz="4"/>
+        </w:tblBorders>
+      </w:tblPr>
+      <w:tblGrid>
+        <w:gridCol w:w="10080"/>
+      </w:tblGrid>
+      <w:tr>
+        <w:trPr>
+          <w:cantSplit/>
+        </w:trPr>
+        <w:tc>
+          <w:tcPr>
+            <w:tcW w:type="dxa" w:w="10080"/>
+            <w:tcBorders>
+              <w:top w:val="single" w:color="B07CFF" w:sz="12"/>
+              <w:left w:val="single" w:color="B07CFF" w:sz="12"/>
+              <w:bottom w:val="single" w:color="B07CFF" w:sz="12"/>
+              <w:right w:val="single" w:color="B07CFF" w:sz="12"/>
+            </w:tcBorders>
+            <w:tcMar>
+              <w:top w:type="dxa" w:w="80"/>
+              <w:left w:type="dxa" w:w="160"/>
+              <w:bottom w:type="dxa" w:w="80"/>
+              <w:right w:type="dxa" w:w="160"/>
+            </w:tcMar>
+          </w:tcPr>
+          <w:p>
+            <w:pPr>
+              <w:spacing w:after="40" w:before="0" w:line="264"/>
+            </w:pPr>
+            <w:r>
+              <w:rPr>
+                <w:rFonts w:ascii="Calibri" w:cs="Calibri" w:eastAsia="Calibri" w:hAnsi="Calibri"/>
+                <w:b/>
+                <w:bCs/>
+                <w:i w:val="false"/>
+                <w:iCs w:val="false"/>
+                <w:color w:val="B07CFF"/>
+                <w:sz w:val="18"/>
+                <w:szCs w:val="18"/>
+              </w:rPr>
+              <w:t xml:space="preserve">DO</w:t>
+            </w:r>
+          </w:p>
+          <w:p>
+            <w:pPr>
+              <w:spacing w:after="0" w:before="0" w:line="264"/>
+            </w:pPr>
+            <w:r>
+              <w:rPr>
+                <w:rFonts w:ascii="Calibri" w:cs="Calibri" w:eastAsia="Calibri" w:hAnsi="Calibri"/>
+                <w:b w:val="false"/>
+                <w:bCs w:val="false"/>
+                <w:i w:val="false"/>
+                <w:iCs w:val="false"/>
+                <w:sz w:val="20"/>
+                <w:szCs w:val="20"/>
+              </w:rPr>
               <w:t xml:space="preserve">Approve</w:t>
+            </w:r>
+          </w:p>
+          <w:p>
+            <w:pPr>
+              <w:spacing w:after="0" w:before="60" w:line="264"/>
+            </w:pPr>
+            <w:r>
+              <w:rPr>
+                <w:rFonts w:ascii="Calibri" w:cs="Calibri" w:eastAsia="Calibri" w:hAnsi="Calibri"/>
+                <w:b/>
+                <w:bCs/>
+                <w:i w:val="false"/>
+                <w:iCs w:val="false"/>
+                <w:color w:val="2ECC71"/>
+                <w:sz w:val="19"/>
+                <w:szCs w:val="19"/>
+              </w:rPr>
+              <w:t xml:space="preserve">→ </w:t>
+            </w:r>
+            <w:r>
+              <w:rPr>
+                <w:rFonts w:ascii="Calibri" w:cs="Calibri" w:eastAsia="Calibri" w:hAnsi="Calibri"/>
+                <w:b w:val="false"/>
+                <w:bCs w:val="false"/>
+                <w:i w:val="false"/>
+                <w:iCs w:val="false"/>
+                <w:color w:val="9AA4B2"/>
+                <w:sz w:val="19"/>
+                <w:szCs w:val="19"/>
+              </w:rPr>
+              <w:t xml:space="preserve">Dotted green line: after the burn (scheduled), 3,036 m.</w:t>
+            </w:r>
+          </w:p>
+        </w:tc>
+      </w:tr>
+    </w:tbl>
+    <w:p>
+      <w:pPr>
+        <w:spacing w:after="20" w:before="0" w:line="264"/>
+      </w:pPr>
+      <w:r>
+        <w:rPr>
+          <w:rFonts w:ascii="Calibri" w:cs="Calibri" w:eastAsia="Calibri" w:hAnsi="Calibri"/>
+          <w:b w:val="false"/>
+          <w:bCs w:val="false"/>
+          <w:i w:val="false"/>
+          <w:iCs w:val="false"/>
+          <w:sz w:val="22"/>
+          <w:szCs w:val="22"/>
+        </w:rPr>
+        <w:t xml:space="preserve"/>
+      </w:r>
+    </w:p>
+    <w:tbl>
+      <w:tblPr>
+        <w:tblW w:type="dxa" w:w="10080"/>
+        <w:tblBorders>
+          <w:top w:val="single" w:color="auto" w:sz="4"/>
+          <w:left w:val="single" w:color="auto" w:sz="4"/>
+          <w:bottom w:val="single" w:color="auto" w:sz="4"/>
+          <w:right w:val="single" w:color="auto" w:sz="4"/>
+          <w:insideH w:val="single" w:color="auto" w:sz="4"/>
+          <w:insideV w:val="single" w:color="auto" w:sz="4"/>
+        </w:tblBorders>
+      </w:tblPr>
+      <w:tblGrid>
+        <w:gridCol w:w="10080"/>
+      </w:tblGrid>
+      <w:tr>
+        <w:trPr>
+          <w:cantSplit/>
+        </w:trPr>
+        <w:tc>
+          <w:tcPr>
+            <w:tcW w:type="dxa" w:w="10080"/>
+            <w:tcBorders>
+              <w:top w:val="single" w:color="B07CFF" w:sz="12"/>
+              <w:left w:val="single" w:color="B07CFF" w:sz="12"/>
+              <w:bottom w:val="single" w:color="B07CFF" w:sz="12"/>
+              <w:right w:val="single" w:color="B07CFF" w:sz="12"/>
+            </w:tcBorders>
+            <w:tcMar>
+              <w:top w:type="dxa" w:w="80"/>
+              <w:left w:type="dxa" w:w="160"/>
+              <w:bottom w:type="dxa" w:w="80"/>
+              <w:right w:type="dxa" w:w="160"/>
+            </w:tcMar>
+          </w:tcPr>
+          <w:p>
+            <w:pPr>
+              <w:spacing w:after="40" w:before="0" w:line="264"/>
+            </w:pPr>
+            <w:r>
+              <w:rPr>
+                <w:rFonts w:ascii="Calibri" w:cs="Calibri" w:eastAsia="Calibri" w:hAnsi="Calibri"/>
+                <w:b/>
+                <w:bCs/>
+                <w:i w:val="false"/>
+                <w:iCs w:val="false"/>
+                <w:color w:val="B07CFF"/>
+                <w:sz w:val="18"/>
+                <w:szCs w:val="18"/>
+              </w:rPr>
+              <w:t xml:space="preserve">DO</w:t>
+            </w:r>
+          </w:p>
+          <w:p>
+            <w:pPr>
+              <w:spacing w:after="0" w:before="0" w:line="264"/>
+            </w:pPr>
+            <w:r>
+              <w:rPr>
+                <w:rFonts w:ascii="Calibri" w:cs="Calibri" w:eastAsia="Calibri" w:hAnsi="Calibri"/>
+                <w:b w:val="false"/>
+                <w:bCs w:val="false"/>
+                <w:i w:val="false"/>
+                <w:iCs w:val="false"/>
+                <w:sz w:val="20"/>
+                <w:szCs w:val="20"/>
+              </w:rPr>
+              <w:t xml:space="preserve">Skip to next ▸ Skip to next</w:t>
+            </w:r>
+          </w:p>
+          <w:p>
+            <w:pPr>
+              <w:spacing w:after="0" w:before="60" w:line="264"/>
+            </w:pPr>
+            <w:r>
+              <w:rPr>
+                <w:rFonts w:ascii="Calibri" w:cs="Calibri" w:eastAsia="Calibri" w:hAnsi="Calibri"/>
+                <w:b/>
+                <w:bCs/>
+                <w:i w:val="false"/>
+                <w:iCs w:val="false"/>
+                <w:color w:val="2ECC71"/>
+                <w:sz w:val="19"/>
+                <w:szCs w:val="19"/>
+              </w:rPr>
+              <w:t xml:space="preserve">→ </w:t>
+            </w:r>
+            <w:r>
+              <w:rPr>
+                <w:rFonts w:ascii="Calibri" w:cs="Calibri" w:eastAsia="Calibri" w:hAnsi="Calibri"/>
+                <w:b w:val="false"/>
+                <w:bCs w:val="false"/>
+                <w:i w:val="false"/>
+                <w:iCs w:val="false"/>
+                <w:color w:val="9AA4B2"/>
+                <w:sz w:val="19"/>
+                <w:szCs w:val="19"/>
+              </w:rPr>
+              <w:t xml:space="preserve">Burn executed at 04:00: the dot jumps up to the green line · CYMBAL-04's pass at real time: missed by 3,036 m, red ghost line at 301 m.</w:t>
+            </w:r>
+          </w:p>
+        </w:tc>
+      </w:tr>
+    </w:tbl>
+    <w:p>
+      <w:pPr>
+        <w:spacing w:after="20" w:before="0" w:line="264"/>
+      </w:pPr>
+      <w:r>
+        <w:rPr>
+          <w:rFonts w:ascii="Calibri" w:cs="Calibri" w:eastAsia="Calibri" w:hAnsi="Calibri"/>
+          <w:b w:val="false"/>
+          <w:bCs w:val="false"/>
+          <w:i w:val="false"/>
+          <w:iCs w:val="false"/>
+          <w:sz w:val="22"/>
+          <w:szCs w:val="22"/>
+        </w:rPr>
+        <w:t xml:space="preserve"/>
+      </w:r>
+    </w:p>
+    <w:tbl>
+      <w:tblPr>
+        <w:tblW w:type="dxa" w:w="10080"/>
+        <w:tblBorders>
+          <w:top w:val="single" w:color="auto" w:sz="4"/>
+          <w:left w:val="single" w:color="auto" w:sz="4"/>
+          <w:bottom w:val="single" w:color="auto" w:sz="4"/>
+          <w:right w:val="single" w:color="auto" w:sz="4"/>
+          <w:insideH w:val="single" w:color="auto" w:sz="4"/>
+          <w:insideV w:val="single" w:color="auto" w:sz="4"/>
+        </w:tblBorders>
+      </w:tblPr>
+      <w:tblGrid>
+        <w:gridCol w:w="10080"/>
+      </w:tblGrid>
+      <w:tr>
+        <w:trPr>
+          <w:cantSplit/>
+        </w:trPr>
+        <w:tc>
+          <w:tcPr>
+            <w:tcW w:type="dxa" w:w="10080"/>
+            <w:tcBorders>
+              <w:top w:val="single" w:color="B07CFF" w:sz="12"/>
+              <w:left w:val="single" w:color="B07CFF" w:sz="12"/>
+              <w:bottom w:val="single" w:color="B07CFF" w:sz="12"/>
+              <w:right w:val="single" w:color="B07CFF" w:sz="12"/>
+            </w:tcBorders>
+            <w:tcMar>
+              <w:top w:type="dxa" w:w="80"/>
+              <w:left w:type="dxa" w:w="160"/>
+              <w:bottom w:type="dxa" w:w="80"/>
+              <w:right w:type="dxa" w:w="160"/>
+            </w:tcMar>
+          </w:tcPr>
+          <w:p>
+            <w:pPr>
+              <w:spacing w:after="40" w:before="0" w:line="264"/>
+            </w:pPr>
+            <w:r>
+              <w:rPr>
+                <w:rFonts w:ascii="Calibri" w:cs="Calibri" w:eastAsia="Calibri" w:hAnsi="Calibri"/>
+                <w:b/>
+                <w:bCs/>
+                <w:i w:val="false"/>
+                <w:iCs w:val="false"/>
+                <w:color w:val="B07CFF"/>
+                <w:sz w:val="18"/>
+                <w:szCs w:val="18"/>
+              </w:rPr>
+              <w:t xml:space="preserve">DO</w:t>
+            </w:r>
+          </w:p>
+          <w:p>
+            <w:pPr>
+              <w:spacing w:after="0" w:before="0" w:line="264"/>
+            </w:pPr>
+            <w:r>
+              <w:rPr>
+                <w:rFonts w:ascii="Calibri" w:cs="Calibri" w:eastAsia="Calibri" w:hAnsi="Calibri"/>
+                <w:b w:val="false"/>
+                <w:bCs w:val="false"/>
+                <w:i w:val="false"/>
+                <w:iCs w:val="false"/>
+                <w:sz w:val="20"/>
+                <w:szCs w:val="20"/>
+              </w:rPr>
+              <w:t xml:space="preserve">Skip to next</w:t>
+            </w:r>
+          </w:p>
+          <w:p>
+            <w:pPr>
+              <w:spacing w:after="0" w:before="60" w:line="264"/>
+            </w:pPr>
+            <w:r>
+              <w:rPr>
+                <w:rFonts w:ascii="Calibri" w:cs="Calibri" w:eastAsia="Calibri" w:hAnsi="Calibri"/>
+                <w:b/>
+                <w:bCs/>
+                <w:i w:val="false"/>
+                <w:iCs w:val="false"/>
+                <w:color w:val="2ECC71"/>
+                <w:sz w:val="19"/>
+                <w:szCs w:val="19"/>
+              </w:rPr>
+              <w:t xml:space="preserve">→ </w:t>
+            </w:r>
+            <w:r>
+              <w:rPr>
+                <w:rFonts w:ascii="Calibri" w:cs="Calibri" w:eastAsia="Calibri" w:hAnsi="Calibri"/>
+                <w:b w:val="false"/>
+                <w:bCs w:val="false"/>
+                <w:i w:val="false"/>
+                <w:iCs w:val="false"/>
+                <w:color w:val="9AA4B2"/>
+                <w:sz w:val="19"/>
+                <w:szCs w:val="19"/>
+              </w:rPr>
+              <w:t xml:space="preserve">Tuesday: fresh tracking for SL-3 R/B (pink SIMULATED). The dot jumps from 421 m to 3,700 m and the agent says no burn.</w:t>
+            </w:r>
+          </w:p>
+        </w:tc>
+      </w:tr>
+    </w:tbl>
+    <w:p>
+      <w:pPr>
+        <w:spacing w:after="20" w:before="0" w:line="264"/>
+      </w:pPr>
+      <w:r>
+        <w:rPr>
+          <w:rFonts w:ascii="Calibri" w:cs="Calibri" w:eastAsia="Calibri" w:hAnsi="Calibri"/>
+          <w:b w:val="false"/>
+          <w:bCs w:val="false"/>
+          <w:i w:val="false"/>
+          <w:iCs w:val="false"/>
+          <w:sz w:val="22"/>
+          <w:szCs w:val="22"/>
+        </w:rPr>
+        <w:t xml:space="preserve"/>
+      </w:r>
+    </w:p>
+    <w:tbl>
+      <w:tblPr>
+        <w:tblW w:type="dxa" w:w="10080"/>
+        <w:tblBorders>
+          <w:top w:val="single" w:color="auto" w:sz="4"/>
+          <w:left w:val="single" w:color="auto" w:sz="4"/>
+          <w:bottom w:val="single" w:color="auto" w:sz="4"/>
+          <w:right w:val="single" w:color="auto" w:sz="4"/>
+          <w:insideH w:val="single" w:color="auto" w:sz="4"/>
+          <w:insideV w:val="single" w:color="auto" w:sz="4"/>
+        </w:tblBorders>
+      </w:tblPr>
+      <w:tblGrid>
+        <w:gridCol w:w="10080"/>
+      </w:tblGrid>
+      <w:tr>
+        <w:trPr>
+          <w:cantSplit/>
+        </w:trPr>
+        <w:tc>
+          <w:tcPr>
+            <w:tcW w:type="dxa" w:w="10080"/>
+            <w:tcBorders>
+              <w:top w:val="single" w:color="B07CFF" w:sz="12"/>
+              <w:left w:val="single" w:color="B07CFF" w:sz="12"/>
+              <w:bottom w:val="single" w:color="B07CFF" w:sz="12"/>
+              <w:right w:val="single" w:color="B07CFF" w:sz="12"/>
+            </w:tcBorders>
+            <w:tcMar>
+              <w:top w:type="dxa" w:w="80"/>
+              <w:left w:type="dxa" w:w="160"/>
+              <w:bottom w:type="dxa" w:w="80"/>
+              <w:right w:type="dxa" w:w="160"/>
+            </w:tcMar>
+          </w:tcPr>
+          <w:p>
+            <w:pPr>
+              <w:spacing w:after="40" w:before="0" w:line="264"/>
+            </w:pPr>
+            <w:r>
+              <w:rPr>
+                <w:rFonts w:ascii="Calibri" w:cs="Calibri" w:eastAsia="Calibri" w:hAnsi="Calibri"/>
+                <w:b/>
+                <w:bCs/>
+                <w:i w:val="false"/>
+                <w:iCs w:val="false"/>
+                <w:color w:val="B07CFF"/>
+                <w:sz w:val="18"/>
+                <w:szCs w:val="18"/>
+              </w:rPr>
+              <w:t xml:space="preserve">DO</w:t>
+            </w:r>
+          </w:p>
+          <w:p>
+            <w:pPr>
+              <w:spacing w:after="0" w:before="0" w:line="264"/>
+            </w:pPr>
+            <w:r>
+              <w:rPr>
+                <w:rFonts w:ascii="Calibri" w:cs="Calibri" w:eastAsia="Calibri" w:hAnsi="Calibri"/>
+                <w:b w:val="false"/>
+                <w:bCs w:val="false"/>
+                <w:i w:val="false"/>
+                <w:iCs w:val="false"/>
+                <w:sz w:val="20"/>
+                <w:szCs w:val="20"/>
+              </w:rPr>
+              <w:t xml:space="preserve">Approve</w:t>
+            </w:r>
+          </w:p>
+        </w:tc>
+      </w:tr>
+    </w:tbl>
+    <w:p>
+      <w:pPr>
+        <w:spacing w:after="20" w:before="0" w:line="264"/>
+      </w:pPr>
+      <w:r>
+        <w:rPr>
+          <w:rFonts w:ascii="Calibri" w:cs="Calibri" w:eastAsia="Calibri" w:hAnsi="Calibri"/>
+          <w:b w:val="false"/>
+          <w:bCs w:val="false"/>
+          <w:i w:val="false"/>
+          <w:iCs w:val="false"/>
+          <w:sz w:val="22"/>
+          <w:szCs w:val="22"/>
+        </w:rPr>
+        <w:t xml:space="preserve"/>
+      </w:r>
+    </w:p>
+    <w:tbl>
+      <w:tblPr>
+        <w:tblW w:type="dxa" w:w="10080"/>
+        <w:tblBorders>
+          <w:top w:val="single" w:color="auto" w:sz="4"/>
+          <w:left w:val="single" w:color="auto" w:sz="4"/>
+          <w:bottom w:val="single" w:color="auto" w:sz="4"/>
+          <w:right w:val="single" w:color="auto" w:sz="4"/>
+          <w:insideH w:val="single" w:color="auto" w:sz="4"/>
+          <w:insideV w:val="single" w:color="auto" w:sz="4"/>
+        </w:tblBorders>
+      </w:tblPr>
+      <w:tblGrid>
+        <w:gridCol w:w="10080"/>
+      </w:tblGrid>
+      <w:tr>
+        <w:trPr>
+          <w:cantSplit/>
+        </w:trPr>
+        <w:tc>
+          <w:tcPr>
+            <w:tcW w:type="dxa" w:w="10080"/>
+            <w:tcBorders>
+              <w:top w:val="single" w:color="2ECC71" w:sz="12"/>
+              <w:left w:val="single" w:color="2ECC71" w:sz="12"/>
+              <w:bottom w:val="single" w:color="2ECC71" w:sz="12"/>
+              <w:right w:val="single" w:color="2ECC71" w:sz="12"/>
+            </w:tcBorders>
+            <w:tcMar>
+              <w:top w:type="dxa" w:w="80"/>
+              <w:left w:type="dxa" w:w="160"/>
+              <w:bottom w:type="dxa" w:w="80"/>
+              <w:right w:type="dxa" w:w="160"/>
+            </w:tcMar>
+          </w:tcPr>
+          <w:p>
+            <w:pPr>
+              <w:spacing w:after="40" w:before="0" w:line="264"/>
+            </w:pPr>
+            <w:r>
+              <w:rPr>
+                <w:rFonts w:ascii="Calibri" w:cs="Calibri" w:eastAsia="Calibri" w:hAnsi="Calibri"/>
+                <w:b/>
+                <w:bCs/>
+                <w:i w:val="false"/>
+                <w:iCs w:val="false"/>
+                <w:color w:val="2ECC71"/>
+                <w:sz w:val="18"/>
+                <w:szCs w:val="18"/>
+              </w:rPr>
+              <w:t xml:space="preserve">IF YOUR TEAM HAS…</w:t>
+            </w:r>
+          </w:p>
+          <w:p>
+            <w:pPr>
+              <w:spacing w:after="0" w:before="0" w:line="264"/>
+            </w:pPr>
+            <w:r>
+              <w:rPr>
+                <w:rFonts w:ascii="Calibri" w:cs="Calibri" w:eastAsia="Calibri" w:hAnsi="Calibri"/>
+                <w:b w:val="false"/>
+                <w:bCs w:val="false"/>
+                <w:i w:val="false"/>
+                <w:iCs w:val="false"/>
+                <w:sz w:val="20"/>
+                <w:szCs w:val="20"/>
+              </w:rPr>
+              <w:t xml:space="preserve">A web developer with time: a custom face like this. Without one, the ADK web UI is a legitimate finish; say why you chose it.</w:t>
             </w:r>
           </w:p>
         </w:tc>
@@ -8488,7 +9298,37 @@
           <w:sz w:val="22"/>
           <w:szCs w:val="22"/>
         </w:rPr>
-        <w:t xml:space="preserve">That's the bar: every number from a tool or a query, every assumption stated. Now go build yours.</w:t>
+        <w:t xml:space="preserve">That's the bar: every number from a tool or a query, every assumption stated.</w:t>
+      </w:r>
+    </w:p>
+    <w:p>
+      <w:pPr>
+        <w:spacing w:after="80" w:before="40" w:line="264"/>
+      </w:pPr>
+      <w:r>
+        <w:rPr>
+          <w:rFonts w:ascii="Calibri" w:cs="Calibri" w:eastAsia="Calibri" w:hAnsi="Calibri"/>
+          <w:b/>
+          <w:bCs/>
+          <w:i w:val="false"/>
+          <w:iCs w:val="false"/>
+          <w:color w:val="2BB3B1"/>
+          <w:sz w:val="20"/>
+          <w:szCs w:val="20"/>
+        </w:rPr>
+        <w:t xml:space="preserve">SAY  </w:t>
+      </w:r>
+      <w:r>
+        <w:rPr>
+          <w:rFonts w:ascii="Calibri" w:cs="Calibri" w:eastAsia="Calibri" w:hAnsi="Calibri"/>
+          <w:b w:val="false"/>
+          <w:bCs w:val="false"/>
+          <w:i/>
+          <w:iCs/>
+          <w:sz w:val="22"/>
+          <w:szCs w:val="22"/>
+        </w:rPr>
+        <w:t xml:space="preserve">And remember where this ended: further than most teams will get in four and a half hours, and that's fine. Three quarters of the way with clear reasoning and honest limits beats a polished demo with nothing behind it. Play to the people at your table. Now go build yours.</w:t>
       </w:r>
     </w:p>
     <w:tbl>

</xml_diff>